<commit_message>
docs(legal): update website policy and terms documents
</commit_message>
<xml_diff>
--- a/public/docs/kscan-privacy-policy.docx
+++ b/public/docs/kscan-privacy-policy.docx
@@ -4,140 +4,60 @@
   <w:body>
     <w:p>
       <w:pPr>
+        <w:pStyle w:val="Title"/>
         <w:jc w:val="center"/>
       </w:pPr>
       <w:r>
-        <w:rPr>
-          <w:rFonts w:ascii="Aptos Display" w:hAnsi="Aptos Display"/>
-          <w:b/>
-          <w:color w:val="15131A"/>
-          <w:sz w:val="48"/>
-        </w:rPr>
-        <w:t>K Scan AI Privacy Policy</w:t>
-      </w:r>
-    </w:p>
-    <w:p>
-      <w:pPr>
+        <w:t>K SCAN AI</w:t>
+      </w:r>
+    </w:p>
+    <w:p>
+      <w:pPr>
+        <w:pStyle w:val="Title"/>
         <w:jc w:val="center"/>
       </w:pPr>
       <w:r>
-        <w:rPr>
-          <w:color w:val="666666"/>
-          <w:sz w:val="19"/>
-        </w:rPr>
-        <w:t xml:space="preserve">Effective Date: May 13, </w:t>
+        <w:t>Privacy Policy</w:t>
+      </w:r>
+    </w:p>
+    <w:p>
+      <w:pPr>
+        <w:pStyle w:val="Meta"/>
+        <w:jc w:val="center"/>
+      </w:pPr>
+      <w:r>
+        <w:t xml:space="preserve">Effective Date: June 12, </w:t>
       </w:r>
       <w:proofErr w:type="gramStart"/>
       <w:r>
-        <w:rPr>
-          <w:color w:val="666666"/>
-          <w:sz w:val="19"/>
-        </w:rPr>
         <w:t>2026  |</w:t>
       </w:r>
       <w:proofErr w:type="gramEnd"/>
       <w:r>
-        <w:rPr>
-          <w:color w:val="666666"/>
-          <w:sz w:val="19"/>
-        </w:rPr>
-        <w:t xml:space="preserve">  Last Updated: May 13, 2026</w:t>
-      </w:r>
-    </w:p>
-    <w:tbl>
-      <w:tblPr>
-        <w:tblW w:w="0" w:type="auto"/>
-        <w:jc w:val="center"/>
-        <w:tblLayout w:type="fixed"/>
-        <w:tblLook w:val="04A0" w:firstRow="1" w:lastRow="0" w:firstColumn="1" w:lastColumn="0" w:noHBand="0" w:noVBand="1"/>
-      </w:tblPr>
-      <w:tblGrid>
-        <w:gridCol w:w="10080"/>
-      </w:tblGrid>
-      <w:tr>
-        <w:trPr>
-          <w:jc w:val="center"/>
-        </w:trPr>
-        <w:tc>
-          <w:tcPr>
-            <w:tcW w:w="10080" w:type="dxa"/>
-            <w:tcBorders>
-              <w:top w:val="single" w:sz="10" w:space="0" w:color="D9D0F4"/>
-              <w:left w:val="single" w:sz="10" w:space="0" w:color="D9D0F4"/>
-              <w:bottom w:val="single" w:sz="10" w:space="0" w:color="D9D0F4"/>
-              <w:right w:val="single" w:sz="10" w:space="0" w:color="D9D0F4"/>
-            </w:tcBorders>
-            <w:shd w:val="clear" w:color="auto" w:fill="F4F1FA"/>
-            <w:tcMar>
-              <w:top w:w="120" w:type="dxa"/>
-              <w:left w:w="160" w:type="dxa"/>
-              <w:bottom w:w="120" w:type="dxa"/>
-              <w:right w:w="160" w:type="dxa"/>
-            </w:tcMar>
-          </w:tcPr>
-          <w:p>
-            <w:r>
-              <w:rPr>
-                <w:b/>
-                <w:color w:val="5B3FD6"/>
-                <w:sz w:val="24"/>
-              </w:rPr>
-              <w:t>Privacy Controls Summary</w:t>
-            </w:r>
-          </w:p>
-          <w:p>
-            <w:pPr>
-              <w:pStyle w:val="ListBullet"/>
-              <w:spacing w:after="60"/>
-            </w:pPr>
-            <w:r>
-              <w:t>Your camera is used only when you choose to scan.</w:t>
-            </w:r>
-          </w:p>
-          <w:p>
-            <w:pPr>
-              <w:pStyle w:val="ListBullet"/>
-              <w:spacing w:after="60"/>
-            </w:pPr>
-            <w:r>
-              <w:t>Raw scans and uploaded images are not sold, licensed, or used for facial recognition.</w:t>
-            </w:r>
-          </w:p>
-          <w:p>
-            <w:pPr>
-              <w:pStyle w:val="ListBullet"/>
-              <w:spacing w:after="60"/>
-            </w:pPr>
-            <w:r>
-              <w:t xml:space="preserve">Certain non-sensitive usage, preference, analytics, marketing, and commercial data may be sold, shared, licensed, or disclosed </w:t>
-            </w:r>
-            <w:proofErr w:type="gramStart"/>
-            <w:r>
-              <w:t>where</w:t>
-            </w:r>
-            <w:proofErr w:type="gramEnd"/>
-            <w:r>
-              <w:t xml:space="preserve"> permitted by law and subject to opt-out or consent rights.</w:t>
-            </w:r>
-          </w:p>
-          <w:p>
-            <w:pPr>
-              <w:pStyle w:val="ListBullet"/>
-              <w:spacing w:after="60"/>
-            </w:pPr>
-            <w:r>
-              <w:t>You may opt out of sale or sharing where required by law and may exercise access, correction, deletion, portability, and other privacy rights where applicable.</w:t>
-            </w:r>
-          </w:p>
-        </w:tc>
-      </w:tr>
-    </w:tbl>
-    <w:p>
-      <w:pPr>
-        <w:spacing w:before="200"/>
-      </w:pPr>
-      <w:r>
-        <w:t>This Privacy Policy explains how K Scan AI (“K Scan,” “we,” “our,” or “us”) collects, uses, discloses, sells, shares, licenses, and protects information when you use our website, mobile application, APIs, AI systems, and related services (collectively, the “Service”). This Policy is designed to be transparent about commercial data uses while protecting scan content and honoring privacy rights. It applies to both the website and the app unless a separate notice says otherwise.</w:t>
+        <w:t xml:space="preserve">  Last Updated: June 12, </w:t>
+      </w:r>
+      <w:proofErr w:type="gramStart"/>
+      <w:r>
+        <w:t>2026  |</w:t>
+      </w:r>
+      <w:proofErr w:type="gramEnd"/>
+      <w:r>
+        <w:t xml:space="preserve">  Contact: kscanai.app@gmail.com</w:t>
+      </w:r>
+    </w:p>
+    <w:p>
+      <w:r>
+        <w:t>K Scan AI ("K Scan," "we," "our," or "us") respects your privacy. This Privacy Policy explains how we collect, use, disclose, retain, and protect information when you use our website, mobile application, APIs, AI systems, StyleChat, Style Library, Dressing Rooms, shopping-assistance tools, and related services (collectively, the "Service").</w:t>
+      </w:r>
+    </w:p>
+    <w:p>
+      <w:r>
+        <w:t>K Scan is a fashion-specific visual discovery, style assistance, and shopping-assistance service. The Service allows users to scan or upload fashion-related images, save style inspiration, use AI-powered StyleChat, organize Dressing Rooms, and receive product, retailer, or marketplace search results or links.</w:t>
+      </w:r>
+    </w:p>
+    <w:p>
+      <w:r>
+        <w:t>This Privacy Policy is written for the current Android and Apple submission posture, including Google Play Android release 1.0.0 and Apple App Store/TestFlight readiness, and for publication on kscan.app. It is intended to describe the current Service unless a feature is expressly identified as future, optional, or configuration-dependent.</w:t>
       </w:r>
     </w:p>
     <w:p>
@@ -145,116 +65,97 @@
         <w:pStyle w:val="Heading1"/>
       </w:pPr>
       <w:r>
-        <w:rPr>
-          <w:color w:val="15131A"/>
-        </w:rPr>
-        <w:t>1. Key Definitions</w:t>
+        <w:t>Privacy Controls Summary</w:t>
       </w:r>
     </w:p>
     <w:p>
       <w:pPr>
         <w:pStyle w:val="ListBullet"/>
-      </w:pPr>
-      <w:r>
-        <w:rPr>
-          <w:b/>
-        </w:rPr>
-        <w:t>Personal Information / Personal Data:</w:t>
-      </w:r>
-      <w:r>
-        <w:t xml:space="preserve"> information that identifies, relates to, describes, can reasonably be linked to, or could reasonably identify an individual or household.</w:t>
+        <w:spacing w:after="40" w:line="247" w:lineRule="auto"/>
+      </w:pPr>
+      <w:r>
+        <w:t>K Scan AI is intended for users 18 years of age and older. The Service is not directed to children or minors, and users under 18 should not use the Service.</w:t>
       </w:r>
     </w:p>
     <w:p>
       <w:pPr>
         <w:pStyle w:val="ListBullet"/>
-      </w:pPr>
-      <w:r>
-        <w:rPr>
-          <w:b/>
-        </w:rPr>
-        <w:t>De-identified Data:</w:t>
-      </w:r>
-      <w:r>
-        <w:t xml:space="preserve"> data processed so it cannot reasonably be linked to an identified person and is subject to controls designed to prevent re-identification.</w:t>
+        <w:spacing w:after="40" w:line="247" w:lineRule="auto"/>
+      </w:pPr>
+      <w:r>
+        <w:t>Your camera, photo library, media picker, and image upload tools are used only when you choose to scan, upload, save, or manage fashion-related images or visual inspiration.</w:t>
       </w:r>
     </w:p>
     <w:p>
       <w:pPr>
         <w:pStyle w:val="ListBullet"/>
-      </w:pPr>
-      <w:r>
-        <w:rPr>
-          <w:b/>
-        </w:rPr>
-        <w:t>Aggregated Data:</w:t>
-      </w:r>
-      <w:r>
-        <w:t xml:space="preserve"> information combined with other </w:t>
-      </w:r>
-      <w:proofErr w:type="gramStart"/>
-      <w:r>
-        <w:t>data</w:t>
-      </w:r>
-      <w:proofErr w:type="gramEnd"/>
-      <w:r>
-        <w:t xml:space="preserve"> so it does not identify a specific person.</w:t>
+        <w:spacing w:after="40" w:line="247" w:lineRule="auto"/>
+      </w:pPr>
+      <w:r>
+        <w:t>K Scan is not designed for surveillance, facial recognition, biometric identification, or identifying people.</w:t>
       </w:r>
     </w:p>
     <w:p>
       <w:pPr>
         <w:pStyle w:val="ListBullet"/>
-      </w:pPr>
-      <w:r>
-        <w:rPr>
-          <w:b/>
-        </w:rPr>
-        <w:t>Anonymized Data:</w:t>
-      </w:r>
-      <w:r>
-        <w:t xml:space="preserve"> data that cannot reasonably be used to identify or re-identify a person.</w:t>
+        <w:spacing w:after="40" w:line="247" w:lineRule="auto"/>
+      </w:pPr>
+      <w:r>
+        <w:t>K Scan does not generate, store, or retain biometric templates, face geometry, faceprints, or identity profiles.</w:t>
       </w:r>
     </w:p>
     <w:p>
       <w:pPr>
         <w:pStyle w:val="ListBullet"/>
-      </w:pPr>
-      <w:r>
-        <w:rPr>
-          <w:b/>
-        </w:rPr>
-        <w:t>Raw Scan Data:</w:t>
-      </w:r>
-      <w:r>
-        <w:t xml:space="preserve"> original camera uploads, image files, screenshots, QR/barcode captures, or other unaltered content submitted for scanning.</w:t>
+        <w:spacing w:after="40" w:line="247" w:lineRule="auto"/>
+      </w:pPr>
+      <w:r>
+        <w:t>Images, screenshots, StyleChat prompts, and related context may be processed through secure cloud systems and AI providers to provide fashion identification, style assistance, search, matching, and related functionality.</w:t>
       </w:r>
     </w:p>
     <w:p>
       <w:pPr>
         <w:pStyle w:val="ListBullet"/>
-      </w:pPr>
-      <w:r>
-        <w:rPr>
-          <w:b/>
-        </w:rPr>
-        <w:t>Derived Scan Data:</w:t>
-      </w:r>
-      <w:r>
-        <w:t xml:space="preserve"> metadata or analysis generated from a scan. K Scan does not monetize derived scan data that can reasonably be linked back to a specific person or raw image unless expressly disclosed and lawfully consented to.</w:t>
+        <w:spacing w:after="40" w:line="247" w:lineRule="auto"/>
+      </w:pPr>
+      <w:r>
+        <w:t>K Scan does not currently claim that image processing is device-only, cloud-free, or subject to face or bystander blurring before upload.</w:t>
       </w:r>
     </w:p>
     <w:p>
       <w:pPr>
         <w:pStyle w:val="ListBullet"/>
-      </w:pPr>
-      <w:r>
-        <w:rPr>
-          <w:b/>
-        </w:rPr>
-        <w:t>Commercial and Preference Data:</w:t>
-      </w:r>
-      <w:r>
-        <w:t xml:space="preserve"> saved items, product interactions, style preferences, shopping activity, affiliate attribution data, and inferred product or fashion interests.</w:t>
+        <w:spacing w:after="40" w:line="247" w:lineRule="auto"/>
+      </w:pPr>
+      <w:r>
+        <w:t>You should avoid uploading images or messages that include faces, bystanders, license plates, government IDs, financial records, medical information, private documents, or other sensitive or non-fashion personal information unless you intend that content to be processed as part of your request.</w:t>
+      </w:r>
+    </w:p>
+    <w:p>
+      <w:pPr>
+        <w:pStyle w:val="ListBullet"/>
+        <w:spacing w:after="40" w:line="247" w:lineRule="auto"/>
+      </w:pPr>
+      <w:r>
+        <w:t>K Scan does not currently use third-party advertising SDKs or collect Advertising ID for targeted advertising in the current release posture. If tracking or advertising SDKs are introduced later, K Scan will update this Policy and request required consent or App Tracking Transparency permission where required.</w:t>
+      </w:r>
+    </w:p>
+    <w:p>
+      <w:pPr>
+        <w:pStyle w:val="ListBullet"/>
+        <w:spacing w:after="40" w:line="247" w:lineRule="auto"/>
+      </w:pPr>
+      <w:r>
+        <w:t>You may request account deletion. Deletion requests are generally processed within 30 days, subject to legal, security, fraud-prevention, backup, and technical limitations described below.</w:t>
+      </w:r>
+    </w:p>
+    <w:p>
+      <w:pPr>
+        <w:pStyle w:val="ListBullet"/>
+        <w:spacing w:after="40" w:line="247" w:lineRule="auto"/>
+      </w:pPr>
+      <w:r>
+        <w:t>This Policy is provided for transparency about K Scan’s privacy practices. If you have questions, contact us at kscanai.app@gmail.com.</w:t>
       </w:r>
     </w:p>
     <w:p>
@@ -262,10 +163,87 @@
         <w:pStyle w:val="Heading1"/>
       </w:pPr>
       <w:r>
-        <w:rPr>
-          <w:color w:val="15131A"/>
-        </w:rPr>
-        <w:t>2. Information We Collect</w:t>
+        <w:t>1. Scope and Overview</w:t>
+      </w:r>
+    </w:p>
+    <w:p>
+      <w:r>
+        <w:t>This Policy applies to the K Scan website, Android app, iOS app, beta releases, TestFlight releases, APIs, AI systems, and related services unless a separate privacy notice says otherwise. It covers data collected directly from users, data generated through app use, data processed by service providers, and data disclosed to shopping, retailer, marketplace, AI, analytics, infrastructure, and support providers where applicable.</w:t>
+      </w:r>
+    </w:p>
+    <w:p>
+      <w:r>
+        <w:t>Some website, investor, beta, or demonstration materials may show planned, conceptual, or future K Scan capabilities. This Policy describes the currently available Service unless a feature is expressly described as future functionality. If K Scan introduces new functionality that materially changes data collection or processing, such as microphone-based voice search, smart-glasses capture, persistent background capture, checkout/payment processing, or on-device privacy filtering, we will update this Policy, update required Google Play and Apple disclosures, and request any required permissions or consent before enabling that functionality.</w:t>
+      </w:r>
+    </w:p>
+    <w:p>
+      <w:pPr>
+        <w:pStyle w:val="Heading1"/>
+      </w:pPr>
+      <w:r>
+        <w:t>2. Age Eligibility and 18+ Target Audience</w:t>
+      </w:r>
+    </w:p>
+    <w:p>
+      <w:r>
+        <w:t>K Scan AI is intended for users 18 years of age and older. The Service is not directed to children or minors. Users under 18 should not use the Service.</w:t>
+      </w:r>
+    </w:p>
+    <w:p>
+      <w:r>
+        <w:lastRenderedPageBreak/>
+        <w:t>K Scan does not knowingly collect personal information from children or minors. If we learn that we have collected information from a person under 18, we will take reasonable steps to delete or restrict that information, subject to legal, safety, security, fraud-prevention, backup, and technical requirements.</w:t>
+      </w:r>
+    </w:p>
+    <w:p>
+      <w:r>
+        <w:t>K Scan does not participate in Google Play Families or Designed for Children for the current release posture.</w:t>
+      </w:r>
+    </w:p>
+    <w:p>
+      <w:pPr>
+        <w:pStyle w:val="Heading1"/>
+      </w:pPr>
+      <w:r>
+        <w:t>3. Key Definitions</w:t>
+      </w:r>
+    </w:p>
+    <w:p>
+      <w:r>
+        <w:t>Personal Information / Personal Data: information that identifies, relates to, describes, can reasonably be linked to, or could reasonably identify an individual or household.</w:t>
+      </w:r>
+    </w:p>
+    <w:p>
+      <w:r>
+        <w:t>User Content: content a user submits, uploads, saves, sends, or shares through the Service, including scan images, uploaded photos, screenshots, StyleChat messages, Dressing Room content, notes, captions, shared-room content, and support communications.</w:t>
+      </w:r>
+    </w:p>
+    <w:p>
+      <w:r>
+        <w:t>Submitted Visual Data: camera captures, uploaded photos, screenshots, image files, QR/barcode captures, or other visual inputs submitted to K Scan for scanning, StyleChat, fashion recognition, product matching, product search, visual inspiration, Dressing Room organization, or related functionality.</w:t>
+      </w:r>
+    </w:p>
+    <w:p>
+      <w:r>
+        <w:t>Derived Data: metadata or analysis generated from use of the Service, including garment category, color, texture, style attributes, product-match signals, image-analysis outputs, search terms, product-interest signals, interaction signals, and related analytical outputs.</w:t>
+      </w:r>
+    </w:p>
+    <w:p>
+      <w:r>
+        <w:t>Commercial and Preference Data: saved items, product interactions, style preferences, shopping activity, affiliate attribution data, product-interest signals, inferred fashion interests, and commerce-related preferences.</w:t>
+      </w:r>
+    </w:p>
+    <w:p>
+      <w:r>
+        <w:t>Aggregated, Anonymized, or De-identified Data: information processed or combined so it does not reasonably identify a specific person and is subject to controls designed to prevent re-identification.</w:t>
+      </w:r>
+    </w:p>
+    <w:p>
+      <w:pPr>
+        <w:pStyle w:val="Heading1"/>
+      </w:pPr>
+      <w:r>
+        <w:t>4. Information We Collect</w:t>
       </w:r>
     </w:p>
     <w:p>
@@ -277,43 +255,62 @@
       </w:r>
     </w:p>
     <w:p>
+      <w:r>
+        <w:t>We may collect information you provide directly, including:</w:t>
+      </w:r>
+    </w:p>
+    <w:p>
       <w:pPr>
         <w:pStyle w:val="ListBullet"/>
-      </w:pPr>
-      <w:r>
-        <w:t>Name, if provided voluntarily</w:t>
+        <w:spacing w:after="40" w:line="247" w:lineRule="auto"/>
+      </w:pPr>
+      <w:r>
+        <w:t>Name, if voluntarily provided</w:t>
       </w:r>
     </w:p>
     <w:p>
       <w:pPr>
         <w:pStyle w:val="ListBullet"/>
-      </w:pPr>
-      <w:r>
-        <w:t xml:space="preserve">Email address, </w:t>
-      </w:r>
-      <w:proofErr w:type="gramStart"/>
-      <w:r>
-        <w:t>including for</w:t>
-      </w:r>
-      <w:proofErr w:type="gramEnd"/>
-      <w:r>
-        <w:t xml:space="preserve"> waitlist signup, beta access, support, or marketing communications</w:t>
+        <w:spacing w:after="40" w:line="247" w:lineRule="auto"/>
+      </w:pPr>
+      <w:r>
+        <w:t>Email address, including for waitlist signup, beta access, support, account creation, login, marketing communications, or privacy requests</w:t>
       </w:r>
     </w:p>
     <w:p>
       <w:pPr>
         <w:pStyle w:val="ListBullet"/>
-      </w:pPr>
-      <w:r>
-        <w:t>Account credentials, where applicable</w:t>
+        <w:spacing w:after="40" w:line="247" w:lineRule="auto"/>
+      </w:pPr>
+      <w:r>
+        <w:t>Account credentials or authentication-related information, where applicable</w:t>
       </w:r>
     </w:p>
     <w:p>
       <w:pPr>
         <w:pStyle w:val="ListBullet"/>
-      </w:pPr>
-      <w:r>
-        <w:t>Messages, support inquiries, feedback, investor inquiries, or other communications</w:t>
+        <w:spacing w:after="40" w:line="247" w:lineRule="auto"/>
+      </w:pPr>
+      <w:r>
+        <w:t>Support requests, feedback, communications, privacy requests, and inquiries</w:t>
+      </w:r>
+    </w:p>
+    <w:p>
+      <w:pPr>
+        <w:pStyle w:val="ListBullet"/>
+        <w:spacing w:after="40" w:line="247" w:lineRule="auto"/>
+      </w:pPr>
+      <w:r>
+        <w:t>Saved items, shopping preferences, profile settings, style preferences, notes, captions, and visual inspiration organization choices</w:t>
+      </w:r>
+    </w:p>
+    <w:p>
+      <w:pPr>
+        <w:pStyle w:val="ListBullet"/>
+        <w:spacing w:after="40" w:line="247" w:lineRule="auto"/>
+      </w:pPr>
+      <w:r>
+        <w:t>StyleChat messages, prompts, responses, image context, and saved chat-related preferences when you use StyleChat or similar AI features</w:t>
       </w:r>
     </w:p>
     <w:p>
@@ -321,16 +318,51 @@
         <w:pStyle w:val="Heading2"/>
       </w:pPr>
       <w:r>
-        <w:t>B. Social Login and Profile Information</w:t>
-      </w:r>
-    </w:p>
-    <w:p>
-      <w:r>
-        <w:t xml:space="preserve">If you sign in or interact through a third-party provider such as Google Sign-In, Apple ID, or social platforms, we may receive limited profile information such as name, email address, profile identifier, username, and publicly available profile information. We use this information to authenticate users, operate the Service, communicate </w:t>
-      </w:r>
+        <w:t>B. Authentication and Account Data</w:t>
+      </w:r>
+    </w:p>
+    <w:p>
+      <w:r>
+        <w:t>If you create an account or sign in through Google, Sign in with Apple, email, or another authentication provider, we may receive limited profile or authentication information permitted by that provider, such as your name, email address, profile identifier, username, authentication token metadata, or publicly available profile information, depending on your settings and the provider’s rules.</w:t>
+      </w:r>
+    </w:p>
+    <w:p>
+      <w:r>
+        <w:t>We use this information to authenticate users, operate the Service, personalize experiences, maintain account security, support account deletion requests, and comply with legal obligations.</w:t>
+      </w:r>
+    </w:p>
+    <w:p>
+      <w:pPr>
+        <w:pStyle w:val="Heading2"/>
+      </w:pPr>
+      <w:r>
+        <w:t>C. Camera, Image, Scan, QR, Barcode, and Uploaded Visual Data</w:t>
+      </w:r>
+    </w:p>
+    <w:p>
+      <w:r>
+        <w:t>When you choose to use K Scan’s camera, upload an image, scan a screenshot, scan QR/barcode content, or submit a fashion-related visual input, we may process the image or scan input to identify fashion items, style signals, product identifiers, text, QR/barcode content, URLs, related product matches, and related style or shopping context.</w:t>
+      </w:r>
+    </w:p>
+    <w:p>
+      <w:r>
+        <w:t>Camera access is activated only when you intentionally initiate a scan, capture, upload, or QR/barcode action. K Scan does not use the camera for continuous monitoring or background surveillance.</w:t>
+      </w:r>
+    </w:p>
+    <w:p>
+      <w:r>
+        <w:t>Submitted images may be processed locally and/or through secure cloud systems to provide fashion identification, StyleChat, search, matching, product recommendations, product lookup, and related functionality. K Scan does not claim that submitted images are processed only on the device.</w:t>
+      </w:r>
+    </w:p>
+    <w:p>
       <w:r>
         <w:lastRenderedPageBreak/>
-        <w:t>with users, and, where permitted, support analytics, marketing, personalization, and commercial partner measurement.</w:t>
+        <w:t>K Scan does not currently claim that faces, bystanders, license plates, private documents, or other identifying visual elements are detected, removed, blurred, or filtered before upload. If your submitted image contains such content, it may be included in the transmitted or stored content because the current release does not remove or obscure those elements before processing.</w:t>
+      </w:r>
+    </w:p>
+    <w:p>
+      <w:r>
+        <w:t>K Scan is designed to analyze garments, accessories, style attributes, product identifiers, QR/barcode content, and product-matching signals, not human faces. K Scan does not use submitted visual data to identify people, verify identity, create biometric profiles, perform facial recognition, perform targeted advertising based on identity, or build identity profiles.</w:t>
       </w:r>
     </w:p>
     <w:p>
@@ -338,44 +370,155 @@
         <w:pStyle w:val="Heading2"/>
       </w:pPr>
       <w:r>
-        <w:t>C. Scan, Image, QR, Barcode, and Visual Data</w:t>
-      </w:r>
-    </w:p>
-    <w:p>
-      <w:r>
-        <w:t>When you use K Scan, images and other scan inputs may be processed to identify fashion items, style signals, QR/barcode content, product identifiers, text, URLs, or related product matches. Processing may occur locally on your device and/or through secure cloud systems when needed to deliver the Service.</w:t>
+        <w:t>D. Photo Library, Media Permissions, Style Library, and Dressing Rooms</w:t>
+      </w:r>
+    </w:p>
+    <w:p>
+      <w:r>
+        <w:t>If you choose to upload screenshots, photos, outfit images, mood-board references, shopping screenshots, social-media screenshots, or other images into K Scan features such as Style Library, Dressing Rooms, saved items, style boards, or related private visual-inspiration tools, K Scan may request access to your device’s photo library, media library, image picker, or selected media files, depending on your device settings and operating system.</w:t>
+      </w:r>
+    </w:p>
+    <w:p>
+      <w:r>
+        <w:t>K Scan uses media-library access only when you choose to upload, import, save, or manage an image. K Scan does not use media permissions for background monitoring, continuous media-library scanning, social media scraping, URL importing, link previews, or access to photos or videos that you have not selected or otherwise granted permission to access.</w:t>
+      </w:r>
+    </w:p>
+    <w:p>
+      <w:r>
+        <w:t>Uploaded inspiration images are private to your account by default. Images uploaded to a Dressing Room may also appear in your Style Library and in the selected Dressing Room’s Room Inspiration section. Removing an uploaded image from a Dressing Room may remove only the room link while keeping the underlying Style Library inspiration item. Deleting an uploaded image from your Style Library may remove or hide it from attached Dressing Rooms, subject to the app’s deletion and retention practices.</w:t>
+      </w:r>
+    </w:p>
+    <w:p>
+      <w:r>
+        <w:t>Uploaded inspiration images may be transmitted through encrypted connections to K Scan’s private cloud storage and authorized service providers to provide upload, storage, display, signed-URL access, account, Library, Dressing Room, support, security, fraud-prevention, troubleshooting, quality-improvement, backup, and legal-compliance functions.</w:t>
+      </w:r>
+    </w:p>
+    <w:p>
+      <w:r>
+        <w:t>In the current release posture, uploaded inspiration images are not included in public shared-room previews or public shared-room web pages unless a separate user-facing sharing feature expressly allows that content to be shared and the user chooses to share it. K Scan does not allow anonymous users to upload inspiration images.</w:t>
+      </w:r>
+    </w:p>
+    <w:p>
+      <w:pPr>
+        <w:pStyle w:val="Heading2"/>
+      </w:pPr>
+      <w:r>
+        <w:t>E. StyleChat and User-Generated Messages</w:t>
+      </w:r>
+    </w:p>
+    <w:p>
+      <w:r>
+        <w:t>If you use StyleChat or related AI chat, messaging, or style-assistance features, we may process your messages, prompts, selected image context, saved style preferences, session metadata, and related content needed to provide the feature.</w:t>
+      </w:r>
+    </w:p>
+    <w:p>
+      <w:r>
+        <w:t>StyleChat may be powered by Gemini and/or other AI infrastructure depending on the current production configuration. AI requests may include text, image context, scan-derived attributes, style preferences, product signals, or other information needed to respond to your request.</w:t>
+      </w:r>
+    </w:p>
+    <w:p>
+      <w:r>
+        <w:t>Users should not submit sensitive personal information, health information, financial information, government IDs, private documents, or private information about other people through StyleChat. StyleChat outputs are AI-generated and may be incomplete, inaccurate, unavailable, or based on similar rather than exact matches.</w:t>
+      </w:r>
+    </w:p>
+    <w:p>
+      <w:pPr>
+        <w:pStyle w:val="Heading2"/>
+      </w:pPr>
+      <w:r>
+        <w:t>F. Dressing Rooms, Sharing, and In-App Messaging</w:t>
+      </w:r>
+    </w:p>
+    <w:p>
+      <w:r>
+        <w:t>If you use Dressing Rooms, shared rooms, owner controls, messaging, notes, comments, or similar collaboration features, K Scan may process room names, room descriptions, shared content, uploaded images, messages, participants, timestamps, owner controls, invitation or revocation events, and related metadata to operate those features.</w:t>
+      </w:r>
+    </w:p>
+    <w:p>
+      <w:r>
+        <w:t>Users should only upload or share content they have permission to share. Private-room, signed-link, access-control, and owner-control features are used to operate access control, but K Scan does not describe these features as end-to-end encrypted unless a future version implements and verifies that architecture.</w:t>
+      </w:r>
+    </w:p>
+    <w:p>
+      <w:pPr>
+        <w:pStyle w:val="Heading2"/>
+      </w:pPr>
+      <w:r>
+        <w:t>G. Shopping, Search, Retailer, Marketplace, and Product Lookup Data</w:t>
+      </w:r>
+    </w:p>
+    <w:p>
+      <w:r>
+        <w:t>K Scan may collect and process search terms, scan-derived product signals, item attributes, product identifiers, retailer identifiers, marketplace identifiers, product URLs, product images, outbound retailer clicks, saved items, price alerts, product categories, affiliate attribution data, and other shopping or product interaction data.</w:t>
+      </w:r>
+    </w:p>
+    <w:p>
+      <w:r>
+        <w:t>K Scan may send search terms, item attributes, product signals, retailer identifiers, product URLs, or similar fashion/product data to product-search, affiliate, retailer, commerce, marketplace, or product-lookup providers to return relevant product matches, retailer links, shopping links, or related results.</w:t>
+      </w:r>
+    </w:p>
+    <w:p>
+      <w:r>
+        <w:lastRenderedPageBreak/>
+        <w:t>K Scan does not intentionally send raw uploaded images to retailers for independent reuse unless separately disclosed. References to retailer, marketplace, or product-search providers do not mean K Scan has an official partnership with any named retailer or marketplace unless we expressly state that a partnership exists.</w:t>
+      </w:r>
+    </w:p>
+    <w:p>
+      <w:pPr>
+        <w:pStyle w:val="Heading2"/>
+      </w:pPr>
+      <w:r>
+        <w:t>H. Device, App, Diagnostics, and Log Data</w:t>
+      </w:r>
+    </w:p>
+    <w:p>
+      <w:r>
+        <w:t>We may collect device, app, diagnostics, and log information, including:</w:t>
       </w:r>
     </w:p>
     <w:p>
       <w:pPr>
         <w:pStyle w:val="ListBullet"/>
-      </w:pPr>
-      <w:r>
-        <w:t>Raw uploaded scans and images are not sold, licensed, or disclosed to data buyers for independent commercial reuse.</w:t>
+        <w:spacing w:after="40" w:line="247" w:lineRule="auto"/>
+      </w:pPr>
+      <w:r>
+        <w:t>Device type, operating system, browser information, app version, package/build information, and language settings</w:t>
       </w:r>
     </w:p>
     <w:p>
       <w:pPr>
         <w:pStyle w:val="ListBullet"/>
-      </w:pPr>
-      <w:r>
-        <w:t>We do not use scan data for facial recognition or to identify individuals.</w:t>
+        <w:spacing w:after="40" w:line="247" w:lineRule="auto"/>
+      </w:pPr>
+      <w:r>
+        <w:t>IP address and approximate location derived from technical data, where applicable</w:t>
       </w:r>
     </w:p>
     <w:p>
       <w:pPr>
         <w:pStyle w:val="ListBullet"/>
-      </w:pPr>
-      <w:r>
-        <w:t>QR/barcode content is used to return scan results, support security, and improve the Service, and may be logged where necessary for diagnostics, fraud prevention, or functionality.</w:t>
+        <w:spacing w:after="40" w:line="247" w:lineRule="auto"/>
+      </w:pPr>
+      <w:r>
+        <w:t>App interactions, session events, feature usage, tap/click events, saved-item interactions, product interactions, and outbound link interactions</w:t>
       </w:r>
     </w:p>
     <w:p>
       <w:pPr>
         <w:pStyle w:val="ListBullet"/>
-      </w:pPr>
-      <w:r>
-        <w:t>Personally identifiable elements are minimized, masked, deleted, aggregated, or de-identified where technically feasible.</w:t>
+        <w:spacing w:after="40" w:line="247" w:lineRule="auto"/>
+      </w:pPr>
+      <w:r>
+        <w:t>Crash logs, performance logs, error logs, security logs, request metadata, fraud-prevention signals, and troubleshooting information</w:t>
+      </w:r>
+    </w:p>
+    <w:p>
+      <w:pPr>
+        <w:pStyle w:val="ListBullet"/>
+        <w:spacing w:after="40" w:line="247" w:lineRule="auto"/>
+      </w:pPr>
+      <w:r>
+        <w:t>User ID, account ID, authentication identifiers, or device-level identifiers where used by the applicable app version or SDKs</w:t>
       </w:r>
     </w:p>
     <w:p>
@@ -383,60 +526,129 @@
         <w:pStyle w:val="Heading2"/>
       </w:pPr>
       <w:r>
-        <w:t>D. Sensitive or Special Category Information in Uploaded Visuals</w:t>
-      </w:r>
-    </w:p>
-    <w:p>
-      <w:r>
-        <w:t>K Scan is not designed to collect sensitive personal information or special category data through scans. Uploaded images may incidentally reveal sensitive traits, such as health-related appearance, religious attire, or other characteristics. We do not intentionally use or monetize such sensitive visual information. Where applicable law requires explicit consent or other enhanced safeguards for processing sensitive or special category data, we will obtain that consent or avoid the processing.</w:t>
-      </w:r>
-    </w:p>
-    <w:p>
-      <w:pPr>
-        <w:pStyle w:val="Heading2"/>
-      </w:pPr>
-      <w:r>
-        <w:t>E. Automatically Collected Information</w:t>
+        <w:t>I. Website, Cookies, and Similar Technologies</w:t>
+      </w:r>
+    </w:p>
+    <w:p>
+      <w:r>
+        <w:t>When you use the K Scan website, we may collect website traffic data, cookie data, browser information, device information, referral information, and interaction data to operate the site, measure performance, maintain security, understand usage, support marketing where permitted, and comply with legal obligations.</w:t>
+      </w:r>
+    </w:p>
+    <w:p>
+      <w:r>
+        <w:t>Where required by law, non-essential cookies or similar technologies are used only after valid consent. Browser controls, device controls, and legally required privacy-control mechanisms may also be available.</w:t>
+      </w:r>
+    </w:p>
+    <w:p>
+      <w:pPr>
+        <w:pStyle w:val="Heading1"/>
+      </w:pPr>
+      <w:r>
+        <w:t>5. How We Use Information</w:t>
+      </w:r>
+    </w:p>
+    <w:p>
+      <w:r>
+        <w:t>We may use information to:</w:t>
       </w:r>
     </w:p>
     <w:p>
       <w:pPr>
         <w:pStyle w:val="ListBullet"/>
-      </w:pPr>
-      <w:r>
-        <w:t>Device type, operating system, browser information, and app version</w:t>
+        <w:spacing w:after="40" w:line="247" w:lineRule="auto"/>
+      </w:pPr>
+      <w:r>
+        <w:t>Provide, operate, maintain, secure, and improve the Service</w:t>
       </w:r>
     </w:p>
     <w:p>
       <w:pPr>
         <w:pStyle w:val="ListBullet"/>
-      </w:pPr>
-      <w:r>
-        <w:t>IP address and approximate location derived from technical data</w:t>
+        <w:spacing w:after="40" w:line="247" w:lineRule="auto"/>
+      </w:pPr>
+      <w:r>
+        <w:t>Authenticate users and support account functionality</w:t>
       </w:r>
     </w:p>
     <w:p>
       <w:pPr>
         <w:pStyle w:val="ListBullet"/>
-      </w:pPr>
-      <w:r>
-        <w:t>App interactions, session data, log data, diagnostics, and performance information</w:t>
+        <w:spacing w:after="40" w:line="247" w:lineRule="auto"/>
+      </w:pPr>
+      <w:r>
+        <w:t>Process scans and uploaded images and generate fashion-related, style-related, commerce-related, visual-search, or product-search results</w:t>
       </w:r>
     </w:p>
     <w:p>
       <w:pPr>
         <w:pStyle w:val="ListBullet"/>
-      </w:pPr>
-      <w:r>
-        <w:t>Device identifiers, which may include IDFA, GAID, or similar advertising identifiers depending on your settings</w:t>
+        <w:spacing w:after="40" w:line="247" w:lineRule="auto"/>
+      </w:pPr>
+      <w:r>
+        <w:t>Operate StyleChat and related AI style-assistance functionality</w:t>
       </w:r>
     </w:p>
     <w:p>
       <w:pPr>
         <w:pStyle w:val="ListBullet"/>
-      </w:pPr>
-      <w:r>
-        <w:t>Marketing engagement data, including email opens, clicks, campaign attribution, and referral source information</w:t>
+        <w:spacing w:after="40" w:line="247" w:lineRule="auto"/>
+      </w:pPr>
+      <w:r>
+        <w:t>Operate Style Library, Dressing Rooms, saved items, sharing, notes, captions, messages, and user controls</w:t>
+      </w:r>
+    </w:p>
+    <w:p>
+      <w:pPr>
+        <w:pStyle w:val="ListBullet"/>
+        <w:spacing w:after="40" w:line="247" w:lineRule="auto"/>
+      </w:pPr>
+      <w:r>
+        <w:t>Personalize product results, style suggestions, recommendations, content, style boards, and user experience</w:t>
+      </w:r>
+    </w:p>
+    <w:p>
+      <w:pPr>
+        <w:pStyle w:val="ListBullet"/>
+        <w:spacing w:after="40" w:line="247" w:lineRule="auto"/>
+      </w:pPr>
+      <w:r>
+        <w:t>Route users to retailer, marketplace, product-search, affiliate, or product pages</w:t>
+      </w:r>
+    </w:p>
+    <w:p>
+      <w:pPr>
+        <w:pStyle w:val="ListBullet"/>
+        <w:spacing w:after="40" w:line="247" w:lineRule="auto"/>
+      </w:pPr>
+      <w:r>
+        <w:t>Measure affiliate attribution, campaign performance, product engagement, and product interaction where permitted</w:t>
+      </w:r>
+    </w:p>
+    <w:p>
+      <w:pPr>
+        <w:pStyle w:val="ListBullet"/>
+        <w:spacing w:after="40" w:line="247" w:lineRule="auto"/>
+      </w:pPr>
+      <w:r>
+        <w:t>Analyze usage trends, diagnose errors, improve AI systems and product quality where permitted, and maintain security</w:t>
+      </w:r>
+    </w:p>
+    <w:p>
+      <w:pPr>
+        <w:pStyle w:val="ListBullet"/>
+        <w:spacing w:after="40" w:line="247" w:lineRule="auto"/>
+      </w:pPr>
+      <w:r>
+        <w:t>Detect fraud, prevent misuse, protect users, enforce legal terms, and comply with legal obligations</w:t>
+      </w:r>
+    </w:p>
+    <w:p>
+      <w:pPr>
+        <w:pStyle w:val="ListBullet"/>
+        <w:spacing w:after="40" w:line="247" w:lineRule="auto"/>
+      </w:pPr>
+      <w:r>
+        <w:t>Generate derived, aggregated, anonymized, or de-identified business intelligence that does not reasonably identify an individual</w:t>
       </w:r>
     </w:p>
     <w:p>
@@ -444,74 +656,239 @@
         <w:pStyle w:val="Heading1"/>
       </w:pPr>
       <w:r>
-        <w:rPr>
-          <w:color w:val="15131A"/>
-        </w:rPr>
-        <w:t>3. How We Use Information</w:t>
+        <w:t>6. AI Processing and Automated Results</w:t>
+      </w:r>
+    </w:p>
+    <w:p>
+      <w:r>
+        <w:t>K Scan uses cloud-hosted AI and automated systems during the current release posture to identify fashion items, extract product attributes, generate style signals, rank matches, power StyleChat, provide style assistance, and personalize experiences where permitted.</w:t>
+      </w:r>
+    </w:p>
+    <w:p>
+      <w:r>
+        <w:t>Depending on the production provider configuration, AI requests may be processed by providers such as Gemini and/or other AI routing or infrastructure providers. Some AI provider processing may be subject to provider terms that permit safety review, abuse monitoring, quality improvement, logging, or other processing described by that provider.</w:t>
+      </w:r>
+    </w:p>
+    <w:p>
+      <w:r>
+        <w:t>K Scan does not make provider-specific commitments about model training, retention, human review, special provider retention modes, or processor-only handling unless the relevant production configuration and provider terms have been verified and separately disclosed.</w:t>
+      </w:r>
+    </w:p>
+    <w:p>
+      <w:r>
+        <w:t>AI-generated results may be incomplete, inaccurate, unavailable, or based on similar rather than exact matches. K Scan does not guarantee that any product match, price, availability, retailer listing, style attribute, StyleChat response, or recommendation is complete or error-free.</w:t>
+      </w:r>
+    </w:p>
+    <w:p>
+      <w:r>
+        <w:t>K Scan does not use AI systems to identify people, perform facial recognition, generate biometric profiles, infer protected traits, or make decisions about eligibility for employment, housing, credit, health care, insurance, or other legally significant opportunities.</w:t>
+      </w:r>
+    </w:p>
+    <w:p>
+      <w:pPr>
+        <w:pStyle w:val="Heading1"/>
+      </w:pPr>
+      <w:r>
+        <w:lastRenderedPageBreak/>
+        <w:t>7. How We Disclose Information</w:t>
+      </w:r>
+    </w:p>
+    <w:p>
+      <w:r>
+        <w:t>K Scan may disclose information to the categories of recipients described below. We do not disclose every data category to every recipient. The data disclosed depends on the feature used, the user’s choices, the app version, provider configuration, legal requirements, and applicable privacy controls.</w:t>
+      </w:r>
+    </w:p>
+    <w:p>
+      <w:pPr>
+        <w:pStyle w:val="Heading1"/>
+      </w:pPr>
+      <w:r>
+        <w:t>8. Service Providers and Third-Party Processors</w:t>
+      </w:r>
+    </w:p>
+    <w:p>
+      <w:r>
+        <w:t>K Scan may disclose information to service providers that perform services on our behalf, such as cloud hosting, infrastructure, storage, database hosting, AI inference, AI routing, analytics, diagnostics, email delivery, customer support, authentication, security, fraud prevention, performance monitoring, crash reporting, account deletion workflows, and app operations.</w:t>
+      </w:r>
+    </w:p>
+    <w:p>
+      <w:r>
+        <w:t>Cloud hosting, infrastructure, storage, database, AI, and processing providers may process submitted images, StyleChat messages, account data, log data, diagnostics, and related metadata to operate the Service, return results, maintain security, troubleshoot functionality, prevent fraud, improve quality where permitted, process deletion requests, or comply with law.</w:t>
+      </w:r>
+    </w:p>
+    <w:p>
+      <w:r>
+        <w:t>These providers may process information as permitted by their agreements with K Scan, their applicable provider terms, this Policy, applicable law, platform rules, and user privacy controls. K Scan uses reasonable contractual, technical, and organizational measures designed to have providers handle user data consistently with this Policy and applicable law, but provider-specific retention, logging, and deletion controls should be verified before stronger claims are made.</w:t>
+      </w:r>
+    </w:p>
+    <w:p>
+      <w:pPr>
+        <w:pStyle w:val="Heading1"/>
+      </w:pPr>
+      <w:r>
+        <w:t>9. Retailer, Affiliate, Commerce, Marketplace, and Product-Search Providers</w:t>
+      </w:r>
+    </w:p>
+    <w:p>
+      <w:r>
+        <w:t>K Scan may disclose limited information to retail, affiliate, commerce, marketplace, product-search, and attribution providers to route users to product results, return relevant listings, measure affiliate conversions, confirm referral activity, attribute purchases or clicks, prevent fraud, support campaign reporting, improve product relevance, and support retailer or partner analytics where permitted.</w:t>
+      </w:r>
+    </w:p>
+    <w:p>
+      <w:r>
+        <w:t>This information may include technical referral data, click data, product interaction data, search terms, product identifiers, product URLs, campaign identifiers, transaction attribution data, approximate location derived from technical data, device or browser information, and limited account or identifier data where permitted.</w:t>
+      </w:r>
+    </w:p>
+    <w:p>
+      <w:r>
+        <w:t>When you tap retailer links, marketplace links, product links, or third-party links, you leave K Scan and the third party’s privacy policy and terms apply. K Scan is not responsible for third-party retailer, marketplace, or affiliate privacy practices, pricing, inventory, shipping, returns, payments, or policies.</w:t>
+      </w:r>
+    </w:p>
+    <w:p>
+      <w:pPr>
+        <w:pStyle w:val="Heading1"/>
+      </w:pPr>
+      <w:r>
+        <w:t>10. Analytics, Advertising, Tracking, and Attribution Posture</w:t>
+      </w:r>
+    </w:p>
+    <w:p>
+      <w:r>
+        <w:t>K Scan may collect basic app interactions, diagnostics, logs, performance data, product interaction data, and attribution data to operate and improve the Service, understand feature performance, troubleshoot errors, prevent fraud, and support commerce routing.</w:t>
+      </w:r>
+    </w:p>
+    <w:p>
+      <w:r>
+        <w:t>Based on the current release posture, K Scan does not currently use third-party advertising SDKs or collect Advertising ID for targeted advertising. K Scan does not currently track users across third-party apps and websites for targeted advertising.</w:t>
+      </w:r>
+    </w:p>
+    <w:p>
+      <w:r>
+        <w:t>If K Scan introduces tracking, third-party advertising SDKs, cross-app or cross-site advertising measurement, or other activities requiring consent or Apple App Tracking Transparency permission, K Scan will update this Policy, update required Google Play and Apple disclosures, and request required consent or App Tracking Transparency permission where required before enabling those activities.</w:t>
+      </w:r>
+    </w:p>
+    <w:p>
+      <w:r>
+        <w:t>Denying optional tracking, if ever requested, will not prevent you from using the core camera-search and style-assistance functionality of the Service, although optional personalization, advertising, attribution, or partner-supported experiences may be affected.</w:t>
+      </w:r>
+    </w:p>
+    <w:p>
+      <w:pPr>
+        <w:pStyle w:val="Heading1"/>
+      </w:pPr>
+      <w:r>
+        <w:t>11. Sale, Sharing, and Targeted Advertising Notice</w:t>
+      </w:r>
+    </w:p>
+    <w:p>
+      <w:r>
+        <w:t>Some privacy laws define sale, sharing, targeted advertising, or similar regulated processing broadly. Certain analytics, affiliate attribution, campaign measurement, product-search, commerce, or partner reporting activities described in this Policy may be considered a sale, sharing, targeted advertising, or similar regulated processing under those laws depending on the data flow and jurisdiction.</w:t>
+      </w:r>
+    </w:p>
+    <w:p>
+      <w:r>
+        <w:t>K Scan does not sell raw scans, uploaded images, biometric identifiers, face templates, faceprints, facial recognition data, government identification, payment card information, or sensitive personal information for independent third-party use.</w:t>
+      </w:r>
+    </w:p>
+    <w:p>
+      <w:r>
+        <w:lastRenderedPageBreak/>
+        <w:t>K Scan may create, use, disclose, license, sell, or commercialize aggregated, anonymized, or de-identified data and insights that do not reasonably identify an individual. These insights may include fashion trend signals, product demand patterns, scan-volume trends, category interest data, style-preference trends, geography-level demand signals at city-level or broader aggregation, retailer performance insights, product-match analytics, conversion analytics, anonymized market research, and aggregated commercial intelligence.</w:t>
+      </w:r>
+    </w:p>
+    <w:p>
+      <w:r>
+        <w:t>Where required by law, K Scan will provide required notices, consent mechanisms, opt-out rights, and legally required controls. You may contact kscanai.app@gmail.com for opt-out or privacy requests. You may also use any legally required privacy-control mechanism we make available, including https://kscan.app/do-not-sell-or-share where applicable.</w:t>
+      </w:r>
+    </w:p>
+    <w:p>
+      <w:pPr>
+        <w:pStyle w:val="Heading1"/>
+      </w:pPr>
+      <w:r>
+        <w:t>12. Data Retention</w:t>
+      </w:r>
+    </w:p>
+    <w:p>
+      <w:r>
+        <w:t>We retain information only as long as reasonably necessary for the purposes described in this Policy, unless a longer period is required or permitted by law.</w:t>
       </w:r>
     </w:p>
     <w:p>
       <w:pPr>
         <w:pStyle w:val="ListBullet"/>
-      </w:pPr>
-      <w:r>
-        <w:t>Provide, operate, maintain, secure, and improve the Service</w:t>
+        <w:spacing w:after="40" w:line="247" w:lineRule="auto"/>
+      </w:pPr>
+      <w:r>
+        <w:t>Account and contact data: retained for the duration of the relationship and for a reasonable period afterward as needed for account support, legal compliance, security, fraud prevention, dispute resolution, or legitimate business records.</w:t>
       </w:r>
     </w:p>
     <w:p>
       <w:pPr>
         <w:pStyle w:val="ListBullet"/>
-      </w:pPr>
-      <w:r>
-        <w:t>Process scans and generate fashion-related, commerce-related, or visual results</w:t>
+        <w:spacing w:after="40" w:line="247" w:lineRule="auto"/>
+      </w:pPr>
+      <w:r>
+        <w:t>Support and communications data: retained as long as reasonably necessary to resolve the issue, maintain business records, protect the Service, or comply with law.</w:t>
       </w:r>
     </w:p>
     <w:p>
       <w:pPr>
         <w:pStyle w:val="ListBullet"/>
-      </w:pPr>
-      <w:r>
-        <w:t>Personalize product results, recommendations, content, and user experience</w:t>
+        <w:spacing w:after="40" w:line="247" w:lineRule="auto"/>
+      </w:pPr>
+      <w:r>
+        <w:t>Usage, analytics, attribution, diagnostics, and marketing data: retained as long as reasonably necessary for analytics, product improvement, attribution, legal compliance, business reporting, troubleshooting, security, or fraud prevention, unless retained in aggregated, anonymized, or de-identified form.</w:t>
       </w:r>
     </w:p>
     <w:p>
       <w:pPr>
         <w:pStyle w:val="ListBullet"/>
-      </w:pPr>
-      <w:r>
-        <w:t>Send welcome emails, beta testing invitations, product updates, service notifications, and marketing communications</w:t>
+        <w:spacing w:after="40" w:line="247" w:lineRule="auto"/>
+      </w:pPr>
+      <w:r>
+        <w:t>Submitted visual data and AI request data: retained as long as reasonably necessary to provide the requested feature, operate the Service, maintain security, troubleshoot issues, improve quality where permitted, prevent abuse or fraud, comply with law, and support legitimate operational needs.</w:t>
       </w:r>
     </w:p>
     <w:p>
       <w:pPr>
         <w:pStyle w:val="ListBullet"/>
-      </w:pPr>
-      <w:r>
-        <w:t>Measure advertising, affiliate attribution, campaign performance, and product engagement</w:t>
+        <w:spacing w:after="40" w:line="247" w:lineRule="auto"/>
+      </w:pPr>
+      <w:r>
+        <w:t>Library, Dressing Room, saved-item, style-board, and user-uploaded inspiration media: retained while your account is active, while the item remains saved, or until you delete the item or your account, unless retention is required or permitted for security, fraud prevention, troubleshooting, support, quality improvement, backup integrity, legal compliance, or another purpose described in this Policy.</w:t>
       </w:r>
     </w:p>
     <w:p>
       <w:pPr>
         <w:pStyle w:val="ListBullet"/>
-      </w:pPr>
-      <w:r>
-        <w:t>Analyze usage trends, improve AI systems, detect fraud, prevent misuse, and enforce legal terms</w:t>
+        <w:spacing w:after="40" w:line="247" w:lineRule="auto"/>
+      </w:pPr>
+      <w:r>
+        <w:t>StyleChat messages, prompts, and related context: retained as needed to operate the feature, maintain chat/session functionality where applicable, troubleshoot issues, maintain security, prevent abuse, improve quality where permitted, comply with law, or support user-requested account deletion and privacy requests.</w:t>
       </w:r>
     </w:p>
     <w:p>
       <w:pPr>
         <w:pStyle w:val="ListBullet"/>
-      </w:pPr>
-      <w:r>
-        <w:t xml:space="preserve">Develop, commercialize, sell, share, license, or disclose certain categories of non-sensitive information </w:t>
-      </w:r>
-      <w:proofErr w:type="gramStart"/>
-      <w:r>
-        <w:t>where</w:t>
-      </w:r>
-      <w:proofErr w:type="gramEnd"/>
-      <w:r>
-        <w:t xml:space="preserve"> permitted by law and subject to user rights and choices</w:t>
+        <w:spacing w:after="40" w:line="247" w:lineRule="auto"/>
+      </w:pPr>
+      <w:r>
+        <w:t>Saved items, scan history, style boards, Dressing Room content, messages, and user preferences: retained while your account is active or until you delete them, unless retention is required or permitted by law.</w:t>
+      </w:r>
+    </w:p>
+    <w:p>
+      <w:pPr>
+        <w:pStyle w:val="ListBullet"/>
+        <w:spacing w:after="40" w:line="247" w:lineRule="auto"/>
+      </w:pPr>
+      <w:r>
+        <w:t>Aggregated, anonymized, or de-identified data: may be retained indefinitely for research, analytics, commercial insights, product improvement, trend analysis, business reporting, retailer insights, partner analytics, and demand-intelligence products, provided it cannot reasonably identify you.</w:t>
+      </w:r>
+    </w:p>
+    <w:p>
+      <w:r>
+        <w:t>Although active application systems are generally processed for deletion within 30 days of a verified deletion request, residual copies may remain in encrypted or access-controlled backups for a limited additional period, such as up to 90 days, before expiring through normal backup lifecycle processes, unless a longer period is required or permitted by law.</w:t>
       </w:r>
     </w:p>
     <w:p>
@@ -519,15 +896,311 @@
         <w:pStyle w:val="Heading1"/>
       </w:pPr>
       <w:r>
-        <w:rPr>
-          <w:color w:val="15131A"/>
-        </w:rPr>
-        <w:t>4. Sale, Sharing, Licensing, and Commercial Use of Data</w:t>
-      </w:r>
-    </w:p>
-    <w:p>
-      <w:r>
-        <w:t>Where permitted by law, K Scan may sell, share, license, disclose, or otherwise make available certain categories of personal information and non-personal data to advertising, analytics, retail, affiliate, commerce, business development, and marketing partners for commercial purposes, including measurement, personalization, advertising, affiliate attribution, product improvement, market insights, and partner reporting.</w:t>
+        <w:t>13. Account Deletion and Privacy Requests</w:t>
+      </w:r>
+    </w:p>
+    <w:p>
+      <w:r>
+        <w:t>If you create an account, you may request deletion of your K Scan account and associated personal information. Where available, you may initiate account deletion through the app at Settings &gt; Account &gt; Delete Account. You may also contact kscanai.app@gmail.com for deletion assistance or privacy requests.</w:t>
+      </w:r>
+    </w:p>
+    <w:p>
+      <w:r>
+        <w:t>Deletion requests are generally processed within 30 days after verification, subject to legal, security, fraud-prevention, dispute-resolution, backup, and technical limitations. K Scan does not claim that deletion is immediate, fully automated, or exhaustive across all downstream systems at the moment a request is submitted.</w:t>
+      </w:r>
+    </w:p>
+    <w:p>
+      <w:r>
+        <w:t>When we process a deletion request, we will delete or de-identify account data and associated personal information where required and reasonably feasible, and we will request relevant service providers to take corresponding action where required by law or applicable agreements. Some information may be retained where legally permitted or technically necessary for security, fraud prevention, legal compliance, dispute resolution, tax, accounting, safety, backup integrity, or other legitimate operational purposes.</w:t>
+      </w:r>
+    </w:p>
+    <w:p>
+      <w:r>
+        <w:t>Aggregated, anonymized, or de-identified data that cannot reasonably be linked back to you may be retained.</w:t>
+      </w:r>
+    </w:p>
+    <w:p>
+      <w:pPr>
+        <w:pStyle w:val="Heading1"/>
+      </w:pPr>
+      <w:r>
+        <w:lastRenderedPageBreak/>
+        <w:t>14. Your Privacy Choices and Controls</w:t>
+      </w:r>
+    </w:p>
+    <w:p>
+      <w:r>
+        <w:t>Depending on your location, you may request access, correction, deletion, portability, restriction, objection, or withdrawal of consent for certain personal information. You may also opt out of marketing emails, manage app permissions through your device settings, limit media access, limit camera access, and use legally required privacy-control mechanisms where available.</w:t>
+      </w:r>
+    </w:p>
+    <w:p>
+      <w:r>
+        <w:t>You may contact us at kscanai.app@gmail.com for privacy requests or questions. We may need to verify your identity before completing certain requests.</w:t>
+      </w:r>
+    </w:p>
+    <w:p>
+      <w:pPr>
+        <w:pStyle w:val="Heading1"/>
+      </w:pPr>
+      <w:r>
+        <w:t>15. California and U.S. State Privacy Rights</w:t>
+      </w:r>
+    </w:p>
+    <w:p>
+      <w:r>
+        <w:t>California residents and residents of other U.S. states with privacy laws may have rights to know, access, delete, correct, obtain a copy of, opt out of sale or sharing, opt out of targeted advertising, limit certain uses of sensitive personal information, and avoid discrimination for exercising privacy rights, subject to legal exceptions.</w:t>
+      </w:r>
+    </w:p>
+    <w:p>
+      <w:r>
+        <w:t>K Scan may use, disclose, share, license, sell, or commercialize certain categories of commercial data, preference data, attribution data, analytics data, derived scan signals, and aggregated or de-identified demand intelligence where permitted by law. K Scan will provide required notices, opt-out rights, consent mechanisms, and other legally required controls for activities that constitute sale, sharing, targeted advertising, or similar regulated processing.</w:t>
+      </w:r>
+    </w:p>
+    <w:p>
+      <w:r>
+        <w:t>Where required, you may opt out by using the in-app privacy settings, using any legally required privacy-control mechanism we make available, visiting https://kscan.app/do-not-sell-or-share, or contacting kscanai.app@gmail.com. K Scan honors Global Privacy Control signals where required by applicable law.</w:t>
+      </w:r>
+    </w:p>
+    <w:p>
+      <w:pPr>
+        <w:pStyle w:val="Heading1"/>
+      </w:pPr>
+      <w:r>
+        <w:t>16. GDPR / UK GDPR Rights and Legal Bases</w:t>
+      </w:r>
+    </w:p>
+    <w:p>
+      <w:r>
+        <w:t>If you are located in the European Economic Area, United Kingdom, or another jurisdiction with similar rights, you may have the right to access, correct, delete, restrict, object to processing, request portability, withdraw consent, and lodge a complaint with a supervisory authority.</w:t>
+      </w:r>
+    </w:p>
+    <w:p>
+      <w:r>
+        <w:t>Possible legal bases include contract performance for core service delivery, consent where required for optional analytics, marketing, tracking, cookies, or targeted advertising, legitimate interests for security, fraud prevention, diagnostics, service improvement, account support, style assistance, commerce routing, and limited affiliate attribution where lawful, and legal obligations for compliance and lawful requests.</w:t>
+      </w:r>
+    </w:p>
+    <w:p>
+      <w:r>
+        <w:t>Where consent is required, it will be requested separately from acceptance of Terms, presented in a reasonably granular manner, and may be withdrawn at any time. Withdrawal does not affect processing already completed lawfully before withdrawal, but it may reduce optional personalized, marketing, or partner-supported features.</w:t>
+      </w:r>
+    </w:p>
+    <w:p>
+      <w:pPr>
+        <w:pStyle w:val="Heading1"/>
+      </w:pPr>
+      <w:r>
+        <w:t>17. International Data Transfers</w:t>
+      </w:r>
+    </w:p>
+    <w:p>
+      <w:r>
+        <w:t>Your information may be processed in the United States and other countries. Where required, we use appropriate safeguards such as Standard Contractual Clauses approved by the European Commission, the UK International Data Transfer Addendum, or other lawful transfer mechanisms.</w:t>
+      </w:r>
+    </w:p>
+    <w:p>
+      <w:pPr>
+        <w:pStyle w:val="Heading1"/>
+      </w:pPr>
+      <w:r>
+        <w:t>18. Security</w:t>
+      </w:r>
+    </w:p>
+    <w:p>
+      <w:r>
+        <w:t>We implement reasonable administrative, technical, and organizational safeguards designed to protect information, including encryption in transit where appropriate, access controls, secure infrastructure, private storage where appropriate, data minimization, retention controls, and operational security practices.</w:t>
+      </w:r>
+    </w:p>
+    <w:p>
+      <w:r>
+        <w:t>No system can be guaranteed completely secure. K Scan does not use absolute-security marketing descriptions unless a future system architecture is verified and disclosed.</w:t>
+      </w:r>
+    </w:p>
+    <w:p>
+      <w:pPr>
+        <w:pStyle w:val="Heading1"/>
+      </w:pPr>
+      <w:r>
+        <w:t>19. Children’s Privacy and Minor Safety</w:t>
+      </w:r>
+    </w:p>
+    <w:p>
+      <w:r>
+        <w:t>K Scan AI is intended for users 18 years of age and older. The Service is not directed to children or minors, and users under 18 should not use the Service.</w:t>
+      </w:r>
+    </w:p>
+    <w:p>
+      <w:r>
+        <w:t>We do not knowingly collect personal information from children or minors. If we learn that we collected information from a person under 18, we will take reasonable steps to delete or restrict that information, subject to legal, safety, security, fraud-prevention, backup, and technical requirements.</w:t>
+      </w:r>
+    </w:p>
+    <w:p>
+      <w:pPr>
+        <w:pStyle w:val="Heading1"/>
+      </w:pPr>
+      <w:r>
+        <w:lastRenderedPageBreak/>
+        <w:t>20. Third-Party Links, Retailers, and Marketplaces</w:t>
+      </w:r>
+    </w:p>
+    <w:p>
+      <w:r>
+        <w:t>The Service may link to third-party retailers, marketplaces, websites, platforms, affiliate partners, product-search providers, or services. K Scan is not responsible for third-party privacy practices, content, security, pricing, product availability, shipping, returns, payment processing, or policies.</w:t>
+      </w:r>
+    </w:p>
+    <w:p>
+      <w:r>
+        <w:t>When you leave K Scan and visit a retailer, marketplace, or third-party website or app, that third party’s privacy policy and terms apply.</w:t>
+      </w:r>
+    </w:p>
+    <w:p>
+      <w:pPr>
+        <w:pStyle w:val="Heading1"/>
+      </w:pPr>
+      <w:r>
+        <w:t>21. Payments and Paid Features</w:t>
+      </w:r>
+    </w:p>
+    <w:p>
+      <w:r>
+        <w:t>In the current release posture, purchase-related calls to action are intended to route users to third-party retailer, marketplace, or product pages. K Scan does not complete checkout, process payment cards, or act as the merchant of record for third-party physical goods purchases unless separately disclosed.</w:t>
+      </w:r>
+    </w:p>
+    <w:p>
+      <w:r>
+        <w:t>If K Scan introduces paid digital features, subscriptions, premium AI features, scan quotas, or account upgrades in the iOS app or Android app, those features will be offered in accordance with applicable Apple, Google Play, and payment-provider rules.</w:t>
+      </w:r>
+    </w:p>
+    <w:p>
+      <w:r>
+        <w:t>Retailer links for physical goods may route users to third-party retailer websites or apps. K Scan does not process payment card data for purchases completed directly with third-party retailers.</w:t>
+      </w:r>
+    </w:p>
+    <w:p>
+      <w:pPr>
+        <w:pStyle w:val="Heading1"/>
+      </w:pPr>
+      <w:r>
+        <w:t>22. Cookies and Website Technologies</w:t>
+      </w:r>
+    </w:p>
+    <w:p>
+      <w:r>
+        <w:t>K Scan may use cookies, pixels, SDKs, local storage, analytics tools, and similar technologies on its website to operate the site, understand usage, maintain security, prevent fraud, measure performance, improve content, and support marketing where permitted.</w:t>
+      </w:r>
+    </w:p>
+    <w:p>
+      <w:r>
+        <w:t>Where required by law, non-essential analytics, advertising, and marketing cookies or SDKs are used only after valid consent. You may manage cookies through browser controls and legally required consent tools where available.</w:t>
+      </w:r>
+    </w:p>
+    <w:p>
+      <w:r>
+        <w:t>We currently do not respond to traditional Do Not Track browser signals. Where required by applicable law, we honor Global Privacy Control signals as opt-out requests for sale or sharing.</w:t>
+      </w:r>
+    </w:p>
+    <w:p>
+      <w:pPr>
+        <w:pStyle w:val="Heading1"/>
+      </w:pPr>
+      <w:r>
+        <w:t>23. Data Breach and Security Incident Notice</w:t>
+      </w:r>
+    </w:p>
+    <w:p>
+      <w:r>
+        <w:t>If K Scan becomes aware of a security incident involving personal information, we will investigate and take appropriate steps based on the nature of the incident. Where required by applicable law, we will notify affected users, regulators, or other parties within legally required timeframes.</w:t>
+      </w:r>
+    </w:p>
+    <w:p>
+      <w:pPr>
+        <w:pStyle w:val="Heading1"/>
+      </w:pPr>
+      <w:r>
+        <w:t>24. Platform Privacy Disclosures</w:t>
+      </w:r>
+    </w:p>
+    <w:p>
+      <w:r>
+        <w:t>K Scan will make required platform privacy disclosures for the applicable app version in Google Play Console and App Store Connect. These disclosures may include categories such as contact information, identifiers, user content, uploaded photos or videos, StyleChat messages, search history, app activity, product interactions, diagnostics, approximate location derived from technical data, and other data depending on the final app build and provider configuration.</w:t>
+      </w:r>
+    </w:p>
+    <w:p>
+      <w:r>
+        <w:t>Platform labels and Data Safety answers should be kept accurate and up to date. If the SDK mix, AI provider routing, data flows, account deletion flow, advertising/tracking posture, or permissions change, K Scan will update this Policy and the relevant platform disclosures.</w:t>
+      </w:r>
+    </w:p>
+    <w:p>
+      <w:pPr>
+        <w:pStyle w:val="Heading1"/>
+      </w:pPr>
+      <w:r>
+        <w:t>25. Legal, Compliance, and Policy Review</w:t>
+      </w:r>
+    </w:p>
+    <w:p>
+      <w:r>
+        <w:t>This Privacy Policy is provided for transparency about K Scan’s privacy practices. It may be updated as the Service, data flows, platform requirements, provider configurations, and applicable laws change. If you have questions, contact kscanai.app@gmail.com.</w:t>
+      </w:r>
+    </w:p>
+    <w:p>
+      <w:pPr>
+        <w:pStyle w:val="Heading1"/>
+      </w:pPr>
+      <w:r>
+        <w:t>26. Changes to This Policy</w:t>
+      </w:r>
+    </w:p>
+    <w:p>
+      <w:r>
+        <w:t>We may update this Privacy Policy from time to time. For material changes that expand how personal information may be used, disclosed, shared, or processed, we will provide additional notice where required and obtain consent or other authorization when applicable. We will update the Last Updated date above when changes are made.</w:t>
+      </w:r>
+    </w:p>
+    <w:p>
+      <w:pPr>
+        <w:pStyle w:val="Heading1"/>
+      </w:pPr>
+      <w:r>
+        <w:t>27. Contact Us</w:t>
+      </w:r>
+    </w:p>
+    <w:p>
+      <w:r>
+        <w:t>K Scan AI</w:t>
+      </w:r>
+    </w:p>
+    <w:p>
+      <w:r>
+        <w:lastRenderedPageBreak/>
+        <w:t>Email: kscanai.app@gmail.com</w:t>
+      </w:r>
+    </w:p>
+    <w:p>
+      <w:r>
+        <w:t>Website: https://kscan.app</w:t>
+      </w:r>
+    </w:p>
+    <w:p>
+      <w:r>
+        <w:t>Privacy-first fashion discovery.</w:t>
+      </w:r>
+    </w:p>
+    <w:p>
+      <w:r>
+        <w:br w:type="page"/>
+      </w:r>
+    </w:p>
+    <w:p>
+      <w:pPr>
+        <w:pStyle w:val="Heading1"/>
+      </w:pPr>
+      <w:r>
+        <w:lastRenderedPageBreak/>
+        <w:t>Appendix A — Public Data Category Summary</w:t>
+      </w:r>
+    </w:p>
+    <w:p>
+      <w:r>
+        <w:t>This summary is provided to help users understand the categories of data the current Service may collect or process. The precise categories depend on the feature used, user choices, app permissions, app version, and provider configuration.</w:t>
       </w:r>
     </w:p>
     <w:tbl>
@@ -538,97 +1211,59 @@
         <w:tblLook w:val="04A0" w:firstRow="1" w:lastRow="0" w:firstColumn="1" w:lastColumn="0" w:noHBand="0" w:noVBand="1"/>
       </w:tblPr>
       <w:tblGrid>
-        <w:gridCol w:w="2520"/>
-        <w:gridCol w:w="2880"/>
-        <w:gridCol w:w="4536"/>
+        <w:gridCol w:w="1800"/>
+        <w:gridCol w:w="4896"/>
+        <w:gridCol w:w="3744"/>
       </w:tblGrid>
       <w:tr>
         <w:trPr>
-          <w:tblHeader/>
           <w:jc w:val="center"/>
         </w:trPr>
         <w:tc>
           <w:tcPr>
-            <w:tcW w:w="2520" w:type="dxa"/>
-            <w:tcBorders>
-              <w:top w:val="single" w:sz="8" w:space="0" w:color="5B3FD6"/>
-              <w:left w:val="single" w:sz="8" w:space="0" w:color="5B3FD6"/>
-              <w:bottom w:val="single" w:sz="8" w:space="0" w:color="5B3FD6"/>
-              <w:right w:val="single" w:sz="8" w:space="0" w:color="5B3FD6"/>
-            </w:tcBorders>
-            <w:shd w:val="clear" w:color="auto" w:fill="5B3FD6"/>
-            <w:tcMar>
-              <w:top w:w="90" w:type="dxa"/>
-              <w:left w:w="90" w:type="dxa"/>
-              <w:bottom w:w="90" w:type="dxa"/>
-              <w:right w:w="90" w:type="dxa"/>
-            </w:tcMar>
+            <w:tcW w:w="1800" w:type="dxa"/>
+            <w:shd w:val="clear" w:color="auto" w:fill="E5E7EB"/>
+            <w:vAlign w:val="center"/>
           </w:tcPr>
           <w:p>
             <w:r>
               <w:rPr>
                 <w:b/>
-                <w:color w:val="FFFFFF"/>
-                <w:sz w:val="19"/>
+                <w:sz w:val="17"/>
               </w:rPr>
-              <w:lastRenderedPageBreak/>
               <w:t>Category</w:t>
             </w:r>
           </w:p>
         </w:tc>
         <w:tc>
           <w:tcPr>
-            <w:tcW w:w="2880" w:type="dxa"/>
-            <w:tcBorders>
-              <w:top w:val="single" w:sz="8" w:space="0" w:color="5B3FD6"/>
-              <w:left w:val="single" w:sz="8" w:space="0" w:color="5B3FD6"/>
-              <w:bottom w:val="single" w:sz="8" w:space="0" w:color="5B3FD6"/>
-              <w:right w:val="single" w:sz="8" w:space="0" w:color="5B3FD6"/>
-            </w:tcBorders>
-            <w:shd w:val="clear" w:color="auto" w:fill="5B3FD6"/>
-            <w:tcMar>
-              <w:top w:w="90" w:type="dxa"/>
-              <w:left w:w="90" w:type="dxa"/>
-              <w:bottom w:w="90" w:type="dxa"/>
-              <w:right w:w="90" w:type="dxa"/>
-            </w:tcMar>
+            <w:tcW w:w="4896" w:type="dxa"/>
+            <w:shd w:val="clear" w:color="auto" w:fill="E5E7EB"/>
+            <w:vAlign w:val="center"/>
           </w:tcPr>
           <w:p>
             <w:r>
               <w:rPr>
                 <w:b/>
-                <w:color w:val="FFFFFF"/>
-                <w:sz w:val="19"/>
+                <w:sz w:val="17"/>
               </w:rPr>
-              <w:t>May Be Sold / Shared / Licensed?</w:t>
+              <w:t>Examples</w:t>
             </w:r>
           </w:p>
         </w:tc>
         <w:tc>
           <w:tcPr>
-            <w:tcW w:w="4536" w:type="dxa"/>
-            <w:tcBorders>
-              <w:top w:val="single" w:sz="8" w:space="0" w:color="5B3FD6"/>
-              <w:left w:val="single" w:sz="8" w:space="0" w:color="5B3FD6"/>
-              <w:bottom w:val="single" w:sz="8" w:space="0" w:color="5B3FD6"/>
-              <w:right w:val="single" w:sz="8" w:space="0" w:color="5B3FD6"/>
-            </w:tcBorders>
-            <w:shd w:val="clear" w:color="auto" w:fill="5B3FD6"/>
-            <w:tcMar>
-              <w:top w:w="90" w:type="dxa"/>
-              <w:left w:w="90" w:type="dxa"/>
-              <w:bottom w:w="90" w:type="dxa"/>
-              <w:right w:w="90" w:type="dxa"/>
-            </w:tcMar>
+            <w:tcW w:w="3744" w:type="dxa"/>
+            <w:shd w:val="clear" w:color="auto" w:fill="E5E7EB"/>
+            <w:vAlign w:val="center"/>
           </w:tcPr>
           <w:p>
             <w:r>
               <w:rPr>
                 <w:b/>
-                <w:color w:val="FFFFFF"/>
-                <w:sz w:val="19"/>
+                <w:sz w:val="17"/>
               </w:rPr>
-              <w:t>Examples</w:t>
+              <w:t>Primary Purposes</w:t>
             </w:r>
           </w:p>
         </w:tc>
@@ -639,89 +1274,40 @@
         </w:trPr>
         <w:tc>
           <w:tcPr>
-            <w:tcW w:w="2520" w:type="dxa"/>
-            <w:tcBorders>
-              <w:top w:val="single" w:sz="4" w:space="0" w:color="D9D0F4"/>
-              <w:left w:val="single" w:sz="4" w:space="0" w:color="D9D0F4"/>
-              <w:bottom w:val="single" w:sz="4" w:space="0" w:color="D9D0F4"/>
-              <w:right w:val="single" w:sz="4" w:space="0" w:color="D9D0F4"/>
-            </w:tcBorders>
-            <w:shd w:val="clear" w:color="auto" w:fill="FFFFFF"/>
-            <w:tcMar>
-              <w:top w:w="80" w:type="dxa"/>
-              <w:left w:w="80" w:type="dxa"/>
-              <w:bottom w:w="80" w:type="dxa"/>
-              <w:right w:w="80" w:type="dxa"/>
-            </w:tcMar>
+            <w:tcW w:w="1800" w:type="dxa"/>
           </w:tcPr>
           <w:p>
-            <w:pPr>
-              <w:spacing w:after="0"/>
-            </w:pPr>
             <w:r>
               <w:rPr>
-                <w:b/>
-                <w:sz w:val="17"/>
+                <w:sz w:val="16"/>
               </w:rPr>
-              <w:t>Identifiers</w:t>
+              <w:t>Contact Info</w:t>
             </w:r>
           </w:p>
         </w:tc>
         <w:tc>
           <w:tcPr>
-            <w:tcW w:w="2880" w:type="dxa"/>
-            <w:tcBorders>
-              <w:top w:val="single" w:sz="4" w:space="0" w:color="D9D0F4"/>
-              <w:left w:val="single" w:sz="4" w:space="0" w:color="D9D0F4"/>
-              <w:bottom w:val="single" w:sz="4" w:space="0" w:color="D9D0F4"/>
-              <w:right w:val="single" w:sz="4" w:space="0" w:color="D9D0F4"/>
-            </w:tcBorders>
-            <w:shd w:val="clear" w:color="auto" w:fill="FFFFFF"/>
-            <w:tcMar>
-              <w:top w:w="80" w:type="dxa"/>
-              <w:left w:w="80" w:type="dxa"/>
-              <w:bottom w:w="80" w:type="dxa"/>
-              <w:right w:w="80" w:type="dxa"/>
-            </w:tcMar>
+            <w:tcW w:w="4896" w:type="dxa"/>
           </w:tcPr>
           <w:p>
-            <w:pPr>
-              <w:spacing w:after="0"/>
-            </w:pPr>
             <w:r>
               <w:rPr>
-                <w:sz w:val="17"/>
+                <w:sz w:val="16"/>
               </w:rPr>
-              <w:t>Yes, where permitted and subject to rights</w:t>
+              <w:t>Email address, name if provided, support contact details</w:t>
             </w:r>
           </w:p>
         </w:tc>
         <w:tc>
           <w:tcPr>
-            <w:tcW w:w="4536" w:type="dxa"/>
-            <w:tcBorders>
-              <w:top w:val="single" w:sz="4" w:space="0" w:color="D9D0F4"/>
-              <w:left w:val="single" w:sz="4" w:space="0" w:color="D9D0F4"/>
-              <w:bottom w:val="single" w:sz="4" w:space="0" w:color="D9D0F4"/>
-              <w:right w:val="single" w:sz="4" w:space="0" w:color="D9D0F4"/>
-            </w:tcBorders>
-            <w:shd w:val="clear" w:color="auto" w:fill="FFFFFF"/>
-            <w:tcMar>
-              <w:top w:w="80" w:type="dxa"/>
-              <w:left w:w="80" w:type="dxa"/>
-              <w:bottom w:w="80" w:type="dxa"/>
-              <w:right w:w="80" w:type="dxa"/>
-            </w:tcMar>
+            <w:tcW w:w="3744" w:type="dxa"/>
           </w:tcPr>
           <w:p>
-            <w:pPr>
-              <w:spacing w:after="0"/>
-            </w:pPr>
             <w:r>
               <w:rPr>
-                <w:sz w:val="17"/>
+                <w:sz w:val="16"/>
               </w:rPr>
-              <w:t>Email address, account identifier, device identifiers, hashed identifiers</w:t>
+              <w:t>Account creation, authentication, support, beta access, notices, privacy requests</w:t>
             </w:r>
           </w:p>
         </w:tc>
@@ -732,89 +1318,40 @@
         </w:trPr>
         <w:tc>
           <w:tcPr>
-            <w:tcW w:w="2520" w:type="dxa"/>
-            <w:tcBorders>
-              <w:top w:val="single" w:sz="4" w:space="0" w:color="D9D0F4"/>
-              <w:left w:val="single" w:sz="4" w:space="0" w:color="D9D0F4"/>
-              <w:bottom w:val="single" w:sz="4" w:space="0" w:color="D9D0F4"/>
-              <w:right w:val="single" w:sz="4" w:space="0" w:color="D9D0F4"/>
-            </w:tcBorders>
-            <w:shd w:val="clear" w:color="auto" w:fill="F8F6FC"/>
-            <w:tcMar>
-              <w:top w:w="80" w:type="dxa"/>
-              <w:left w:w="80" w:type="dxa"/>
-              <w:bottom w:w="80" w:type="dxa"/>
-              <w:right w:w="80" w:type="dxa"/>
-            </w:tcMar>
+            <w:tcW w:w="1800" w:type="dxa"/>
           </w:tcPr>
           <w:p>
-            <w:pPr>
-              <w:spacing w:after="0"/>
-            </w:pPr>
             <w:r>
               <w:rPr>
-                <w:b/>
-                <w:sz w:val="17"/>
+                <w:sz w:val="16"/>
               </w:rPr>
-              <w:t>Internet or network activity</w:t>
+              <w:t>Identifiers</w:t>
             </w:r>
           </w:p>
         </w:tc>
         <w:tc>
           <w:tcPr>
-            <w:tcW w:w="2880" w:type="dxa"/>
-            <w:tcBorders>
-              <w:top w:val="single" w:sz="4" w:space="0" w:color="D9D0F4"/>
-              <w:left w:val="single" w:sz="4" w:space="0" w:color="D9D0F4"/>
-              <w:bottom w:val="single" w:sz="4" w:space="0" w:color="D9D0F4"/>
-              <w:right w:val="single" w:sz="4" w:space="0" w:color="D9D0F4"/>
-            </w:tcBorders>
-            <w:shd w:val="clear" w:color="auto" w:fill="F8F6FC"/>
-            <w:tcMar>
-              <w:top w:w="80" w:type="dxa"/>
-              <w:left w:w="80" w:type="dxa"/>
-              <w:bottom w:w="80" w:type="dxa"/>
-              <w:right w:w="80" w:type="dxa"/>
-            </w:tcMar>
+            <w:tcW w:w="4896" w:type="dxa"/>
           </w:tcPr>
           <w:p>
-            <w:pPr>
-              <w:spacing w:after="0"/>
-            </w:pPr>
             <w:r>
               <w:rPr>
-                <w:sz w:val="17"/>
+                <w:sz w:val="16"/>
               </w:rPr>
-              <w:t>Yes</w:t>
+              <w:t>User ID, account ID, authentication identifiers, device-level identifiers where used</w:t>
             </w:r>
           </w:p>
         </w:tc>
         <w:tc>
           <w:tcPr>
-            <w:tcW w:w="4536" w:type="dxa"/>
-            <w:tcBorders>
-              <w:top w:val="single" w:sz="4" w:space="0" w:color="D9D0F4"/>
-              <w:left w:val="single" w:sz="4" w:space="0" w:color="D9D0F4"/>
-              <w:bottom w:val="single" w:sz="4" w:space="0" w:color="D9D0F4"/>
-              <w:right w:val="single" w:sz="4" w:space="0" w:color="D9D0F4"/>
-            </w:tcBorders>
-            <w:shd w:val="clear" w:color="auto" w:fill="F8F6FC"/>
-            <w:tcMar>
-              <w:top w:w="80" w:type="dxa"/>
-              <w:left w:w="80" w:type="dxa"/>
-              <w:bottom w:w="80" w:type="dxa"/>
-              <w:right w:w="80" w:type="dxa"/>
-            </w:tcMar>
+            <w:tcW w:w="3744" w:type="dxa"/>
           </w:tcPr>
           <w:p>
-            <w:pPr>
-              <w:spacing w:after="0"/>
-            </w:pPr>
             <w:r>
               <w:rPr>
-                <w:sz w:val="17"/>
+                <w:sz w:val="16"/>
               </w:rPr>
-              <w:t>App usage, clicks, pages viewed, session data</w:t>
+              <w:t>Authentication, security, account management, diagnostics, fraud prevention</w:t>
             </w:r>
           </w:p>
         </w:tc>
@@ -825,89 +1362,40 @@
         </w:trPr>
         <w:tc>
           <w:tcPr>
-            <w:tcW w:w="2520" w:type="dxa"/>
-            <w:tcBorders>
-              <w:top w:val="single" w:sz="4" w:space="0" w:color="D9D0F4"/>
-              <w:left w:val="single" w:sz="4" w:space="0" w:color="D9D0F4"/>
-              <w:bottom w:val="single" w:sz="4" w:space="0" w:color="D9D0F4"/>
-              <w:right w:val="single" w:sz="4" w:space="0" w:color="D9D0F4"/>
-            </w:tcBorders>
-            <w:shd w:val="clear" w:color="auto" w:fill="FFFFFF"/>
-            <w:tcMar>
-              <w:top w:w="80" w:type="dxa"/>
-              <w:left w:w="80" w:type="dxa"/>
-              <w:bottom w:w="80" w:type="dxa"/>
-              <w:right w:w="80" w:type="dxa"/>
-            </w:tcMar>
+            <w:tcW w:w="1800" w:type="dxa"/>
           </w:tcPr>
           <w:p>
-            <w:pPr>
-              <w:spacing w:after="0"/>
-            </w:pPr>
             <w:r>
               <w:rPr>
-                <w:b/>
-                <w:sz w:val="17"/>
+                <w:sz w:val="16"/>
               </w:rPr>
-              <w:t>Commercial and preference data</w:t>
+              <w:t>User Content</w:t>
             </w:r>
           </w:p>
         </w:tc>
         <w:tc>
           <w:tcPr>
-            <w:tcW w:w="2880" w:type="dxa"/>
-            <w:tcBorders>
-              <w:top w:val="single" w:sz="4" w:space="0" w:color="D9D0F4"/>
-              <w:left w:val="single" w:sz="4" w:space="0" w:color="D9D0F4"/>
-              <w:bottom w:val="single" w:sz="4" w:space="0" w:color="D9D0F4"/>
-              <w:right w:val="single" w:sz="4" w:space="0" w:color="D9D0F4"/>
-            </w:tcBorders>
-            <w:shd w:val="clear" w:color="auto" w:fill="FFFFFF"/>
-            <w:tcMar>
-              <w:top w:w="80" w:type="dxa"/>
-              <w:left w:w="80" w:type="dxa"/>
-              <w:bottom w:w="80" w:type="dxa"/>
-              <w:right w:w="80" w:type="dxa"/>
-            </w:tcMar>
+            <w:tcW w:w="4896" w:type="dxa"/>
           </w:tcPr>
           <w:p>
-            <w:pPr>
-              <w:spacing w:after="0"/>
-            </w:pPr>
             <w:r>
               <w:rPr>
-                <w:sz w:val="17"/>
+                <w:sz w:val="16"/>
               </w:rPr>
-              <w:t>Yes</w:t>
+              <w:t>Uploaded images, screenshots, scan content, StyleChat messages, notes, captions, Dressing Room content, shared-room content, support messages</w:t>
             </w:r>
           </w:p>
         </w:tc>
         <w:tc>
           <w:tcPr>
-            <w:tcW w:w="4536" w:type="dxa"/>
-            <w:tcBorders>
-              <w:top w:val="single" w:sz="4" w:space="0" w:color="D9D0F4"/>
-              <w:left w:val="single" w:sz="4" w:space="0" w:color="D9D0F4"/>
-              <w:bottom w:val="single" w:sz="4" w:space="0" w:color="D9D0F4"/>
-              <w:right w:val="single" w:sz="4" w:space="0" w:color="D9D0F4"/>
-            </w:tcBorders>
-            <w:shd w:val="clear" w:color="auto" w:fill="FFFFFF"/>
-            <w:tcMar>
-              <w:top w:w="80" w:type="dxa"/>
-              <w:left w:w="80" w:type="dxa"/>
-              <w:bottom w:w="80" w:type="dxa"/>
-              <w:right w:w="80" w:type="dxa"/>
-            </w:tcMar>
+            <w:tcW w:w="3744" w:type="dxa"/>
           </w:tcPr>
           <w:p>
-            <w:pPr>
-              <w:spacing w:after="0"/>
-            </w:pPr>
             <w:r>
               <w:rPr>
-                <w:sz w:val="17"/>
+                <w:sz w:val="16"/>
               </w:rPr>
-              <w:t>Saved items, product interactions, style preferences, shopping activity</w:t>
+              <w:t>Core app functionality, AI style assistance, storage, display, support, safety, troubleshooting</w:t>
             </w:r>
           </w:p>
         </w:tc>
@@ -918,89 +1406,40 @@
         </w:trPr>
         <w:tc>
           <w:tcPr>
-            <w:tcW w:w="2520" w:type="dxa"/>
-            <w:tcBorders>
-              <w:top w:val="single" w:sz="4" w:space="0" w:color="D9D0F4"/>
-              <w:left w:val="single" w:sz="4" w:space="0" w:color="D9D0F4"/>
-              <w:bottom w:val="single" w:sz="4" w:space="0" w:color="D9D0F4"/>
-              <w:right w:val="single" w:sz="4" w:space="0" w:color="D9D0F4"/>
-            </w:tcBorders>
-            <w:shd w:val="clear" w:color="auto" w:fill="F8F6FC"/>
-            <w:tcMar>
-              <w:top w:w="80" w:type="dxa"/>
-              <w:left w:w="80" w:type="dxa"/>
-              <w:bottom w:w="80" w:type="dxa"/>
-              <w:right w:w="80" w:type="dxa"/>
-            </w:tcMar>
+            <w:tcW w:w="1800" w:type="dxa"/>
           </w:tcPr>
           <w:p>
-            <w:pPr>
-              <w:spacing w:after="0"/>
-            </w:pPr>
             <w:r>
               <w:rPr>
-                <w:b/>
-                <w:sz w:val="17"/>
+                <w:sz w:val="16"/>
               </w:rPr>
-              <w:t>Inferences</w:t>
+              <w:t>Search History</w:t>
             </w:r>
           </w:p>
         </w:tc>
         <w:tc>
           <w:tcPr>
-            <w:tcW w:w="2880" w:type="dxa"/>
-            <w:tcBorders>
-              <w:top w:val="single" w:sz="4" w:space="0" w:color="D9D0F4"/>
-              <w:left w:val="single" w:sz="4" w:space="0" w:color="D9D0F4"/>
-              <w:bottom w:val="single" w:sz="4" w:space="0" w:color="D9D0F4"/>
-              <w:right w:val="single" w:sz="4" w:space="0" w:color="D9D0F4"/>
-            </w:tcBorders>
-            <w:shd w:val="clear" w:color="auto" w:fill="F8F6FC"/>
-            <w:tcMar>
-              <w:top w:w="80" w:type="dxa"/>
-              <w:left w:w="80" w:type="dxa"/>
-              <w:bottom w:w="80" w:type="dxa"/>
-              <w:right w:w="80" w:type="dxa"/>
-            </w:tcMar>
+            <w:tcW w:w="4896" w:type="dxa"/>
           </w:tcPr>
           <w:p>
-            <w:pPr>
-              <w:spacing w:after="0"/>
-            </w:pPr>
             <w:r>
               <w:rPr>
-                <w:sz w:val="17"/>
+                <w:sz w:val="16"/>
               </w:rPr>
-              <w:t>Yes</w:t>
+              <w:t>In-app searches, product lookup queries, scan-derived search terms</w:t>
             </w:r>
           </w:p>
         </w:tc>
         <w:tc>
           <w:tcPr>
-            <w:tcW w:w="4536" w:type="dxa"/>
-            <w:tcBorders>
-              <w:top w:val="single" w:sz="4" w:space="0" w:color="D9D0F4"/>
-              <w:left w:val="single" w:sz="4" w:space="0" w:color="D9D0F4"/>
-              <w:bottom w:val="single" w:sz="4" w:space="0" w:color="D9D0F4"/>
-              <w:right w:val="single" w:sz="4" w:space="0" w:color="D9D0F4"/>
-            </w:tcBorders>
-            <w:shd w:val="clear" w:color="auto" w:fill="F8F6FC"/>
-            <w:tcMar>
-              <w:top w:w="80" w:type="dxa"/>
-              <w:left w:w="80" w:type="dxa"/>
-              <w:bottom w:w="80" w:type="dxa"/>
-              <w:right w:w="80" w:type="dxa"/>
-            </w:tcMar>
+            <w:tcW w:w="3744" w:type="dxa"/>
           </w:tcPr>
           <w:p>
-            <w:pPr>
-              <w:spacing w:after="0"/>
-            </w:pPr>
             <w:r>
               <w:rPr>
-                <w:sz w:val="17"/>
+                <w:sz w:val="16"/>
               </w:rPr>
-              <w:t>Style interests, product affinity scores, category preferences</w:t>
+              <w:t>Search, product matching, retailer results, recommendations, analytics where permitted</w:t>
             </w:r>
           </w:p>
         </w:tc>
@@ -1011,89 +1450,40 @@
         </w:trPr>
         <w:tc>
           <w:tcPr>
-            <w:tcW w:w="2520" w:type="dxa"/>
-            <w:tcBorders>
-              <w:top w:val="single" w:sz="4" w:space="0" w:color="D9D0F4"/>
-              <w:left w:val="single" w:sz="4" w:space="0" w:color="D9D0F4"/>
-              <w:bottom w:val="single" w:sz="4" w:space="0" w:color="D9D0F4"/>
-              <w:right w:val="single" w:sz="4" w:space="0" w:color="D9D0F4"/>
-            </w:tcBorders>
-            <w:shd w:val="clear" w:color="auto" w:fill="FFFFFF"/>
-            <w:tcMar>
-              <w:top w:w="80" w:type="dxa"/>
-              <w:left w:w="80" w:type="dxa"/>
-              <w:bottom w:w="80" w:type="dxa"/>
-              <w:right w:w="80" w:type="dxa"/>
-            </w:tcMar>
+            <w:tcW w:w="1800" w:type="dxa"/>
           </w:tcPr>
           <w:p>
-            <w:pPr>
-              <w:spacing w:after="0"/>
-            </w:pPr>
             <w:r>
               <w:rPr>
-                <w:b/>
-                <w:sz w:val="17"/>
+                <w:sz w:val="16"/>
               </w:rPr>
-              <w:t>Approximate location</w:t>
+              <w:t>Usage Data</w:t>
             </w:r>
           </w:p>
         </w:tc>
         <w:tc>
           <w:tcPr>
-            <w:tcW w:w="2880" w:type="dxa"/>
-            <w:tcBorders>
-              <w:top w:val="single" w:sz="4" w:space="0" w:color="D9D0F4"/>
-              <w:left w:val="single" w:sz="4" w:space="0" w:color="D9D0F4"/>
-              <w:bottom w:val="single" w:sz="4" w:space="0" w:color="D9D0F4"/>
-              <w:right w:val="single" w:sz="4" w:space="0" w:color="D9D0F4"/>
-            </w:tcBorders>
-            <w:shd w:val="clear" w:color="auto" w:fill="FFFFFF"/>
-            <w:tcMar>
-              <w:top w:w="80" w:type="dxa"/>
-              <w:left w:w="80" w:type="dxa"/>
-              <w:bottom w:w="80" w:type="dxa"/>
-              <w:right w:w="80" w:type="dxa"/>
-            </w:tcMar>
+            <w:tcW w:w="4896" w:type="dxa"/>
           </w:tcPr>
           <w:p>
-            <w:pPr>
-              <w:spacing w:after="0"/>
-            </w:pPr>
             <w:r>
               <w:rPr>
-                <w:sz w:val="17"/>
+                <w:sz w:val="16"/>
               </w:rPr>
-              <w:t>Yes</w:t>
+              <w:t>App interactions, product interactions, saved items, outbound retailer clicks, feature usage</w:t>
             </w:r>
           </w:p>
         </w:tc>
         <w:tc>
           <w:tcPr>
-            <w:tcW w:w="4536" w:type="dxa"/>
-            <w:tcBorders>
-              <w:top w:val="single" w:sz="4" w:space="0" w:color="D9D0F4"/>
-              <w:left w:val="single" w:sz="4" w:space="0" w:color="D9D0F4"/>
-              <w:bottom w:val="single" w:sz="4" w:space="0" w:color="D9D0F4"/>
-              <w:right w:val="single" w:sz="4" w:space="0" w:color="D9D0F4"/>
-            </w:tcBorders>
-            <w:shd w:val="clear" w:color="auto" w:fill="FFFFFF"/>
-            <w:tcMar>
-              <w:top w:w="80" w:type="dxa"/>
-              <w:left w:w="80" w:type="dxa"/>
-              <w:bottom w:w="80" w:type="dxa"/>
-              <w:right w:w="80" w:type="dxa"/>
-            </w:tcMar>
+            <w:tcW w:w="3744" w:type="dxa"/>
           </w:tcPr>
           <w:p>
-            <w:pPr>
-              <w:spacing w:after="0"/>
-            </w:pPr>
             <w:r>
               <w:rPr>
-                <w:sz w:val="17"/>
+                <w:sz w:val="16"/>
               </w:rPr>
-              <w:t>Approximate location derived from IP address or device settings</w:t>
+              <w:t>App functionality, product improvement, attribution, analytics, personalization where permitted</w:t>
             </w:r>
           </w:p>
         </w:tc>
@@ -1104,89 +1494,40 @@
         </w:trPr>
         <w:tc>
           <w:tcPr>
-            <w:tcW w:w="2520" w:type="dxa"/>
-            <w:tcBorders>
-              <w:top w:val="single" w:sz="4" w:space="0" w:color="D9D0F4"/>
-              <w:left w:val="single" w:sz="4" w:space="0" w:color="D9D0F4"/>
-              <w:bottom w:val="single" w:sz="4" w:space="0" w:color="D9D0F4"/>
-              <w:right w:val="single" w:sz="4" w:space="0" w:color="D9D0F4"/>
-            </w:tcBorders>
-            <w:shd w:val="clear" w:color="auto" w:fill="F8F6FC"/>
-            <w:tcMar>
-              <w:top w:w="80" w:type="dxa"/>
-              <w:left w:w="80" w:type="dxa"/>
-              <w:bottom w:w="80" w:type="dxa"/>
-              <w:right w:w="80" w:type="dxa"/>
-            </w:tcMar>
+            <w:tcW w:w="1800" w:type="dxa"/>
           </w:tcPr>
           <w:p>
-            <w:pPr>
-              <w:spacing w:after="0"/>
-            </w:pPr>
             <w:r>
               <w:rPr>
-                <w:b/>
-                <w:sz w:val="17"/>
+                <w:sz w:val="16"/>
               </w:rPr>
-              <w:t>Marketing engagement data</w:t>
+              <w:t>Diagnostics</w:t>
             </w:r>
           </w:p>
         </w:tc>
         <w:tc>
           <w:tcPr>
-            <w:tcW w:w="2880" w:type="dxa"/>
-            <w:tcBorders>
-              <w:top w:val="single" w:sz="4" w:space="0" w:color="D9D0F4"/>
-              <w:left w:val="single" w:sz="4" w:space="0" w:color="D9D0F4"/>
-              <w:bottom w:val="single" w:sz="4" w:space="0" w:color="D9D0F4"/>
-              <w:right w:val="single" w:sz="4" w:space="0" w:color="D9D0F4"/>
-            </w:tcBorders>
-            <w:shd w:val="clear" w:color="auto" w:fill="F8F6FC"/>
-            <w:tcMar>
-              <w:top w:w="80" w:type="dxa"/>
-              <w:left w:w="80" w:type="dxa"/>
-              <w:bottom w:w="80" w:type="dxa"/>
-              <w:right w:w="80" w:type="dxa"/>
-            </w:tcMar>
+            <w:tcW w:w="4896" w:type="dxa"/>
           </w:tcPr>
           <w:p>
-            <w:pPr>
-              <w:spacing w:after="0"/>
-            </w:pPr>
             <w:r>
               <w:rPr>
-                <w:sz w:val="17"/>
+                <w:sz w:val="16"/>
               </w:rPr>
-              <w:t>Yes</w:t>
+              <w:t>Crash logs, performance logs, error logs, security logs</w:t>
             </w:r>
           </w:p>
         </w:tc>
         <w:tc>
           <w:tcPr>
-            <w:tcW w:w="4536" w:type="dxa"/>
-            <w:tcBorders>
-              <w:top w:val="single" w:sz="4" w:space="0" w:color="D9D0F4"/>
-              <w:left w:val="single" w:sz="4" w:space="0" w:color="D9D0F4"/>
-              <w:bottom w:val="single" w:sz="4" w:space="0" w:color="D9D0F4"/>
-              <w:right w:val="single" w:sz="4" w:space="0" w:color="D9D0F4"/>
-            </w:tcBorders>
-            <w:shd w:val="clear" w:color="auto" w:fill="F8F6FC"/>
-            <w:tcMar>
-              <w:top w:w="80" w:type="dxa"/>
-              <w:left w:w="80" w:type="dxa"/>
-              <w:bottom w:w="80" w:type="dxa"/>
-              <w:right w:w="80" w:type="dxa"/>
-            </w:tcMar>
+            <w:tcW w:w="3744" w:type="dxa"/>
           </w:tcPr>
           <w:p>
-            <w:pPr>
-              <w:spacing w:after="0"/>
-            </w:pPr>
             <w:r>
               <w:rPr>
-                <w:sz w:val="17"/>
+                <w:sz w:val="16"/>
               </w:rPr>
-              <w:t>Campaign clicks, referral source, email engagement</w:t>
+              <w:t>Troubleshooting, security, performance, quality improvement</w:t>
             </w:r>
           </w:p>
         </w:tc>
@@ -1197,89 +1538,40 @@
         </w:trPr>
         <w:tc>
           <w:tcPr>
-            <w:tcW w:w="2520" w:type="dxa"/>
-            <w:tcBorders>
-              <w:top w:val="single" w:sz="4" w:space="0" w:color="D9D0F4"/>
-              <w:left w:val="single" w:sz="4" w:space="0" w:color="D9D0F4"/>
-              <w:bottom w:val="single" w:sz="4" w:space="0" w:color="D9D0F4"/>
-              <w:right w:val="single" w:sz="4" w:space="0" w:color="D9D0F4"/>
-            </w:tcBorders>
-            <w:shd w:val="clear" w:color="auto" w:fill="FFFFFF"/>
-            <w:tcMar>
-              <w:top w:w="80" w:type="dxa"/>
-              <w:left w:w="80" w:type="dxa"/>
-              <w:bottom w:w="80" w:type="dxa"/>
-              <w:right w:w="80" w:type="dxa"/>
-            </w:tcMar>
+            <w:tcW w:w="1800" w:type="dxa"/>
           </w:tcPr>
           <w:p>
-            <w:pPr>
-              <w:spacing w:after="0"/>
-            </w:pPr>
             <w:r>
               <w:rPr>
-                <w:b/>
-                <w:sz w:val="17"/>
+                <w:sz w:val="16"/>
               </w:rPr>
-              <w:t>Raw uploaded scans/images</w:t>
+              <w:t>Approximate Location</w:t>
             </w:r>
           </w:p>
         </w:tc>
         <w:tc>
           <w:tcPr>
-            <w:tcW w:w="2880" w:type="dxa"/>
-            <w:tcBorders>
-              <w:top w:val="single" w:sz="4" w:space="0" w:color="D9D0F4"/>
-              <w:left w:val="single" w:sz="4" w:space="0" w:color="D9D0F4"/>
-              <w:bottom w:val="single" w:sz="4" w:space="0" w:color="D9D0F4"/>
-              <w:right w:val="single" w:sz="4" w:space="0" w:color="D9D0F4"/>
-            </w:tcBorders>
-            <w:shd w:val="clear" w:color="auto" w:fill="FFFFFF"/>
-            <w:tcMar>
-              <w:top w:w="80" w:type="dxa"/>
-              <w:left w:w="80" w:type="dxa"/>
-              <w:bottom w:w="80" w:type="dxa"/>
-              <w:right w:w="80" w:type="dxa"/>
-            </w:tcMar>
+            <w:tcW w:w="4896" w:type="dxa"/>
           </w:tcPr>
           <w:p>
-            <w:pPr>
-              <w:spacing w:after="0"/>
-            </w:pPr>
             <w:r>
               <w:rPr>
-                <w:sz w:val="17"/>
+                <w:sz w:val="16"/>
               </w:rPr>
-              <w:t>No</w:t>
+              <w:t>Approximate location derived from IP address or technical data, if applicable</w:t>
             </w:r>
           </w:p>
         </w:tc>
         <w:tc>
           <w:tcPr>
-            <w:tcW w:w="4536" w:type="dxa"/>
-            <w:tcBorders>
-              <w:top w:val="single" w:sz="4" w:space="0" w:color="D9D0F4"/>
-              <w:left w:val="single" w:sz="4" w:space="0" w:color="D9D0F4"/>
-              <w:bottom w:val="single" w:sz="4" w:space="0" w:color="D9D0F4"/>
-              <w:right w:val="single" w:sz="4" w:space="0" w:color="D9D0F4"/>
-            </w:tcBorders>
-            <w:shd w:val="clear" w:color="auto" w:fill="FFFFFF"/>
-            <w:tcMar>
-              <w:top w:w="80" w:type="dxa"/>
-              <w:left w:w="80" w:type="dxa"/>
-              <w:bottom w:w="80" w:type="dxa"/>
-              <w:right w:w="80" w:type="dxa"/>
-            </w:tcMar>
+            <w:tcW w:w="3744" w:type="dxa"/>
           </w:tcPr>
           <w:p>
-            <w:pPr>
-              <w:spacing w:after="0"/>
-            </w:pPr>
             <w:r>
               <w:rPr>
-                <w:sz w:val="17"/>
+                <w:sz w:val="16"/>
               </w:rPr>
-              <w:t>Original camera uploads, raw scan files</w:t>
+              <w:t>Security, localization, analytics, product relevance, fraud prevention</w:t>
             </w:r>
           </w:p>
         </w:tc>
@@ -1290,89 +1582,40 @@
         </w:trPr>
         <w:tc>
           <w:tcPr>
-            <w:tcW w:w="2520" w:type="dxa"/>
-            <w:tcBorders>
-              <w:top w:val="single" w:sz="4" w:space="0" w:color="D9D0F4"/>
-              <w:left w:val="single" w:sz="4" w:space="0" w:color="D9D0F4"/>
-              <w:bottom w:val="single" w:sz="4" w:space="0" w:color="D9D0F4"/>
-              <w:right w:val="single" w:sz="4" w:space="0" w:color="D9D0F4"/>
-            </w:tcBorders>
-            <w:shd w:val="clear" w:color="auto" w:fill="F8F6FC"/>
-            <w:tcMar>
-              <w:top w:w="80" w:type="dxa"/>
-              <w:left w:w="80" w:type="dxa"/>
-              <w:bottom w:w="80" w:type="dxa"/>
-              <w:right w:w="80" w:type="dxa"/>
-            </w:tcMar>
+            <w:tcW w:w="1800" w:type="dxa"/>
           </w:tcPr>
           <w:p>
-            <w:pPr>
-              <w:spacing w:after="0"/>
-            </w:pPr>
             <w:r>
               <w:rPr>
-                <w:b/>
-                <w:sz w:val="17"/>
+                <w:sz w:val="16"/>
               </w:rPr>
-              <w:t>Re-identifiable derived scan datasets</w:t>
+              <w:t>Purchases / Product Interaction</w:t>
             </w:r>
           </w:p>
         </w:tc>
         <w:tc>
           <w:tcPr>
-            <w:tcW w:w="2880" w:type="dxa"/>
-            <w:tcBorders>
-              <w:top w:val="single" w:sz="4" w:space="0" w:color="D9D0F4"/>
-              <w:left w:val="single" w:sz="4" w:space="0" w:color="D9D0F4"/>
-              <w:bottom w:val="single" w:sz="4" w:space="0" w:color="D9D0F4"/>
-              <w:right w:val="single" w:sz="4" w:space="0" w:color="D9D0F4"/>
-            </w:tcBorders>
-            <w:shd w:val="clear" w:color="auto" w:fill="F8F6FC"/>
-            <w:tcMar>
-              <w:top w:w="80" w:type="dxa"/>
-              <w:left w:w="80" w:type="dxa"/>
-              <w:bottom w:w="80" w:type="dxa"/>
-              <w:right w:w="80" w:type="dxa"/>
-            </w:tcMar>
+            <w:tcW w:w="4896" w:type="dxa"/>
           </w:tcPr>
           <w:p>
-            <w:pPr>
-              <w:spacing w:after="0"/>
-            </w:pPr>
             <w:r>
               <w:rPr>
-                <w:sz w:val="17"/>
+                <w:sz w:val="16"/>
               </w:rPr>
-              <w:t>No, unless separately disclosed and lawfully consented to</w:t>
+              <w:t>Retailer clicks, affiliate attribution, purchase-attribution signals where available</w:t>
             </w:r>
           </w:p>
         </w:tc>
         <w:tc>
           <w:tcPr>
-            <w:tcW w:w="4536" w:type="dxa"/>
-            <w:tcBorders>
-              <w:top w:val="single" w:sz="4" w:space="0" w:color="D9D0F4"/>
-              <w:left w:val="single" w:sz="4" w:space="0" w:color="D9D0F4"/>
-              <w:bottom w:val="single" w:sz="4" w:space="0" w:color="D9D0F4"/>
-              <w:right w:val="single" w:sz="4" w:space="0" w:color="D9D0F4"/>
-            </w:tcBorders>
-            <w:shd w:val="clear" w:color="auto" w:fill="F8F6FC"/>
-            <w:tcMar>
-              <w:top w:w="80" w:type="dxa"/>
-              <w:left w:w="80" w:type="dxa"/>
-              <w:bottom w:w="80" w:type="dxa"/>
-              <w:right w:w="80" w:type="dxa"/>
-            </w:tcMar>
+            <w:tcW w:w="3744" w:type="dxa"/>
           </w:tcPr>
           <w:p>
-            <w:pPr>
-              <w:spacing w:after="0"/>
-            </w:pPr>
             <w:r>
               <w:rPr>
-                <w:sz w:val="17"/>
+                <w:sz w:val="16"/>
               </w:rPr>
-              <w:t>Derived visual metadata that can reasonably be linked to a person or original image</w:t>
+              <w:t>Commerce routing, attribution, partner reporting where permitted</w:t>
             </w:r>
           </w:p>
         </w:tc>
@@ -1383,89 +1626,40 @@
         </w:trPr>
         <w:tc>
           <w:tcPr>
-            <w:tcW w:w="2520" w:type="dxa"/>
-            <w:tcBorders>
-              <w:top w:val="single" w:sz="4" w:space="0" w:color="D9D0F4"/>
-              <w:left w:val="single" w:sz="4" w:space="0" w:color="D9D0F4"/>
-              <w:bottom w:val="single" w:sz="4" w:space="0" w:color="D9D0F4"/>
-              <w:right w:val="single" w:sz="4" w:space="0" w:color="D9D0F4"/>
-            </w:tcBorders>
-            <w:shd w:val="clear" w:color="auto" w:fill="FFFFFF"/>
-            <w:tcMar>
-              <w:top w:w="80" w:type="dxa"/>
-              <w:left w:w="80" w:type="dxa"/>
-              <w:bottom w:w="80" w:type="dxa"/>
-              <w:right w:w="80" w:type="dxa"/>
-            </w:tcMar>
+            <w:tcW w:w="1800" w:type="dxa"/>
           </w:tcPr>
           <w:p>
-            <w:pPr>
-              <w:spacing w:after="0"/>
-            </w:pPr>
             <w:r>
               <w:rPr>
-                <w:b/>
-                <w:sz w:val="17"/>
+                <w:sz w:val="16"/>
               </w:rPr>
-              <w:t>Biometric identifiers/facial recognition data</w:t>
+              <w:t>Financial Info</w:t>
             </w:r>
           </w:p>
         </w:tc>
         <w:tc>
           <w:tcPr>
-            <w:tcW w:w="2880" w:type="dxa"/>
-            <w:tcBorders>
-              <w:top w:val="single" w:sz="4" w:space="0" w:color="D9D0F4"/>
-              <w:left w:val="single" w:sz="4" w:space="0" w:color="D9D0F4"/>
-              <w:bottom w:val="single" w:sz="4" w:space="0" w:color="D9D0F4"/>
-              <w:right w:val="single" w:sz="4" w:space="0" w:color="D9D0F4"/>
-            </w:tcBorders>
-            <w:shd w:val="clear" w:color="auto" w:fill="FFFFFF"/>
-            <w:tcMar>
-              <w:top w:w="80" w:type="dxa"/>
-              <w:left w:w="80" w:type="dxa"/>
-              <w:bottom w:w="80" w:type="dxa"/>
-              <w:right w:w="80" w:type="dxa"/>
-            </w:tcMar>
+            <w:tcW w:w="4896" w:type="dxa"/>
           </w:tcPr>
           <w:p>
-            <w:pPr>
-              <w:spacing w:after="0"/>
-            </w:pPr>
             <w:r>
               <w:rPr>
-                <w:sz w:val="17"/>
+                <w:sz w:val="16"/>
               </w:rPr>
-              <w:t>No</w:t>
+              <w:t>Payment card data is not processed by K Scan for third-party physical goods purchases in the current release posture</w:t>
             </w:r>
           </w:p>
         </w:tc>
         <w:tc>
           <w:tcPr>
-            <w:tcW w:w="4536" w:type="dxa"/>
-            <w:tcBorders>
-              <w:top w:val="single" w:sz="4" w:space="0" w:color="D9D0F4"/>
-              <w:left w:val="single" w:sz="4" w:space="0" w:color="D9D0F4"/>
-              <w:bottom w:val="single" w:sz="4" w:space="0" w:color="D9D0F4"/>
-              <w:right w:val="single" w:sz="4" w:space="0" w:color="D9D0F4"/>
-            </w:tcBorders>
-            <w:shd w:val="clear" w:color="auto" w:fill="FFFFFF"/>
-            <w:tcMar>
-              <w:top w:w="80" w:type="dxa"/>
-              <w:left w:w="80" w:type="dxa"/>
-              <w:bottom w:w="80" w:type="dxa"/>
-              <w:right w:w="80" w:type="dxa"/>
-            </w:tcMar>
+            <w:tcW w:w="3744" w:type="dxa"/>
           </w:tcPr>
           <w:p>
-            <w:pPr>
-              <w:spacing w:after="0"/>
-            </w:pPr>
             <w:r>
               <w:rPr>
-                <w:sz w:val="17"/>
+                <w:sz w:val="16"/>
               </w:rPr>
-              <w:t>Face templates, biometric identifiers</w:t>
+              <w:t>Not collected by K Scan for current third-party retailer checkout flows</w:t>
             </w:r>
           </w:p>
         </w:tc>
@@ -1476,485 +1670,40 @@
         </w:trPr>
         <w:tc>
           <w:tcPr>
-            <w:tcW w:w="2520" w:type="dxa"/>
-            <w:tcBorders>
-              <w:top w:val="single" w:sz="4" w:space="0" w:color="D9D0F4"/>
-              <w:left w:val="single" w:sz="4" w:space="0" w:color="D9D0F4"/>
-              <w:bottom w:val="single" w:sz="4" w:space="0" w:color="D9D0F4"/>
-              <w:right w:val="single" w:sz="4" w:space="0" w:color="D9D0F4"/>
-            </w:tcBorders>
-            <w:shd w:val="clear" w:color="auto" w:fill="F8F6FC"/>
-            <w:tcMar>
-              <w:top w:w="80" w:type="dxa"/>
-              <w:left w:w="80" w:type="dxa"/>
-              <w:bottom w:w="80" w:type="dxa"/>
-              <w:right w:w="80" w:type="dxa"/>
-            </w:tcMar>
+            <w:tcW w:w="1800" w:type="dxa"/>
           </w:tcPr>
           <w:p>
-            <w:pPr>
-              <w:spacing w:after="0"/>
-            </w:pPr>
             <w:r>
               <w:rPr>
-                <w:b/>
-                <w:sz w:val="17"/>
+                <w:sz w:val="16"/>
               </w:rPr>
-              <w:t>Payment card data/government IDs</w:t>
+              <w:t>Sensitive Info</w:t>
             </w:r>
           </w:p>
         </w:tc>
         <w:tc>
           <w:tcPr>
-            <w:tcW w:w="2880" w:type="dxa"/>
-            <w:tcBorders>
-              <w:top w:val="single" w:sz="4" w:space="0" w:color="D9D0F4"/>
-              <w:left w:val="single" w:sz="4" w:space="0" w:color="D9D0F4"/>
-              <w:bottom w:val="single" w:sz="4" w:space="0" w:color="D9D0F4"/>
-              <w:right w:val="single" w:sz="4" w:space="0" w:color="D9D0F4"/>
-            </w:tcBorders>
-            <w:shd w:val="clear" w:color="auto" w:fill="F8F6FC"/>
-            <w:tcMar>
-              <w:top w:w="80" w:type="dxa"/>
-              <w:left w:w="80" w:type="dxa"/>
-              <w:bottom w:w="80" w:type="dxa"/>
-              <w:right w:w="80" w:type="dxa"/>
-            </w:tcMar>
+            <w:tcW w:w="4896" w:type="dxa"/>
           </w:tcPr>
           <w:p>
-            <w:pPr>
-              <w:spacing w:after="0"/>
-            </w:pPr>
             <w:r>
               <w:rPr>
-                <w:sz w:val="17"/>
+                <w:sz w:val="16"/>
               </w:rPr>
-              <w:t>No</w:t>
+              <w:t>Not intentionally collected; may be incidentally present in user-uploaded images or messages</w:t>
             </w:r>
           </w:p>
         </w:tc>
         <w:tc>
           <w:tcPr>
-            <w:tcW w:w="4536" w:type="dxa"/>
-            <w:tcBorders>
-              <w:top w:val="single" w:sz="4" w:space="0" w:color="D9D0F4"/>
-              <w:left w:val="single" w:sz="4" w:space="0" w:color="D9D0F4"/>
-              <w:bottom w:val="single" w:sz="4" w:space="0" w:color="D9D0F4"/>
-              <w:right w:val="single" w:sz="4" w:space="0" w:color="D9D0F4"/>
-            </w:tcBorders>
-            <w:shd w:val="clear" w:color="auto" w:fill="F8F6FC"/>
-            <w:tcMar>
-              <w:top w:w="80" w:type="dxa"/>
-              <w:left w:w="80" w:type="dxa"/>
-              <w:bottom w:w="80" w:type="dxa"/>
-              <w:right w:w="80" w:type="dxa"/>
-            </w:tcMar>
-          </w:tcPr>
-          <w:p>
-            <w:pPr>
-              <w:spacing w:after="0"/>
-            </w:pPr>
-            <w:r>
-              <w:rPr>
-                <w:sz w:val="17"/>
-              </w:rPr>
-              <w:t>Card numbers, government identification</w:t>
-            </w:r>
-          </w:p>
-        </w:tc>
-      </w:tr>
-    </w:tbl>
-    <w:p>
-      <w:r>
-        <w:t>We do not sell raw uploaded scans, biometric identifiers, facial recognition data, government identification, payment card data, or sensitive personal information unless expressly disclosed and legally permitted with any required consent.</w:t>
-      </w:r>
-    </w:p>
-    <w:p>
-      <w:pPr>
-        <w:pStyle w:val="Heading1"/>
-      </w:pPr>
-      <w:r>
-        <w:rPr>
-          <w:color w:val="15131A"/>
-        </w:rPr>
-        <w:t>5. Cookies, Analytics, Advertising, and Tracking</w:t>
-      </w:r>
-    </w:p>
-    <w:p>
-      <w:r>
-        <w:t>We may use cookies, pixels, SDKs, device identifiers, tracking technologies, attribution tools, analytics platforms, advertising platforms, and marketing services to operate the Service, understand usage, measure campaigns, personalize experiences, and support commercial partnerships.</w:t>
-      </w:r>
-    </w:p>
-    <w:p>
-      <w:pPr>
-        <w:pStyle w:val="ListBullet"/>
-      </w:pPr>
-      <w:r>
-        <w:t>Where required by law, non-essential analytics, advertising, and marketing cookies or SDKs are used only after valid consent.</w:t>
-      </w:r>
-    </w:p>
-    <w:p>
-      <w:pPr>
-        <w:pStyle w:val="ListBullet"/>
-      </w:pPr>
-      <w:r>
-        <w:t>Users may manage preferences through cookie tools, browser settings, device settings, app permissions, advertising ID controls, and legally required opt-out mechanisms.</w:t>
-      </w:r>
-    </w:p>
-    <w:p>
-      <w:pPr>
-        <w:pStyle w:val="ListBullet"/>
-      </w:pPr>
-      <w:r>
-        <w:t>We currently do not respond to traditional “Do Not Track” signals. Where required by applicable law, we honor Global Privacy Control signals as opt-out requests for sale or sharing.</w:t>
-      </w:r>
-    </w:p>
-    <w:p>
-      <w:pPr>
-        <w:pStyle w:val="Heading1"/>
-      </w:pPr>
-      <w:r>
-        <w:rPr>
-          <w:color w:val="15131A"/>
-        </w:rPr>
-        <w:t>6. How We Share Information</w:t>
-      </w:r>
-    </w:p>
-    <w:p>
-      <w:pPr>
-        <w:pStyle w:val="ListBullet"/>
-      </w:pPr>
-      <w:r>
-        <w:t>Service providers, including cloud hosting, infrastructure, analytics, email delivery, customer support, security, fraud prevention, and performance monitoring providers</w:t>
-      </w:r>
-    </w:p>
-    <w:p>
-      <w:pPr>
-        <w:pStyle w:val="ListBullet"/>
-      </w:pPr>
-      <w:r>
-        <w:t>Advertising, analytics, retail, affiliate, commerce, and marketing partners, where permitted by law and subject to opt-out or consent rights</w:t>
-      </w:r>
-    </w:p>
-    <w:p>
-      <w:pPr>
-        <w:pStyle w:val="ListBullet"/>
-      </w:pPr>
-      <w:r>
-        <w:t>Payment processors, if paid features are introduced</w:t>
-      </w:r>
-    </w:p>
-    <w:p>
-      <w:pPr>
-        <w:pStyle w:val="ListBullet"/>
-      </w:pPr>
-      <w:r>
-        <w:t>Legal authorities or third parties when necessary to comply with law, protect rights, enforce terms, or prevent misuse</w:t>
-      </w:r>
-    </w:p>
-    <w:p>
-      <w:pPr>
-        <w:pStyle w:val="ListBullet"/>
-      </w:pPr>
-      <w:r>
-        <w:lastRenderedPageBreak/>
-        <w:t>Business transaction parties in connection with a merger, financing, acquisition, bankruptcy, restructuring, or sale of assets</w:t>
-      </w:r>
-    </w:p>
-    <w:p>
-      <w:pPr>
-        <w:pStyle w:val="ListBullet"/>
-      </w:pPr>
-      <w:r>
-        <w:t>Other parties with your consent or at your direction</w:t>
-      </w:r>
-    </w:p>
-    <w:p>
-      <w:pPr>
-        <w:pStyle w:val="Heading1"/>
-      </w:pPr>
-      <w:r>
-        <w:rPr>
-          <w:color w:val="15131A"/>
-        </w:rPr>
-        <w:t>7. Data Retention</w:t>
-      </w:r>
-    </w:p>
-    <w:p>
-      <w:pPr>
-        <w:pStyle w:val="ListBullet"/>
-      </w:pPr>
-      <w:r>
-        <w:t>Account and contact data: for the duration of the relationship plus up to 24 months, unless longer retention is required</w:t>
-      </w:r>
-    </w:p>
-    <w:p>
-      <w:pPr>
-        <w:pStyle w:val="ListBullet"/>
-      </w:pPr>
-      <w:r>
-        <w:t>Support and communications data: up to 24 months after resolution</w:t>
-      </w:r>
-    </w:p>
-    <w:p>
-      <w:pPr>
-        <w:pStyle w:val="ListBullet"/>
-      </w:pPr>
-      <w:r>
-        <w:t>Usage, analytics, and marketing data: up to 24 months, unless retained in aggregated, anonymized, or de-identified form</w:t>
-      </w:r>
-    </w:p>
-    <w:p>
-      <w:pPr>
-        <w:pStyle w:val="ListBullet"/>
-      </w:pPr>
-      <w:r>
-        <w:t>Raw scan data: typically processed transiently and deleted within 24-72 hours unless saved by the user, required for functionality, required for security, or legally required</w:t>
-      </w:r>
-    </w:p>
-    <w:p>
-      <w:pPr>
-        <w:pStyle w:val="ListBullet"/>
-      </w:pPr>
-      <w:r>
-        <w:t>Aggregated, anonymized, or de-identified data: may be retained indefinitely for research, analytics, commercial insights, and product improvement</w:t>
-      </w:r>
-    </w:p>
-    <w:p>
-      <w:pPr>
-        <w:pStyle w:val="Heading1"/>
-      </w:pPr>
-      <w:r>
-        <w:rPr>
-          <w:color w:val="15131A"/>
-        </w:rPr>
-        <w:t>8. Your Privacy Choices and Requests</w:t>
-      </w:r>
-    </w:p>
-    <w:p>
-      <w:pPr>
-        <w:pStyle w:val="ListBullet"/>
-      </w:pPr>
-      <w:r>
-        <w:t>You may request access, correction, deletion, portability, or restriction of certain personal information depending on your location.</w:t>
-      </w:r>
-    </w:p>
-    <w:p>
-      <w:pPr>
-        <w:pStyle w:val="ListBullet"/>
-      </w:pPr>
-      <w:r>
-        <w:t xml:space="preserve">You may opt out of marketing emails using the </w:t>
-      </w:r>
-      <w:proofErr w:type="gramStart"/>
-      <w:r>
-        <w:t>unsubscribe</w:t>
-      </w:r>
-      <w:proofErr w:type="gramEnd"/>
-      <w:r>
-        <w:t xml:space="preserve"> link or by contacting us.</w:t>
-      </w:r>
-    </w:p>
-    <w:p>
-      <w:pPr>
-        <w:pStyle w:val="ListBullet"/>
-      </w:pPr>
-      <w:r>
-        <w:t>You may limit tracking through device settings, app permissions, browser controls, cookie settings, advertising ID controls, and legally required opt-out mechanisms.</w:t>
-      </w:r>
-    </w:p>
-    <w:p>
-      <w:pPr>
-        <w:pStyle w:val="ListBullet"/>
-      </w:pPr>
-      <w:r>
-        <w:t>You may opt out of sale or sharing of personal information where required by law by contacting us at privacy@kscan.ai or by using any legally required privacy-control mechanism we make available.</w:t>
-      </w:r>
-    </w:p>
-    <w:p>
-      <w:pPr>
-        <w:pStyle w:val="ListBullet"/>
-      </w:pPr>
-      <w:r>
-        <w:t>Exercising privacy rights will not result in unlawful discrimination or denial of the core Service, although certain optional personalized or advertising-related experiences may change as a result.</w:t>
-      </w:r>
-    </w:p>
-    <w:p>
-      <w:pPr>
-        <w:pStyle w:val="Heading2"/>
-      </w:pPr>
-      <w:r>
-        <w:t>Deletion Requests and Downstream Recipients</w:t>
-      </w:r>
-    </w:p>
-    <w:p>
-      <w:r>
-        <w:t>Where required by applicable law, if we receive and verify a deletion request, we will delete or de-identify the covered personal information and notify relevant service providers, contractors, and third parties to whom we sold or shared that information so they can take corresponding action, unless an exception applies or the law does not require further notice. We may retain information where legally permitted for security, fraud prevention, legal compliance, dispute resolution, or other allowed purposes.</w:t>
-      </w:r>
-    </w:p>
-    <w:p>
-      <w:pPr>
-        <w:pStyle w:val="Heading1"/>
-      </w:pPr>
-      <w:r>
-        <w:rPr>
-          <w:color w:val="15131A"/>
-        </w:rPr>
-        <w:t>9. California Privacy Rights (CCPA / CPRA)</w:t>
-      </w:r>
-    </w:p>
-    <w:p>
-      <w:r>
-        <w:t>California residents may have the right to know, access, delete, correct, opt out of sale or sharing, limit use of sensitive personal information where applicable, and avoid discrimination for exercising these rights. K Scan may sell or share certain personal information as described in this Policy.</w:t>
-      </w:r>
-    </w:p>
-    <w:p>
-      <w:pPr>
-        <w:pStyle w:val="ListBullet"/>
-      </w:pPr>
-      <w:proofErr w:type="spellStart"/>
-      <w:r>
-        <w:t>Opt</w:t>
-      </w:r>
-      <w:proofErr w:type="spellEnd"/>
-      <w:r>
-        <w:t xml:space="preserve"> out of sale or </w:t>
-      </w:r>
-      <w:proofErr w:type="gramStart"/>
-      <w:r>
-        <w:t>sharing:</w:t>
-      </w:r>
-      <w:proofErr w:type="gramEnd"/>
-      <w:r>
-        <w:t xml:space="preserve"> contact privacy@kscan.ai or use any legally required privacy-control mechanism we make available.</w:t>
-      </w:r>
-    </w:p>
-    <w:p>
-      <w:pPr>
-        <w:pStyle w:val="ListBullet"/>
-      </w:pPr>
-      <w:r>
-        <w:t>Global Privacy Control: honored where required by applicable law.</w:t>
-      </w:r>
-    </w:p>
-    <w:p>
-      <w:pPr>
-        <w:pStyle w:val="ListBullet"/>
-      </w:pPr>
-      <w:r>
-        <w:t>Authorized agents: accepted where legally permitted, subject to verification.</w:t>
-      </w:r>
-    </w:p>
-    <w:p>
-      <w:pPr>
-        <w:pStyle w:val="ListBullet"/>
-      </w:pPr>
-      <w:r>
-        <w:t xml:space="preserve">Response timing: we will respond to verified consumer requests within 45 days, extendable by another 45 days </w:t>
-      </w:r>
-      <w:proofErr w:type="gramStart"/>
-      <w:r>
-        <w:t>where</w:t>
-      </w:r>
-      <w:proofErr w:type="gramEnd"/>
-      <w:r>
-        <w:t xml:space="preserve"> permitted by law.</w:t>
-      </w:r>
-    </w:p>
-    <w:p>
-      <w:pPr>
-        <w:pStyle w:val="Heading1"/>
-      </w:pPr>
-      <w:r>
-        <w:rPr>
-          <w:color w:val="15131A"/>
-        </w:rPr>
-        <w:lastRenderedPageBreak/>
-        <w:t>10. GDPR / UK GDPR Rights and Legal Bases</w:t>
-      </w:r>
-    </w:p>
-    <w:p>
-      <w:r>
-        <w:t xml:space="preserve">If you </w:t>
-      </w:r>
-      <w:proofErr w:type="gramStart"/>
-      <w:r>
-        <w:t>are located in</w:t>
-      </w:r>
-      <w:proofErr w:type="gramEnd"/>
-      <w:r>
-        <w:t xml:space="preserve"> the European Economic Area, United Kingdom, or another jurisdiction with similar rights, you may have the right to access, correct, delete, restrict, object to processing, request portability, withdraw consent, and lodge a complaint with a supervisory authority. A directory of EU supervisory authorities is available at https://edpb.europa.eu.</w:t>
-      </w:r>
-    </w:p>
-    <w:tbl>
-      <w:tblPr>
-        <w:tblStyle w:val="TableGrid"/>
-        <w:tblW w:w="0" w:type="auto"/>
-        <w:jc w:val="center"/>
-        <w:tblLook w:val="04A0" w:firstRow="1" w:lastRow="0" w:firstColumn="1" w:lastColumn="0" w:noHBand="0" w:noVBand="1"/>
-      </w:tblPr>
-      <w:tblGrid>
-        <w:gridCol w:w="4824"/>
-        <w:gridCol w:w="5112"/>
-      </w:tblGrid>
-      <w:tr>
-        <w:trPr>
-          <w:tblHeader/>
-          <w:jc w:val="center"/>
-        </w:trPr>
-        <w:tc>
-          <w:tcPr>
-            <w:tcW w:w="4824" w:type="dxa"/>
-            <w:tcBorders>
-              <w:top w:val="single" w:sz="8" w:space="0" w:color="5B3FD6"/>
-              <w:left w:val="single" w:sz="8" w:space="0" w:color="5B3FD6"/>
-              <w:bottom w:val="single" w:sz="8" w:space="0" w:color="5B3FD6"/>
-              <w:right w:val="single" w:sz="8" w:space="0" w:color="5B3FD6"/>
-            </w:tcBorders>
-            <w:shd w:val="clear" w:color="auto" w:fill="5B3FD6"/>
-            <w:tcMar>
-              <w:top w:w="90" w:type="dxa"/>
-              <w:left w:w="90" w:type="dxa"/>
-              <w:bottom w:w="90" w:type="dxa"/>
-              <w:right w:w="90" w:type="dxa"/>
-            </w:tcMar>
+            <w:tcW w:w="3744" w:type="dxa"/>
           </w:tcPr>
           <w:p>
             <w:r>
               <w:rPr>
-                <w:b/>
-                <w:color w:val="FFFFFF"/>
-                <w:sz w:val="19"/>
+                <w:sz w:val="16"/>
               </w:rPr>
-              <w:t>Purpose</w:t>
-            </w:r>
-          </w:p>
-        </w:tc>
-        <w:tc>
-          <w:tcPr>
-            <w:tcW w:w="5112" w:type="dxa"/>
-            <w:tcBorders>
-              <w:top w:val="single" w:sz="8" w:space="0" w:color="5B3FD6"/>
-              <w:left w:val="single" w:sz="8" w:space="0" w:color="5B3FD6"/>
-              <w:bottom w:val="single" w:sz="8" w:space="0" w:color="5B3FD6"/>
-              <w:right w:val="single" w:sz="8" w:space="0" w:color="5B3FD6"/>
-            </w:tcBorders>
-            <w:shd w:val="clear" w:color="auto" w:fill="5B3FD6"/>
-            <w:tcMar>
-              <w:top w:w="90" w:type="dxa"/>
-              <w:left w:w="90" w:type="dxa"/>
-              <w:bottom w:w="90" w:type="dxa"/>
-              <w:right w:w="90" w:type="dxa"/>
-            </w:tcMar>
-          </w:tcPr>
-          <w:p>
-            <w:r>
-              <w:rPr>
-                <w:b/>
-                <w:color w:val="FFFFFF"/>
-                <w:sz w:val="19"/>
-              </w:rPr>
-              <w:t>Possible Legal Basis</w:t>
+              <w:t>Users should avoid submitting sensitive personal information</w:t>
             </w:r>
           </w:p>
         </w:tc>
@@ -1965,60 +1714,40 @@
         </w:trPr>
         <w:tc>
           <w:tcPr>
-            <w:tcW w:w="4824" w:type="dxa"/>
-            <w:tcBorders>
-              <w:top w:val="single" w:sz="4" w:space="0" w:color="D9D0F4"/>
-              <w:left w:val="single" w:sz="4" w:space="0" w:color="D9D0F4"/>
-              <w:bottom w:val="single" w:sz="4" w:space="0" w:color="D9D0F4"/>
-              <w:right w:val="single" w:sz="4" w:space="0" w:color="D9D0F4"/>
-            </w:tcBorders>
-            <w:shd w:val="clear" w:color="auto" w:fill="FFFFFF"/>
-            <w:tcMar>
-              <w:top w:w="80" w:type="dxa"/>
-              <w:left w:w="80" w:type="dxa"/>
-              <w:bottom w:w="80" w:type="dxa"/>
-              <w:right w:w="80" w:type="dxa"/>
-            </w:tcMar>
+            <w:tcW w:w="1800" w:type="dxa"/>
           </w:tcPr>
           <w:p>
-            <w:pPr>
-              <w:spacing w:after="0"/>
-            </w:pPr>
             <w:r>
               <w:rPr>
-                <w:b/>
-                <w:sz w:val="17"/>
+                <w:sz w:val="16"/>
               </w:rPr>
-              <w:t>Core account and service delivery</w:t>
+              <w:t>Contacts / Health / Fitness / Browsing History</w:t>
             </w:r>
           </w:p>
         </w:tc>
         <w:tc>
           <w:tcPr>
-            <w:tcW w:w="5112" w:type="dxa"/>
-            <w:tcBorders>
-              <w:top w:val="single" w:sz="4" w:space="0" w:color="D9D0F4"/>
-              <w:left w:val="single" w:sz="4" w:space="0" w:color="D9D0F4"/>
-              <w:bottom w:val="single" w:sz="4" w:space="0" w:color="D9D0F4"/>
-              <w:right w:val="single" w:sz="4" w:space="0" w:color="D9D0F4"/>
-            </w:tcBorders>
-            <w:shd w:val="clear" w:color="auto" w:fill="FFFFFF"/>
-            <w:tcMar>
-              <w:top w:w="80" w:type="dxa"/>
-              <w:left w:w="80" w:type="dxa"/>
-              <w:bottom w:w="80" w:type="dxa"/>
-              <w:right w:w="80" w:type="dxa"/>
-            </w:tcMar>
+            <w:tcW w:w="4896" w:type="dxa"/>
           </w:tcPr>
           <w:p>
-            <w:pPr>
-              <w:spacing w:after="0"/>
-            </w:pPr>
             <w:r>
               <w:rPr>
-                <w:sz w:val="17"/>
+                <w:sz w:val="16"/>
               </w:rPr>
-              <w:t>Contract performance; consent where required</w:t>
+              <w:t>Not collected by K Scan as current core app categories unless future features separately disclose otherwise</w:t>
+            </w:r>
+          </w:p>
+        </w:tc>
+        <w:tc>
+          <w:tcPr>
+            <w:tcW w:w="3744" w:type="dxa"/>
+          </w:tcPr>
+          <w:p>
+            <w:r>
+              <w:rPr>
+                <w:sz w:val="16"/>
+              </w:rPr>
+              <w:t>Not applicable to current core functionality</w:t>
             </w:r>
           </w:p>
         </w:tc>
@@ -2029,403 +1758,51 @@
         </w:trPr>
         <w:tc>
           <w:tcPr>
-            <w:tcW w:w="4824" w:type="dxa"/>
-            <w:tcBorders>
-              <w:top w:val="single" w:sz="4" w:space="0" w:color="D9D0F4"/>
-              <w:left w:val="single" w:sz="4" w:space="0" w:color="D9D0F4"/>
-              <w:bottom w:val="single" w:sz="4" w:space="0" w:color="D9D0F4"/>
-              <w:right w:val="single" w:sz="4" w:space="0" w:color="D9D0F4"/>
-            </w:tcBorders>
-            <w:shd w:val="clear" w:color="auto" w:fill="F8F6FC"/>
-            <w:tcMar>
-              <w:top w:w="80" w:type="dxa"/>
-              <w:left w:w="80" w:type="dxa"/>
-              <w:bottom w:w="80" w:type="dxa"/>
-              <w:right w:w="80" w:type="dxa"/>
-            </w:tcMar>
+            <w:tcW w:w="1800" w:type="dxa"/>
           </w:tcPr>
           <w:p>
-            <w:pPr>
-              <w:spacing w:after="0"/>
-            </w:pPr>
             <w:r>
               <w:rPr>
-                <w:b/>
-                <w:sz w:val="17"/>
+                <w:sz w:val="16"/>
               </w:rPr>
-              <w:t>Security, fraud prevention, diagnostics</w:t>
+              <w:t>Other Data</w:t>
             </w:r>
           </w:p>
         </w:tc>
         <w:tc>
           <w:tcPr>
-            <w:tcW w:w="5112" w:type="dxa"/>
-            <w:tcBorders>
-              <w:top w:val="single" w:sz="4" w:space="0" w:color="D9D0F4"/>
-              <w:left w:val="single" w:sz="4" w:space="0" w:color="D9D0F4"/>
-              <w:bottom w:val="single" w:sz="4" w:space="0" w:color="D9D0F4"/>
-              <w:right w:val="single" w:sz="4" w:space="0" w:color="D9D0F4"/>
-            </w:tcBorders>
-            <w:shd w:val="clear" w:color="auto" w:fill="F8F6FC"/>
-            <w:tcMar>
-              <w:top w:w="80" w:type="dxa"/>
-              <w:left w:w="80" w:type="dxa"/>
-              <w:bottom w:w="80" w:type="dxa"/>
-              <w:right w:w="80" w:type="dxa"/>
-            </w:tcMar>
+            <w:tcW w:w="4896" w:type="dxa"/>
           </w:tcPr>
           <w:p>
-            <w:pPr>
-              <w:spacing w:after="0"/>
-            </w:pPr>
             <w:r>
               <w:rPr>
-                <w:sz w:val="17"/>
+                <w:sz w:val="16"/>
               </w:rPr>
-              <w:t>Legitimate interests; legal obligations where applicable</w:t>
-            </w:r>
-          </w:p>
-        </w:tc>
-      </w:tr>
-      <w:tr>
-        <w:trPr>
-          <w:jc w:val="center"/>
-        </w:trPr>
-        <w:tc>
-          <w:tcPr>
-            <w:tcW w:w="4824" w:type="dxa"/>
-            <w:tcBorders>
-              <w:top w:val="single" w:sz="4" w:space="0" w:color="D9D0F4"/>
-              <w:left w:val="single" w:sz="4" w:space="0" w:color="D9D0F4"/>
-              <w:bottom w:val="single" w:sz="4" w:space="0" w:color="D9D0F4"/>
-              <w:right w:val="single" w:sz="4" w:space="0" w:color="D9D0F4"/>
-            </w:tcBorders>
-            <w:shd w:val="clear" w:color="auto" w:fill="FFFFFF"/>
-            <w:tcMar>
-              <w:top w:w="80" w:type="dxa"/>
-              <w:left w:w="80" w:type="dxa"/>
-              <w:bottom w:w="80" w:type="dxa"/>
-              <w:right w:w="80" w:type="dxa"/>
-            </w:tcMar>
-          </w:tcPr>
-          <w:p>
-            <w:pPr>
-              <w:spacing w:after="0"/>
-            </w:pPr>
-            <w:r>
-              <w:rPr>
-                <w:b/>
-                <w:sz w:val="17"/>
-              </w:rPr>
-              <w:t>Non-essential cookies, targeted advertising, and tracking where required</w:t>
+              <w:t>Style preferences, garment attributes, product signals, derived fashion interests</w:t>
             </w:r>
           </w:p>
         </w:tc>
         <w:tc>
           <w:tcPr>
-            <w:tcW w:w="5112" w:type="dxa"/>
-            <w:tcBorders>
-              <w:top w:val="single" w:sz="4" w:space="0" w:color="D9D0F4"/>
-              <w:left w:val="single" w:sz="4" w:space="0" w:color="D9D0F4"/>
-              <w:bottom w:val="single" w:sz="4" w:space="0" w:color="D9D0F4"/>
-              <w:right w:val="single" w:sz="4" w:space="0" w:color="D9D0F4"/>
-            </w:tcBorders>
-            <w:shd w:val="clear" w:color="auto" w:fill="FFFFFF"/>
-            <w:tcMar>
-              <w:top w:w="80" w:type="dxa"/>
-              <w:left w:w="80" w:type="dxa"/>
-              <w:bottom w:w="80" w:type="dxa"/>
-              <w:right w:w="80" w:type="dxa"/>
-            </w:tcMar>
+            <w:tcW w:w="3744" w:type="dxa"/>
           </w:tcPr>
           <w:p>
-            <w:pPr>
-              <w:spacing w:after="0"/>
-            </w:pPr>
             <w:r>
               <w:rPr>
-                <w:sz w:val="17"/>
+                <w:sz w:val="16"/>
               </w:rPr>
-              <w:t>Consent</w:t>
-            </w:r>
-          </w:p>
-        </w:tc>
-      </w:tr>
-      <w:tr>
-        <w:trPr>
-          <w:jc w:val="center"/>
-        </w:trPr>
-        <w:tc>
-          <w:tcPr>
-            <w:tcW w:w="4824" w:type="dxa"/>
-            <w:tcBorders>
-              <w:top w:val="single" w:sz="4" w:space="0" w:color="D9D0F4"/>
-              <w:left w:val="single" w:sz="4" w:space="0" w:color="D9D0F4"/>
-              <w:bottom w:val="single" w:sz="4" w:space="0" w:color="D9D0F4"/>
-              <w:right w:val="single" w:sz="4" w:space="0" w:color="D9D0F4"/>
-            </w:tcBorders>
-            <w:shd w:val="clear" w:color="auto" w:fill="F8F6FC"/>
-            <w:tcMar>
-              <w:top w:w="80" w:type="dxa"/>
-              <w:left w:w="80" w:type="dxa"/>
-              <w:bottom w:w="80" w:type="dxa"/>
-              <w:right w:w="80" w:type="dxa"/>
-            </w:tcMar>
-          </w:tcPr>
-          <w:p>
-            <w:pPr>
-              <w:spacing w:after="0"/>
-            </w:pPr>
-            <w:r>
-              <w:rPr>
-                <w:b/>
-                <w:sz w:val="17"/>
-              </w:rPr>
-              <w:t>Sale-like or partner monetization uses that require permission under applicable law</w:t>
-            </w:r>
-          </w:p>
-        </w:tc>
-        <w:tc>
-          <w:tcPr>
-            <w:tcW w:w="5112" w:type="dxa"/>
-            <w:tcBorders>
-              <w:top w:val="single" w:sz="4" w:space="0" w:color="D9D0F4"/>
-              <w:left w:val="single" w:sz="4" w:space="0" w:color="D9D0F4"/>
-              <w:bottom w:val="single" w:sz="4" w:space="0" w:color="D9D0F4"/>
-              <w:right w:val="single" w:sz="4" w:space="0" w:color="D9D0F4"/>
-            </w:tcBorders>
-            <w:shd w:val="clear" w:color="auto" w:fill="F8F6FC"/>
-            <w:tcMar>
-              <w:top w:w="80" w:type="dxa"/>
-              <w:left w:w="80" w:type="dxa"/>
-              <w:bottom w:w="80" w:type="dxa"/>
-              <w:right w:w="80" w:type="dxa"/>
-            </w:tcMar>
-          </w:tcPr>
-          <w:p>
-            <w:pPr>
-              <w:spacing w:after="0"/>
-            </w:pPr>
-            <w:r>
-              <w:rPr>
-                <w:sz w:val="17"/>
-              </w:rPr>
-              <w:t>Consent or another expressly lawful basis where valid</w:t>
-            </w:r>
-          </w:p>
-        </w:tc>
-      </w:tr>
-      <w:tr>
-        <w:trPr>
-          <w:jc w:val="center"/>
-        </w:trPr>
-        <w:tc>
-          <w:tcPr>
-            <w:tcW w:w="4824" w:type="dxa"/>
-            <w:tcBorders>
-              <w:top w:val="single" w:sz="4" w:space="0" w:color="D9D0F4"/>
-              <w:left w:val="single" w:sz="4" w:space="0" w:color="D9D0F4"/>
-              <w:bottom w:val="single" w:sz="4" w:space="0" w:color="D9D0F4"/>
-              <w:right w:val="single" w:sz="4" w:space="0" w:color="D9D0F4"/>
-            </w:tcBorders>
-            <w:shd w:val="clear" w:color="auto" w:fill="FFFFFF"/>
-            <w:tcMar>
-              <w:top w:w="80" w:type="dxa"/>
-              <w:left w:w="80" w:type="dxa"/>
-              <w:bottom w:w="80" w:type="dxa"/>
-              <w:right w:w="80" w:type="dxa"/>
-            </w:tcMar>
-          </w:tcPr>
-          <w:p>
-            <w:pPr>
-              <w:spacing w:after="0"/>
-            </w:pPr>
-            <w:r>
-              <w:rPr>
-                <w:b/>
-                <w:sz w:val="17"/>
-              </w:rPr>
-              <w:t>Compliance and legal requests</w:t>
-            </w:r>
-          </w:p>
-        </w:tc>
-        <w:tc>
-          <w:tcPr>
-            <w:tcW w:w="5112" w:type="dxa"/>
-            <w:tcBorders>
-              <w:top w:val="single" w:sz="4" w:space="0" w:color="D9D0F4"/>
-              <w:left w:val="single" w:sz="4" w:space="0" w:color="D9D0F4"/>
-              <w:bottom w:val="single" w:sz="4" w:space="0" w:color="D9D0F4"/>
-              <w:right w:val="single" w:sz="4" w:space="0" w:color="D9D0F4"/>
-            </w:tcBorders>
-            <w:shd w:val="clear" w:color="auto" w:fill="FFFFFF"/>
-            <w:tcMar>
-              <w:top w:w="80" w:type="dxa"/>
-              <w:left w:w="80" w:type="dxa"/>
-              <w:bottom w:w="80" w:type="dxa"/>
-              <w:right w:w="80" w:type="dxa"/>
-            </w:tcMar>
-          </w:tcPr>
-          <w:p>
-            <w:pPr>
-              <w:spacing w:after="0"/>
-            </w:pPr>
-            <w:r>
-              <w:rPr>
-                <w:sz w:val="17"/>
-              </w:rPr>
-              <w:t>Legal obligations</w:t>
+              <w:t>Recommendations, product matching, personalization, analytics, aggregated insights where permitted</w:t>
             </w:r>
           </w:p>
         </w:tc>
       </w:tr>
     </w:tbl>
-    <w:p>
-      <w:r>
-        <w:t>Where consent is required, it will be requested separately from acceptance of Terms, presented in a reasonably granular manner, and may be withdrawn at any time. Withdrawal does not affect processing already completed lawfully before withdrawal, but it may reduce optional personalized, marketing, or partner-supported features.</w:t>
-      </w:r>
-    </w:p>
-    <w:p>
-      <w:pPr>
-        <w:pStyle w:val="Heading1"/>
-      </w:pPr>
-      <w:r>
-        <w:rPr>
-          <w:color w:val="15131A"/>
-        </w:rPr>
-        <w:t>11. International Data Transfers</w:t>
-      </w:r>
-    </w:p>
-    <w:p>
-      <w:r>
-        <w:t>Your information may be processed in the United States and other countries. Where required, we use appropriate safeguards such as Standard Contractual Clauses approved by the European Commission, the UK International Data Transfer Addendum, or other lawful transfer mechanisms.</w:t>
-      </w:r>
-    </w:p>
-    <w:p>
-      <w:pPr>
-        <w:pStyle w:val="Heading1"/>
-      </w:pPr>
-      <w:r>
-        <w:rPr>
-          <w:color w:val="15131A"/>
-        </w:rPr>
-        <w:t>12. Security</w:t>
-      </w:r>
-    </w:p>
-    <w:p>
-      <w:r>
-        <w:t>We implement reasonable administrative, technical, and organizational safeguards designed to protect information, including encryption in transit where appropriate, access controls, and secure infrastructure. No system can be guaranteed completely secure.</w:t>
-      </w:r>
-    </w:p>
-    <w:p>
-      <w:pPr>
-        <w:pStyle w:val="Heading1"/>
-      </w:pPr>
-      <w:r>
-        <w:rPr>
-          <w:color w:val="15131A"/>
-        </w:rPr>
-        <w:t>13. Children’s Privacy</w:t>
-      </w:r>
-    </w:p>
-    <w:p>
-      <w:r>
-        <w:t xml:space="preserve">The Service is not directed to children under 13 where U.S. federal law applies. We do not knowingly sell or share personal information of minors under 16 without required authorization. If we learn that we </w:t>
-      </w:r>
-      <w:proofErr w:type="gramStart"/>
-      <w:r>
-        <w:t>collected</w:t>
-      </w:r>
-      <w:proofErr w:type="gramEnd"/>
-      <w:r>
-        <w:t xml:space="preserve"> personal information from a child without required consent, we will take reasonable steps to delete it.</w:t>
-      </w:r>
-    </w:p>
-    <w:p>
-      <w:pPr>
-        <w:pStyle w:val="Heading1"/>
-      </w:pPr>
-      <w:r>
-        <w:rPr>
-          <w:color w:val="15131A"/>
-        </w:rPr>
-        <w:t>14. Third-Party Links and Retailers</w:t>
-      </w:r>
-    </w:p>
-    <w:p>
-      <w:r>
-        <w:t>The Service may link to third-party retailers, websites, platforms, or services. We are not responsible for their privacy practices, content, security, pricing, products, or policies. Review third-party policies before providing information or making purchases.</w:t>
-      </w:r>
-    </w:p>
-    <w:p>
-      <w:pPr>
-        <w:pStyle w:val="Heading1"/>
-      </w:pPr>
-      <w:r>
-        <w:rPr>
-          <w:color w:val="15131A"/>
-        </w:rPr>
-        <w:t>15. Changes to This Policy</w:t>
-      </w:r>
-    </w:p>
-    <w:p>
-      <w:r>
-        <w:t>We may update this Privacy Policy from time to time. For material changes that expand how personal information may be used, sold, shared, licensed, or disclosed, we will provide additional notice where required and obtain consent or other authorization when applicable. We will also update the “Last Updated” date above.</w:t>
-      </w:r>
-    </w:p>
-    <w:p>
-      <w:pPr>
-        <w:pStyle w:val="Heading1"/>
-      </w:pPr>
-      <w:r>
-        <w:rPr>
-          <w:color w:val="15131A"/>
-        </w:rPr>
-        <w:lastRenderedPageBreak/>
-        <w:t>16. Contact Us</w:t>
-      </w:r>
-    </w:p>
-    <w:p>
-      <w:r>
-        <w:rPr>
-          <w:b/>
-        </w:rPr>
-        <w:t>K Scan AI</w:t>
-      </w:r>
-    </w:p>
-    <w:p>
-      <w:r>
-        <w:t xml:space="preserve">Email: </w:t>
-      </w:r>
-      <w:hyperlink r:id="rId8" w:history="1">
-        <w:r>
-          <w:rPr>
-            <w:rStyle w:val="Hyperlink"/>
-          </w:rPr>
-          <w:t>kscanai.app@gmail.com</w:t>
-        </w:r>
-      </w:hyperlink>
-    </w:p>
-    <w:p>
-      <w:r>
-        <w:t xml:space="preserve">Website: </w:t>
-      </w:r>
-      <w:hyperlink r:id="rId9">
-        <w:r>
-          <w:rPr>
-            <w:color w:val="5B3FD6"/>
-            <w:u w:val="single"/>
-          </w:rPr>
-          <w:t>https://kscan.app</w:t>
-        </w:r>
-      </w:hyperlink>
-    </w:p>
     <w:p/>
     <w:sectPr>
-      <w:headerReference w:type="default" r:id="rId10"/>
-      <w:footerReference w:type="default" r:id="rId11"/>
+      <w:headerReference w:type="default" r:id="rId8"/>
+      <w:footerReference w:type="default" r:id="rId9"/>
       <w:pgSz w:w="12240" w:h="15840"/>
-      <w:pgMar w:top="936" w:right="1080" w:bottom="936" w:left="1080" w:header="720" w:footer="720" w:gutter="0"/>
+      <w:pgMar w:top="792" w:right="893" w:bottom="792" w:left="893" w:header="360" w:footer="360" w:gutter="0"/>
       <w:cols w:space="720"/>
       <w:docGrid w:linePitch="360"/>
     </w:sectPr>
@@ -2467,36 +1844,11 @@
     </w:pPr>
     <w:r>
       <w:rPr>
-        <w:color w:val="52525B"/>
-        <w:sz w:val="17"/>
-      </w:rPr>
-      <w:t xml:space="preserve">Privacy-first fashion </w:t>
+        <w:color w:val="6B7280"/>
+        <w:sz w:val="16"/>
+      </w:rPr>
+      <w:t>Website, Google Play, and Apple App Store submission-ready public policy version</w:t>
     </w:r>
-    <w:proofErr w:type="gramStart"/>
-    <w:r>
-      <w:rPr>
-        <w:color w:val="52525B"/>
-        <w:sz w:val="17"/>
-      </w:rPr>
-      <w:t>discovery  •</w:t>
-    </w:r>
-    <w:proofErr w:type="gramEnd"/>
-    <w:r>
-      <w:rPr>
-        <w:color w:val="52525B"/>
-        <w:sz w:val="17"/>
-      </w:rPr>
-      <w:t xml:space="preserve">  </w:t>
-    </w:r>
-    <w:proofErr w:type="spellStart"/>
-    <w:r>
-      <w:rPr>
-        <w:color w:val="52525B"/>
-        <w:sz w:val="17"/>
-      </w:rPr>
-      <w:t>kscan.app</w:t>
-    </w:r>
-    <w:proofErr w:type="spellEnd"/>
   </w:p>
 </w:ftr>
 </file>
@@ -2531,28 +1883,28 @@
   <w:p>
     <w:pPr>
       <w:pStyle w:val="Header"/>
-      <w:jc w:val="right"/>
+      <w:jc w:val="center"/>
     </w:pPr>
     <w:r>
       <w:rPr>
-        <w:color w:val="52525B"/>
-        <w:sz w:val="17"/>
+        <w:color w:val="6B7280"/>
+        <w:sz w:val="16"/>
       </w:rPr>
       <w:t xml:space="preserve">K Scan </w:t>
     </w:r>
     <w:proofErr w:type="gramStart"/>
     <w:r>
       <w:rPr>
-        <w:color w:val="52525B"/>
-        <w:sz w:val="17"/>
+        <w:color w:val="6B7280"/>
+        <w:sz w:val="16"/>
       </w:rPr>
       <w:t>AI  |</w:t>
     </w:r>
     <w:proofErr w:type="gramEnd"/>
     <w:r>
       <w:rPr>
-        <w:color w:val="52525B"/>
-        <w:sz w:val="17"/>
+        <w:color w:val="6B7280"/>
+        <w:sz w:val="16"/>
       </w:rPr>
       <w:t xml:space="preserve">  Privacy Policy</w:t>
     </w:r>
@@ -2733,31 +2085,31 @@
       </w:rPr>
     </w:lvl>
   </w:abstractNum>
-  <w:num w:numId="1" w16cid:durableId="995107986">
+  <w:num w:numId="1" w16cid:durableId="1996176602">
     <w:abstractNumId w:val="8"/>
   </w:num>
-  <w:num w:numId="2" w16cid:durableId="140734683">
+  <w:num w:numId="2" w16cid:durableId="905265907">
     <w:abstractNumId w:val="6"/>
   </w:num>
-  <w:num w:numId="3" w16cid:durableId="1354962087">
+  <w:num w:numId="3" w16cid:durableId="173957529">
     <w:abstractNumId w:val="5"/>
   </w:num>
-  <w:num w:numId="4" w16cid:durableId="105585846">
+  <w:num w:numId="4" w16cid:durableId="873466764">
     <w:abstractNumId w:val="4"/>
   </w:num>
-  <w:num w:numId="5" w16cid:durableId="449738685">
+  <w:num w:numId="5" w16cid:durableId="47461648">
     <w:abstractNumId w:val="7"/>
   </w:num>
-  <w:num w:numId="6" w16cid:durableId="1991055624">
+  <w:num w:numId="6" w16cid:durableId="1420249278">
     <w:abstractNumId w:val="3"/>
   </w:num>
-  <w:num w:numId="7" w16cid:durableId="615521064">
+  <w:num w:numId="7" w16cid:durableId="1937402122">
     <w:abstractNumId w:val="2"/>
   </w:num>
-  <w:num w:numId="8" w16cid:durableId="1641880088">
+  <w:num w:numId="8" w16cid:durableId="712731749">
     <w:abstractNumId w:val="1"/>
   </w:num>
-  <w:num w:numId="9" w16cid:durableId="1308893821">
+  <w:num w:numId="9" w16cid:durableId="299650180">
     <w:abstractNumId w:val="0"/>
   </w:num>
 </w:numbering>
@@ -3154,12 +2506,12 @@
     <w:qFormat/>
     <w:rsid w:val="00FC693F"/>
     <w:pPr>
-      <w:spacing w:after="140" w:line="259" w:lineRule="auto"/>
+      <w:spacing w:after="100" w:line="254" w:lineRule="auto"/>
     </w:pPr>
     <w:rPr>
       <w:rFonts w:ascii="Aptos" w:eastAsia="Aptos" w:hAnsi="Aptos"/>
-      <w:color w:val="262626"/>
-      <w:sz w:val="21"/>
+      <w:color w:val="18181B"/>
+      <w:sz w:val="19"/>
     </w:rPr>
   </w:style>
   <w:style w:type="paragraph" w:styleId="Heading1">
@@ -3173,14 +2525,14 @@
     <w:pPr>
       <w:keepNext/>
       <w:keepLines/>
-      <w:spacing w:before="480" w:after="0"/>
+      <w:spacing w:before="180" w:after="80"/>
       <w:outlineLvl w:val="0"/>
     </w:pPr>
     <w:rPr>
       <w:rFonts w:asciiTheme="majorHAnsi" w:eastAsiaTheme="majorEastAsia" w:hAnsiTheme="majorHAnsi" w:cstheme="majorBidi"/>
       <w:b/>
       <w:bCs/>
-      <w:color w:val="365F91" w:themeColor="accent1" w:themeShade="BF"/>
+      <w:color w:val="111827"/>
       <w:sz w:val="28"/>
       <w:szCs w:val="28"/>
     </w:rPr>
@@ -3197,15 +2549,15 @@
     <w:pPr>
       <w:keepNext/>
       <w:keepLines/>
-      <w:spacing w:before="200" w:after="0"/>
+      <w:spacing w:before="120" w:after="40"/>
       <w:outlineLvl w:val="1"/>
     </w:pPr>
     <w:rPr>
       <w:rFonts w:asciiTheme="majorHAnsi" w:eastAsiaTheme="majorEastAsia" w:hAnsiTheme="majorHAnsi" w:cstheme="majorBidi"/>
       <w:b/>
       <w:bCs/>
-      <w:color w:val="4F81BD" w:themeColor="accent1"/>
-      <w:sz w:val="26"/>
+      <w:color w:val="203764"/>
+      <w:sz w:val="22"/>
       <w:szCs w:val="26"/>
     </w:rPr>
   </w:style>
@@ -3221,14 +2573,15 @@
     <w:pPr>
       <w:keepNext/>
       <w:keepLines/>
-      <w:spacing w:before="200" w:after="0"/>
+      <w:spacing w:before="80" w:after="20"/>
       <w:outlineLvl w:val="2"/>
     </w:pPr>
     <w:rPr>
       <w:rFonts w:asciiTheme="majorHAnsi" w:eastAsiaTheme="majorEastAsia" w:hAnsiTheme="majorHAnsi" w:cstheme="majorBidi"/>
       <w:b/>
       <w:bCs/>
-      <w:color w:val="4F81BD" w:themeColor="accent1"/>
+      <w:color w:val="374151"/>
+      <w:sz w:val="20"/>
     </w:rPr>
   </w:style>
   <w:style w:type="paragraph" w:styleId="Heading4">
@@ -3506,15 +2859,16 @@
       <w:pBdr>
         <w:bottom w:val="single" w:sz="8" w:space="4" w:color="4F81BD" w:themeColor="accent1"/>
       </w:pBdr>
-      <w:spacing w:after="300" w:line="240" w:lineRule="auto"/>
+      <w:spacing w:after="160" w:line="240" w:lineRule="auto"/>
       <w:contextualSpacing/>
     </w:pPr>
     <w:rPr>
       <w:rFonts w:asciiTheme="majorHAnsi" w:eastAsiaTheme="majorEastAsia" w:hAnsiTheme="majorHAnsi" w:cstheme="majorBidi"/>
-      <w:color w:val="17365D" w:themeColor="text2" w:themeShade="BF"/>
+      <w:b/>
+      <w:color w:val="121212"/>
       <w:spacing w:val="5"/>
       <w:kern w:val="28"/>
-      <w:sz w:val="52"/>
+      <w:sz w:val="48"/>
       <w:szCs w:val="52"/>
     </w:rPr>
   </w:style>
@@ -14151,96 +13505,26 @@
       </w:tcPr>
     </w:tblStylePr>
   </w:style>
-  <w:style w:type="paragraph" w:customStyle="1" w:styleId="KScanTitle">
-    <w:name w:val="KScan Title"/>
+  <w:style w:type="paragraph" w:customStyle="1" w:styleId="SmallNote">
+    <w:name w:val="Small Note"/>
     <w:pPr>
-      <w:spacing w:after="160" w:line="252" w:lineRule="auto"/>
+      <w:spacing w:after="60" w:line="240" w:lineRule="auto"/>
     </w:pPr>
     <w:rPr>
       <w:rFonts w:ascii="Aptos" w:eastAsia="Aptos" w:hAnsi="Aptos"/>
-      <w:b/>
-      <w:color w:val="18181B"/>
-      <w:sz w:val="52"/>
+      <w:color w:val="4B5563"/>
+      <w:sz w:val="17"/>
     </w:rPr>
   </w:style>
-  <w:style w:type="paragraph" w:customStyle="1" w:styleId="KScanSubtitle">
-    <w:name w:val="KScan Subtitle"/>
+  <w:style w:type="paragraph" w:customStyle="1" w:styleId="Meta">
+    <w:name w:val="Meta"/>
     <w:pPr>
-      <w:spacing w:after="360" w:line="252" w:lineRule="auto"/>
+      <w:spacing w:after="120"/>
     </w:pPr>
     <w:rPr>
       <w:rFonts w:ascii="Aptos" w:eastAsia="Aptos" w:hAnsi="Aptos"/>
-      <w:color w:val="52525B"/>
-      <w:sz w:val="21"/>
-    </w:rPr>
-  </w:style>
-  <w:style w:type="paragraph" w:customStyle="1" w:styleId="KScanH1">
-    <w:name w:val="KScan H1"/>
-    <w:pPr>
-      <w:spacing w:before="320" w:after="120" w:line="252" w:lineRule="auto"/>
-    </w:pPr>
-    <w:rPr>
-      <w:rFonts w:ascii="Aptos" w:eastAsia="Aptos" w:hAnsi="Aptos"/>
-      <w:b/>
-      <w:color w:val="2D1F5E"/>
-      <w:sz w:val="30"/>
-    </w:rPr>
-  </w:style>
-  <w:style w:type="paragraph" w:customStyle="1" w:styleId="KScanH2">
-    <w:name w:val="KScan H2"/>
-    <w:pPr>
-      <w:spacing w:before="160" w:after="80" w:line="252" w:lineRule="auto"/>
-    </w:pPr>
-    <w:rPr>
-      <w:rFonts w:ascii="Aptos" w:eastAsia="Aptos" w:hAnsi="Aptos"/>
-      <w:b/>
-      <w:color w:val="27272A"/>
-      <w:sz w:val="24"/>
-    </w:rPr>
-  </w:style>
-  <w:style w:type="paragraph" w:customStyle="1" w:styleId="KScanSmall">
-    <w:name w:val="KScan Small"/>
-    <w:pPr>
-      <w:spacing w:after="80" w:line="252" w:lineRule="auto"/>
-    </w:pPr>
-    <w:rPr>
-      <w:rFonts w:ascii="Aptos" w:eastAsia="Aptos" w:hAnsi="Aptos"/>
-      <w:color w:val="52525B"/>
+      <w:color w:val="4B5563"/>
       <w:sz w:val="18"/>
-    </w:rPr>
-  </w:style>
-  <w:style w:type="paragraph" w:customStyle="1" w:styleId="Callout">
-    <w:name w:val="Callout"/>
-    <w:rsid w:val="00F54515"/>
-    <w:pPr>
-      <w:spacing w:after="60"/>
-    </w:pPr>
-    <w:rPr>
-      <w:rFonts w:ascii="Aptos" w:hAnsi="Aptos"/>
-      <w:sz w:val="19"/>
-    </w:rPr>
-  </w:style>
-  <w:style w:type="character" w:styleId="Hyperlink">
-    <w:name w:val="Hyperlink"/>
-    <w:basedOn w:val="DefaultParagraphFont"/>
-    <w:uiPriority w:val="99"/>
-    <w:unhideWhenUsed/>
-    <w:rsid w:val="00800ED5"/>
-    <w:rPr>
-      <w:color w:val="0000FF" w:themeColor="hyperlink"/>
-      <w:u w:val="single"/>
-    </w:rPr>
-  </w:style>
-  <w:style w:type="character" w:styleId="UnresolvedMention">
-    <w:name w:val="Unresolved Mention"/>
-    <w:basedOn w:val="DefaultParagraphFont"/>
-    <w:uiPriority w:val="99"/>
-    <w:semiHidden/>
-    <w:unhideWhenUsed/>
-    <w:rsid w:val="00800ED5"/>
-    <w:rPr>
-      <w:color w:val="605E5C"/>
-      <w:shd w:val="clear" w:color="auto" w:fill="E1DFDD"/>
     </w:rPr>
   </w:style>
 </w:styles>

</xml_diff>

<commit_message>
Update downloadable legal documents
</commit_message>
<xml_diff>
--- a/public/docs/kscan-privacy-policy.docx
+++ b/public/docs/kscan-privacy-policy.docx
@@ -4,20 +4,43 @@
   <w:body>
     <w:p>
       <w:pPr>
+        <w:jc w:val="center"/>
+      </w:pPr>
+      <w:r>
+        <w:rPr>
+          <w:rFonts w:ascii="Aptos Display" w:hAnsi="Aptos Display"/>
+          <w:b/>
+          <w:color w:val="C89B3C"/>
+          <w:sz w:val="28"/>
+        </w:rPr>
+        <w:t>K SCAN AI</w:t>
+      </w:r>
+    </w:p>
+    <w:p>
+      <w:pPr>
         <w:pStyle w:val="Title"/>
+        <w:pBdr>
+          <w:bottom w:val="single" w:sz="10" w:space="6" w:color="C89B3C"/>
+        </w:pBdr>
         <w:jc w:val="center"/>
       </w:pPr>
       <w:r>
-        <w:t>K SCAN AI</w:t>
-      </w:r>
-    </w:p>
-    <w:p>
-      <w:pPr>
-        <w:pStyle w:val="Title"/>
+        <w:t>Privacy Policy</w:t>
+      </w:r>
+    </w:p>
+    <w:p>
+      <w:pPr>
+        <w:pStyle w:val="Subtitle"/>
         <w:jc w:val="center"/>
       </w:pPr>
       <w:r>
-        <w:t>Privacy Policy</w:t>
+        <w:t>Full public policy for the website and current</w:t>
+      </w:r>
+      <w:r>
+        <w:t xml:space="preserve"> mobile app</w:t>
+      </w:r>
+      <w:r>
+        <w:t xml:space="preserve"> release</w:t>
       </w:r>
     </w:p>
     <w:p>
@@ -26,43 +49,92 @@
         <w:jc w:val="center"/>
       </w:pPr>
       <w:r>
-        <w:t xml:space="preserve">Effective Date: June 12, </w:t>
-      </w:r>
-      <w:proofErr w:type="gramStart"/>
-      <w:r>
-        <w:t>2026  |</w:t>
-      </w:r>
-      <w:proofErr w:type="gramEnd"/>
-      <w:r>
-        <w:t xml:space="preserve">  Last Updated: June 12, </w:t>
-      </w:r>
-      <w:proofErr w:type="gramStart"/>
-      <w:r>
-        <w:t>2026  |</w:t>
-      </w:r>
-      <w:proofErr w:type="gramEnd"/>
-      <w:r>
-        <w:t xml:space="preserve">  Contact: kscanai.app@gmail.com</w:t>
-      </w:r>
-    </w:p>
-    <w:p>
-      <w:r>
-        <w:t>K Scan AI ("K Scan," "we," "our," or "us") respects your privacy. This Privacy Policy explains how we collect, use, disclose, retain, and protect information when you use our website, mobile application, APIs, AI systems, StyleChat, Style Library, Dressing Rooms, shopping-assistance tools, and related services (collectively, the "Service").</w:t>
-      </w:r>
-    </w:p>
-    <w:p>
-      <w:r>
-        <w:t>K Scan is a fashion-specific visual discovery, style assistance, and shopping-assistance service. The Service allows users to scan or upload fashion-related images, save style inspiration, use AI-powered StyleChat, organize Dressing Rooms, and receive product, retailer, or marketplace search results or links.</w:t>
-      </w:r>
-    </w:p>
-    <w:p>
-      <w:r>
-        <w:t>This Privacy Policy is written for the current Android and Apple submission posture, including Google Play Android release 1.0.0 and Apple App Store/TestFlight readiness, and for publication on kscan.app. It is intended to describe the current Service unless a feature is expressly identified as future, optional, or configuration-dependent.</w:t>
+        <w:t>Effective Date: June 12, 2026  |  Last Updated: July 18, 2026  |  Contact: kscanai.app@gmail.com</w:t>
+      </w:r>
+    </w:p>
+    <w:tbl>
+      <w:tblPr>
+        <w:tblW w:w="0" w:type="auto"/>
+        <w:jc w:val="center"/>
+        <w:tblLayout w:type="fixed"/>
+        <w:tblLook w:val="04A0" w:firstRow="1" w:lastRow="0" w:firstColumn="1" w:lastColumn="0" w:noHBand="0" w:noVBand="1"/>
+      </w:tblPr>
+      <w:tblGrid>
+        <w:gridCol w:w="9994"/>
+      </w:tblGrid>
+      <w:tr>
+        <w:trPr>
+          <w:jc w:val="center"/>
+        </w:trPr>
+        <w:tc>
+          <w:tcPr>
+            <w:tcW w:w="9994" w:type="dxa"/>
+            <w:shd w:val="clear" w:color="auto" w:fill="F5F2FA"/>
+            <w:tcMar>
+              <w:top w:w="120" w:type="dxa"/>
+              <w:left w:w="160" w:type="dxa"/>
+              <w:bottom w:w="120" w:type="dxa"/>
+              <w:right w:w="160" w:type="dxa"/>
+            </w:tcMar>
+          </w:tcPr>
+          <w:p>
+            <w:pPr>
+              <w:jc w:val="center"/>
+            </w:pPr>
+            <w:r>
+              <w:rPr>
+                <w:b/>
+              </w:rPr>
+              <w:t xml:space="preserve">Governing full HTML version: </w:t>
+            </w:r>
+            <w:hyperlink r:id="rId8">
+              <w:r>
+                <w:rPr>
+                  <w:color w:val="2D1F5E"/>
+                  <w:u w:val="single"/>
+                </w:rPr>
+                <w:t>https://kscan.app/legal/privacy</w:t>
+              </w:r>
+            </w:hyperlink>
+            <w:r>
+              <w:br/>
+              <w:t xml:space="preserve">Public summary: </w:t>
+            </w:r>
+            <w:hyperlink r:id="rId9">
+              <w:r>
+                <w:rPr>
+                  <w:color w:val="2D1F5E"/>
+                  <w:u w:val="single"/>
+                </w:rPr>
+                <w:t>https://kscan.app/privacy</w:t>
+              </w:r>
+            </w:hyperlink>
+          </w:p>
+        </w:tc>
+      </w:tr>
+    </w:tbl>
+    <w:p/>
+    <w:p>
+      <w:r>
+        <w:t>K Scan AI ("K Scan," "we," "our," or "us") respects your privacy. This Privacy Policy explains how we collect, use, disclose, retain, and protect information when you use the K Scan website, Android application, APIs, AI systems, Elise and her StyleChat conversational capability, Style Library, Recent Scans, Dressing Rooms, shopping-assistance tools, and related services (collectively, the "Service").</w:t>
+      </w:r>
+    </w:p>
+    <w:p>
+      <w:r>
+        <w:t>K Scan is a fashion-specific visual discovery, style-assistance, and shopping-assistance service. The current Android open-test release allows users to scan or select one to five fashion-related images, receive AI-generated item and style results, view retailer-neutral shopping options, save scans, use Elise for conversational styling support, and organize or share items through Dressing Rooms.</w:t>
+      </w:r>
+    </w:p>
+    <w:p>
+      <w:r>
+        <w:t>This Policy describes the current Service as of the Last Updated date. Website, investor, demonstration, or roadmap materials may describe planned functionality. Planned functionality is not treated as active data processing unless it is enabled in the Service and described here.</w:t>
       </w:r>
     </w:p>
     <w:p>
       <w:pPr>
         <w:pStyle w:val="Heading1"/>
+        <w:pBdr>
+          <w:bottom w:val="single" w:sz="6" w:space="3" w:color="C89B3C"/>
+        </w:pBdr>
       </w:pPr>
       <w:r>
         <w:t>Privacy Controls Summary</w:t>
@@ -71,1136 +143,1162 @@
     <w:p>
       <w:pPr>
         <w:pStyle w:val="ListBullet"/>
-        <w:spacing w:after="40" w:line="247" w:lineRule="auto"/>
-      </w:pPr>
+        <w:ind w:hanging="187"/>
+      </w:pPr>
+      <w:r>
+        <w:t>K Scan AI is intended for users 18 years of age and older. The Service is not directed to children or minors.</w:t>
+      </w:r>
+    </w:p>
+    <w:p>
+      <w:pPr>
+        <w:pStyle w:val="ListBullet"/>
+        <w:ind w:hanging="187"/>
+      </w:pPr>
+      <w:r>
+        <w:t>Camera and image-picker access are used only when you choose to capture or select fashion-related images.</w:t>
+      </w:r>
+    </w:p>
+    <w:p>
+      <w:pPr>
+        <w:pStyle w:val="ListBullet"/>
+        <w:ind w:hanging="187"/>
+      </w:pPr>
+      <w:r>
+        <w:t>The Android open-test release can process up to five selected images in one scan flow and may identify multiple garments across those images.</w:t>
+      </w:r>
+    </w:p>
+    <w:p>
+      <w:pPr>
+        <w:pStyle w:val="ListBullet"/>
+        <w:ind w:hanging="187"/>
+      </w:pPr>
+      <w:r>
+        <w:t>K Scan is not designed for surveillance, facial recognition, biometric identification, or identifying people. K Scan does not create or retain biometric templates, faceprints, face geometry, or identity profiles.</w:t>
+      </w:r>
+    </w:p>
+    <w:p>
+      <w:pPr>
+        <w:pStyle w:val="ListBullet"/>
+        <w:ind w:hanging="187"/>
+      </w:pPr>
+      <w:r>
+        <w:t>The current release does not guarantee automatic face, bystander, license-plate, or sensitive-document blurring before upload. Avoid submitting sensitive or non-fashion content.</w:t>
+      </w:r>
+    </w:p>
+    <w:p>
+      <w:pPr>
+        <w:pStyle w:val="ListBullet"/>
+        <w:ind w:hanging="187"/>
+      </w:pPr>
+      <w:r>
+        <w:t>Images, prompts, style context, and related information may be processed through K Scan cloud systems and authorized AI providers. The current release is not device-only or cloud-free.</w:t>
+      </w:r>
+    </w:p>
+    <w:p>
+      <w:pPr>
+        <w:pStyle w:val="ListBullet"/>
+        <w:ind w:hanging="187"/>
+      </w:pPr>
+      <w:r>
+        <w:t>Elise spoken responses use text-to-speech. The feature does not record your voice and the Android app does not request microphone permission.</w:t>
+      </w:r>
+    </w:p>
+    <w:p>
+      <w:pPr>
+        <w:pStyle w:val="ListBullet"/>
+        <w:ind w:hanging="187"/>
+      </w:pPr>
+      <w:r>
+        <w:t>Recent Scans and their saved shopping snapshots are device-local by default. Cloud Saved Scans synchronization is disabled by default. Account-backed Dressing Rooms and Shared with Me memberships use cloud services.</w:t>
+      </w:r>
+    </w:p>
+    <w:p>
+      <w:pPr>
+        <w:pStyle w:val="ListBullet"/>
+        <w:ind w:hanging="187"/>
+      </w:pPr>
+      <w:r>
+        <w:t>The Android app may request approximate location only for optional weather-aware styling. It does not request precise or background location in the current release.</w:t>
+      </w:r>
+    </w:p>
+    <w:p>
+      <w:pPr>
+        <w:pStyle w:val="ListBullet"/>
+        <w:ind w:hanging="187"/>
+      </w:pPr>
+      <w:r>
+        <w:t>K Scan does not currently use third-party advertising SDKs or collect Advertising ID for targeted advertising.</w:t>
+      </w:r>
+    </w:p>
+    <w:p>
+      <w:pPr>
+        <w:pStyle w:val="ListBullet"/>
+        <w:ind w:hanging="187"/>
+      </w:pPr>
+      <w:r>
+        <w:t>You may request account deletion. Verified deletion requests are generally processed within 30 days, subject to legal, security, backup, fraud-prevention, and technical limitations.</w:t>
+      </w:r>
+    </w:p>
+    <w:p>
+      <w:pPr>
+        <w:pStyle w:val="Heading1"/>
+        <w:pBdr>
+          <w:bottom w:val="single" w:sz="6" w:space="3" w:color="C89B3C"/>
+        </w:pBdr>
+      </w:pPr>
+      <w:r>
+        <w:lastRenderedPageBreak/>
+        <w:t>1. Scope and Overview</w:t>
+      </w:r>
+    </w:p>
+    <w:p>
+      <w:r>
+        <w:t>This Policy applies to the K Scan website, Android app, beta and open-test releases, APIs, AI systems, and related services unless a separate privacy notice applies. It covers information you provide, information generated through use of the Service, information stored locally on your device, information stored in K Scan cloud systems, and information processed by authorized service providers.</w:t>
+      </w:r>
+    </w:p>
+    <w:p>
+      <w:r>
+        <w:t>The current Android open-test application uses package com.kscanai.app. Platform Data Safety disclosures and in-app disclosures should be read together with this Policy. If a feature materially changes data collection or processing, K Scan will update this Policy and any required platform disclosures before or when the change is enabled.</w:t>
+      </w:r>
+    </w:p>
+    <w:p>
+      <w:pPr>
+        <w:pStyle w:val="Heading1"/>
+        <w:pBdr>
+          <w:bottom w:val="single" w:sz="6" w:space="3" w:color="C89B3C"/>
+        </w:pBdr>
+      </w:pPr>
+      <w:r>
+        <w:t>2. Age Eligibility and 18+ Audience</w:t>
+      </w:r>
+    </w:p>
+    <w:p>
       <w:r>
         <w:t>K Scan AI is intended for users 18 years of age and older. The Service is not directed to children or minors, and users under 18 should not use the Service.</w:t>
       </w:r>
     </w:p>
     <w:p>
+      <w:r>
+        <w:t>K Scan does not knowingly collect personal information from children or minors. If we learn that we collected information from a person under 18, we will take reasonable steps to delete or restrict it, subject to legal, safety, security, fraud-prevention, backup, and technical requirements. K Scan does not participate in Google Play Families or Designed for Families for the current release posture.</w:t>
+      </w:r>
+    </w:p>
+    <w:p>
+      <w:pPr>
+        <w:pStyle w:val="Heading1"/>
+        <w:pBdr>
+          <w:bottom w:val="single" w:sz="6" w:space="3" w:color="C89B3C"/>
+        </w:pBdr>
+      </w:pPr>
+      <w:r>
+        <w:t>3. Key Definitions</w:t>
+      </w:r>
+    </w:p>
+    <w:p>
+      <w:pPr>
+        <w:pStyle w:val="Definition"/>
+      </w:pPr>
+      <w:r>
+        <w:rPr>
+          <w:b/>
+        </w:rPr>
+        <w:t xml:space="preserve">Personal Information or Personal Data: </w:t>
+      </w:r>
+      <w:r>
+        <w:t>Information that identifies, relates to, describes, can reasonably be linked to, or could reasonably identify an individual or household.</w:t>
+      </w:r>
+    </w:p>
+    <w:p>
+      <w:pPr>
+        <w:pStyle w:val="Definition"/>
+      </w:pPr>
+      <w:r>
+        <w:rPr>
+          <w:b/>
+        </w:rPr>
+        <w:t xml:space="preserve">User Content: </w:t>
+      </w:r>
+      <w:r>
+        <w:t>Content a user submits, captures, uploads, saves, sends, or shares through the Service, including images, scan content, Elise or StyleChat messages, room content, notes, captions, and support communications.</w:t>
+      </w:r>
+    </w:p>
+    <w:p>
+      <w:pPr>
+        <w:pStyle w:val="Definition"/>
+      </w:pPr>
+      <w:r>
+        <w:rPr>
+          <w:b/>
+        </w:rPr>
+        <w:t xml:space="preserve">Submitted Visual Data: </w:t>
+      </w:r>
+      <w:r>
+        <w:t>Camera captures, selected photos, screenshots, and other visual inputs submitted for fashion scanning, item recognition, style analysis, shopping assistance, Style Library, Recent Scans, or Dressing Rooms.</w:t>
+      </w:r>
+    </w:p>
+    <w:p>
+      <w:pPr>
+        <w:pStyle w:val="Definition"/>
+      </w:pPr>
+      <w:r>
+        <w:rPr>
+          <w:b/>
+        </w:rPr>
+        <w:t xml:space="preserve">Derived Fashion Data: </w:t>
+      </w:r>
+      <w:r>
+        <w:t>Information generated from Submitted Visual Data or use of the Service, such as garment category, color, texture, silhouette, material estimate, product-match signals, source-image association, shopping queries, and other fashion-related analytical outputs.</w:t>
+      </w:r>
+    </w:p>
+    <w:p>
+      <w:pPr>
+        <w:pStyle w:val="Definition"/>
+      </w:pPr>
+      <w:r>
+        <w:rPr>
+          <w:b/>
+        </w:rPr>
+        <w:t xml:space="preserve">Elise: </w:t>
+      </w:r>
+      <w:r>
+        <w:t>K Scan's AI stylist interface. StyleChat is Elise's conversational capability. Elise may provide text responses and, when enabled and available, generated spoken responses.</w:t>
+      </w:r>
+    </w:p>
+    <w:p>
+      <w:pPr>
+        <w:pStyle w:val="Definition"/>
+      </w:pPr>
+      <w:r>
+        <w:rPr>
+          <w:b/>
+        </w:rPr>
+        <w:t xml:space="preserve">Recent Scans: </w:t>
+      </w:r>
+      <w:r>
+        <w:t>Saved scan records and related commerce snapshots stored on the user's device by default, including available retailer, price, currency, product link, and product-image information captured when the scan is saved.</w:t>
+      </w:r>
+    </w:p>
+    <w:p>
+      <w:pPr>
+        <w:pStyle w:val="Definition"/>
+      </w:pPr>
+      <w:r>
+        <w:rPr>
+          <w:b/>
+        </w:rPr>
+        <w:t xml:space="preserve">Dressing Rooms: </w:t>
+      </w:r>
+      <w:r>
+        <w:t>Account-backed private or shared spaces used to organize, discuss, save, and share fashion-related items and images.</w:t>
+      </w:r>
+    </w:p>
+    <w:p>
+      <w:pPr>
+        <w:pStyle w:val="Definition"/>
+      </w:pPr>
+      <w:r>
+        <w:rPr>
+          <w:b/>
+        </w:rPr>
+        <w:t xml:space="preserve">Aggregated or De-identified Data: </w:t>
+      </w:r>
+      <w:r>
+        <w:t>Information processed or combined so that it does not reasonably identify a person and is subject to controls designed to prevent re-identification.</w:t>
+      </w:r>
+    </w:p>
+    <w:p>
+      <w:pPr>
+        <w:pStyle w:val="Heading1"/>
+        <w:pBdr>
+          <w:bottom w:val="single" w:sz="6" w:space="3" w:color="C89B3C"/>
+        </w:pBdr>
+      </w:pPr>
+      <w:r>
+        <w:lastRenderedPageBreak/>
+        <w:t>4. Information We Collect</w:t>
+      </w:r>
+    </w:p>
+    <w:p>
+      <w:pPr>
+        <w:pStyle w:val="Heading2"/>
+      </w:pPr>
+      <w:r>
+        <w:t>4.1 Account, Contact, and Authentication Information</w:t>
+      </w:r>
+    </w:p>
+    <w:p>
+      <w:r>
+        <w:t>We may collect information you provide directly, including your name if provided, email address, profile settings, support messages, feedback, privacy requests, and other account information. Authentication may be provided through email, Google, Apple, or another enabled provider. We receive only the profile and authentication information permitted by the provider and your settings.</w:t>
+      </w:r>
+    </w:p>
+    <w:p>
+      <w:pPr>
+        <w:pStyle w:val="Heading2"/>
+      </w:pPr>
+      <w:r>
+        <w:t>4.2 Camera, Image Picker, and Multi-Image Scan Data</w:t>
+      </w:r>
+    </w:p>
+    <w:p>
+      <w:r>
+        <w:t>When you intentionally start a scan or select images, K Scan may access the camera or the images you select through the operating-system image picker. The current Android open-test release supports selecting and reviewing between one and five images before submission. You can remove selected images before starting analysis.</w:t>
+      </w:r>
+    </w:p>
+    <w:p>
+      <w:r>
+        <w:t>Submitted Visual Data may be resized, compressed, transmitted through encrypted connections, and processed by K Scan cloud services and authorized AI providers. A scan may produce one result, multiple garment results, partial results, or no result. K Scan may maintain an association between each detected item and its source image so that results, saved items, shopping options, and Dressing Room actions remain understandable.</w:t>
+      </w:r>
+    </w:p>
+    <w:p>
+      <w:r>
+        <w:t>Camera access is activated only when you initiate a camera action. K Scan does not use the camera for continuous monitoring, background capture, or surveillance.</w:t>
+      </w:r>
+    </w:p>
+    <w:p>
+      <w:r>
+        <w:t>The current release does not guarantee that faces, bystanders, license plates, private documents, or other identifying visual elements are detected, removed, blurred, or filtered before transmission. K Scan is designed to analyze clothing and accessories, not people. Do not submit sensitive or non-fashion content unless you intend that content to be processed as part of your request.</w:t>
+      </w:r>
+    </w:p>
+    <w:p>
+      <w:pPr>
+        <w:pStyle w:val="Heading2"/>
+      </w:pPr>
+      <w:r>
+        <w:t>4.3 Device-Local Recent Scans and Commerce Snapshots</w:t>
+      </w:r>
+    </w:p>
+    <w:p>
+      <w:r>
+        <w:t>Recent Scans are stored on the device by default. When you save a scan that contains shopping options, K Scan may store a snapshot of the available retailer, source, price, currency, product link, availability, product type, and product image information. Reopening a saved scan uses that stored snapshot. If no shopping option existed when the scan was saved, none may appear when it is reopened.</w:t>
+      </w:r>
+    </w:p>
+    <w:p>
+      <w:r>
+        <w:t>Cloud Saved Scans synchronization is disabled by default in the current release. Device-local records do not automatically become available on another device. Clearing app data or uninstalling the app may remove device-local records. Account deletion from K Scan cloud systems may not erase a local copy that remains on a disconnected device; you may also delete local records through the app, clear app data, or uninstall the app.</w:t>
+      </w:r>
+    </w:p>
+    <w:p>
+      <w:pPr>
+        <w:pStyle w:val="Heading2"/>
+      </w:pPr>
+      <w:r>
+        <w:t>4.4 Style Library and Account-Backed Content</w:t>
+      </w:r>
+    </w:p>
+    <w:p>
+      <w:r>
+        <w:t>When you save or upload content to account-backed features, K Scan may store the content and related metadata in private cloud storage associated with your account. This may include selected images, item metadata, style preferences, timestamps, and references needed to display, organize, retrieve, or delete the content. Signed or time-limited URLs may be generated to display protected images.</w:t>
+      </w:r>
+    </w:p>
+    <w:p>
+      <w:pPr>
+        <w:pStyle w:val="Heading2"/>
+      </w:pPr>
+      <w:r>
+        <w:t>4.5 Elise, StyleChat, Signature Style, and Spoken Responses</w:t>
+      </w:r>
+    </w:p>
+    <w:p>
+      <w:r>
+        <w:t>When you use Elise or her StyleChat conversational capability, K Scan may process your prompts, messages, selected item or image context, recent conversation context, saved style preferences, and Signature Style signals needed to respond. Signature Style may include fashion preferences inferred from items you save, scan, like, reject, discuss, or organize.</w:t>
+      </w:r>
+    </w:p>
+    <w:p>
+      <w:r>
+        <w:t>When Spoken Responses are enabled, K Scan may send the text of an eligible Elise response, limited message and session identifiers, and the selected stylist voice profile to K Scan's speech service and an authorized text-to-speech provider, currently ElevenLabs, to generate audio and timing information. Generated audio may be cached temporarily on the device for playback and removed after playback, interruption, or cache cleanup.</w:t>
+      </w:r>
+    </w:p>
+    <w:p>
+      <w:r>
+        <w:lastRenderedPageBreak/>
+        <w:t>Spoken Responses do not record your voice. The current Android release does not request microphone permission, does not collect raw microphone audio, and does not create voiceprints or biometric voice identifiers. Spoken Responses may be unavailable because of network conditions, provider availability, account limits, or provider quota.</w:t>
+      </w:r>
+    </w:p>
+    <w:p>
+      <w:pPr>
+        <w:pStyle w:val="Heading2"/>
+      </w:pPr>
+      <w:r>
+        <w:t>4.6 Dressing Rooms, Shared with Me, Messaging, and Sharing</w:t>
+      </w:r>
+    </w:p>
+    <w:p>
+      <w:r>
+        <w:t>Owned Dressing Rooms, room items, and Shared with Me memberships are account-backed. K Scan may process room names, descriptions, item snapshots, images, participants, membership status, messages, reactions, timestamps, invitations, removals, revocations, and related metadata to operate these features.</w:t>
+      </w:r>
+    </w:p>
+    <w:p>
+      <w:r>
+        <w:t>Content you deliberately add to a shared Dressing Room may be visible to room members. Where a room owner enables a share link or public preview, selected room details, items, and images may be visible to anyone who possesses the active link. Share links and memberships may be revoked, but recipients may retain screenshots or copies of content they previously viewed. K Scan does not describe Dressing Rooms as end-to-end encrypted or zero-knowledge storage.</w:t>
+      </w:r>
+    </w:p>
+    <w:p>
+      <w:pPr>
+        <w:pStyle w:val="Heading2"/>
+      </w:pPr>
+      <w:r>
+        <w:t>4.7 Shopping, Retailer, Marketplace, and Product Interaction Data</w:t>
+      </w:r>
+    </w:p>
+    <w:p>
+      <w:r>
+        <w:t>K Scan may process scan-derived product signals, search terms, item attributes, product identifiers, retailer or marketplace identifiers, product URLs, product images, saved items, and outbound-link interactions to return shopping options and retailer-neutral product results. Product availability, pricing, images, currency, and links may change or be incomplete.</w:t>
+      </w:r>
+    </w:p>
+    <w:p>
+      <w:r>
+        <w:t>When you open a third-party retailer or marketplace link, you leave K Scan and the third party's privacy policy applies. K Scan does not intentionally provide raw uploaded images to retailers for their independent use unless separately disclosed. K Scan may receive referral or affiliate compensation from qualifying outbound links, but the current mobile release does not use third-party advertising SDKs or Advertising ID for targeted advertising.</w:t>
+      </w:r>
+    </w:p>
+    <w:p>
+      <w:pPr>
+        <w:pStyle w:val="Heading2"/>
+      </w:pPr>
+      <w:r>
+        <w:t>4.8 Approximate Location</w:t>
+      </w:r>
+    </w:p>
+    <w:p>
+      <w:r>
+        <w:t>The Android app may request approximate location for optional weather-aware styling or localization. K Scan does not request precise location or background location in the current release. If you deny approximate location, core scanning, saving, Dressing Rooms, and Elise text functionality remain available, although optional weather-aware context may be limited.</w:t>
+      </w:r>
+    </w:p>
+    <w:p>
+      <w:r>
+        <w:t>Approximate location may also be inferred from an IP address for security, localization, fraud prevention, or service delivery. K Scan does not use location for continuous tracking.</w:t>
+      </w:r>
+    </w:p>
+    <w:p>
+      <w:pPr>
+        <w:pStyle w:val="Heading2"/>
+      </w:pPr>
+      <w:r>
+        <w:t>4.9 Device, App, Diagnostics, and Security Data</w:t>
+      </w:r>
+    </w:p>
+    <w:p>
+      <w:r>
+        <w:t>We may process device type, operating system, app version, package and build information, language settings, IP address, request metadata, authentication identifiers, app interactions, feature usage, error information, performance information, and security or fraud-prevention signals. The precise data depends on the feature used and the production configuration. The current app does not use a third-party targeted-advertising SDK or collect Advertising ID.</w:t>
+      </w:r>
+    </w:p>
+    <w:p>
+      <w:pPr>
+        <w:pStyle w:val="Heading2"/>
+      </w:pPr>
+      <w:r>
+        <w:t>4.10 Website, Cookies, and Similar Technologies</w:t>
+      </w:r>
+    </w:p>
+    <w:p>
+      <w:r>
+        <w:t>When you use the K Scan website, we may process browser, device, referral, traffic, cookie, and interaction data to operate the website, maintain security, measure performance, and understand usage. Where required by law, non-essential cookies or similar technologies are used only after valid consent.</w:t>
+      </w:r>
+    </w:p>
+    <w:p>
+      <w:pPr>
+        <w:pStyle w:val="Heading1"/>
+        <w:pBdr>
+          <w:bottom w:val="single" w:sz="6" w:space="3" w:color="C89B3C"/>
+        </w:pBdr>
+      </w:pPr>
+      <w:r>
+        <w:t>5. How We Use Information</w:t>
+      </w:r>
+    </w:p>
+    <w:p>
       <w:pPr>
         <w:pStyle w:val="ListBullet"/>
-        <w:spacing w:after="40" w:line="247" w:lineRule="auto"/>
-      </w:pPr>
-      <w:r>
-        <w:t>Your camera, photo library, media picker, and image upload tools are used only when you choose to scan, upload, save, or manage fashion-related images or visual inspiration.</w:t>
+        <w:ind w:hanging="187"/>
+      </w:pPr>
+      <w:r>
+        <w:t>Provide, operate, maintain, secure, and troubleshoot the Service.</w:t>
       </w:r>
     </w:p>
     <w:p>
       <w:pPr>
         <w:pStyle w:val="ListBullet"/>
-        <w:spacing w:after="40" w:line="247" w:lineRule="auto"/>
-      </w:pPr>
-      <w:r>
-        <w:t>K Scan is not designed for surveillance, facial recognition, biometric identification, or identifying people.</w:t>
+        <w:ind w:hanging="187"/>
+      </w:pPr>
+      <w:r>
+        <w:t>Authenticate users and maintain account, session, and actor isolation.</w:t>
       </w:r>
     </w:p>
     <w:p>
       <w:pPr>
         <w:pStyle w:val="ListBullet"/>
-        <w:spacing w:after="40" w:line="247" w:lineRule="auto"/>
-      </w:pPr>
-      <w:r>
-        <w:t>K Scan does not generate, store, or retain biometric templates, face geometry, faceprints, or identity profiles.</w:t>
+        <w:ind w:hanging="187"/>
+      </w:pPr>
+      <w:r>
+        <w:t>Process single-image and multi-image scans and return fashion-related results.</w:t>
       </w:r>
     </w:p>
     <w:p>
       <w:pPr>
         <w:pStyle w:val="ListBullet"/>
-        <w:spacing w:after="40" w:line="247" w:lineRule="auto"/>
-      </w:pPr>
-      <w:r>
-        <w:t>Images, screenshots, StyleChat prompts, and related context may be processed through secure cloud systems and AI providers to provide fashion identification, style assistance, search, matching, and related functionality.</w:t>
+        <w:ind w:hanging="187"/>
+      </w:pPr>
+      <w:r>
+        <w:t>Provide Elise text responses, spoken responses, Signature Style personalization, and related AI functions.</w:t>
       </w:r>
     </w:p>
     <w:p>
       <w:pPr>
         <w:pStyle w:val="ListBullet"/>
-        <w:spacing w:after="40" w:line="247" w:lineRule="auto"/>
-      </w:pPr>
-      <w:r>
-        <w:t>K Scan does not currently claim that image processing is device-only, cloud-free, or subject to face or bystander blurring before upload.</w:t>
+        <w:ind w:hanging="187"/>
+      </w:pPr>
+      <w:r>
+        <w:lastRenderedPageBreak/>
+        <w:t>Save and reopen Recent Scans and stored commerce snapshots.</w:t>
       </w:r>
     </w:p>
     <w:p>
       <w:pPr>
         <w:pStyle w:val="ListBullet"/>
-        <w:spacing w:after="40" w:line="247" w:lineRule="auto"/>
-      </w:pPr>
-      <w:r>
-        <w:t>You should avoid uploading images or messages that include faces, bystanders, license plates, government IDs, financial records, medical information, private documents, or other sensitive or non-fashion personal information unless you intend that content to be processed as part of your request.</w:t>
+        <w:ind w:hanging="187"/>
+      </w:pPr>
+      <w:r>
+        <w:t>Operate Style Library, owned Dressing Rooms, Shared with Me, room sharing, messages, and reactions.</w:t>
       </w:r>
     </w:p>
     <w:p>
       <w:pPr>
         <w:pStyle w:val="ListBullet"/>
-        <w:spacing w:after="40" w:line="247" w:lineRule="auto"/>
-      </w:pPr>
-      <w:r>
-        <w:t>K Scan does not currently use third-party advertising SDKs or collect Advertising ID for targeted advertising in the current release posture. If tracking or advertising SDKs are introduced later, K Scan will update this Policy and request required consent or App Tracking Transparency permission where required.</w:t>
+        <w:ind w:hanging="187"/>
+      </w:pPr>
+      <w:r>
+        <w:t>Return retailer-neutral shopping results and route users to third-party product pages.</w:t>
       </w:r>
     </w:p>
     <w:p>
       <w:pPr>
         <w:pStyle w:val="ListBullet"/>
-        <w:spacing w:after="40" w:line="247" w:lineRule="auto"/>
-      </w:pPr>
-      <w:r>
-        <w:t>You may request account deletion. Deletion requests are generally processed within 30 days, subject to legal, security, fraud-prevention, backup, and technical limitations described below.</w:t>
+        <w:ind w:hanging="187"/>
+      </w:pPr>
+      <w:r>
+        <w:t>Prevent duplicate actions, abuse, fraud, unauthorized access, and cross-account data leakage.</w:t>
       </w:r>
     </w:p>
     <w:p>
       <w:pPr>
         <w:pStyle w:val="ListBullet"/>
-        <w:spacing w:after="40" w:line="247" w:lineRule="auto"/>
-      </w:pPr>
-      <w:r>
-        <w:t>This Policy is provided for transparency about K Scan’s privacy practices. If you have questions, contact us at kscanai.app@gmail.com.</w:t>
+        <w:ind w:hanging="187"/>
+      </w:pPr>
+      <w:r>
+        <w:t>Measure service reliability, diagnose errors, and improve product quality where permitted.</w:t>
+      </w:r>
+    </w:p>
+    <w:p>
+      <w:pPr>
+        <w:pStyle w:val="ListBullet"/>
+        <w:ind w:hanging="187"/>
+      </w:pPr>
+      <w:r>
+        <w:t>Comply with law, respond to lawful requests, enforce terms, and protect users and the Service.</w:t>
+      </w:r>
+    </w:p>
+    <w:p>
+      <w:pPr>
+        <w:pStyle w:val="ListBullet"/>
+        <w:ind w:hanging="187"/>
+      </w:pPr>
+      <w:r>
+        <w:t>Create aggregated or de-identified analytics for internal service improvement, planning, and reporting.</w:t>
       </w:r>
     </w:p>
     <w:p>
       <w:pPr>
         <w:pStyle w:val="Heading1"/>
-      </w:pPr>
-      <w:r>
-        <w:t>1. Scope and Overview</w:t>
-      </w:r>
-    </w:p>
-    <w:p>
-      <w:r>
-        <w:t>This Policy applies to the K Scan website, Android app, iOS app, beta releases, TestFlight releases, APIs, AI systems, and related services unless a separate privacy notice says otherwise. It covers data collected directly from users, data generated through app use, data processed by service providers, and data disclosed to shopping, retailer, marketplace, AI, analytics, infrastructure, and support providers where applicable.</w:t>
-      </w:r>
-    </w:p>
-    <w:p>
-      <w:r>
-        <w:t>Some website, investor, beta, or demonstration materials may show planned, conceptual, or future K Scan capabilities. This Policy describes the currently available Service unless a feature is expressly described as future functionality. If K Scan introduces new functionality that materially changes data collection or processing, such as microphone-based voice search, smart-glasses capture, persistent background capture, checkout/payment processing, or on-device privacy filtering, we will update this Policy, update required Google Play and Apple disclosures, and request any required permissions or consent before enabling that functionality.</w:t>
+        <w:pBdr>
+          <w:bottom w:val="single" w:sz="6" w:space="3" w:color="C89B3C"/>
+        </w:pBdr>
+      </w:pPr>
+      <w:r>
+        <w:t>6. AI Processing and Automated Results</w:t>
+      </w:r>
+    </w:p>
+    <w:p>
+      <w:r>
+        <w:t>K Scan uses cloud-hosted AI and automated systems to identify clothing and accessories, generate fashion attributes, match products, provide Elise responses, generate spoken audio, and personalize style assistance. Depending on the production configuration, providers may include Google Gemini, Supabase-hosted functions, ElevenLabs, and other authorized infrastructure or fallback providers.</w:t>
+      </w:r>
+    </w:p>
+    <w:p>
+      <w:r>
+        <w:t>AI-generated results are probabilistic and may be incomplete, inaccurate, unavailable, offensive, or based on similar rather than exact products. K Scan does not guarantee product identity, brand, authenticity, price, currency, availability, fit, material, retailer listing, or recommendation accuracy. AI Outputs are for fashion discovery and informational use, not professional, legal, medical, financial, authentication, or purchasing advice.</w:t>
+      </w:r>
+    </w:p>
+    <w:p>
+      <w:r>
+        <w:t>K Scan does not use AI to identify people, perform facial recognition, create biometric profiles, infer protected traits for legally significant decisions, or make decisions about employment, housing, credit, health care, insurance, or similar opportunities.</w:t>
       </w:r>
     </w:p>
     <w:p>
       <w:pPr>
         <w:pStyle w:val="Heading1"/>
-      </w:pPr>
-      <w:r>
-        <w:t>2. Age Eligibility and 18+ Target Audience</w:t>
-      </w:r>
-    </w:p>
-    <w:p>
-      <w:r>
-        <w:t>K Scan AI is intended for users 18 years of age and older. The Service is not directed to children or minors. Users under 18 should not use the Service.</w:t>
-      </w:r>
-    </w:p>
-    <w:p>
+        <w:pBdr>
+          <w:bottom w:val="single" w:sz="6" w:space="3" w:color="C89B3C"/>
+        </w:pBdr>
+      </w:pPr>
+      <w:r>
+        <w:t>7. How We Disclose Information</w:t>
+      </w:r>
+    </w:p>
+    <w:p>
+      <w:r>
+        <w:t>K Scan may disclose information to service providers and other recipients only as reasonably necessary for the purposes described in this Policy, based on the feature used, user choices, app version, provider configuration, and legal requirements.</w:t>
+      </w:r>
+    </w:p>
+    <w:p>
+      <w:pPr>
+        <w:pStyle w:val="Heading1"/>
+        <w:pBdr>
+          <w:bottom w:val="single" w:sz="6" w:space="3" w:color="C89B3C"/>
+        </w:pBdr>
+      </w:pPr>
+      <w:r>
+        <w:t>8. Service Providers and Infrastructure</w:t>
+      </w:r>
+    </w:p>
+    <w:p>
+      <w:r>
+        <w:t>K Scan may use providers for authentication, database hosting, storage, cloud infrastructure, AI inference, text-to-speech, product search, email, security, diagnostics, support, account deletion, and app operations. These providers may process account data, Submitted Visual Data, prompts, messages, generated audio, item metadata, diagnostics, and related information as necessary to provide their services.</w:t>
+      </w:r>
+    </w:p>
+    <w:p>
+      <w:r>
+        <w:t>K Scan uses reasonable contractual, technical, and organizational measures designed to have providers handle information consistently with this Policy and applicable law. Provider-specific logging, retention, safety review, quality improvement, and deletion terms may apply. K Scan does not make a zero-retention or no-human-review promise unless the applicable production configuration has been verified and separately disclosed.</w:t>
+      </w:r>
+    </w:p>
+    <w:p>
+      <w:pPr>
+        <w:pStyle w:val="Heading1"/>
+        <w:pBdr>
+          <w:bottom w:val="single" w:sz="6" w:space="3" w:color="C89B3C"/>
+        </w:pBdr>
+      </w:pPr>
+      <w:r>
+        <w:t>9. Retailer, Marketplace, and Product-Search Providers</w:t>
+      </w:r>
+    </w:p>
+    <w:p>
+      <w:r>
+        <w:t>K Scan may disclose limited fashion and product information, such as search terms, garment attributes, product signals, product identifiers, and product URLs, to product-search, commerce, affiliate, retailer, or marketplace providers to return relevant results and route users to third-party pages. When you visit a third party, its privacy policy and terms apply.</w:t>
+      </w:r>
+    </w:p>
+    <w:p>
+      <w:pPr>
+        <w:pStyle w:val="Heading1"/>
+        <w:pBdr>
+          <w:bottom w:val="single" w:sz="6" w:space="3" w:color="C89B3C"/>
+        </w:pBdr>
+      </w:pPr>
+      <w:r>
+        <w:t>10. Analytics, Advertising, and Tracking Posture</w:t>
+      </w:r>
+    </w:p>
+    <w:p>
+      <w:r>
+        <w:t xml:space="preserve">K Scan may use first-party operational logs and basic usage information to maintain security, understand feature performance, diagnose errors, and improve the Service. The current mobile release does not use third-party </w:t>
+      </w:r>
       <w:r>
         <w:lastRenderedPageBreak/>
-        <w:t>K Scan does not knowingly collect personal information from children or minors. If we learn that we have collected information from a person under 18, we will take reasonable steps to delete or restrict that information, subject to legal, safety, security, fraud-prevention, backup, and technical requirements.</w:t>
-      </w:r>
-    </w:p>
-    <w:p>
-      <w:r>
-        <w:t>K Scan does not participate in Google Play Families or Designed for Children for the current release posture.</w:t>
+        <w:t>advertising SDKs, does not collect Advertising ID for targeted advertising, and does not track users across third-party apps or websites for targeted advertising.</w:t>
+      </w:r>
+    </w:p>
+    <w:p>
+      <w:r>
+        <w:t>If K Scan later introduces cross-app tracking, targeted advertising, advertising SDKs, or activities requiring consent or App Tracking Transparency, K Scan will update this Policy and platform disclosures and request required consent before enabling those activities.</w:t>
       </w:r>
     </w:p>
     <w:p>
       <w:pPr>
         <w:pStyle w:val="Heading1"/>
-      </w:pPr>
-      <w:r>
-        <w:t>3. Key Definitions</w:t>
-      </w:r>
-    </w:p>
-    <w:p>
-      <w:r>
-        <w:t>Personal Information / Personal Data: information that identifies, relates to, describes, can reasonably be linked to, or could reasonably identify an individual or household.</w:t>
-      </w:r>
-    </w:p>
-    <w:p>
-      <w:r>
-        <w:t>User Content: content a user submits, uploads, saves, sends, or shares through the Service, including scan images, uploaded photos, screenshots, StyleChat messages, Dressing Room content, notes, captions, shared-room content, and support communications.</w:t>
-      </w:r>
-    </w:p>
-    <w:p>
-      <w:r>
-        <w:t>Submitted Visual Data: camera captures, uploaded photos, screenshots, image files, QR/barcode captures, or other visual inputs submitted to K Scan for scanning, StyleChat, fashion recognition, product matching, product search, visual inspiration, Dressing Room organization, or related functionality.</w:t>
-      </w:r>
-    </w:p>
-    <w:p>
-      <w:r>
-        <w:t>Derived Data: metadata or analysis generated from use of the Service, including garment category, color, texture, style attributes, product-match signals, image-analysis outputs, search terms, product-interest signals, interaction signals, and related analytical outputs.</w:t>
-      </w:r>
-    </w:p>
-    <w:p>
-      <w:r>
-        <w:t>Commercial and Preference Data: saved items, product interactions, style preferences, shopping activity, affiliate attribution data, product-interest signals, inferred fashion interests, and commerce-related preferences.</w:t>
-      </w:r>
-    </w:p>
-    <w:p>
-      <w:r>
-        <w:t>Aggregated, Anonymized, or De-identified Data: information processed or combined so it does not reasonably identify a specific person and is subject to controls designed to prevent re-identification.</w:t>
+        <w:pBdr>
+          <w:bottom w:val="single" w:sz="6" w:space="3" w:color="C89B3C"/>
+        </w:pBdr>
+      </w:pPr>
+      <w:r>
+        <w:t>11. Sale, Sharing, and De-identified Information</w:t>
+      </w:r>
+    </w:p>
+    <w:p>
+      <w:r>
+        <w:t>K Scan does not sell raw scans, uploaded images, Elise messages, biometric identifiers, face templates, voiceprints, precise location, government identification, payment-card information, or sensitive personal information for independent third-party use.</w:t>
+      </w:r>
+    </w:p>
+    <w:p>
+      <w:r>
+        <w:t>K Scan may use aggregated or de-identified information for internal analytics, security, service improvement, product planning, trend analysis, and business reporting, provided the information does not reasonably identify a person. If K Scan later begins a regulated sale or sharing activity, it will provide required notice, consent, and opt-out controls before or when the activity begins.</w:t>
       </w:r>
     </w:p>
     <w:p>
       <w:pPr>
         <w:pStyle w:val="Heading1"/>
-      </w:pPr>
-      <w:r>
-        <w:t>4. Information We Collect</w:t>
-      </w:r>
-    </w:p>
-    <w:p>
-      <w:pPr>
-        <w:pStyle w:val="Heading2"/>
-      </w:pPr>
-      <w:r>
-        <w:t>A. Information You Provide</w:t>
-      </w:r>
-    </w:p>
-    <w:p>
-      <w:r>
-        <w:t>We may collect information you provide directly, including:</w:t>
+        <w:pBdr>
+          <w:bottom w:val="single" w:sz="6" w:space="3" w:color="C89B3C"/>
+        </w:pBdr>
+      </w:pPr>
+      <w:r>
+        <w:t>12. Data Retention</w:t>
+      </w:r>
+    </w:p>
+    <w:p>
+      <w:r>
+        <w:t>K Scan retains information only as long as reasonably necessary for the purposes described in this Policy, unless a longer period is required or permitted by law.</w:t>
       </w:r>
     </w:p>
     <w:p>
       <w:pPr>
         <w:pStyle w:val="ListBullet"/>
-        <w:spacing w:after="40" w:line="247" w:lineRule="auto"/>
-      </w:pPr>
-      <w:r>
-        <w:t>Name, if voluntarily provided</w:t>
+        <w:ind w:hanging="187"/>
+      </w:pPr>
+      <w:r>
+        <w:t>Account and contact data: retained while the account is active and for a reasonable period afterward for support, security, fraud prevention, dispute resolution, or legal compliance.</w:t>
       </w:r>
     </w:p>
     <w:p>
       <w:pPr>
         <w:pStyle w:val="ListBullet"/>
-        <w:spacing w:after="40" w:line="247" w:lineRule="auto"/>
-      </w:pPr>
-      <w:r>
-        <w:t>Email address, including for waitlist signup, beta access, support, account creation, login, marketing communications, or privacy requests</w:t>
+        <w:ind w:hanging="187"/>
+      </w:pPr>
+      <w:r>
+        <w:t>Device-local Recent Scans: retained on the device until deleted in the app, app data is cleared, or the app is uninstalled, subject to device and operating-system behavior.</w:t>
       </w:r>
     </w:p>
     <w:p>
       <w:pPr>
         <w:pStyle w:val="ListBullet"/>
-        <w:spacing w:after="40" w:line="247" w:lineRule="auto"/>
-      </w:pPr>
-      <w:r>
-        <w:t>Account credentials or authentication-related information, where applicable</w:t>
+        <w:ind w:hanging="187"/>
+      </w:pPr>
+      <w:r>
+        <w:t>Account-backed Style Library and Dressing Room data: retained while the account is active or until the user deletes the item, room, membership, or account, subject to backup, security, fraud-prevention, and legal requirements.</w:t>
       </w:r>
     </w:p>
     <w:p>
       <w:pPr>
         <w:pStyle w:val="ListBullet"/>
-        <w:spacing w:after="40" w:line="247" w:lineRule="auto"/>
-      </w:pPr>
-      <w:r>
-        <w:t>Support requests, feedback, communications, privacy requests, and inquiries</w:t>
+        <w:ind w:hanging="187"/>
+      </w:pPr>
+      <w:r>
+        <w:t>Submitted Visual Data used for AI processing: retained only as long as reasonably necessary to process the request, maintain security, troubleshoot, prevent abuse, comply with law, or support an item the user intentionally saves.</w:t>
       </w:r>
     </w:p>
     <w:p>
       <w:pPr>
         <w:pStyle w:val="ListBullet"/>
-        <w:spacing w:after="40" w:line="247" w:lineRule="auto"/>
-      </w:pPr>
-      <w:r>
-        <w:t>Saved items, shopping preferences, profile settings, style preferences, notes, captions, and visual inspiration organization choices</w:t>
+        <w:ind w:hanging="187"/>
+      </w:pPr>
+      <w:r>
+        <w:t>Elise and StyleChat messages: retained as needed to operate sessions, preserve requested history, provide Signature Style context, troubleshoot, maintain security, and honor privacy requests.</w:t>
       </w:r>
     </w:p>
     <w:p>
       <w:pPr>
         <w:pStyle w:val="ListBullet"/>
-        <w:spacing w:after="40" w:line="247" w:lineRule="auto"/>
-      </w:pPr>
-      <w:r>
-        <w:t>StyleChat messages, prompts, responses, image context, and saved chat-related preferences when you use StyleChat or similar AI features</w:t>
-      </w:r>
-    </w:p>
-    <w:p>
-      <w:pPr>
-        <w:pStyle w:val="Heading2"/>
-      </w:pPr>
-      <w:r>
-        <w:t>B. Authentication and Account Data</w:t>
-      </w:r>
-    </w:p>
-    <w:p>
-      <w:r>
-        <w:t>If you create an account or sign in through Google, Sign in with Apple, email, or another authentication provider, we may receive limited profile or authentication information permitted by that provider, such as your name, email address, profile identifier, username, authentication token metadata, or publicly available profile information, depending on your settings and the provider’s rules.</w:t>
-      </w:r>
-    </w:p>
-    <w:p>
-      <w:r>
-        <w:t>We use this information to authenticate users, operate the Service, personalize experiences, maintain account security, support account deletion requests, and comply with legal obligations.</w:t>
-      </w:r>
-    </w:p>
-    <w:p>
-      <w:pPr>
-        <w:pStyle w:val="Heading2"/>
-      </w:pPr>
-      <w:r>
-        <w:t>C. Camera, Image, Scan, QR, Barcode, and Uploaded Visual Data</w:t>
-      </w:r>
-    </w:p>
-    <w:p>
-      <w:r>
-        <w:t>When you choose to use K Scan’s camera, upload an image, scan a screenshot, scan QR/barcode content, or submit a fashion-related visual input, we may process the image or scan input to identify fashion items, style signals, product identifiers, text, QR/barcode content, URLs, related product matches, and related style or shopping context.</w:t>
-      </w:r>
-    </w:p>
-    <w:p>
-      <w:r>
-        <w:t>Camera access is activated only when you intentionally initiate a scan, capture, upload, or QR/barcode action. K Scan does not use the camera for continuous monitoring or background surveillance.</w:t>
-      </w:r>
-    </w:p>
-    <w:p>
-      <w:r>
-        <w:t>Submitted images may be processed locally and/or through secure cloud systems to provide fashion identification, StyleChat, search, matching, product recommendations, product lookup, and related functionality. K Scan does not claim that submitted images are processed only on the device.</w:t>
+        <w:ind w:hanging="187"/>
+      </w:pPr>
+      <w:r>
+        <w:t>Generated spoken-response audio: generally stored temporarily for playback and cache management rather than as a permanent voice recording.</w:t>
+      </w:r>
+    </w:p>
+    <w:p>
+      <w:pPr>
+        <w:pStyle w:val="ListBullet"/>
+        <w:ind w:hanging="187"/>
+      </w:pPr>
+      <w:r>
+        <w:t>Operational logs and diagnostics: retained for a reasonable period for security, reliability, troubleshooting, and legal compliance.</w:t>
+      </w:r>
+    </w:p>
+    <w:p>
+      <w:pPr>
+        <w:pStyle w:val="ListBullet"/>
+        <w:ind w:hanging="187"/>
+      </w:pPr>
+      <w:r>
+        <w:t>Aggregated or de-identified information: may be retained for internal analytics and planning if it cannot reasonably identify a person.</w:t>
+      </w:r>
+    </w:p>
+    <w:p>
+      <w:r>
+        <w:t>Active application systems are generally processed for deletion within 30 days of a verified deletion request. Residual copies may remain in encrypted or access-controlled backups for a limited additional period before expiring through normal backup lifecycle processes, unless a longer period is required or permitted by law.</w:t>
+      </w:r>
+    </w:p>
+    <w:p>
+      <w:pPr>
+        <w:pStyle w:val="Heading1"/>
+        <w:pBdr>
+          <w:bottom w:val="single" w:sz="6" w:space="3" w:color="C89B3C"/>
+        </w:pBdr>
+      </w:pPr>
+      <w:r>
+        <w:t>13. Account Deletion and Privacy Requests</w:t>
+      </w:r>
+    </w:p>
+    <w:p>
+      <w:r>
+        <w:t>You may request deletion through the app at Settings &gt; Account &gt; Delete Account, through the public deletion page, or by contacting K Scan. The external deletion resource is available at https://kscan.app/legal/delete-account.</w:t>
+      </w:r>
+    </w:p>
+    <w:p>
+      <w:r>
+        <w:t>Deletion requests are generally processed within 30 days after verification, subject to legal, security, fraud-prevention, dispute-resolution, backup, and technical limitations. K Scan does not claim that deletion is immediate or fully automated across every system.</w:t>
       </w:r>
     </w:p>
     <w:p>
       <w:r>
         <w:lastRenderedPageBreak/>
-        <w:t>K Scan does not currently claim that faces, bystanders, license plates, private documents, or other identifying visual elements are detected, removed, blurred, or filtered before upload. If your submitted image contains such content, it may be included in the transmitted or stored content because the current release does not remove or obscure those elements before processing.</w:t>
-      </w:r>
-    </w:p>
-    <w:p>
-      <w:r>
-        <w:t>K Scan is designed to analyze garments, accessories, style attributes, product identifiers, QR/barcode content, and product-matching signals, not human faces. K Scan does not use submitted visual data to identify people, verify identity, create biometric profiles, perform facial recognition, perform targeted advertising based on identity, or build identity profiles.</w:t>
-      </w:r>
-    </w:p>
-    <w:p>
-      <w:pPr>
-        <w:pStyle w:val="Heading2"/>
-      </w:pPr>
-      <w:r>
-        <w:t>D. Photo Library, Media Permissions, Style Library, and Dressing Rooms</w:t>
-      </w:r>
-    </w:p>
-    <w:p>
-      <w:r>
-        <w:t>If you choose to upload screenshots, photos, outfit images, mood-board references, shopping screenshots, social-media screenshots, or other images into K Scan features such as Style Library, Dressing Rooms, saved items, style boards, or related private visual-inspiration tools, K Scan may request access to your device’s photo library, media library, image picker, or selected media files, depending on your device settings and operating system.</w:t>
-      </w:r>
-    </w:p>
-    <w:p>
-      <w:r>
-        <w:t>K Scan uses media-library access only when you choose to upload, import, save, or manage an image. K Scan does not use media permissions for background monitoring, continuous media-library scanning, social media scraping, URL importing, link previews, or access to photos or videos that you have not selected or otherwise granted permission to access.</w:t>
-      </w:r>
-    </w:p>
-    <w:p>
-      <w:r>
-        <w:t>Uploaded inspiration images are private to your account by default. Images uploaded to a Dressing Room may also appear in your Style Library and in the selected Dressing Room’s Room Inspiration section. Removing an uploaded image from a Dressing Room may remove only the room link while keeping the underlying Style Library inspiration item. Deleting an uploaded image from your Style Library may remove or hide it from attached Dressing Rooms, subject to the app’s deletion and retention practices.</w:t>
-      </w:r>
-    </w:p>
-    <w:p>
-      <w:r>
-        <w:t>Uploaded inspiration images may be transmitted through encrypted connections to K Scan’s private cloud storage and authorized service providers to provide upload, storage, display, signed-URL access, account, Library, Dressing Room, support, security, fraud-prevention, troubleshooting, quality-improvement, backup, and legal-compliance functions.</w:t>
-      </w:r>
-    </w:p>
-    <w:p>
-      <w:r>
-        <w:t>In the current release posture, uploaded inspiration images are not included in public shared-room previews or public shared-room web pages unless a separate user-facing sharing feature expressly allows that content to be shared and the user chooses to share it. K Scan does not allow anonymous users to upload inspiration images.</w:t>
-      </w:r>
-    </w:p>
-    <w:p>
-      <w:pPr>
-        <w:pStyle w:val="Heading2"/>
-      </w:pPr>
-      <w:r>
-        <w:t>E. StyleChat and User-Generated Messages</w:t>
-      </w:r>
-    </w:p>
-    <w:p>
-      <w:r>
-        <w:t>If you use StyleChat or related AI chat, messaging, or style-assistance features, we may process your messages, prompts, selected image context, saved style preferences, session metadata, and related content needed to provide the feature.</w:t>
-      </w:r>
-    </w:p>
-    <w:p>
-      <w:r>
-        <w:t>StyleChat may be powered by Gemini and/or other AI infrastructure depending on the current production configuration. AI requests may include text, image context, scan-derived attributes, style preferences, product signals, or other information needed to respond to your request.</w:t>
-      </w:r>
-    </w:p>
-    <w:p>
-      <w:r>
-        <w:t>Users should not submit sensitive personal information, health information, financial information, government IDs, private documents, or private information about other people through StyleChat. StyleChat outputs are AI-generated and may be incomplete, inaccurate, unavailable, or based on similar rather than exact matches.</w:t>
-      </w:r>
-    </w:p>
-    <w:p>
-      <w:pPr>
-        <w:pStyle w:val="Heading2"/>
-      </w:pPr>
-      <w:r>
-        <w:t>F. Dressing Rooms, Sharing, and In-App Messaging</w:t>
-      </w:r>
-    </w:p>
-    <w:p>
-      <w:r>
-        <w:t>If you use Dressing Rooms, shared rooms, owner controls, messaging, notes, comments, or similar collaboration features, K Scan may process room names, room descriptions, shared content, uploaded images, messages, participants, timestamps, owner controls, invitation or revocation events, and related metadata to operate those features.</w:t>
-      </w:r>
-    </w:p>
-    <w:p>
-      <w:r>
-        <w:t>Users should only upload or share content they have permission to share. Private-room, signed-link, access-control, and owner-control features are used to operate access control, but K Scan does not describe these features as end-to-end encrypted unless a future version implements and verifies that architecture.</w:t>
-      </w:r>
-    </w:p>
-    <w:p>
-      <w:pPr>
-        <w:pStyle w:val="Heading2"/>
-      </w:pPr>
-      <w:r>
-        <w:t>G. Shopping, Search, Retailer, Marketplace, and Product Lookup Data</w:t>
-      </w:r>
-    </w:p>
-    <w:p>
-      <w:r>
-        <w:t>K Scan may collect and process search terms, scan-derived product signals, item attributes, product identifiers, retailer identifiers, marketplace identifiers, product URLs, product images, outbound retailer clicks, saved items, price alerts, product categories, affiliate attribution data, and other shopping or product interaction data.</w:t>
-      </w:r>
-    </w:p>
-    <w:p>
-      <w:r>
-        <w:t>K Scan may send search terms, item attributes, product signals, retailer identifiers, product URLs, or similar fashion/product data to product-search, affiliate, retailer, commerce, marketplace, or product-lookup providers to return relevant product matches, retailer links, shopping links, or related results.</w:t>
-      </w:r>
-    </w:p>
-    <w:p>
+        <w:t>Cloud account deletion does not necessarily remove device-local Recent Scans from a device that is offline or no longer connected to the account. To remove local records, delete them in the app, clear app data, or uninstall the app. Information may be retained where legally permitted or technically necessary for security, fraud prevention, dispute resolution, tax or accounting obligations, backup integrity, or other legitimate operational purposes.</w:t>
+      </w:r>
+    </w:p>
+    <w:p>
+      <w:pPr>
+        <w:pStyle w:val="Heading1"/>
+        <w:pBdr>
+          <w:bottom w:val="single" w:sz="6" w:space="3" w:color="C89B3C"/>
+        </w:pBdr>
+      </w:pPr>
+      <w:r>
+        <w:t>14. Your Privacy Choices and Controls</w:t>
+      </w:r>
+    </w:p>
+    <w:p>
+      <w:pPr>
+        <w:pStyle w:val="ListBullet"/>
+        <w:ind w:hanging="187"/>
+      </w:pPr>
+      <w:r>
+        <w:t>Use device settings to allow or deny camera, selected-photo, and approximate-location access.</w:t>
+      </w:r>
+    </w:p>
+    <w:p>
+      <w:pPr>
+        <w:pStyle w:val="ListBullet"/>
+        <w:ind w:hanging="187"/>
+      </w:pPr>
+      <w:r>
+        <w:t>Turn Elise Spoken Responses on or off in the app.</w:t>
+      </w:r>
+    </w:p>
+    <w:p>
+      <w:pPr>
+        <w:pStyle w:val="ListBullet"/>
+        <w:ind w:hanging="187"/>
+      </w:pPr>
+      <w:r>
+        <w:t>Delete individual Recent Scans, Style Library items, Dressing Rooms, or memberships where the app provides those controls.</w:t>
+      </w:r>
+    </w:p>
+    <w:p>
+      <w:pPr>
+        <w:pStyle w:val="ListBullet"/>
+        <w:ind w:hanging="187"/>
+      </w:pPr>
+      <w:r>
+        <w:t>Revoke room share links or remove Shared with Me memberships where available.</w:t>
+      </w:r>
+    </w:p>
+    <w:p>
+      <w:pPr>
+        <w:pStyle w:val="ListBullet"/>
+        <w:ind w:hanging="187"/>
+      </w:pPr>
+      <w:r>
+        <w:t>Request access, correction, deletion, export, restriction, objection, or withdrawal of consent where required by law.</w:t>
+      </w:r>
+    </w:p>
+    <w:p>
+      <w:pPr>
+        <w:pStyle w:val="ListBullet"/>
+        <w:ind w:hanging="187"/>
+      </w:pPr>
+      <w:r>
+        <w:t>Opt out of marketing communications through the method included in the communication.</w:t>
+      </w:r>
+    </w:p>
+    <w:p>
+      <w:pPr>
+        <w:pStyle w:val="ListBullet"/>
+        <w:ind w:hanging="187"/>
+      </w:pPr>
+      <w:r>
+        <w:t>Use any legally required sale, sharing, or targeted-advertising opt-out control if such processing is introduced.</w:t>
+      </w:r>
+    </w:p>
+    <w:p>
+      <w:r>
+        <w:t>Privacy requests may be submitted to kscanai.app@gmail.com. We may need to verify your identity before completing certain requests.</w:t>
+      </w:r>
+    </w:p>
+    <w:p>
+      <w:pPr>
+        <w:pStyle w:val="Heading1"/>
+        <w:pBdr>
+          <w:bottom w:val="single" w:sz="6" w:space="3" w:color="C89B3C"/>
+        </w:pBdr>
+      </w:pPr>
+      <w:r>
+        <w:t>15. California and Other U.S. State Privacy Rights</w:t>
+      </w:r>
+    </w:p>
+    <w:p>
+      <w:r>
+        <w:t>Residents of California and other U.S. states with applicable privacy laws may have rights to know, access, correct, delete, obtain a copy of, or opt out of certain processing of personal information, and to avoid unlawful discrimination for exercising those rights, subject to legal exceptions. K Scan honors Global Privacy Control signals where required by law.</w:t>
+      </w:r>
+    </w:p>
+    <w:p>
+      <w:r>
+        <w:t>The current mobile release does not use third-party advertising SDKs or Advertising ID for targeted advertising. K Scan does not sell raw scans, uploaded images, biometric data, or sensitive personal information. Requests may be submitted through available in-app controls, https://kscan.app/legal/delete-account, or kscanai.app@gmail.com.</w:t>
+      </w:r>
+    </w:p>
+    <w:p>
+      <w:pPr>
+        <w:pStyle w:val="Heading1"/>
+        <w:pBdr>
+          <w:bottom w:val="single" w:sz="6" w:space="3" w:color="C89B3C"/>
+        </w:pBdr>
+      </w:pPr>
+      <w:r>
+        <w:t>16. GDPR and UK GDPR Rights and Legal Bases</w:t>
+      </w:r>
+    </w:p>
+    <w:p>
+      <w:r>
+        <w:t>If you are located in the European Economic Area, United Kingdom, or another jurisdiction with similar rights, you may have rights to access, correct, delete, restrict, object, request portability, withdraw consent, and lodge a complaint with a supervisory authority.</w:t>
+      </w:r>
+    </w:p>
+    <w:p>
+      <w:r>
+        <w:t>Possible legal bases include performance of a contract for core Service delivery; consent where required for optional permissions, cookies, marketing, or other optional processing; legitimate interests for security, fraud prevention, diagnostics, service improvement, account support, and commerce routing where lawful; and legal obligations.</w:t>
+      </w:r>
+    </w:p>
+    <w:p>
+      <w:pPr>
+        <w:pStyle w:val="Heading1"/>
+        <w:pBdr>
+          <w:bottom w:val="single" w:sz="6" w:space="3" w:color="C89B3C"/>
+        </w:pBdr>
+      </w:pPr>
+      <w:r>
+        <w:t>17. International Data Transfers</w:t>
+      </w:r>
+    </w:p>
+    <w:p>
+      <w:r>
+        <w:t>Information may be processed in the United States and other countries. Where required, K Scan uses lawful transfer mechanisms and safeguards, which may include Standard Contractual Clauses or other approved mechanisms.</w:t>
+      </w:r>
+    </w:p>
+    <w:p>
+      <w:pPr>
+        <w:pStyle w:val="Heading1"/>
+        <w:pBdr>
+          <w:bottom w:val="single" w:sz="6" w:space="3" w:color="C89B3C"/>
+        </w:pBdr>
+      </w:pPr>
+      <w:r>
+        <w:t>18. Security</w:t>
+      </w:r>
+    </w:p>
+    <w:p>
+      <w:r>
+        <w:t>K Scan implements reasonable administrative, technical, and organizational safeguards designed to protect information, including encryption in transit where appropriate, access controls, private storage where appropriate, actor-scoped authorization, data minimization, and operational security practices. No system can be guaranteed completely secure, and K Scan does not use absolute-security or zero-knowledge claims for the current mobile architecture.</w:t>
+      </w:r>
+    </w:p>
+    <w:p>
+      <w:pPr>
+        <w:pStyle w:val="Heading1"/>
+        <w:pBdr>
+          <w:bottom w:val="single" w:sz="6" w:space="3" w:color="C89B3C"/>
+        </w:pBdr>
+      </w:pPr>
       <w:r>
         <w:lastRenderedPageBreak/>
-        <w:t>K Scan does not intentionally send raw uploaded images to retailers for independent reuse unless separately disclosed. References to retailer, marketplace, or product-search providers do not mean K Scan has an official partnership with any named retailer or marketplace unless we expressly state that a partnership exists.</w:t>
-      </w:r>
-    </w:p>
-    <w:p>
-      <w:pPr>
-        <w:pStyle w:val="Heading2"/>
-      </w:pPr>
-      <w:r>
-        <w:t>H. Device, App, Diagnostics, and Log Data</w:t>
-      </w:r>
-    </w:p>
-    <w:p>
-      <w:r>
-        <w:t>We may collect device, app, diagnostics, and log information, including:</w:t>
-      </w:r>
-    </w:p>
-    <w:p>
-      <w:pPr>
-        <w:pStyle w:val="ListBullet"/>
-        <w:spacing w:after="40" w:line="247" w:lineRule="auto"/>
-      </w:pPr>
-      <w:r>
-        <w:t>Device type, operating system, browser information, app version, package/build information, and language settings</w:t>
-      </w:r>
-    </w:p>
-    <w:p>
-      <w:pPr>
-        <w:pStyle w:val="ListBullet"/>
-        <w:spacing w:after="40" w:line="247" w:lineRule="auto"/>
-      </w:pPr>
-      <w:r>
-        <w:t>IP address and approximate location derived from technical data, where applicable</w:t>
-      </w:r>
-    </w:p>
-    <w:p>
-      <w:pPr>
-        <w:pStyle w:val="ListBullet"/>
-        <w:spacing w:after="40" w:line="247" w:lineRule="auto"/>
-      </w:pPr>
-      <w:r>
-        <w:t>App interactions, session events, feature usage, tap/click events, saved-item interactions, product interactions, and outbound link interactions</w:t>
-      </w:r>
-    </w:p>
-    <w:p>
-      <w:pPr>
-        <w:pStyle w:val="ListBullet"/>
-        <w:spacing w:after="40" w:line="247" w:lineRule="auto"/>
-      </w:pPr>
-      <w:r>
-        <w:t>Crash logs, performance logs, error logs, security logs, request metadata, fraud-prevention signals, and troubleshooting information</w:t>
-      </w:r>
-    </w:p>
-    <w:p>
-      <w:pPr>
-        <w:pStyle w:val="ListBullet"/>
-        <w:spacing w:after="40" w:line="247" w:lineRule="auto"/>
-      </w:pPr>
-      <w:r>
-        <w:t>User ID, account ID, authentication identifiers, or device-level identifiers where used by the applicable app version or SDKs</w:t>
-      </w:r>
-    </w:p>
-    <w:p>
-      <w:pPr>
-        <w:pStyle w:val="Heading2"/>
-      </w:pPr>
-      <w:r>
-        <w:t>I. Website, Cookies, and Similar Technologies</w:t>
-      </w:r>
-    </w:p>
-    <w:p>
-      <w:r>
-        <w:t>When you use the K Scan website, we may collect website traffic data, cookie data, browser information, device information, referral information, and interaction data to operate the site, measure performance, maintain security, understand usage, support marketing where permitted, and comply with legal obligations.</w:t>
-      </w:r>
-    </w:p>
-    <w:p>
-      <w:r>
-        <w:t>Where required by law, non-essential cookies or similar technologies are used only after valid consent. Browser controls, device controls, and legally required privacy-control mechanisms may also be available.</w:t>
+        <w:t>19. Children and Minor Safety</w:t>
+      </w:r>
+    </w:p>
+    <w:p>
+      <w:r>
+        <w:t>The Service is intended for adults 18 and older and is not directed to children or minors. If you believe a minor has provided information to K Scan, contact kscanai.app@gmail.com.</w:t>
       </w:r>
     </w:p>
     <w:p>
       <w:pPr>
         <w:pStyle w:val="Heading1"/>
-      </w:pPr>
-      <w:r>
-        <w:t>5. How We Use Information</w:t>
-      </w:r>
-    </w:p>
-    <w:p>
-      <w:r>
-        <w:t>We may use information to:</w:t>
-      </w:r>
-    </w:p>
-    <w:p>
-      <w:pPr>
-        <w:pStyle w:val="ListBullet"/>
-        <w:spacing w:after="40" w:line="247" w:lineRule="auto"/>
-      </w:pPr>
-      <w:r>
-        <w:t>Provide, operate, maintain, secure, and improve the Service</w:t>
-      </w:r>
-    </w:p>
-    <w:p>
-      <w:pPr>
-        <w:pStyle w:val="ListBullet"/>
-        <w:spacing w:after="40" w:line="247" w:lineRule="auto"/>
-      </w:pPr>
-      <w:r>
-        <w:t>Authenticate users and support account functionality</w:t>
-      </w:r>
-    </w:p>
-    <w:p>
-      <w:pPr>
-        <w:pStyle w:val="ListBullet"/>
-        <w:spacing w:after="40" w:line="247" w:lineRule="auto"/>
-      </w:pPr>
-      <w:r>
-        <w:t>Process scans and uploaded images and generate fashion-related, style-related, commerce-related, visual-search, or product-search results</w:t>
-      </w:r>
-    </w:p>
-    <w:p>
-      <w:pPr>
-        <w:pStyle w:val="ListBullet"/>
-        <w:spacing w:after="40" w:line="247" w:lineRule="auto"/>
-      </w:pPr>
-      <w:r>
-        <w:t>Operate StyleChat and related AI style-assistance functionality</w:t>
-      </w:r>
-    </w:p>
-    <w:p>
-      <w:pPr>
-        <w:pStyle w:val="ListBullet"/>
-        <w:spacing w:after="40" w:line="247" w:lineRule="auto"/>
-      </w:pPr>
-      <w:r>
-        <w:t>Operate Style Library, Dressing Rooms, saved items, sharing, notes, captions, messages, and user controls</w:t>
-      </w:r>
-    </w:p>
-    <w:p>
-      <w:pPr>
-        <w:pStyle w:val="ListBullet"/>
-        <w:spacing w:after="40" w:line="247" w:lineRule="auto"/>
-      </w:pPr>
-      <w:r>
-        <w:t>Personalize product results, style suggestions, recommendations, content, style boards, and user experience</w:t>
-      </w:r>
-    </w:p>
-    <w:p>
-      <w:pPr>
-        <w:pStyle w:val="ListBullet"/>
-        <w:spacing w:after="40" w:line="247" w:lineRule="auto"/>
-      </w:pPr>
-      <w:r>
-        <w:t>Route users to retailer, marketplace, product-search, affiliate, or product pages</w:t>
-      </w:r>
-    </w:p>
-    <w:p>
-      <w:pPr>
-        <w:pStyle w:val="ListBullet"/>
-        <w:spacing w:after="40" w:line="247" w:lineRule="auto"/>
-      </w:pPr>
-      <w:r>
-        <w:t>Measure affiliate attribution, campaign performance, product engagement, and product interaction where permitted</w:t>
-      </w:r>
-    </w:p>
-    <w:p>
-      <w:pPr>
-        <w:pStyle w:val="ListBullet"/>
-        <w:spacing w:after="40" w:line="247" w:lineRule="auto"/>
-      </w:pPr>
-      <w:r>
-        <w:t>Analyze usage trends, diagnose errors, improve AI systems and product quality where permitted, and maintain security</w:t>
-      </w:r>
-    </w:p>
-    <w:p>
-      <w:pPr>
-        <w:pStyle w:val="ListBullet"/>
-        <w:spacing w:after="40" w:line="247" w:lineRule="auto"/>
-      </w:pPr>
-      <w:r>
-        <w:t>Detect fraud, prevent misuse, protect users, enforce legal terms, and comply with legal obligations</w:t>
-      </w:r>
-    </w:p>
-    <w:p>
-      <w:pPr>
-        <w:pStyle w:val="ListBullet"/>
-        <w:spacing w:after="40" w:line="247" w:lineRule="auto"/>
-      </w:pPr>
-      <w:r>
-        <w:t>Generate derived, aggregated, anonymized, or de-identified business intelligence that does not reasonably identify an individual</w:t>
+        <w:pBdr>
+          <w:bottom w:val="single" w:sz="6" w:space="3" w:color="C89B3C"/>
+        </w:pBdr>
+      </w:pPr>
+      <w:r>
+        <w:t>20. Third-Party Links and Retailer Transactions</w:t>
+      </w:r>
+    </w:p>
+    <w:p>
+      <w:r>
+        <w:t>The Service may link to third-party retailers, marketplaces, websites, or apps. K Scan is not responsible for third-party privacy practices, security, pricing, availability, authenticity, shipping, returns, payment processing, or customer service. Purchases are completed directly with the applicable third party unless K Scan expressly discloses otherwise.</w:t>
       </w:r>
     </w:p>
     <w:p>
       <w:pPr>
         <w:pStyle w:val="Heading1"/>
-      </w:pPr>
-      <w:r>
-        <w:t>6. AI Processing and Automated Results</w:t>
-      </w:r>
-    </w:p>
-    <w:p>
-      <w:r>
-        <w:t>K Scan uses cloud-hosted AI and automated systems during the current release posture to identify fashion items, extract product attributes, generate style signals, rank matches, power StyleChat, provide style assistance, and personalize experiences where permitted.</w:t>
-      </w:r>
-    </w:p>
-    <w:p>
-      <w:r>
-        <w:t>Depending on the production provider configuration, AI requests may be processed by providers such as Gemini and/or other AI routing or infrastructure providers. Some AI provider processing may be subject to provider terms that permit safety review, abuse monitoring, quality improvement, logging, or other processing described by that provider.</w:t>
-      </w:r>
-    </w:p>
-    <w:p>
-      <w:r>
-        <w:t>K Scan does not make provider-specific commitments about model training, retention, human review, special provider retention modes, or processor-only handling unless the relevant production configuration and provider terms have been verified and separately disclosed.</w:t>
-      </w:r>
-    </w:p>
-    <w:p>
-      <w:r>
-        <w:t>AI-generated results may be incomplete, inaccurate, unavailable, or based on similar rather than exact matches. K Scan does not guarantee that any product match, price, availability, retailer listing, style attribute, StyleChat response, or recommendation is complete or error-free.</w:t>
-      </w:r>
-    </w:p>
-    <w:p>
-      <w:r>
-        <w:t>K Scan does not use AI systems to identify people, perform facial recognition, generate biometric profiles, infer protected traits, or make decisions about eligibility for employment, housing, credit, health care, insurance, or other legally significant opportunities.</w:t>
+        <w:pBdr>
+          <w:bottom w:val="single" w:sz="6" w:space="3" w:color="C89B3C"/>
+        </w:pBdr>
+      </w:pPr>
+      <w:r>
+        <w:t>21. Payments and Future Paid Features</w:t>
+      </w:r>
+    </w:p>
+    <w:p>
+      <w:r>
+        <w:t>In the current release, shopping actions route users to third-party pages for physical goods. K Scan does not process payment-card information for those purchases. If K Scan later offers paid digital features or subscriptions in the app, it will use Google Play Billing, Apple In-App Purchase, or other required payment methods and will update applicable disclosures.</w:t>
       </w:r>
     </w:p>
     <w:p>
       <w:pPr>
         <w:pStyle w:val="Heading1"/>
+        <w:pBdr>
+          <w:bottom w:val="single" w:sz="6" w:space="3" w:color="C89B3C"/>
+        </w:pBdr>
+      </w:pPr>
+      <w:r>
+        <w:t>22. Platform Privacy Disclosures</w:t>
+      </w:r>
+    </w:p>
+    <w:p>
+      <w:r>
+        <w:t>K Scan will maintain Google Play Data Safety and other platform disclosures that correspond to the applicable app build. Depending on the features used, reportable categories may include contact information, identifiers, photos, User Content, search terms, app activity, product interactions, diagnostics, and approximate location. Platform disclosures must be updated when permissions, SDKs, AI providers, storage practices, or data flows change.</w:t>
+      </w:r>
+    </w:p>
+    <w:p>
+      <w:pPr>
+        <w:pStyle w:val="Heading1"/>
+        <w:pBdr>
+          <w:bottom w:val="single" w:sz="6" w:space="3" w:color="C89B3C"/>
+        </w:pBdr>
+      </w:pPr>
+      <w:r>
+        <w:t>23. Changes to This Policy</w:t>
+      </w:r>
+    </w:p>
+    <w:p>
+      <w:r>
+        <w:t>K Scan may update this Privacy Policy as the Service, data flows, providers, platform requirements, or law changes. For material changes, K Scan will provide additional notice or obtain consent where required. The Last Updated date will be revised when changes are published.</w:t>
+      </w:r>
+    </w:p>
+    <w:p>
+      <w:pPr>
+        <w:pStyle w:val="Heading1"/>
+        <w:pBdr>
+          <w:bottom w:val="single" w:sz="6" w:space="3" w:color="C89B3C"/>
+        </w:pBdr>
+      </w:pPr>
+      <w:r>
+        <w:t>24. Contact Us</w:t>
+      </w:r>
+    </w:p>
+    <w:p>
+      <w:r>
+        <w:t>K Scan AI</w:t>
+      </w:r>
+    </w:p>
+    <w:p>
+      <w:r>
+        <w:rPr>
+          <w:b/>
+        </w:rPr>
+        <w:t xml:space="preserve">Email: </w:t>
+      </w:r>
+      <w:hyperlink r:id="rId10">
+        <w:r>
+          <w:rPr>
+            <w:color w:val="2D1F5E"/>
+            <w:u w:val="single"/>
+          </w:rPr>
+          <w:t>kscanai.app@gmail.com</w:t>
+        </w:r>
+      </w:hyperlink>
+    </w:p>
+    <w:p>
+      <w:r>
+        <w:rPr>
+          <w:b/>
+        </w:rPr>
+        <w:t xml:space="preserve">Website: </w:t>
+      </w:r>
+      <w:hyperlink r:id="rId11">
+        <w:r>
+          <w:rPr>
+            <w:color w:val="2D1F5E"/>
+            <w:u w:val="single"/>
+          </w:rPr>
+          <w:t>https://kscan.app</w:t>
+        </w:r>
+      </w:hyperlink>
+    </w:p>
+    <w:p>
+      <w:r>
+        <w:rPr>
+          <w:b/>
+        </w:rPr>
+        <w:t xml:space="preserve">Full Privacy Policy: </w:t>
+      </w:r>
+      <w:hyperlink r:id="rId12">
+        <w:r>
+          <w:rPr>
+            <w:color w:val="2D1F5E"/>
+            <w:u w:val="single"/>
+          </w:rPr>
+          <w:t>https://kscan.app/legal/privacy</w:t>
+        </w:r>
+      </w:hyperlink>
+    </w:p>
+    <w:p>
+      <w:r>
+        <w:rPr>
+          <w:b/>
+        </w:rPr>
+        <w:t xml:space="preserve">Privacy Summary: </w:t>
+      </w:r>
+      <w:hyperlink r:id="rId13">
+        <w:r>
+          <w:rPr>
+            <w:color w:val="2D1F5E"/>
+            <w:u w:val="single"/>
+          </w:rPr>
+          <w:t>https://kscan.app/privacy</w:t>
+        </w:r>
+      </w:hyperlink>
+    </w:p>
+    <w:p>
+      <w:r>
+        <w:rPr>
+          <w:b/>
+        </w:rPr>
+        <w:t xml:space="preserve">Account Deletion: </w:t>
+      </w:r>
+      <w:hyperlink r:id="rId14">
+        <w:r>
+          <w:rPr>
+            <w:color w:val="2D1F5E"/>
+            <w:u w:val="single"/>
+          </w:rPr>
+          <w:t>https://kscan.app/legal/delete-account</w:t>
+        </w:r>
+      </w:hyperlink>
+    </w:p>
+    <w:p>
+      <w:r>
+        <w:br w:type="page"/>
+      </w:r>
+    </w:p>
+    <w:p>
+      <w:pPr>
+        <w:pStyle w:val="Heading1"/>
+        <w:pBdr>
+          <w:bottom w:val="single" w:sz="6" w:space="3" w:color="C89B3C"/>
+        </w:pBdr>
       </w:pPr>
       <w:r>
         <w:lastRenderedPageBreak/>
-        <w:t>7. How We Disclose Information</w:t>
-      </w:r>
-    </w:p>
-    <w:p>
-      <w:r>
-        <w:t>K Scan may disclose information to the categories of recipients described below. We do not disclose every data category to every recipient. The data disclosed depends on the feature used, the user’s choices, the app version, provider configuration, legal requirements, and applicable privacy controls.</w:t>
-      </w:r>
-    </w:p>
-    <w:p>
-      <w:pPr>
-        <w:pStyle w:val="Heading1"/>
-      </w:pPr>
-      <w:r>
-        <w:t>8. Service Providers and Third-Party Processors</w:t>
-      </w:r>
-    </w:p>
-    <w:p>
-      <w:r>
-        <w:t>K Scan may disclose information to service providers that perform services on our behalf, such as cloud hosting, infrastructure, storage, database hosting, AI inference, AI routing, analytics, diagnostics, email delivery, customer support, authentication, security, fraud prevention, performance monitoring, crash reporting, account deletion workflows, and app operations.</w:t>
-      </w:r>
-    </w:p>
-    <w:p>
-      <w:r>
-        <w:t>Cloud hosting, infrastructure, storage, database, AI, and processing providers may process submitted images, StyleChat messages, account data, log data, diagnostics, and related metadata to operate the Service, return results, maintain security, troubleshoot functionality, prevent fraud, improve quality where permitted, process deletion requests, or comply with law.</w:t>
-      </w:r>
-    </w:p>
-    <w:p>
-      <w:r>
-        <w:t>These providers may process information as permitted by their agreements with K Scan, their applicable provider terms, this Policy, applicable law, platform rules, and user privacy controls. K Scan uses reasonable contractual, technical, and organizational measures designed to have providers handle user data consistently with this Policy and applicable law, but provider-specific retention, logging, and deletion controls should be verified before stronger claims are made.</w:t>
-      </w:r>
-    </w:p>
-    <w:p>
-      <w:pPr>
-        <w:pStyle w:val="Heading1"/>
-      </w:pPr>
-      <w:r>
-        <w:t>9. Retailer, Affiliate, Commerce, Marketplace, and Product-Search Providers</w:t>
-      </w:r>
-    </w:p>
-    <w:p>
-      <w:r>
-        <w:t>K Scan may disclose limited information to retail, affiliate, commerce, marketplace, product-search, and attribution providers to route users to product results, return relevant listings, measure affiliate conversions, confirm referral activity, attribute purchases or clicks, prevent fraud, support campaign reporting, improve product relevance, and support retailer or partner analytics where permitted.</w:t>
-      </w:r>
-    </w:p>
-    <w:p>
-      <w:r>
-        <w:t>This information may include technical referral data, click data, product interaction data, search terms, product identifiers, product URLs, campaign identifiers, transaction attribution data, approximate location derived from technical data, device or browser information, and limited account or identifier data where permitted.</w:t>
-      </w:r>
-    </w:p>
-    <w:p>
-      <w:r>
-        <w:t>When you tap retailer links, marketplace links, product links, or third-party links, you leave K Scan and the third party’s privacy policy and terms apply. K Scan is not responsible for third-party retailer, marketplace, or affiliate privacy practices, pricing, inventory, shipping, returns, payments, or policies.</w:t>
-      </w:r>
-    </w:p>
-    <w:p>
-      <w:pPr>
-        <w:pStyle w:val="Heading1"/>
-      </w:pPr>
-      <w:r>
-        <w:t>10. Analytics, Advertising, Tracking, and Attribution Posture</w:t>
-      </w:r>
-    </w:p>
-    <w:p>
-      <w:r>
-        <w:t>K Scan may collect basic app interactions, diagnostics, logs, performance data, product interaction data, and attribution data to operate and improve the Service, understand feature performance, troubleshoot errors, prevent fraud, and support commerce routing.</w:t>
-      </w:r>
-    </w:p>
-    <w:p>
-      <w:r>
-        <w:t>Based on the current release posture, K Scan does not currently use third-party advertising SDKs or collect Advertising ID for targeted advertising. K Scan does not currently track users across third-party apps and websites for targeted advertising.</w:t>
-      </w:r>
-    </w:p>
-    <w:p>
-      <w:r>
-        <w:t>If K Scan introduces tracking, third-party advertising SDKs, cross-app or cross-site advertising measurement, or other activities requiring consent or Apple App Tracking Transparency permission, K Scan will update this Policy, update required Google Play and Apple disclosures, and request required consent or App Tracking Transparency permission where required before enabling those activities.</w:t>
-      </w:r>
-    </w:p>
-    <w:p>
-      <w:r>
-        <w:t>Denying optional tracking, if ever requested, will not prevent you from using the core camera-search and style-assistance functionality of the Service, although optional personalization, advertising, attribution, or partner-supported experiences may be affected.</w:t>
-      </w:r>
-    </w:p>
-    <w:p>
-      <w:pPr>
-        <w:pStyle w:val="Heading1"/>
-      </w:pPr>
-      <w:r>
-        <w:t>11. Sale, Sharing, and Targeted Advertising Notice</w:t>
-      </w:r>
-    </w:p>
-    <w:p>
-      <w:r>
-        <w:t>Some privacy laws define sale, sharing, targeted advertising, or similar regulated processing broadly. Certain analytics, affiliate attribution, campaign measurement, product-search, commerce, or partner reporting activities described in this Policy may be considered a sale, sharing, targeted advertising, or similar regulated processing under those laws depending on the data flow and jurisdiction.</w:t>
-      </w:r>
-    </w:p>
-    <w:p>
-      <w:r>
-        <w:t>K Scan does not sell raw scans, uploaded images, biometric identifiers, face templates, faceprints, facial recognition data, government identification, payment card information, or sensitive personal information for independent third-party use.</w:t>
-      </w:r>
-    </w:p>
-    <w:p>
-      <w:r>
-        <w:lastRenderedPageBreak/>
-        <w:t>K Scan may create, use, disclose, license, sell, or commercialize aggregated, anonymized, or de-identified data and insights that do not reasonably identify an individual. These insights may include fashion trend signals, product demand patterns, scan-volume trends, category interest data, style-preference trends, geography-level demand signals at city-level or broader aggregation, retailer performance insights, product-match analytics, conversion analytics, anonymized market research, and aggregated commercial intelligence.</w:t>
-      </w:r>
-    </w:p>
-    <w:p>
-      <w:r>
-        <w:t>Where required by law, K Scan will provide required notices, consent mechanisms, opt-out rights, and legally required controls. You may contact kscanai.app@gmail.com for opt-out or privacy requests. You may also use any legally required privacy-control mechanism we make available, including https://kscan.app/do-not-sell-or-share where applicable.</w:t>
-      </w:r>
-    </w:p>
-    <w:p>
-      <w:pPr>
-        <w:pStyle w:val="Heading1"/>
-      </w:pPr>
-      <w:r>
-        <w:t>12. Data Retention</w:t>
-      </w:r>
-    </w:p>
-    <w:p>
-      <w:r>
-        <w:t>We retain information only as long as reasonably necessary for the purposes described in this Policy, unless a longer period is required or permitted by law.</w:t>
-      </w:r>
-    </w:p>
-    <w:p>
-      <w:pPr>
-        <w:pStyle w:val="ListBullet"/>
-        <w:spacing w:after="40" w:line="247" w:lineRule="auto"/>
-      </w:pPr>
-      <w:r>
-        <w:t>Account and contact data: retained for the duration of the relationship and for a reasonable period afterward as needed for account support, legal compliance, security, fraud prevention, dispute resolution, or legitimate business records.</w:t>
-      </w:r>
-    </w:p>
-    <w:p>
-      <w:pPr>
-        <w:pStyle w:val="ListBullet"/>
-        <w:spacing w:after="40" w:line="247" w:lineRule="auto"/>
-      </w:pPr>
-      <w:r>
-        <w:t>Support and communications data: retained as long as reasonably necessary to resolve the issue, maintain business records, protect the Service, or comply with law.</w:t>
-      </w:r>
-    </w:p>
-    <w:p>
-      <w:pPr>
-        <w:pStyle w:val="ListBullet"/>
-        <w:spacing w:after="40" w:line="247" w:lineRule="auto"/>
-      </w:pPr>
-      <w:r>
-        <w:t>Usage, analytics, attribution, diagnostics, and marketing data: retained as long as reasonably necessary for analytics, product improvement, attribution, legal compliance, business reporting, troubleshooting, security, or fraud prevention, unless retained in aggregated, anonymized, or de-identified form.</w:t>
-      </w:r>
-    </w:p>
-    <w:p>
-      <w:pPr>
-        <w:pStyle w:val="ListBullet"/>
-        <w:spacing w:after="40" w:line="247" w:lineRule="auto"/>
-      </w:pPr>
-      <w:r>
-        <w:t>Submitted visual data and AI request data: retained as long as reasonably necessary to provide the requested feature, operate the Service, maintain security, troubleshoot issues, improve quality where permitted, prevent abuse or fraud, comply with law, and support legitimate operational needs.</w:t>
-      </w:r>
-    </w:p>
-    <w:p>
-      <w:pPr>
-        <w:pStyle w:val="ListBullet"/>
-        <w:spacing w:after="40" w:line="247" w:lineRule="auto"/>
-      </w:pPr>
-      <w:r>
-        <w:t>Library, Dressing Room, saved-item, style-board, and user-uploaded inspiration media: retained while your account is active, while the item remains saved, or until you delete the item or your account, unless retention is required or permitted for security, fraud prevention, troubleshooting, support, quality improvement, backup integrity, legal compliance, or another purpose described in this Policy.</w:t>
-      </w:r>
-    </w:p>
-    <w:p>
-      <w:pPr>
-        <w:pStyle w:val="ListBullet"/>
-        <w:spacing w:after="40" w:line="247" w:lineRule="auto"/>
-      </w:pPr>
-      <w:r>
-        <w:t>StyleChat messages, prompts, and related context: retained as needed to operate the feature, maintain chat/session functionality where applicable, troubleshoot issues, maintain security, prevent abuse, improve quality where permitted, comply with law, or support user-requested account deletion and privacy requests.</w:t>
-      </w:r>
-    </w:p>
-    <w:p>
-      <w:pPr>
-        <w:pStyle w:val="ListBullet"/>
-        <w:spacing w:after="40" w:line="247" w:lineRule="auto"/>
-      </w:pPr>
-      <w:r>
-        <w:t>Saved items, scan history, style boards, Dressing Room content, messages, and user preferences: retained while your account is active or until you delete them, unless retention is required or permitted by law.</w:t>
-      </w:r>
-    </w:p>
-    <w:p>
-      <w:pPr>
-        <w:pStyle w:val="ListBullet"/>
-        <w:spacing w:after="40" w:line="247" w:lineRule="auto"/>
-      </w:pPr>
-      <w:r>
-        <w:t>Aggregated, anonymized, or de-identified data: may be retained indefinitely for research, analytics, commercial insights, product improvement, trend analysis, business reporting, retailer insights, partner analytics, and demand-intelligence products, provided it cannot reasonably identify you.</w:t>
-      </w:r>
-    </w:p>
-    <w:p>
-      <w:r>
-        <w:t>Although active application systems are generally processed for deletion within 30 days of a verified deletion request, residual copies may remain in encrypted or access-controlled backups for a limited additional period, such as up to 90 days, before expiring through normal backup lifecycle processes, unless a longer period is required or permitted by law.</w:t>
-      </w:r>
-    </w:p>
-    <w:p>
-      <w:pPr>
-        <w:pStyle w:val="Heading1"/>
-      </w:pPr>
-      <w:r>
-        <w:t>13. Account Deletion and Privacy Requests</w:t>
-      </w:r>
-    </w:p>
-    <w:p>
-      <w:r>
-        <w:t>If you create an account, you may request deletion of your K Scan account and associated personal information. Where available, you may initiate account deletion through the app at Settings &gt; Account &gt; Delete Account. You may also contact kscanai.app@gmail.com for deletion assistance or privacy requests.</w:t>
-      </w:r>
-    </w:p>
-    <w:p>
-      <w:r>
-        <w:t>Deletion requests are generally processed within 30 days after verification, subject to legal, security, fraud-prevention, dispute-resolution, backup, and technical limitations. K Scan does not claim that deletion is immediate, fully automated, or exhaustive across all downstream systems at the moment a request is submitted.</w:t>
-      </w:r>
-    </w:p>
-    <w:p>
-      <w:r>
-        <w:t>When we process a deletion request, we will delete or de-identify account data and associated personal information where required and reasonably feasible, and we will request relevant service providers to take corresponding action where required by law or applicable agreements. Some information may be retained where legally permitted or technically necessary for security, fraud prevention, legal compliance, dispute resolution, tax, accounting, safety, backup integrity, or other legitimate operational purposes.</w:t>
-      </w:r>
-    </w:p>
-    <w:p>
-      <w:r>
-        <w:t>Aggregated, anonymized, or de-identified data that cannot reasonably be linked back to you may be retained.</w:t>
-      </w:r>
-    </w:p>
-    <w:p>
-      <w:pPr>
-        <w:pStyle w:val="Heading1"/>
-      </w:pPr>
-      <w:r>
-        <w:lastRenderedPageBreak/>
-        <w:t>14. Your Privacy Choices and Controls</w:t>
-      </w:r>
-    </w:p>
-    <w:p>
-      <w:r>
-        <w:t>Depending on your location, you may request access, correction, deletion, portability, restriction, objection, or withdrawal of consent for certain personal information. You may also opt out of marketing emails, manage app permissions through your device settings, limit media access, limit camera access, and use legally required privacy-control mechanisms where available.</w:t>
-      </w:r>
-    </w:p>
-    <w:p>
-      <w:r>
-        <w:t>You may contact us at kscanai.app@gmail.com for privacy requests or questions. We may need to verify your identity before completing certain requests.</w:t>
-      </w:r>
-    </w:p>
-    <w:p>
-      <w:pPr>
-        <w:pStyle w:val="Heading1"/>
-      </w:pPr>
-      <w:r>
-        <w:t>15. California and U.S. State Privacy Rights</w:t>
-      </w:r>
-    </w:p>
-    <w:p>
-      <w:r>
-        <w:t>California residents and residents of other U.S. states with privacy laws may have rights to know, access, delete, correct, obtain a copy of, opt out of sale or sharing, opt out of targeted advertising, limit certain uses of sensitive personal information, and avoid discrimination for exercising privacy rights, subject to legal exceptions.</w:t>
-      </w:r>
-    </w:p>
-    <w:p>
-      <w:r>
-        <w:t>K Scan may use, disclose, share, license, sell, or commercialize certain categories of commercial data, preference data, attribution data, analytics data, derived scan signals, and aggregated or de-identified demand intelligence where permitted by law. K Scan will provide required notices, opt-out rights, consent mechanisms, and other legally required controls for activities that constitute sale, sharing, targeted advertising, or similar regulated processing.</w:t>
-      </w:r>
-    </w:p>
-    <w:p>
-      <w:r>
-        <w:t>Where required, you may opt out by using the in-app privacy settings, using any legally required privacy-control mechanism we make available, visiting https://kscan.app/do-not-sell-or-share, or contacting kscanai.app@gmail.com. K Scan honors Global Privacy Control signals where required by applicable law.</w:t>
-      </w:r>
-    </w:p>
-    <w:p>
-      <w:pPr>
-        <w:pStyle w:val="Heading1"/>
-      </w:pPr>
-      <w:r>
-        <w:t>16. GDPR / UK GDPR Rights and Legal Bases</w:t>
-      </w:r>
-    </w:p>
-    <w:p>
-      <w:r>
-        <w:t>If you are located in the European Economic Area, United Kingdom, or another jurisdiction with similar rights, you may have the right to access, correct, delete, restrict, object to processing, request portability, withdraw consent, and lodge a complaint with a supervisory authority.</w:t>
-      </w:r>
-    </w:p>
-    <w:p>
-      <w:r>
-        <w:t>Possible legal bases include contract performance for core service delivery, consent where required for optional analytics, marketing, tracking, cookies, or targeted advertising, legitimate interests for security, fraud prevention, diagnostics, service improvement, account support, style assistance, commerce routing, and limited affiliate attribution where lawful, and legal obligations for compliance and lawful requests.</w:t>
-      </w:r>
-    </w:p>
-    <w:p>
-      <w:r>
-        <w:t>Where consent is required, it will be requested separately from acceptance of Terms, presented in a reasonably granular manner, and may be withdrawn at any time. Withdrawal does not affect processing already completed lawfully before withdrawal, but it may reduce optional personalized, marketing, or partner-supported features.</w:t>
-      </w:r>
-    </w:p>
-    <w:p>
-      <w:pPr>
-        <w:pStyle w:val="Heading1"/>
-      </w:pPr>
-      <w:r>
-        <w:t>17. International Data Transfers</w:t>
-      </w:r>
-    </w:p>
-    <w:p>
-      <w:r>
-        <w:t>Your information may be processed in the United States and other countries. Where required, we use appropriate safeguards such as Standard Contractual Clauses approved by the European Commission, the UK International Data Transfer Addendum, or other lawful transfer mechanisms.</w:t>
-      </w:r>
-    </w:p>
-    <w:p>
-      <w:pPr>
-        <w:pStyle w:val="Heading1"/>
-      </w:pPr>
-      <w:r>
-        <w:t>18. Security</w:t>
-      </w:r>
-    </w:p>
-    <w:p>
-      <w:r>
-        <w:t>We implement reasonable administrative, technical, and organizational safeguards designed to protect information, including encryption in transit where appropriate, access controls, secure infrastructure, private storage where appropriate, data minimization, retention controls, and operational security practices.</w:t>
-      </w:r>
-    </w:p>
-    <w:p>
-      <w:r>
-        <w:t>No system can be guaranteed completely secure. K Scan does not use absolute-security marketing descriptions unless a future system architecture is verified and disclosed.</w:t>
-      </w:r>
-    </w:p>
-    <w:p>
-      <w:pPr>
-        <w:pStyle w:val="Heading1"/>
-      </w:pPr>
-      <w:r>
-        <w:t>19. Children’s Privacy and Minor Safety</w:t>
-      </w:r>
-    </w:p>
-    <w:p>
-      <w:r>
-        <w:t>K Scan AI is intended for users 18 years of age and older. The Service is not directed to children or minors, and users under 18 should not use the Service.</w:t>
-      </w:r>
-    </w:p>
-    <w:p>
-      <w:r>
-        <w:t>We do not knowingly collect personal information from children or minors. If we learn that we collected information from a person under 18, we will take reasonable steps to delete or restrict that information, subject to legal, safety, security, fraud-prevention, backup, and technical requirements.</w:t>
-      </w:r>
-    </w:p>
-    <w:p>
-      <w:pPr>
-        <w:pStyle w:val="Heading1"/>
-      </w:pPr>
-      <w:r>
-        <w:lastRenderedPageBreak/>
-        <w:t>20. Third-Party Links, Retailers, and Marketplaces</w:t>
-      </w:r>
-    </w:p>
-    <w:p>
-      <w:r>
-        <w:t>The Service may link to third-party retailers, marketplaces, websites, platforms, affiliate partners, product-search providers, or services. K Scan is not responsible for third-party privacy practices, content, security, pricing, product availability, shipping, returns, payment processing, or policies.</w:t>
-      </w:r>
-    </w:p>
-    <w:p>
-      <w:r>
-        <w:t>When you leave K Scan and visit a retailer, marketplace, or third-party website or app, that third party’s privacy policy and terms apply.</w:t>
-      </w:r>
-    </w:p>
-    <w:p>
-      <w:pPr>
-        <w:pStyle w:val="Heading1"/>
-      </w:pPr>
-      <w:r>
-        <w:t>21. Payments and Paid Features</w:t>
-      </w:r>
-    </w:p>
-    <w:p>
-      <w:r>
-        <w:t>In the current release posture, purchase-related calls to action are intended to route users to third-party retailer, marketplace, or product pages. K Scan does not complete checkout, process payment cards, or act as the merchant of record for third-party physical goods purchases unless separately disclosed.</w:t>
-      </w:r>
-    </w:p>
-    <w:p>
-      <w:r>
-        <w:t>If K Scan introduces paid digital features, subscriptions, premium AI features, scan quotas, or account upgrades in the iOS app or Android app, those features will be offered in accordance with applicable Apple, Google Play, and payment-provider rules.</w:t>
-      </w:r>
-    </w:p>
-    <w:p>
-      <w:r>
-        <w:t>Retailer links for physical goods may route users to third-party retailer websites or apps. K Scan does not process payment card data for purchases completed directly with third-party retailers.</w:t>
-      </w:r>
-    </w:p>
-    <w:p>
-      <w:pPr>
-        <w:pStyle w:val="Heading1"/>
-      </w:pPr>
-      <w:r>
-        <w:t>22. Cookies and Website Technologies</w:t>
-      </w:r>
-    </w:p>
-    <w:p>
-      <w:r>
-        <w:t>K Scan may use cookies, pixels, SDKs, local storage, analytics tools, and similar technologies on its website to operate the site, understand usage, maintain security, prevent fraud, measure performance, improve content, and support marketing where permitted.</w:t>
-      </w:r>
-    </w:p>
-    <w:p>
-      <w:r>
-        <w:t>Where required by law, non-essential analytics, advertising, and marketing cookies or SDKs are used only after valid consent. You may manage cookies through browser controls and legally required consent tools where available.</w:t>
-      </w:r>
-    </w:p>
-    <w:p>
-      <w:r>
-        <w:t>We currently do not respond to traditional Do Not Track browser signals. Where required by applicable law, we honor Global Privacy Control signals as opt-out requests for sale or sharing.</w:t>
-      </w:r>
-    </w:p>
-    <w:p>
-      <w:pPr>
-        <w:pStyle w:val="Heading1"/>
-      </w:pPr>
-      <w:r>
-        <w:t>23. Data Breach and Security Incident Notice</w:t>
-      </w:r>
-    </w:p>
-    <w:p>
-      <w:r>
-        <w:t>If K Scan becomes aware of a security incident involving personal information, we will investigate and take appropriate steps based on the nature of the incident. Where required by applicable law, we will notify affected users, regulators, or other parties within legally required timeframes.</w:t>
-      </w:r>
-    </w:p>
-    <w:p>
-      <w:pPr>
-        <w:pStyle w:val="Heading1"/>
-      </w:pPr>
-      <w:r>
-        <w:t>24. Platform Privacy Disclosures</w:t>
-      </w:r>
-    </w:p>
-    <w:p>
-      <w:r>
-        <w:t>K Scan will make required platform privacy disclosures for the applicable app version in Google Play Console and App Store Connect. These disclosures may include categories such as contact information, identifiers, user content, uploaded photos or videos, StyleChat messages, search history, app activity, product interactions, diagnostics, approximate location derived from technical data, and other data depending on the final app build and provider configuration.</w:t>
-      </w:r>
-    </w:p>
-    <w:p>
-      <w:r>
-        <w:t>Platform labels and Data Safety answers should be kept accurate and up to date. If the SDK mix, AI provider routing, data flows, account deletion flow, advertising/tracking posture, or permissions change, K Scan will update this Policy and the relevant platform disclosures.</w:t>
-      </w:r>
-    </w:p>
-    <w:p>
-      <w:pPr>
-        <w:pStyle w:val="Heading1"/>
-      </w:pPr>
-      <w:r>
-        <w:t>25. Legal, Compliance, and Policy Review</w:t>
-      </w:r>
-    </w:p>
-    <w:p>
-      <w:r>
-        <w:t>This Privacy Policy is provided for transparency about K Scan’s privacy practices. It may be updated as the Service, data flows, platform requirements, provider configurations, and applicable laws change. If you have questions, contact kscanai.app@gmail.com.</w:t>
-      </w:r>
-    </w:p>
-    <w:p>
-      <w:pPr>
-        <w:pStyle w:val="Heading1"/>
-      </w:pPr>
-      <w:r>
-        <w:t>26. Changes to This Policy</w:t>
-      </w:r>
-    </w:p>
-    <w:p>
-      <w:r>
-        <w:t>We may update this Privacy Policy from time to time. For material changes that expand how personal information may be used, disclosed, shared, or processed, we will provide additional notice where required and obtain consent or other authorization when applicable. We will update the Last Updated date above when changes are made.</w:t>
-      </w:r>
-    </w:p>
-    <w:p>
-      <w:pPr>
-        <w:pStyle w:val="Heading1"/>
-      </w:pPr>
-      <w:r>
-        <w:t>27. Contact Us</w:t>
-      </w:r>
-    </w:p>
-    <w:p>
-      <w:r>
-        <w:t>K Scan AI</w:t>
-      </w:r>
-    </w:p>
-    <w:p>
-      <w:r>
-        <w:lastRenderedPageBreak/>
-        <w:t>Email: kscanai.app@gmail.com</w:t>
-      </w:r>
-    </w:p>
-    <w:p>
-      <w:r>
-        <w:t>Website: https://kscan.app</w:t>
-      </w:r>
-    </w:p>
-    <w:p>
-      <w:r>
-        <w:t>Privacy-first fashion discovery.</w:t>
-      </w:r>
-    </w:p>
-    <w:p>
-      <w:r>
-        <w:br w:type="page"/>
-      </w:r>
-    </w:p>
-    <w:p>
-      <w:pPr>
-        <w:pStyle w:val="Heading1"/>
-      </w:pPr>
-      <w:r>
-        <w:lastRenderedPageBreak/>
-        <w:t>Appendix A — Public Data Category Summary</w:t>
-      </w:r>
-    </w:p>
-    <w:p>
-      <w:r>
-        <w:t>This summary is provided to help users understand the categories of data the current Service may collect or process. The precise categories depend on the feature used, user choices, app permissions, app version, and provider configuration.</w:t>
+        <w:t>Appendix A - Current Data Category Summary</w:t>
       </w:r>
     </w:p>
     <w:tbl>
@@ -1211,25 +1309,29 @@
         <w:tblLook w:val="04A0" w:firstRow="1" w:lastRow="0" w:firstColumn="1" w:lastColumn="0" w:noHBand="0" w:noVBand="1"/>
       </w:tblPr>
       <w:tblGrid>
-        <w:gridCol w:w="1800"/>
-        <w:gridCol w:w="4896"/>
-        <w:gridCol w:w="3744"/>
+        <w:gridCol w:w="3328"/>
+        <w:gridCol w:w="3328"/>
+        <w:gridCol w:w="3328"/>
       </w:tblGrid>
       <w:tr>
         <w:trPr>
+          <w:tblHeader/>
           <w:jc w:val="center"/>
         </w:trPr>
         <w:tc>
           <w:tcPr>
-            <w:tcW w:w="1800" w:type="dxa"/>
-            <w:shd w:val="clear" w:color="auto" w:fill="E5E7EB"/>
+            <w:tcW w:w="3331" w:type="dxa"/>
+            <w:shd w:val="clear" w:color="auto" w:fill="2D1F5E"/>
             <w:vAlign w:val="center"/>
           </w:tcPr>
           <w:p>
+            <w:pPr>
+              <w:jc w:val="center"/>
+            </w:pPr>
             <w:r>
               <w:rPr>
                 <w:b/>
-                <w:sz w:val="17"/>
+                <w:color w:val="FFFFFF"/>
               </w:rPr>
               <w:t>Category</w:t>
             </w:r>
@@ -1237,15 +1339,18 @@
         </w:tc>
         <w:tc>
           <w:tcPr>
-            <w:tcW w:w="4896" w:type="dxa"/>
-            <w:shd w:val="clear" w:color="auto" w:fill="E5E7EB"/>
+            <w:tcW w:w="3331" w:type="dxa"/>
+            <w:shd w:val="clear" w:color="auto" w:fill="2D1F5E"/>
             <w:vAlign w:val="center"/>
           </w:tcPr>
           <w:p>
+            <w:pPr>
+              <w:jc w:val="center"/>
+            </w:pPr>
             <w:r>
               <w:rPr>
                 <w:b/>
-                <w:sz w:val="17"/>
+                <w:color w:val="FFFFFF"/>
               </w:rPr>
               <w:t>Examples</w:t>
             </w:r>
@@ -1253,17 +1358,20 @@
         </w:tc>
         <w:tc>
           <w:tcPr>
-            <w:tcW w:w="3744" w:type="dxa"/>
-            <w:shd w:val="clear" w:color="auto" w:fill="E5E7EB"/>
+            <w:tcW w:w="3331" w:type="dxa"/>
+            <w:shd w:val="clear" w:color="auto" w:fill="2D1F5E"/>
             <w:vAlign w:val="center"/>
           </w:tcPr>
           <w:p>
+            <w:pPr>
+              <w:jc w:val="center"/>
+            </w:pPr>
             <w:r>
               <w:rPr>
                 <w:b/>
-                <w:sz w:val="17"/>
+                <w:color w:val="FFFFFF"/>
               </w:rPr>
-              <w:t>Primary Purposes</w:t>
+              <w:t>Primary purpose</w:t>
             </w:r>
           </w:p>
         </w:tc>
@@ -1274,40 +1382,58 @@
         </w:trPr>
         <w:tc>
           <w:tcPr>
-            <w:tcW w:w="1800" w:type="dxa"/>
+            <w:tcW w:w="3331" w:type="dxa"/>
+            <w:tcMar>
+              <w:top w:w="80" w:type="dxa"/>
+              <w:left w:w="100" w:type="dxa"/>
+              <w:bottom w:w="80" w:type="dxa"/>
+              <w:right w:w="100" w:type="dxa"/>
+            </w:tcMar>
           </w:tcPr>
           <w:p>
             <w:r>
               <w:rPr>
                 <w:sz w:val="16"/>
               </w:rPr>
-              <w:t>Contact Info</w:t>
+              <w:t>Contact information</w:t>
             </w:r>
           </w:p>
         </w:tc>
         <w:tc>
           <w:tcPr>
-            <w:tcW w:w="4896" w:type="dxa"/>
+            <w:tcW w:w="3331" w:type="dxa"/>
+            <w:tcMar>
+              <w:top w:w="80" w:type="dxa"/>
+              <w:left w:w="100" w:type="dxa"/>
+              <w:bottom w:w="80" w:type="dxa"/>
+              <w:right w:w="100" w:type="dxa"/>
+            </w:tcMar>
           </w:tcPr>
           <w:p>
             <w:r>
               <w:rPr>
                 <w:sz w:val="16"/>
               </w:rPr>
-              <w:t>Email address, name if provided, support contact details</w:t>
+              <w:t>Email address and name if provided</w:t>
             </w:r>
           </w:p>
         </w:tc>
         <w:tc>
           <w:tcPr>
-            <w:tcW w:w="3744" w:type="dxa"/>
+            <w:tcW w:w="3331" w:type="dxa"/>
+            <w:tcMar>
+              <w:top w:w="80" w:type="dxa"/>
+              <w:left w:w="100" w:type="dxa"/>
+              <w:bottom w:w="80" w:type="dxa"/>
+              <w:right w:w="100" w:type="dxa"/>
+            </w:tcMar>
           </w:tcPr>
           <w:p>
             <w:r>
               <w:rPr>
                 <w:sz w:val="16"/>
               </w:rPr>
-              <w:t>Account creation, authentication, support, beta access, notices, privacy requests</w:t>
+              <w:t>Authentication, support, notices, privacy requests</w:t>
             </w:r>
           </w:p>
         </w:tc>
@@ -1318,7 +1444,13 @@
         </w:trPr>
         <w:tc>
           <w:tcPr>
-            <w:tcW w:w="1800" w:type="dxa"/>
+            <w:tcW w:w="3331" w:type="dxa"/>
+            <w:tcMar>
+              <w:top w:w="80" w:type="dxa"/>
+              <w:left w:w="100" w:type="dxa"/>
+              <w:bottom w:w="80" w:type="dxa"/>
+              <w:right w:w="100" w:type="dxa"/>
+            </w:tcMar>
           </w:tcPr>
           <w:p>
             <w:r>
@@ -1331,27 +1463,39 @@
         </w:tc>
         <w:tc>
           <w:tcPr>
-            <w:tcW w:w="4896" w:type="dxa"/>
+            <w:tcW w:w="3331" w:type="dxa"/>
+            <w:tcMar>
+              <w:top w:w="80" w:type="dxa"/>
+              <w:left w:w="100" w:type="dxa"/>
+              <w:bottom w:w="80" w:type="dxa"/>
+              <w:right w:w="100" w:type="dxa"/>
+            </w:tcMar>
           </w:tcPr>
           <w:p>
             <w:r>
               <w:rPr>
                 <w:sz w:val="16"/>
               </w:rPr>
-              <w:t>User ID, account ID, authentication identifiers, device-level identifiers where used</w:t>
+              <w:t>User ID, account ID, authentication and session identifiers</w:t>
             </w:r>
           </w:p>
         </w:tc>
         <w:tc>
           <w:tcPr>
-            <w:tcW w:w="3744" w:type="dxa"/>
+            <w:tcW w:w="3331" w:type="dxa"/>
+            <w:tcMar>
+              <w:top w:w="80" w:type="dxa"/>
+              <w:left w:w="100" w:type="dxa"/>
+              <w:bottom w:w="80" w:type="dxa"/>
+              <w:right w:w="100" w:type="dxa"/>
+            </w:tcMar>
           </w:tcPr>
           <w:p>
             <w:r>
               <w:rPr>
                 <w:sz w:val="16"/>
               </w:rPr>
-              <w:t>Authentication, security, account management, diagnostics, fraud prevention</w:t>
+              <w:t>Account security, actor isolation, diagnostics</w:t>
             </w:r>
           </w:p>
         </w:tc>
@@ -1362,40 +1506,58 @@
         </w:trPr>
         <w:tc>
           <w:tcPr>
-            <w:tcW w:w="1800" w:type="dxa"/>
+            <w:tcW w:w="3331" w:type="dxa"/>
+            <w:tcMar>
+              <w:top w:w="80" w:type="dxa"/>
+              <w:left w:w="100" w:type="dxa"/>
+              <w:bottom w:w="80" w:type="dxa"/>
+              <w:right w:w="100" w:type="dxa"/>
+            </w:tcMar>
           </w:tcPr>
           <w:p>
             <w:r>
               <w:rPr>
                 <w:sz w:val="16"/>
               </w:rPr>
-              <w:t>User Content</w:t>
+              <w:t>Photos and User Content</w:t>
             </w:r>
           </w:p>
         </w:tc>
         <w:tc>
           <w:tcPr>
-            <w:tcW w:w="4896" w:type="dxa"/>
+            <w:tcW w:w="3331" w:type="dxa"/>
+            <w:tcMar>
+              <w:top w:w="80" w:type="dxa"/>
+              <w:left w:w="100" w:type="dxa"/>
+              <w:bottom w:w="80" w:type="dxa"/>
+              <w:right w:w="100" w:type="dxa"/>
+            </w:tcMar>
           </w:tcPr>
           <w:p>
             <w:r>
               <w:rPr>
                 <w:sz w:val="16"/>
               </w:rPr>
-              <w:t>Uploaded images, screenshots, scan content, StyleChat messages, notes, captions, Dressing Room content, shared-room content, support messages</w:t>
+              <w:t>Selected images, scans, Elise/StyleChat messages, room content</w:t>
             </w:r>
           </w:p>
         </w:tc>
         <w:tc>
           <w:tcPr>
-            <w:tcW w:w="3744" w:type="dxa"/>
+            <w:tcW w:w="3331" w:type="dxa"/>
+            <w:tcMar>
+              <w:top w:w="80" w:type="dxa"/>
+              <w:left w:w="100" w:type="dxa"/>
+              <w:bottom w:w="80" w:type="dxa"/>
+              <w:right w:w="100" w:type="dxa"/>
+            </w:tcMar>
           </w:tcPr>
           <w:p>
             <w:r>
               <w:rPr>
                 <w:sz w:val="16"/>
               </w:rPr>
-              <w:t>Core app functionality, AI style assistance, storage, display, support, safety, troubleshooting</w:t>
+              <w:t>Scanning, AI styling, saving, sharing, support</w:t>
             </w:r>
           </w:p>
         </w:tc>
@@ -1406,40 +1568,58 @@
         </w:trPr>
         <w:tc>
           <w:tcPr>
-            <w:tcW w:w="1800" w:type="dxa"/>
+            <w:tcW w:w="3331" w:type="dxa"/>
+            <w:tcMar>
+              <w:top w:w="80" w:type="dxa"/>
+              <w:left w:w="100" w:type="dxa"/>
+              <w:bottom w:w="80" w:type="dxa"/>
+              <w:right w:w="100" w:type="dxa"/>
+            </w:tcMar>
           </w:tcPr>
           <w:p>
             <w:r>
               <w:rPr>
                 <w:sz w:val="16"/>
               </w:rPr>
-              <w:t>Search History</w:t>
+              <w:t>Search and commerce data</w:t>
             </w:r>
           </w:p>
         </w:tc>
         <w:tc>
           <w:tcPr>
-            <w:tcW w:w="4896" w:type="dxa"/>
+            <w:tcW w:w="3331" w:type="dxa"/>
+            <w:tcMar>
+              <w:top w:w="80" w:type="dxa"/>
+              <w:left w:w="100" w:type="dxa"/>
+              <w:bottom w:w="80" w:type="dxa"/>
+              <w:right w:w="100" w:type="dxa"/>
+            </w:tcMar>
           </w:tcPr>
           <w:p>
             <w:r>
               <w:rPr>
                 <w:sz w:val="16"/>
               </w:rPr>
-              <w:t>In-app searches, product lookup queries, scan-derived search terms</w:t>
+              <w:t>Product queries, item attributes, retailer links, saved commerce snapshots</w:t>
             </w:r>
           </w:p>
         </w:tc>
         <w:tc>
           <w:tcPr>
-            <w:tcW w:w="3744" w:type="dxa"/>
+            <w:tcW w:w="3331" w:type="dxa"/>
+            <w:tcMar>
+              <w:top w:w="80" w:type="dxa"/>
+              <w:left w:w="100" w:type="dxa"/>
+              <w:bottom w:w="80" w:type="dxa"/>
+              <w:right w:w="100" w:type="dxa"/>
+            </w:tcMar>
           </w:tcPr>
           <w:p>
             <w:r>
               <w:rPr>
                 <w:sz w:val="16"/>
               </w:rPr>
-              <w:t>Search, product matching, retailer results, recommendations, analytics where permitted</w:t>
+              <w:t>Product matching, retailer-neutral routing, reopen behavior</w:t>
             </w:r>
           </w:p>
         </w:tc>
@@ -1450,40 +1630,58 @@
         </w:trPr>
         <w:tc>
           <w:tcPr>
-            <w:tcW w:w="1800" w:type="dxa"/>
+            <w:tcW w:w="3331" w:type="dxa"/>
+            <w:tcMar>
+              <w:top w:w="80" w:type="dxa"/>
+              <w:left w:w="100" w:type="dxa"/>
+              <w:bottom w:w="80" w:type="dxa"/>
+              <w:right w:w="100" w:type="dxa"/>
+            </w:tcMar>
           </w:tcPr>
           <w:p>
             <w:r>
               <w:rPr>
                 <w:sz w:val="16"/>
               </w:rPr>
-              <w:t>Usage Data</w:t>
+              <w:t>App activity</w:t>
             </w:r>
           </w:p>
         </w:tc>
         <w:tc>
           <w:tcPr>
-            <w:tcW w:w="4896" w:type="dxa"/>
+            <w:tcW w:w="3331" w:type="dxa"/>
+            <w:tcMar>
+              <w:top w:w="80" w:type="dxa"/>
+              <w:left w:w="100" w:type="dxa"/>
+              <w:bottom w:w="80" w:type="dxa"/>
+              <w:right w:w="100" w:type="dxa"/>
+            </w:tcMar>
           </w:tcPr>
           <w:p>
             <w:r>
               <w:rPr>
                 <w:sz w:val="16"/>
               </w:rPr>
-              <w:t>App interactions, product interactions, saved items, outbound retailer clicks, feature usage</w:t>
+              <w:t>Feature usage, save actions, room actions, outbound-link interactions</w:t>
             </w:r>
           </w:p>
         </w:tc>
         <w:tc>
           <w:tcPr>
-            <w:tcW w:w="3744" w:type="dxa"/>
+            <w:tcW w:w="3331" w:type="dxa"/>
+            <w:tcMar>
+              <w:top w:w="80" w:type="dxa"/>
+              <w:left w:w="100" w:type="dxa"/>
+              <w:bottom w:w="80" w:type="dxa"/>
+              <w:right w:w="100" w:type="dxa"/>
+            </w:tcMar>
           </w:tcPr>
           <w:p>
             <w:r>
               <w:rPr>
                 <w:sz w:val="16"/>
               </w:rPr>
-              <w:t>App functionality, product improvement, attribution, analytics, personalization where permitted</w:t>
+              <w:t>App functionality, reliability, fraud prevention, internal analytics</w:t>
             </w:r>
           </w:p>
         </w:tc>
@@ -1494,7 +1692,75 @@
         </w:trPr>
         <w:tc>
           <w:tcPr>
-            <w:tcW w:w="1800" w:type="dxa"/>
+            <w:tcW w:w="3331" w:type="dxa"/>
+            <w:tcMar>
+              <w:top w:w="80" w:type="dxa"/>
+              <w:left w:w="100" w:type="dxa"/>
+              <w:bottom w:w="80" w:type="dxa"/>
+              <w:right w:w="100" w:type="dxa"/>
+            </w:tcMar>
+          </w:tcPr>
+          <w:p>
+            <w:r>
+              <w:rPr>
+                <w:sz w:val="16"/>
+              </w:rPr>
+              <w:t>Approximate location</w:t>
+            </w:r>
+          </w:p>
+        </w:tc>
+        <w:tc>
+          <w:tcPr>
+            <w:tcW w:w="3331" w:type="dxa"/>
+            <w:tcMar>
+              <w:top w:w="80" w:type="dxa"/>
+              <w:left w:w="100" w:type="dxa"/>
+              <w:bottom w:w="80" w:type="dxa"/>
+              <w:right w:w="100" w:type="dxa"/>
+            </w:tcMar>
+          </w:tcPr>
+          <w:p>
+            <w:r>
+              <w:rPr>
+                <w:sz w:val="16"/>
+              </w:rPr>
+              <w:t>Optional coarse device location or IP-derived region</w:t>
+            </w:r>
+          </w:p>
+        </w:tc>
+        <w:tc>
+          <w:tcPr>
+            <w:tcW w:w="3331" w:type="dxa"/>
+            <w:tcMar>
+              <w:top w:w="80" w:type="dxa"/>
+              <w:left w:w="100" w:type="dxa"/>
+              <w:bottom w:w="80" w:type="dxa"/>
+              <w:right w:w="100" w:type="dxa"/>
+            </w:tcMar>
+          </w:tcPr>
+          <w:p>
+            <w:r>
+              <w:rPr>
+                <w:sz w:val="16"/>
+              </w:rPr>
+              <w:t>Optional weather context, localization, security</w:t>
+            </w:r>
+          </w:p>
+        </w:tc>
+      </w:tr>
+      <w:tr>
+        <w:trPr>
+          <w:jc w:val="center"/>
+        </w:trPr>
+        <w:tc>
+          <w:tcPr>
+            <w:tcW w:w="3331" w:type="dxa"/>
+            <w:tcMar>
+              <w:top w:w="80" w:type="dxa"/>
+              <w:left w:w="100" w:type="dxa"/>
+              <w:bottom w:w="80" w:type="dxa"/>
+              <w:right w:w="100" w:type="dxa"/>
+            </w:tcMar>
           </w:tcPr>
           <w:p>
             <w:r>
@@ -1507,27 +1773,39 @@
         </w:tc>
         <w:tc>
           <w:tcPr>
-            <w:tcW w:w="4896" w:type="dxa"/>
+            <w:tcW w:w="3331" w:type="dxa"/>
+            <w:tcMar>
+              <w:top w:w="80" w:type="dxa"/>
+              <w:left w:w="100" w:type="dxa"/>
+              <w:bottom w:w="80" w:type="dxa"/>
+              <w:right w:w="100" w:type="dxa"/>
+            </w:tcMar>
           </w:tcPr>
           <w:p>
             <w:r>
               <w:rPr>
                 <w:sz w:val="16"/>
               </w:rPr>
-              <w:t>Crash logs, performance logs, error logs, security logs</w:t>
+              <w:t>Error, performance, request, and security logs</w:t>
             </w:r>
           </w:p>
         </w:tc>
         <w:tc>
           <w:tcPr>
-            <w:tcW w:w="3744" w:type="dxa"/>
+            <w:tcW w:w="3331" w:type="dxa"/>
+            <w:tcMar>
+              <w:top w:w="80" w:type="dxa"/>
+              <w:left w:w="100" w:type="dxa"/>
+              <w:bottom w:w="80" w:type="dxa"/>
+              <w:right w:w="100" w:type="dxa"/>
+            </w:tcMar>
           </w:tcPr>
           <w:p>
             <w:r>
               <w:rPr>
                 <w:sz w:val="16"/>
               </w:rPr>
-              <w:t>Troubleshooting, security, performance, quality improvement</w:t>
+              <w:t>Troubleshooting, reliability, security</w:t>
             </w:r>
           </w:p>
         </w:tc>
@@ -1538,40 +1816,58 @@
         </w:trPr>
         <w:tc>
           <w:tcPr>
-            <w:tcW w:w="1800" w:type="dxa"/>
+            <w:tcW w:w="3331" w:type="dxa"/>
+            <w:tcMar>
+              <w:top w:w="80" w:type="dxa"/>
+              <w:left w:w="100" w:type="dxa"/>
+              <w:bottom w:w="80" w:type="dxa"/>
+              <w:right w:w="100" w:type="dxa"/>
+            </w:tcMar>
           </w:tcPr>
           <w:p>
             <w:r>
               <w:rPr>
                 <w:sz w:val="16"/>
               </w:rPr>
-              <w:t>Approximate Location</w:t>
+              <w:t>Audio</w:t>
             </w:r>
           </w:p>
         </w:tc>
         <w:tc>
           <w:tcPr>
-            <w:tcW w:w="4896" w:type="dxa"/>
+            <w:tcW w:w="3331" w:type="dxa"/>
+            <w:tcMar>
+              <w:top w:w="80" w:type="dxa"/>
+              <w:left w:w="100" w:type="dxa"/>
+              <w:bottom w:w="80" w:type="dxa"/>
+              <w:right w:w="100" w:type="dxa"/>
+            </w:tcMar>
           </w:tcPr>
           <w:p>
             <w:r>
               <w:rPr>
                 <w:sz w:val="16"/>
               </w:rPr>
-              <w:t>Approximate location derived from IP address or technical data, if applicable</w:t>
+              <w:t>Generated Elise speech audio and timing data</w:t>
             </w:r>
           </w:p>
         </w:tc>
         <w:tc>
           <w:tcPr>
-            <w:tcW w:w="3744" w:type="dxa"/>
+            <w:tcW w:w="3331" w:type="dxa"/>
+            <w:tcMar>
+              <w:top w:w="80" w:type="dxa"/>
+              <w:left w:w="100" w:type="dxa"/>
+              <w:bottom w:w="80" w:type="dxa"/>
+              <w:right w:w="100" w:type="dxa"/>
+            </w:tcMar>
           </w:tcPr>
           <w:p>
             <w:r>
               <w:rPr>
                 <w:sz w:val="16"/>
               </w:rPr>
-              <w:t>Security, localization, analytics, product relevance, fraud prevention</w:t>
+              <w:t>Text-to-speech playback; no microphone recording</w:t>
             </w:r>
           </w:p>
         </w:tc>
@@ -1582,40 +1878,58 @@
         </w:trPr>
         <w:tc>
           <w:tcPr>
-            <w:tcW w:w="1800" w:type="dxa"/>
+            <w:tcW w:w="3331" w:type="dxa"/>
+            <w:tcMar>
+              <w:top w:w="80" w:type="dxa"/>
+              <w:left w:w="100" w:type="dxa"/>
+              <w:bottom w:w="80" w:type="dxa"/>
+              <w:right w:w="100" w:type="dxa"/>
+            </w:tcMar>
           </w:tcPr>
           <w:p>
             <w:r>
               <w:rPr>
                 <w:sz w:val="16"/>
               </w:rPr>
-              <w:t>Purchases / Product Interaction</w:t>
+              <w:t>Financial information</w:t>
             </w:r>
           </w:p>
         </w:tc>
         <w:tc>
           <w:tcPr>
-            <w:tcW w:w="4896" w:type="dxa"/>
+            <w:tcW w:w="3331" w:type="dxa"/>
+            <w:tcMar>
+              <w:top w:w="80" w:type="dxa"/>
+              <w:left w:w="100" w:type="dxa"/>
+              <w:bottom w:w="80" w:type="dxa"/>
+              <w:right w:w="100" w:type="dxa"/>
+            </w:tcMar>
           </w:tcPr>
           <w:p>
             <w:r>
               <w:rPr>
                 <w:sz w:val="16"/>
               </w:rPr>
-              <w:t>Retailer clicks, affiliate attribution, purchase-attribution signals where available</w:t>
+              <w:t>Payment-card data for retailer purchases</w:t>
             </w:r>
           </w:p>
         </w:tc>
         <w:tc>
           <w:tcPr>
-            <w:tcW w:w="3744" w:type="dxa"/>
+            <w:tcW w:w="3331" w:type="dxa"/>
+            <w:tcMar>
+              <w:top w:w="80" w:type="dxa"/>
+              <w:left w:w="100" w:type="dxa"/>
+              <w:bottom w:w="80" w:type="dxa"/>
+              <w:right w:w="100" w:type="dxa"/>
+            </w:tcMar>
           </w:tcPr>
           <w:p>
             <w:r>
               <w:rPr>
                 <w:sz w:val="16"/>
               </w:rPr>
-              <w:t>Commerce routing, attribution, partner reporting where permitted</w:t>
+              <w:t>Not collected by K Scan in the current third-party checkout flow</w:t>
             </w:r>
           </w:p>
         </w:tc>
@@ -1626,172 +1940,58 @@
         </w:trPr>
         <w:tc>
           <w:tcPr>
-            <w:tcW w:w="1800" w:type="dxa"/>
+            <w:tcW w:w="3331" w:type="dxa"/>
+            <w:tcMar>
+              <w:top w:w="80" w:type="dxa"/>
+              <w:left w:w="100" w:type="dxa"/>
+              <w:bottom w:w="80" w:type="dxa"/>
+              <w:right w:w="100" w:type="dxa"/>
+            </w:tcMar>
           </w:tcPr>
           <w:p>
             <w:r>
               <w:rPr>
                 <w:sz w:val="16"/>
               </w:rPr>
-              <w:t>Financial Info</w:t>
+              <w:t>Sensitive information</w:t>
             </w:r>
           </w:p>
         </w:tc>
         <w:tc>
           <w:tcPr>
-            <w:tcW w:w="4896" w:type="dxa"/>
+            <w:tcW w:w="3331" w:type="dxa"/>
+            <w:tcMar>
+              <w:top w:w="80" w:type="dxa"/>
+              <w:left w:w="100" w:type="dxa"/>
+              <w:bottom w:w="80" w:type="dxa"/>
+              <w:right w:w="100" w:type="dxa"/>
+            </w:tcMar>
           </w:tcPr>
           <w:p>
             <w:r>
               <w:rPr>
                 <w:sz w:val="16"/>
               </w:rPr>
-              <w:t>Payment card data is not processed by K Scan for third-party physical goods purchases in the current release posture</w:t>
+              <w:t>Not intentionally requested; may appear incidentally in uploaded content</w:t>
             </w:r>
           </w:p>
         </w:tc>
         <w:tc>
           <w:tcPr>
-            <w:tcW w:w="3744" w:type="dxa"/>
+            <w:tcW w:w="3331" w:type="dxa"/>
+            <w:tcMar>
+              <w:top w:w="80" w:type="dxa"/>
+              <w:left w:w="100" w:type="dxa"/>
+              <w:bottom w:w="80" w:type="dxa"/>
+              <w:right w:w="100" w:type="dxa"/>
+            </w:tcMar>
           </w:tcPr>
           <w:p>
             <w:r>
               <w:rPr>
                 <w:sz w:val="16"/>
               </w:rPr>
-              <w:t>Not collected by K Scan for current third-party retailer checkout flows</w:t>
-            </w:r>
-          </w:p>
-        </w:tc>
-      </w:tr>
-      <w:tr>
-        <w:trPr>
-          <w:jc w:val="center"/>
-        </w:trPr>
-        <w:tc>
-          <w:tcPr>
-            <w:tcW w:w="1800" w:type="dxa"/>
-          </w:tcPr>
-          <w:p>
-            <w:r>
-              <w:rPr>
-                <w:sz w:val="16"/>
-              </w:rPr>
-              <w:t>Sensitive Info</w:t>
-            </w:r>
-          </w:p>
-        </w:tc>
-        <w:tc>
-          <w:tcPr>
-            <w:tcW w:w="4896" w:type="dxa"/>
-          </w:tcPr>
-          <w:p>
-            <w:r>
-              <w:rPr>
-                <w:sz w:val="16"/>
-              </w:rPr>
-              <w:t>Not intentionally collected; may be incidentally present in user-uploaded images or messages</w:t>
-            </w:r>
-          </w:p>
-        </w:tc>
-        <w:tc>
-          <w:tcPr>
-            <w:tcW w:w="3744" w:type="dxa"/>
-          </w:tcPr>
-          <w:p>
-            <w:r>
-              <w:rPr>
-                <w:sz w:val="16"/>
-              </w:rPr>
-              <w:t>Users should avoid submitting sensitive personal information</w:t>
-            </w:r>
-          </w:p>
-        </w:tc>
-      </w:tr>
-      <w:tr>
-        <w:trPr>
-          <w:jc w:val="center"/>
-        </w:trPr>
-        <w:tc>
-          <w:tcPr>
-            <w:tcW w:w="1800" w:type="dxa"/>
-          </w:tcPr>
-          <w:p>
-            <w:r>
-              <w:rPr>
-                <w:sz w:val="16"/>
-              </w:rPr>
-              <w:t>Contacts / Health / Fitness / Browsing History</w:t>
-            </w:r>
-          </w:p>
-        </w:tc>
-        <w:tc>
-          <w:tcPr>
-            <w:tcW w:w="4896" w:type="dxa"/>
-          </w:tcPr>
-          <w:p>
-            <w:r>
-              <w:rPr>
-                <w:sz w:val="16"/>
-              </w:rPr>
-              <w:t>Not collected by K Scan as current core app categories unless future features separately disclose otherwise</w:t>
-            </w:r>
-          </w:p>
-        </w:tc>
-        <w:tc>
-          <w:tcPr>
-            <w:tcW w:w="3744" w:type="dxa"/>
-          </w:tcPr>
-          <w:p>
-            <w:r>
-              <w:rPr>
-                <w:sz w:val="16"/>
-              </w:rPr>
-              <w:t>Not applicable to current core functionality</w:t>
-            </w:r>
-          </w:p>
-        </w:tc>
-      </w:tr>
-      <w:tr>
-        <w:trPr>
-          <w:jc w:val="center"/>
-        </w:trPr>
-        <w:tc>
-          <w:tcPr>
-            <w:tcW w:w="1800" w:type="dxa"/>
-          </w:tcPr>
-          <w:p>
-            <w:r>
-              <w:rPr>
-                <w:sz w:val="16"/>
-              </w:rPr>
-              <w:t>Other Data</w:t>
-            </w:r>
-          </w:p>
-        </w:tc>
-        <w:tc>
-          <w:tcPr>
-            <w:tcW w:w="4896" w:type="dxa"/>
-          </w:tcPr>
-          <w:p>
-            <w:r>
-              <w:rPr>
-                <w:sz w:val="16"/>
-              </w:rPr>
-              <w:t>Style preferences, garment attributes, product signals, derived fashion interests</w:t>
-            </w:r>
-          </w:p>
-        </w:tc>
-        <w:tc>
-          <w:tcPr>
-            <w:tcW w:w="3744" w:type="dxa"/>
-          </w:tcPr>
-          <w:p>
-            <w:r>
-              <w:rPr>
-                <w:sz w:val="16"/>
-              </w:rPr>
-              <w:t>Recommendations, product matching, personalization, analytics, aggregated insights where permitted</w:t>
+              <w:t>Users should avoid submitting sensitive or non-fashion information</w:t>
             </w:r>
           </w:p>
         </w:tc>
@@ -1799,10 +1999,10 @@
     </w:tbl>
     <w:p/>
     <w:sectPr>
-      <w:headerReference w:type="default" r:id="rId8"/>
-      <w:footerReference w:type="default" r:id="rId9"/>
+      <w:headerReference w:type="default" r:id="rId15"/>
+      <w:footerReference w:type="default" r:id="rId16"/>
       <w:pgSz w:w="12240" w:h="15840"/>
-      <w:pgMar w:top="792" w:right="893" w:bottom="792" w:left="893" w:header="360" w:footer="360" w:gutter="0"/>
+      <w:pgMar w:top="936" w:right="1123" w:bottom="936" w:left="1123" w:header="432" w:footer="432" w:gutter="0"/>
       <w:cols w:space="720"/>
       <w:docGrid w:linePitch="360"/>
     </w:sectPr>
@@ -1839,15 +2039,40 @@
 <w:ftr xmlns:wpc="http://schemas.microsoft.com/office/word/2010/wordprocessingCanvas" xmlns:cx="http://schemas.microsoft.com/office/drawing/2014/chartex" xmlns:cx1="http://schemas.microsoft.com/office/drawing/2015/9/8/chartex" xmlns:cx2="http://schemas.microsoft.com/office/drawing/2015/10/21/chartex" xmlns:cx3="http://schemas.microsoft.com/office/drawing/2016/5/9/chartex" xmlns:cx4="http://schemas.microsoft.com/office/drawing/2016/5/10/chartex" xmlns:cx5="http://schemas.microsoft.com/office/drawing/2016/5/11/chartex" xmlns:cx6="http://schemas.microsoft.com/office/drawing/2016/5/12/chartex" xmlns:cx7="http://schemas.microsoft.com/office/drawing/2016/5/13/chartex" xmlns:cx8="http://schemas.microsoft.com/office/drawing/2016/5/14/chartex" xmlns:mc="http://schemas.openxmlformats.org/markup-compatibility/2006" xmlns:aink="http://schemas.microsoft.com/office/drawing/2016/ink" xmlns:am3d="http://schemas.microsoft.com/office/drawing/2017/model3d" xmlns:o="urn:schemas-microsoft-com:office:office" xmlns:oel="http://schemas.microsoft.com/office/2019/extlst" xmlns:r="http://schemas.openxmlformats.org/officeDocument/2006/relationships" xmlns:m="http://schemas.openxmlformats.org/officeDocument/2006/math" xmlns:v="urn:schemas-microsoft-com:vml" xmlns:wp14="http://schemas.microsoft.com/office/word/2010/wordprocessingDrawing" xmlns:wp="http://schemas.openxmlformats.org/drawingml/2006/wordprocessingDrawing" xmlns:w10="urn:schemas-microsoft-com:office:word" xmlns:w="http://schemas.openxmlformats.org/wordprocessingml/2006/main" xmlns:w14="http://schemas.microsoft.com/office/word/2010/wordml" xmlns:w15="http://schemas.microsoft.com/office/word/2012/wordml" xmlns:w16cex="http://schemas.microsoft.com/office/word/2018/wordml/cex" xmlns:w16cid="http://schemas.microsoft.com/office/word/2016/wordml/cid" xmlns:w16="http://schemas.microsoft.com/office/word/2018/wordml" xmlns:w16du="http://schemas.microsoft.com/office/word/2023/wordml/word16du" xmlns:w16sdtdh="http://schemas.microsoft.com/office/word/2020/wordml/sdtdatahash" xmlns:w16sdtfl="http://schemas.microsoft.com/office/word/2024/wordml/sdtformatlock" xmlns:w16se="http://schemas.microsoft.com/office/word/2015/wordml/symex" xmlns:wpg="http://schemas.microsoft.com/office/word/2010/wordprocessingGroup" xmlns:wpi="http://schemas.microsoft.com/office/word/2010/wordprocessingInk" xmlns:wne="http://schemas.microsoft.com/office/word/2006/wordml" xmlns:wps="http://schemas.microsoft.com/office/word/2010/wordprocessingShape" mc:Ignorable="w14 w15 w16se w16cid w16 w16cex w16sdtdh w16sdtfl w16du wp14">
   <w:p>
     <w:pPr>
-      <w:pStyle w:val="Footer"/>
+      <w:pStyle w:val="Meta"/>
       <w:jc w:val="center"/>
     </w:pPr>
     <w:r>
-      <w:rPr>
-        <w:color w:val="6B7280"/>
-        <w:sz w:val="16"/>
-      </w:rPr>
-      <w:t>Website, Google Play, and Apple App Store submission-ready public policy version</w:t>
+      <w:t xml:space="preserve">K Scan AI  |  </w:t>
+    </w:r>
+    <w:hyperlink r:id="rId1">
+      <w:r>
+        <w:rPr>
+          <w:color w:val="2D1F5E"/>
+        </w:rPr>
+        <w:t>https://kscan.app/legal/privacy</w:t>
+      </w:r>
+    </w:hyperlink>
+    <w:r>
+      <w:t xml:space="preserve">  |  </w:t>
+    </w:r>
+    <w:r>
+      <w:fldChar w:fldCharType="begin"/>
+    </w:r>
+    <w:r>
+      <w:instrText xml:space="preserve"> PAGE </w:instrText>
+    </w:r>
+    <w:r>
+      <w:fldChar w:fldCharType="separate"/>
+    </w:r>
+    <w:r>
+      <w:rPr>
+        <w:noProof/>
+      </w:rPr>
+      <w:t>1</w:t>
+    </w:r>
+    <w:r>
+      <w:fldChar w:fldCharType="end"/>
     </w:r>
   </w:p>
 </w:ftr>
@@ -1882,31 +2107,11 @@
 <w:hdr xmlns:wpc="http://schemas.microsoft.com/office/word/2010/wordprocessingCanvas" xmlns:cx="http://schemas.microsoft.com/office/drawing/2014/chartex" xmlns:cx1="http://schemas.microsoft.com/office/drawing/2015/9/8/chartex" xmlns:cx2="http://schemas.microsoft.com/office/drawing/2015/10/21/chartex" xmlns:cx3="http://schemas.microsoft.com/office/drawing/2016/5/9/chartex" xmlns:cx4="http://schemas.microsoft.com/office/drawing/2016/5/10/chartex" xmlns:cx5="http://schemas.microsoft.com/office/drawing/2016/5/11/chartex" xmlns:cx6="http://schemas.microsoft.com/office/drawing/2016/5/12/chartex" xmlns:cx7="http://schemas.microsoft.com/office/drawing/2016/5/13/chartex" xmlns:cx8="http://schemas.microsoft.com/office/drawing/2016/5/14/chartex" xmlns:mc="http://schemas.openxmlformats.org/markup-compatibility/2006" xmlns:aink="http://schemas.microsoft.com/office/drawing/2016/ink" xmlns:am3d="http://schemas.microsoft.com/office/drawing/2017/model3d" xmlns:o="urn:schemas-microsoft-com:office:office" xmlns:oel="http://schemas.microsoft.com/office/2019/extlst" xmlns:r="http://schemas.openxmlformats.org/officeDocument/2006/relationships" xmlns:m="http://schemas.openxmlformats.org/officeDocument/2006/math" xmlns:v="urn:schemas-microsoft-com:vml" xmlns:wp14="http://schemas.microsoft.com/office/word/2010/wordprocessingDrawing" xmlns:wp="http://schemas.openxmlformats.org/drawingml/2006/wordprocessingDrawing" xmlns:w10="urn:schemas-microsoft-com:office:word" xmlns:w="http://schemas.openxmlformats.org/wordprocessingml/2006/main" xmlns:w14="http://schemas.microsoft.com/office/word/2010/wordml" xmlns:w15="http://schemas.microsoft.com/office/word/2012/wordml" xmlns:w16cex="http://schemas.microsoft.com/office/word/2018/wordml/cex" xmlns:w16cid="http://schemas.microsoft.com/office/word/2016/wordml/cid" xmlns:w16="http://schemas.microsoft.com/office/word/2018/wordml" xmlns:w16du="http://schemas.microsoft.com/office/word/2023/wordml/word16du" xmlns:w16sdtdh="http://schemas.microsoft.com/office/word/2020/wordml/sdtdatahash" xmlns:w16sdtfl="http://schemas.microsoft.com/office/word/2024/wordml/sdtformatlock" xmlns:w16se="http://schemas.microsoft.com/office/word/2015/wordml/symex" xmlns:wpg="http://schemas.microsoft.com/office/word/2010/wordprocessingGroup" xmlns:wpi="http://schemas.microsoft.com/office/word/2010/wordprocessingInk" xmlns:wne="http://schemas.microsoft.com/office/word/2006/wordml" xmlns:wps="http://schemas.microsoft.com/office/word/2010/wordprocessingShape" mc:Ignorable="w14 w15 w16se w16cid w16 w16cex w16sdtdh w16sdtfl w16du wp14">
   <w:p>
     <w:pPr>
-      <w:pStyle w:val="Header"/>
-      <w:jc w:val="center"/>
+      <w:pStyle w:val="Meta"/>
+      <w:jc w:val="right"/>
     </w:pPr>
     <w:r>
-      <w:rPr>
-        <w:color w:val="6B7280"/>
-        <w:sz w:val="16"/>
-      </w:rPr>
-      <w:t xml:space="preserve">K Scan </w:t>
-    </w:r>
-    <w:proofErr w:type="gramStart"/>
-    <w:r>
-      <w:rPr>
-        <w:color w:val="6B7280"/>
-        <w:sz w:val="16"/>
-      </w:rPr>
-      <w:t>AI  |</w:t>
-    </w:r>
-    <w:proofErr w:type="gramEnd"/>
-    <w:r>
-      <w:rPr>
-        <w:color w:val="6B7280"/>
-        <w:sz w:val="16"/>
-      </w:rPr>
-      <w:t xml:space="preserve">  Privacy Policy</w:t>
+      <w:t>K SCAN AI  |  FULL PUBLIC LEGAL POLICY</w:t>
     </w:r>
   </w:p>
 </w:hdr>
@@ -2085,31 +2290,31 @@
       </w:rPr>
     </w:lvl>
   </w:abstractNum>
-  <w:num w:numId="1" w16cid:durableId="1996176602">
+  <w:num w:numId="1" w16cid:durableId="1447964682">
     <w:abstractNumId w:val="8"/>
   </w:num>
-  <w:num w:numId="2" w16cid:durableId="905265907">
+  <w:num w:numId="2" w16cid:durableId="1178932527">
     <w:abstractNumId w:val="6"/>
   </w:num>
-  <w:num w:numId="3" w16cid:durableId="173957529">
+  <w:num w:numId="3" w16cid:durableId="1065101629">
     <w:abstractNumId w:val="5"/>
   </w:num>
-  <w:num w:numId="4" w16cid:durableId="873466764">
+  <w:num w:numId="4" w16cid:durableId="983003499">
     <w:abstractNumId w:val="4"/>
   </w:num>
-  <w:num w:numId="5" w16cid:durableId="47461648">
+  <w:num w:numId="5" w16cid:durableId="1682658535">
     <w:abstractNumId w:val="7"/>
   </w:num>
-  <w:num w:numId="6" w16cid:durableId="1420249278">
+  <w:num w:numId="6" w16cid:durableId="1507985734">
     <w:abstractNumId w:val="3"/>
   </w:num>
-  <w:num w:numId="7" w16cid:durableId="1937402122">
+  <w:num w:numId="7" w16cid:durableId="1541816838">
     <w:abstractNumId w:val="2"/>
   </w:num>
-  <w:num w:numId="8" w16cid:durableId="712731749">
+  <w:num w:numId="8" w16cid:durableId="1589726869">
     <w:abstractNumId w:val="1"/>
   </w:num>
-  <w:num w:numId="9" w16cid:durableId="299650180">
+  <w:num w:numId="9" w16cid:durableId="1586261999">
     <w:abstractNumId w:val="0"/>
   </w:num>
 </w:numbering>
@@ -2506,12 +2711,12 @@
     <w:qFormat/>
     <w:rsid w:val="00FC693F"/>
     <w:pPr>
-      <w:spacing w:after="100" w:line="254" w:lineRule="auto"/>
+      <w:spacing w:after="120" w:line="259" w:lineRule="auto"/>
     </w:pPr>
     <w:rPr>
-      <w:rFonts w:ascii="Aptos" w:eastAsia="Aptos" w:hAnsi="Aptos"/>
-      <w:color w:val="18181B"/>
-      <w:sz w:val="19"/>
+      <w:rFonts w:ascii="Aptos" w:hAnsi="Aptos"/>
+      <w:color w:val="1C1C1C"/>
+      <w:sz w:val="20"/>
     </w:rPr>
   </w:style>
   <w:style w:type="paragraph" w:styleId="Heading1">
@@ -2525,15 +2730,15 @@
     <w:pPr>
       <w:keepNext/>
       <w:keepLines/>
-      <w:spacing w:before="180" w:after="80"/>
+      <w:spacing w:before="240" w:after="100"/>
       <w:outlineLvl w:val="0"/>
     </w:pPr>
     <w:rPr>
       <w:rFonts w:asciiTheme="majorHAnsi" w:eastAsiaTheme="majorEastAsia" w:hAnsiTheme="majorHAnsi" w:cstheme="majorBidi"/>
       <w:b/>
       <w:bCs/>
-      <w:color w:val="111827"/>
-      <w:sz w:val="28"/>
+      <w:color w:val="2D1F5E"/>
+      <w:sz w:val="30"/>
       <w:szCs w:val="28"/>
     </w:rPr>
   </w:style>
@@ -2549,15 +2754,15 @@
     <w:pPr>
       <w:keepNext/>
       <w:keepLines/>
-      <w:spacing w:before="120" w:after="40"/>
+      <w:spacing w:before="160" w:after="60"/>
       <w:outlineLvl w:val="1"/>
     </w:pPr>
     <w:rPr>
       <w:rFonts w:asciiTheme="majorHAnsi" w:eastAsiaTheme="majorEastAsia" w:hAnsiTheme="majorHAnsi" w:cstheme="majorBidi"/>
       <w:b/>
       <w:bCs/>
-      <w:color w:val="203764"/>
-      <w:sz w:val="22"/>
+      <w:color w:val="2D1F5E"/>
+      <w:sz w:val="23"/>
       <w:szCs w:val="26"/>
     </w:rPr>
   </w:style>
@@ -2573,15 +2778,15 @@
     <w:pPr>
       <w:keepNext/>
       <w:keepLines/>
-      <w:spacing w:before="80" w:after="20"/>
+      <w:spacing w:before="160" w:after="60"/>
       <w:outlineLvl w:val="2"/>
     </w:pPr>
     <w:rPr>
       <w:rFonts w:asciiTheme="majorHAnsi" w:eastAsiaTheme="majorEastAsia" w:hAnsiTheme="majorHAnsi" w:cstheme="majorBidi"/>
       <w:b/>
       <w:bCs/>
-      <w:color w:val="374151"/>
-      <w:sz w:val="20"/>
+      <w:color w:val="2D1F5E"/>
+      <w:sz w:val="21"/>
     </w:rPr>
   </w:style>
   <w:style w:type="paragraph" w:styleId="Heading4">
@@ -2695,7 +2900,6 @@
     <w:rPr>
       <w:rFonts w:asciiTheme="majorHAnsi" w:eastAsiaTheme="majorEastAsia" w:hAnsiTheme="majorHAnsi" w:cstheme="majorBidi"/>
       <w:color w:val="4F81BD" w:themeColor="accent1"/>
-      <w:sz w:val="20"/>
       <w:szCs w:val="20"/>
     </w:rPr>
   </w:style>
@@ -2720,7 +2924,6 @@
       <w:i/>
       <w:iCs/>
       <w:color w:val="404040" w:themeColor="text1" w:themeTint="BF"/>
-      <w:sz w:val="20"/>
       <w:szCs w:val="20"/>
     </w:rPr>
   </w:style>
@@ -2859,16 +3062,16 @@
       <w:pBdr>
         <w:bottom w:val="single" w:sz="8" w:space="4" w:color="4F81BD" w:themeColor="accent1"/>
       </w:pBdr>
-      <w:spacing w:after="160" w:line="240" w:lineRule="auto"/>
+      <w:spacing w:after="300" w:line="240" w:lineRule="auto"/>
       <w:contextualSpacing/>
     </w:pPr>
     <w:rPr>
       <w:rFonts w:asciiTheme="majorHAnsi" w:eastAsiaTheme="majorEastAsia" w:hAnsiTheme="majorHAnsi" w:cstheme="majorBidi"/>
       <w:b/>
-      <w:color w:val="121212"/>
+      <w:color w:val="2D1F5E"/>
       <w:spacing w:val="5"/>
       <w:kern w:val="28"/>
-      <w:sz w:val="48"/>
+      <w:sz w:val="50"/>
       <w:szCs w:val="52"/>
     </w:rPr>
   </w:style>
@@ -2904,9 +3107,9 @@
       <w:rFonts w:asciiTheme="majorHAnsi" w:eastAsiaTheme="majorEastAsia" w:hAnsiTheme="majorHAnsi" w:cstheme="majorBidi"/>
       <w:i/>
       <w:iCs/>
-      <w:color w:val="4F81BD" w:themeColor="accent1"/>
+      <w:color w:val="666666"/>
       <w:spacing w:val="15"/>
-      <w:sz w:val="24"/>
+      <w:sz w:val="23"/>
       <w:szCs w:val="24"/>
     </w:rPr>
   </w:style>
@@ -2944,9 +3147,6 @@
     <w:uiPriority w:val="99"/>
     <w:unhideWhenUsed/>
     <w:rsid w:val="00AA1D8D"/>
-    <w:pPr>
-      <w:spacing w:after="120"/>
-    </w:pPr>
   </w:style>
   <w:style w:type="character" w:customStyle="1" w:styleId="BodyTextChar">
     <w:name w:val="Body Text Char"/>
@@ -2963,7 +3163,7 @@
     <w:unhideWhenUsed/>
     <w:rsid w:val="00AA1D8D"/>
     <w:pPr>
-      <w:spacing w:after="120" w:line="480" w:lineRule="auto"/>
+      <w:spacing w:line="480" w:lineRule="auto"/>
     </w:pPr>
   </w:style>
   <w:style w:type="character" w:customStyle="1" w:styleId="BodyText2Char">
@@ -2980,9 +3180,6 @@
     <w:uiPriority w:val="99"/>
     <w:unhideWhenUsed/>
     <w:rsid w:val="00AA1D8D"/>
-    <w:pPr>
-      <w:spacing w:after="120"/>
-    </w:pPr>
     <w:rPr>
       <w:sz w:val="16"/>
       <w:szCs w:val="16"/>
@@ -3117,7 +3314,6 @@
     <w:unhideWhenUsed/>
     <w:rsid w:val="0029639D"/>
     <w:pPr>
-      <w:spacing w:after="120"/>
       <w:ind w:left="360"/>
       <w:contextualSpacing/>
     </w:pPr>
@@ -3129,7 +3325,6 @@
     <w:unhideWhenUsed/>
     <w:rsid w:val="0029639D"/>
     <w:pPr>
-      <w:spacing w:after="120"/>
       <w:ind w:left="720"/>
       <w:contextualSpacing/>
     </w:pPr>
@@ -3141,7 +3336,6 @@
     <w:unhideWhenUsed/>
     <w:rsid w:val="0029639D"/>
     <w:pPr>
-      <w:spacing w:after="120"/>
       <w:ind w:left="1080"/>
       <w:contextualSpacing/>
     </w:pPr>
@@ -13505,26 +13699,38 @@
       </w:tcPr>
     </w:tblStylePr>
   </w:style>
-  <w:style w:type="paragraph" w:customStyle="1" w:styleId="SmallNote">
-    <w:name w:val="Small Note"/>
-    <w:pPr>
-      <w:spacing w:after="60" w:line="240" w:lineRule="auto"/>
-    </w:pPr>
-    <w:rPr>
-      <w:rFonts w:ascii="Aptos" w:eastAsia="Aptos" w:hAnsi="Aptos"/>
-      <w:color w:val="4B5563"/>
-      <w:sz w:val="17"/>
-    </w:rPr>
-  </w:style>
   <w:style w:type="paragraph" w:customStyle="1" w:styleId="Meta">
     <w:name w:val="Meta"/>
     <w:pPr>
-      <w:spacing w:after="120"/>
+      <w:spacing w:after="160"/>
     </w:pPr>
     <w:rPr>
-      <w:rFonts w:ascii="Aptos" w:eastAsia="Aptos" w:hAnsi="Aptos"/>
-      <w:color w:val="4B5563"/>
+      <w:rFonts w:ascii="Aptos" w:hAnsi="Aptos"/>
+      <w:color w:val="666666"/>
       <w:sz w:val="18"/>
+    </w:rPr>
+  </w:style>
+  <w:style w:type="paragraph" w:customStyle="1" w:styleId="Callout">
+    <w:name w:val="Callout"/>
+    <w:pPr>
+      <w:spacing w:before="80" w:after="160"/>
+      <w:ind w:left="259" w:right="259"/>
+    </w:pPr>
+    <w:rPr>
+      <w:rFonts w:ascii="Aptos" w:hAnsi="Aptos"/>
+      <w:color w:val="1C1C1C"/>
+      <w:sz w:val="19"/>
+    </w:rPr>
+  </w:style>
+  <w:style w:type="paragraph" w:customStyle="1" w:styleId="Definition">
+    <w:name w:val="Definition"/>
+    <w:pPr>
+      <w:spacing w:after="100"/>
+      <w:ind w:left="216" w:hanging="216"/>
+    </w:pPr>
+    <w:rPr>
+      <w:rFonts w:ascii="Aptos" w:hAnsi="Aptos"/>
+      <w:sz w:val="20"/>
     </w:rPr>
   </w:style>
 </w:styles>

</xml_diff>

<commit_message>
Publish full legal policies as HTML pages (#2)
* Publish full legal policies as HTML pages

* Update downloadable legal documents

---------

Co-authored-by: Justin Smith <justin.landes@gmail.com>
</commit_message>
<xml_diff>
--- a/public/docs/kscan-privacy-policy.docx
+++ b/public/docs/kscan-privacy-policy.docx
@@ -4,20 +4,43 @@
   <w:body>
     <w:p>
       <w:pPr>
+        <w:jc w:val="center"/>
+      </w:pPr>
+      <w:r>
+        <w:rPr>
+          <w:rFonts w:ascii="Aptos Display" w:hAnsi="Aptos Display"/>
+          <w:b/>
+          <w:color w:val="C89B3C"/>
+          <w:sz w:val="28"/>
+        </w:rPr>
+        <w:t>K SCAN AI</w:t>
+      </w:r>
+    </w:p>
+    <w:p>
+      <w:pPr>
         <w:pStyle w:val="Title"/>
+        <w:pBdr>
+          <w:bottom w:val="single" w:sz="10" w:space="6" w:color="C89B3C"/>
+        </w:pBdr>
         <w:jc w:val="center"/>
       </w:pPr>
       <w:r>
-        <w:t>K SCAN AI</w:t>
-      </w:r>
-    </w:p>
-    <w:p>
-      <w:pPr>
-        <w:pStyle w:val="Title"/>
+        <w:t>Privacy Policy</w:t>
+      </w:r>
+    </w:p>
+    <w:p>
+      <w:pPr>
+        <w:pStyle w:val="Subtitle"/>
         <w:jc w:val="center"/>
       </w:pPr>
       <w:r>
-        <w:t>Privacy Policy</w:t>
+        <w:t>Full public policy for the website and current</w:t>
+      </w:r>
+      <w:r>
+        <w:t xml:space="preserve"> mobile app</w:t>
+      </w:r>
+      <w:r>
+        <w:t xml:space="preserve"> release</w:t>
       </w:r>
     </w:p>
     <w:p>
@@ -26,43 +49,92 @@
         <w:jc w:val="center"/>
       </w:pPr>
       <w:r>
-        <w:t xml:space="preserve">Effective Date: June 12, </w:t>
-      </w:r>
-      <w:proofErr w:type="gramStart"/>
-      <w:r>
-        <w:t>2026  |</w:t>
-      </w:r>
-      <w:proofErr w:type="gramEnd"/>
-      <w:r>
-        <w:t xml:space="preserve">  Last Updated: June 12, </w:t>
-      </w:r>
-      <w:proofErr w:type="gramStart"/>
-      <w:r>
-        <w:t>2026  |</w:t>
-      </w:r>
-      <w:proofErr w:type="gramEnd"/>
-      <w:r>
-        <w:t xml:space="preserve">  Contact: kscanai.app@gmail.com</w:t>
-      </w:r>
-    </w:p>
-    <w:p>
-      <w:r>
-        <w:t>K Scan AI ("K Scan," "we," "our," or "us") respects your privacy. This Privacy Policy explains how we collect, use, disclose, retain, and protect information when you use our website, mobile application, APIs, AI systems, StyleChat, Style Library, Dressing Rooms, shopping-assistance tools, and related services (collectively, the "Service").</w:t>
-      </w:r>
-    </w:p>
-    <w:p>
-      <w:r>
-        <w:t>K Scan is a fashion-specific visual discovery, style assistance, and shopping-assistance service. The Service allows users to scan or upload fashion-related images, save style inspiration, use AI-powered StyleChat, organize Dressing Rooms, and receive product, retailer, or marketplace search results or links.</w:t>
-      </w:r>
-    </w:p>
-    <w:p>
-      <w:r>
-        <w:t>This Privacy Policy is written for the current Android and Apple submission posture, including Google Play Android release 1.0.0 and Apple App Store/TestFlight readiness, and for publication on kscan.app. It is intended to describe the current Service unless a feature is expressly identified as future, optional, or configuration-dependent.</w:t>
+        <w:t>Effective Date: June 12, 2026  |  Last Updated: July 18, 2026  |  Contact: kscanai.app@gmail.com</w:t>
+      </w:r>
+    </w:p>
+    <w:tbl>
+      <w:tblPr>
+        <w:tblW w:w="0" w:type="auto"/>
+        <w:jc w:val="center"/>
+        <w:tblLayout w:type="fixed"/>
+        <w:tblLook w:val="04A0" w:firstRow="1" w:lastRow="0" w:firstColumn="1" w:lastColumn="0" w:noHBand="0" w:noVBand="1"/>
+      </w:tblPr>
+      <w:tblGrid>
+        <w:gridCol w:w="9994"/>
+      </w:tblGrid>
+      <w:tr>
+        <w:trPr>
+          <w:jc w:val="center"/>
+        </w:trPr>
+        <w:tc>
+          <w:tcPr>
+            <w:tcW w:w="9994" w:type="dxa"/>
+            <w:shd w:val="clear" w:color="auto" w:fill="F5F2FA"/>
+            <w:tcMar>
+              <w:top w:w="120" w:type="dxa"/>
+              <w:left w:w="160" w:type="dxa"/>
+              <w:bottom w:w="120" w:type="dxa"/>
+              <w:right w:w="160" w:type="dxa"/>
+            </w:tcMar>
+          </w:tcPr>
+          <w:p>
+            <w:pPr>
+              <w:jc w:val="center"/>
+            </w:pPr>
+            <w:r>
+              <w:rPr>
+                <w:b/>
+              </w:rPr>
+              <w:t xml:space="preserve">Governing full HTML version: </w:t>
+            </w:r>
+            <w:hyperlink r:id="rId8">
+              <w:r>
+                <w:rPr>
+                  <w:color w:val="2D1F5E"/>
+                  <w:u w:val="single"/>
+                </w:rPr>
+                <w:t>https://kscan.app/legal/privacy</w:t>
+              </w:r>
+            </w:hyperlink>
+            <w:r>
+              <w:br/>
+              <w:t xml:space="preserve">Public summary: </w:t>
+            </w:r>
+            <w:hyperlink r:id="rId9">
+              <w:r>
+                <w:rPr>
+                  <w:color w:val="2D1F5E"/>
+                  <w:u w:val="single"/>
+                </w:rPr>
+                <w:t>https://kscan.app/privacy</w:t>
+              </w:r>
+            </w:hyperlink>
+          </w:p>
+        </w:tc>
+      </w:tr>
+    </w:tbl>
+    <w:p/>
+    <w:p>
+      <w:r>
+        <w:t>K Scan AI ("K Scan," "we," "our," or "us") respects your privacy. This Privacy Policy explains how we collect, use, disclose, retain, and protect information when you use the K Scan website, Android application, APIs, AI systems, Elise and her StyleChat conversational capability, Style Library, Recent Scans, Dressing Rooms, shopping-assistance tools, and related services (collectively, the "Service").</w:t>
+      </w:r>
+    </w:p>
+    <w:p>
+      <w:r>
+        <w:t>K Scan is a fashion-specific visual discovery, style-assistance, and shopping-assistance service. The current Android open-test release allows users to scan or select one to five fashion-related images, receive AI-generated item and style results, view retailer-neutral shopping options, save scans, use Elise for conversational styling support, and organize or share items through Dressing Rooms.</w:t>
+      </w:r>
+    </w:p>
+    <w:p>
+      <w:r>
+        <w:t>This Policy describes the current Service as of the Last Updated date. Website, investor, demonstration, or roadmap materials may describe planned functionality. Planned functionality is not treated as active data processing unless it is enabled in the Service and described here.</w:t>
       </w:r>
     </w:p>
     <w:p>
       <w:pPr>
         <w:pStyle w:val="Heading1"/>
+        <w:pBdr>
+          <w:bottom w:val="single" w:sz="6" w:space="3" w:color="C89B3C"/>
+        </w:pBdr>
       </w:pPr>
       <w:r>
         <w:t>Privacy Controls Summary</w:t>
@@ -71,1136 +143,1162 @@
     <w:p>
       <w:pPr>
         <w:pStyle w:val="ListBullet"/>
-        <w:spacing w:after="40" w:line="247" w:lineRule="auto"/>
-      </w:pPr>
+        <w:ind w:hanging="187"/>
+      </w:pPr>
+      <w:r>
+        <w:t>K Scan AI is intended for users 18 years of age and older. The Service is not directed to children or minors.</w:t>
+      </w:r>
+    </w:p>
+    <w:p>
+      <w:pPr>
+        <w:pStyle w:val="ListBullet"/>
+        <w:ind w:hanging="187"/>
+      </w:pPr>
+      <w:r>
+        <w:t>Camera and image-picker access are used only when you choose to capture or select fashion-related images.</w:t>
+      </w:r>
+    </w:p>
+    <w:p>
+      <w:pPr>
+        <w:pStyle w:val="ListBullet"/>
+        <w:ind w:hanging="187"/>
+      </w:pPr>
+      <w:r>
+        <w:t>The Android open-test release can process up to five selected images in one scan flow and may identify multiple garments across those images.</w:t>
+      </w:r>
+    </w:p>
+    <w:p>
+      <w:pPr>
+        <w:pStyle w:val="ListBullet"/>
+        <w:ind w:hanging="187"/>
+      </w:pPr>
+      <w:r>
+        <w:t>K Scan is not designed for surveillance, facial recognition, biometric identification, or identifying people. K Scan does not create or retain biometric templates, faceprints, face geometry, or identity profiles.</w:t>
+      </w:r>
+    </w:p>
+    <w:p>
+      <w:pPr>
+        <w:pStyle w:val="ListBullet"/>
+        <w:ind w:hanging="187"/>
+      </w:pPr>
+      <w:r>
+        <w:t>The current release does not guarantee automatic face, bystander, license-plate, or sensitive-document blurring before upload. Avoid submitting sensitive or non-fashion content.</w:t>
+      </w:r>
+    </w:p>
+    <w:p>
+      <w:pPr>
+        <w:pStyle w:val="ListBullet"/>
+        <w:ind w:hanging="187"/>
+      </w:pPr>
+      <w:r>
+        <w:t>Images, prompts, style context, and related information may be processed through K Scan cloud systems and authorized AI providers. The current release is not device-only or cloud-free.</w:t>
+      </w:r>
+    </w:p>
+    <w:p>
+      <w:pPr>
+        <w:pStyle w:val="ListBullet"/>
+        <w:ind w:hanging="187"/>
+      </w:pPr>
+      <w:r>
+        <w:t>Elise spoken responses use text-to-speech. The feature does not record your voice and the Android app does not request microphone permission.</w:t>
+      </w:r>
+    </w:p>
+    <w:p>
+      <w:pPr>
+        <w:pStyle w:val="ListBullet"/>
+        <w:ind w:hanging="187"/>
+      </w:pPr>
+      <w:r>
+        <w:t>Recent Scans and their saved shopping snapshots are device-local by default. Cloud Saved Scans synchronization is disabled by default. Account-backed Dressing Rooms and Shared with Me memberships use cloud services.</w:t>
+      </w:r>
+    </w:p>
+    <w:p>
+      <w:pPr>
+        <w:pStyle w:val="ListBullet"/>
+        <w:ind w:hanging="187"/>
+      </w:pPr>
+      <w:r>
+        <w:t>The Android app may request approximate location only for optional weather-aware styling. It does not request precise or background location in the current release.</w:t>
+      </w:r>
+    </w:p>
+    <w:p>
+      <w:pPr>
+        <w:pStyle w:val="ListBullet"/>
+        <w:ind w:hanging="187"/>
+      </w:pPr>
+      <w:r>
+        <w:t>K Scan does not currently use third-party advertising SDKs or collect Advertising ID for targeted advertising.</w:t>
+      </w:r>
+    </w:p>
+    <w:p>
+      <w:pPr>
+        <w:pStyle w:val="ListBullet"/>
+        <w:ind w:hanging="187"/>
+      </w:pPr>
+      <w:r>
+        <w:t>You may request account deletion. Verified deletion requests are generally processed within 30 days, subject to legal, security, backup, fraud-prevention, and technical limitations.</w:t>
+      </w:r>
+    </w:p>
+    <w:p>
+      <w:pPr>
+        <w:pStyle w:val="Heading1"/>
+        <w:pBdr>
+          <w:bottom w:val="single" w:sz="6" w:space="3" w:color="C89B3C"/>
+        </w:pBdr>
+      </w:pPr>
+      <w:r>
+        <w:lastRenderedPageBreak/>
+        <w:t>1. Scope and Overview</w:t>
+      </w:r>
+    </w:p>
+    <w:p>
+      <w:r>
+        <w:t>This Policy applies to the K Scan website, Android app, beta and open-test releases, APIs, AI systems, and related services unless a separate privacy notice applies. It covers information you provide, information generated through use of the Service, information stored locally on your device, information stored in K Scan cloud systems, and information processed by authorized service providers.</w:t>
+      </w:r>
+    </w:p>
+    <w:p>
+      <w:r>
+        <w:t>The current Android open-test application uses package com.kscanai.app. Platform Data Safety disclosures and in-app disclosures should be read together with this Policy. If a feature materially changes data collection or processing, K Scan will update this Policy and any required platform disclosures before or when the change is enabled.</w:t>
+      </w:r>
+    </w:p>
+    <w:p>
+      <w:pPr>
+        <w:pStyle w:val="Heading1"/>
+        <w:pBdr>
+          <w:bottom w:val="single" w:sz="6" w:space="3" w:color="C89B3C"/>
+        </w:pBdr>
+      </w:pPr>
+      <w:r>
+        <w:t>2. Age Eligibility and 18+ Audience</w:t>
+      </w:r>
+    </w:p>
+    <w:p>
       <w:r>
         <w:t>K Scan AI is intended for users 18 years of age and older. The Service is not directed to children or minors, and users under 18 should not use the Service.</w:t>
       </w:r>
     </w:p>
     <w:p>
+      <w:r>
+        <w:t>K Scan does not knowingly collect personal information from children or minors. If we learn that we collected information from a person under 18, we will take reasonable steps to delete or restrict it, subject to legal, safety, security, fraud-prevention, backup, and technical requirements. K Scan does not participate in Google Play Families or Designed for Families for the current release posture.</w:t>
+      </w:r>
+    </w:p>
+    <w:p>
+      <w:pPr>
+        <w:pStyle w:val="Heading1"/>
+        <w:pBdr>
+          <w:bottom w:val="single" w:sz="6" w:space="3" w:color="C89B3C"/>
+        </w:pBdr>
+      </w:pPr>
+      <w:r>
+        <w:t>3. Key Definitions</w:t>
+      </w:r>
+    </w:p>
+    <w:p>
+      <w:pPr>
+        <w:pStyle w:val="Definition"/>
+      </w:pPr>
+      <w:r>
+        <w:rPr>
+          <w:b/>
+        </w:rPr>
+        <w:t xml:space="preserve">Personal Information or Personal Data: </w:t>
+      </w:r>
+      <w:r>
+        <w:t>Information that identifies, relates to, describes, can reasonably be linked to, or could reasonably identify an individual or household.</w:t>
+      </w:r>
+    </w:p>
+    <w:p>
+      <w:pPr>
+        <w:pStyle w:val="Definition"/>
+      </w:pPr>
+      <w:r>
+        <w:rPr>
+          <w:b/>
+        </w:rPr>
+        <w:t xml:space="preserve">User Content: </w:t>
+      </w:r>
+      <w:r>
+        <w:t>Content a user submits, captures, uploads, saves, sends, or shares through the Service, including images, scan content, Elise or StyleChat messages, room content, notes, captions, and support communications.</w:t>
+      </w:r>
+    </w:p>
+    <w:p>
+      <w:pPr>
+        <w:pStyle w:val="Definition"/>
+      </w:pPr>
+      <w:r>
+        <w:rPr>
+          <w:b/>
+        </w:rPr>
+        <w:t xml:space="preserve">Submitted Visual Data: </w:t>
+      </w:r>
+      <w:r>
+        <w:t>Camera captures, selected photos, screenshots, and other visual inputs submitted for fashion scanning, item recognition, style analysis, shopping assistance, Style Library, Recent Scans, or Dressing Rooms.</w:t>
+      </w:r>
+    </w:p>
+    <w:p>
+      <w:pPr>
+        <w:pStyle w:val="Definition"/>
+      </w:pPr>
+      <w:r>
+        <w:rPr>
+          <w:b/>
+        </w:rPr>
+        <w:t xml:space="preserve">Derived Fashion Data: </w:t>
+      </w:r>
+      <w:r>
+        <w:t>Information generated from Submitted Visual Data or use of the Service, such as garment category, color, texture, silhouette, material estimate, product-match signals, source-image association, shopping queries, and other fashion-related analytical outputs.</w:t>
+      </w:r>
+    </w:p>
+    <w:p>
+      <w:pPr>
+        <w:pStyle w:val="Definition"/>
+      </w:pPr>
+      <w:r>
+        <w:rPr>
+          <w:b/>
+        </w:rPr>
+        <w:t xml:space="preserve">Elise: </w:t>
+      </w:r>
+      <w:r>
+        <w:t>K Scan's AI stylist interface. StyleChat is Elise's conversational capability. Elise may provide text responses and, when enabled and available, generated spoken responses.</w:t>
+      </w:r>
+    </w:p>
+    <w:p>
+      <w:pPr>
+        <w:pStyle w:val="Definition"/>
+      </w:pPr>
+      <w:r>
+        <w:rPr>
+          <w:b/>
+        </w:rPr>
+        <w:t xml:space="preserve">Recent Scans: </w:t>
+      </w:r>
+      <w:r>
+        <w:t>Saved scan records and related commerce snapshots stored on the user's device by default, including available retailer, price, currency, product link, and product-image information captured when the scan is saved.</w:t>
+      </w:r>
+    </w:p>
+    <w:p>
+      <w:pPr>
+        <w:pStyle w:val="Definition"/>
+      </w:pPr>
+      <w:r>
+        <w:rPr>
+          <w:b/>
+        </w:rPr>
+        <w:t xml:space="preserve">Dressing Rooms: </w:t>
+      </w:r>
+      <w:r>
+        <w:t>Account-backed private or shared spaces used to organize, discuss, save, and share fashion-related items and images.</w:t>
+      </w:r>
+    </w:p>
+    <w:p>
+      <w:pPr>
+        <w:pStyle w:val="Definition"/>
+      </w:pPr>
+      <w:r>
+        <w:rPr>
+          <w:b/>
+        </w:rPr>
+        <w:t xml:space="preserve">Aggregated or De-identified Data: </w:t>
+      </w:r>
+      <w:r>
+        <w:t>Information processed or combined so that it does not reasonably identify a person and is subject to controls designed to prevent re-identification.</w:t>
+      </w:r>
+    </w:p>
+    <w:p>
+      <w:pPr>
+        <w:pStyle w:val="Heading1"/>
+        <w:pBdr>
+          <w:bottom w:val="single" w:sz="6" w:space="3" w:color="C89B3C"/>
+        </w:pBdr>
+      </w:pPr>
+      <w:r>
+        <w:lastRenderedPageBreak/>
+        <w:t>4. Information We Collect</w:t>
+      </w:r>
+    </w:p>
+    <w:p>
+      <w:pPr>
+        <w:pStyle w:val="Heading2"/>
+      </w:pPr>
+      <w:r>
+        <w:t>4.1 Account, Contact, and Authentication Information</w:t>
+      </w:r>
+    </w:p>
+    <w:p>
+      <w:r>
+        <w:t>We may collect information you provide directly, including your name if provided, email address, profile settings, support messages, feedback, privacy requests, and other account information. Authentication may be provided through email, Google, Apple, or another enabled provider. We receive only the profile and authentication information permitted by the provider and your settings.</w:t>
+      </w:r>
+    </w:p>
+    <w:p>
+      <w:pPr>
+        <w:pStyle w:val="Heading2"/>
+      </w:pPr>
+      <w:r>
+        <w:t>4.2 Camera, Image Picker, and Multi-Image Scan Data</w:t>
+      </w:r>
+    </w:p>
+    <w:p>
+      <w:r>
+        <w:t>When you intentionally start a scan or select images, K Scan may access the camera or the images you select through the operating-system image picker. The current Android open-test release supports selecting and reviewing between one and five images before submission. You can remove selected images before starting analysis.</w:t>
+      </w:r>
+    </w:p>
+    <w:p>
+      <w:r>
+        <w:t>Submitted Visual Data may be resized, compressed, transmitted through encrypted connections, and processed by K Scan cloud services and authorized AI providers. A scan may produce one result, multiple garment results, partial results, or no result. K Scan may maintain an association between each detected item and its source image so that results, saved items, shopping options, and Dressing Room actions remain understandable.</w:t>
+      </w:r>
+    </w:p>
+    <w:p>
+      <w:r>
+        <w:t>Camera access is activated only when you initiate a camera action. K Scan does not use the camera for continuous monitoring, background capture, or surveillance.</w:t>
+      </w:r>
+    </w:p>
+    <w:p>
+      <w:r>
+        <w:t>The current release does not guarantee that faces, bystanders, license plates, private documents, or other identifying visual elements are detected, removed, blurred, or filtered before transmission. K Scan is designed to analyze clothing and accessories, not people. Do not submit sensitive or non-fashion content unless you intend that content to be processed as part of your request.</w:t>
+      </w:r>
+    </w:p>
+    <w:p>
+      <w:pPr>
+        <w:pStyle w:val="Heading2"/>
+      </w:pPr>
+      <w:r>
+        <w:t>4.3 Device-Local Recent Scans and Commerce Snapshots</w:t>
+      </w:r>
+    </w:p>
+    <w:p>
+      <w:r>
+        <w:t>Recent Scans are stored on the device by default. When you save a scan that contains shopping options, K Scan may store a snapshot of the available retailer, source, price, currency, product link, availability, product type, and product image information. Reopening a saved scan uses that stored snapshot. If no shopping option existed when the scan was saved, none may appear when it is reopened.</w:t>
+      </w:r>
+    </w:p>
+    <w:p>
+      <w:r>
+        <w:t>Cloud Saved Scans synchronization is disabled by default in the current release. Device-local records do not automatically become available on another device. Clearing app data or uninstalling the app may remove device-local records. Account deletion from K Scan cloud systems may not erase a local copy that remains on a disconnected device; you may also delete local records through the app, clear app data, or uninstall the app.</w:t>
+      </w:r>
+    </w:p>
+    <w:p>
+      <w:pPr>
+        <w:pStyle w:val="Heading2"/>
+      </w:pPr>
+      <w:r>
+        <w:t>4.4 Style Library and Account-Backed Content</w:t>
+      </w:r>
+    </w:p>
+    <w:p>
+      <w:r>
+        <w:t>When you save or upload content to account-backed features, K Scan may store the content and related metadata in private cloud storage associated with your account. This may include selected images, item metadata, style preferences, timestamps, and references needed to display, organize, retrieve, or delete the content. Signed or time-limited URLs may be generated to display protected images.</w:t>
+      </w:r>
+    </w:p>
+    <w:p>
+      <w:pPr>
+        <w:pStyle w:val="Heading2"/>
+      </w:pPr>
+      <w:r>
+        <w:t>4.5 Elise, StyleChat, Signature Style, and Spoken Responses</w:t>
+      </w:r>
+    </w:p>
+    <w:p>
+      <w:r>
+        <w:t>When you use Elise or her StyleChat conversational capability, K Scan may process your prompts, messages, selected item or image context, recent conversation context, saved style preferences, and Signature Style signals needed to respond. Signature Style may include fashion preferences inferred from items you save, scan, like, reject, discuss, or organize.</w:t>
+      </w:r>
+    </w:p>
+    <w:p>
+      <w:r>
+        <w:t>When Spoken Responses are enabled, K Scan may send the text of an eligible Elise response, limited message and session identifiers, and the selected stylist voice profile to K Scan's speech service and an authorized text-to-speech provider, currently ElevenLabs, to generate audio and timing information. Generated audio may be cached temporarily on the device for playback and removed after playback, interruption, or cache cleanup.</w:t>
+      </w:r>
+    </w:p>
+    <w:p>
+      <w:r>
+        <w:lastRenderedPageBreak/>
+        <w:t>Spoken Responses do not record your voice. The current Android release does not request microphone permission, does not collect raw microphone audio, and does not create voiceprints or biometric voice identifiers. Spoken Responses may be unavailable because of network conditions, provider availability, account limits, or provider quota.</w:t>
+      </w:r>
+    </w:p>
+    <w:p>
+      <w:pPr>
+        <w:pStyle w:val="Heading2"/>
+      </w:pPr>
+      <w:r>
+        <w:t>4.6 Dressing Rooms, Shared with Me, Messaging, and Sharing</w:t>
+      </w:r>
+    </w:p>
+    <w:p>
+      <w:r>
+        <w:t>Owned Dressing Rooms, room items, and Shared with Me memberships are account-backed. K Scan may process room names, descriptions, item snapshots, images, participants, membership status, messages, reactions, timestamps, invitations, removals, revocations, and related metadata to operate these features.</w:t>
+      </w:r>
+    </w:p>
+    <w:p>
+      <w:r>
+        <w:t>Content you deliberately add to a shared Dressing Room may be visible to room members. Where a room owner enables a share link or public preview, selected room details, items, and images may be visible to anyone who possesses the active link. Share links and memberships may be revoked, but recipients may retain screenshots or copies of content they previously viewed. K Scan does not describe Dressing Rooms as end-to-end encrypted or zero-knowledge storage.</w:t>
+      </w:r>
+    </w:p>
+    <w:p>
+      <w:pPr>
+        <w:pStyle w:val="Heading2"/>
+      </w:pPr>
+      <w:r>
+        <w:t>4.7 Shopping, Retailer, Marketplace, and Product Interaction Data</w:t>
+      </w:r>
+    </w:p>
+    <w:p>
+      <w:r>
+        <w:t>K Scan may process scan-derived product signals, search terms, item attributes, product identifiers, retailer or marketplace identifiers, product URLs, product images, saved items, and outbound-link interactions to return shopping options and retailer-neutral product results. Product availability, pricing, images, currency, and links may change or be incomplete.</w:t>
+      </w:r>
+    </w:p>
+    <w:p>
+      <w:r>
+        <w:t>When you open a third-party retailer or marketplace link, you leave K Scan and the third party's privacy policy applies. K Scan does not intentionally provide raw uploaded images to retailers for their independent use unless separately disclosed. K Scan may receive referral or affiliate compensation from qualifying outbound links, but the current mobile release does not use third-party advertising SDKs or Advertising ID for targeted advertising.</w:t>
+      </w:r>
+    </w:p>
+    <w:p>
+      <w:pPr>
+        <w:pStyle w:val="Heading2"/>
+      </w:pPr>
+      <w:r>
+        <w:t>4.8 Approximate Location</w:t>
+      </w:r>
+    </w:p>
+    <w:p>
+      <w:r>
+        <w:t>The Android app may request approximate location for optional weather-aware styling or localization. K Scan does not request precise location or background location in the current release. If you deny approximate location, core scanning, saving, Dressing Rooms, and Elise text functionality remain available, although optional weather-aware context may be limited.</w:t>
+      </w:r>
+    </w:p>
+    <w:p>
+      <w:r>
+        <w:t>Approximate location may also be inferred from an IP address for security, localization, fraud prevention, or service delivery. K Scan does not use location for continuous tracking.</w:t>
+      </w:r>
+    </w:p>
+    <w:p>
+      <w:pPr>
+        <w:pStyle w:val="Heading2"/>
+      </w:pPr>
+      <w:r>
+        <w:t>4.9 Device, App, Diagnostics, and Security Data</w:t>
+      </w:r>
+    </w:p>
+    <w:p>
+      <w:r>
+        <w:t>We may process device type, operating system, app version, package and build information, language settings, IP address, request metadata, authentication identifiers, app interactions, feature usage, error information, performance information, and security or fraud-prevention signals. The precise data depends on the feature used and the production configuration. The current app does not use a third-party targeted-advertising SDK or collect Advertising ID.</w:t>
+      </w:r>
+    </w:p>
+    <w:p>
+      <w:pPr>
+        <w:pStyle w:val="Heading2"/>
+      </w:pPr>
+      <w:r>
+        <w:t>4.10 Website, Cookies, and Similar Technologies</w:t>
+      </w:r>
+    </w:p>
+    <w:p>
+      <w:r>
+        <w:t>When you use the K Scan website, we may process browser, device, referral, traffic, cookie, and interaction data to operate the website, maintain security, measure performance, and understand usage. Where required by law, non-essential cookies or similar technologies are used only after valid consent.</w:t>
+      </w:r>
+    </w:p>
+    <w:p>
+      <w:pPr>
+        <w:pStyle w:val="Heading1"/>
+        <w:pBdr>
+          <w:bottom w:val="single" w:sz="6" w:space="3" w:color="C89B3C"/>
+        </w:pBdr>
+      </w:pPr>
+      <w:r>
+        <w:t>5. How We Use Information</w:t>
+      </w:r>
+    </w:p>
+    <w:p>
       <w:pPr>
         <w:pStyle w:val="ListBullet"/>
-        <w:spacing w:after="40" w:line="247" w:lineRule="auto"/>
-      </w:pPr>
-      <w:r>
-        <w:t>Your camera, photo library, media picker, and image upload tools are used only when you choose to scan, upload, save, or manage fashion-related images or visual inspiration.</w:t>
+        <w:ind w:hanging="187"/>
+      </w:pPr>
+      <w:r>
+        <w:t>Provide, operate, maintain, secure, and troubleshoot the Service.</w:t>
       </w:r>
     </w:p>
     <w:p>
       <w:pPr>
         <w:pStyle w:val="ListBullet"/>
-        <w:spacing w:after="40" w:line="247" w:lineRule="auto"/>
-      </w:pPr>
-      <w:r>
-        <w:t>K Scan is not designed for surveillance, facial recognition, biometric identification, or identifying people.</w:t>
+        <w:ind w:hanging="187"/>
+      </w:pPr>
+      <w:r>
+        <w:t>Authenticate users and maintain account, session, and actor isolation.</w:t>
       </w:r>
     </w:p>
     <w:p>
       <w:pPr>
         <w:pStyle w:val="ListBullet"/>
-        <w:spacing w:after="40" w:line="247" w:lineRule="auto"/>
-      </w:pPr>
-      <w:r>
-        <w:t>K Scan does not generate, store, or retain biometric templates, face geometry, faceprints, or identity profiles.</w:t>
+        <w:ind w:hanging="187"/>
+      </w:pPr>
+      <w:r>
+        <w:t>Process single-image and multi-image scans and return fashion-related results.</w:t>
       </w:r>
     </w:p>
     <w:p>
       <w:pPr>
         <w:pStyle w:val="ListBullet"/>
-        <w:spacing w:after="40" w:line="247" w:lineRule="auto"/>
-      </w:pPr>
-      <w:r>
-        <w:t>Images, screenshots, StyleChat prompts, and related context may be processed through secure cloud systems and AI providers to provide fashion identification, style assistance, search, matching, and related functionality.</w:t>
+        <w:ind w:hanging="187"/>
+      </w:pPr>
+      <w:r>
+        <w:t>Provide Elise text responses, spoken responses, Signature Style personalization, and related AI functions.</w:t>
       </w:r>
     </w:p>
     <w:p>
       <w:pPr>
         <w:pStyle w:val="ListBullet"/>
-        <w:spacing w:after="40" w:line="247" w:lineRule="auto"/>
-      </w:pPr>
-      <w:r>
-        <w:t>K Scan does not currently claim that image processing is device-only, cloud-free, or subject to face or bystander blurring before upload.</w:t>
+        <w:ind w:hanging="187"/>
+      </w:pPr>
+      <w:r>
+        <w:lastRenderedPageBreak/>
+        <w:t>Save and reopen Recent Scans and stored commerce snapshots.</w:t>
       </w:r>
     </w:p>
     <w:p>
       <w:pPr>
         <w:pStyle w:val="ListBullet"/>
-        <w:spacing w:after="40" w:line="247" w:lineRule="auto"/>
-      </w:pPr>
-      <w:r>
-        <w:t>You should avoid uploading images or messages that include faces, bystanders, license plates, government IDs, financial records, medical information, private documents, or other sensitive or non-fashion personal information unless you intend that content to be processed as part of your request.</w:t>
+        <w:ind w:hanging="187"/>
+      </w:pPr>
+      <w:r>
+        <w:t>Operate Style Library, owned Dressing Rooms, Shared with Me, room sharing, messages, and reactions.</w:t>
       </w:r>
     </w:p>
     <w:p>
       <w:pPr>
         <w:pStyle w:val="ListBullet"/>
-        <w:spacing w:after="40" w:line="247" w:lineRule="auto"/>
-      </w:pPr>
-      <w:r>
-        <w:t>K Scan does not currently use third-party advertising SDKs or collect Advertising ID for targeted advertising in the current release posture. If tracking or advertising SDKs are introduced later, K Scan will update this Policy and request required consent or App Tracking Transparency permission where required.</w:t>
+        <w:ind w:hanging="187"/>
+      </w:pPr>
+      <w:r>
+        <w:t>Return retailer-neutral shopping results and route users to third-party product pages.</w:t>
       </w:r>
     </w:p>
     <w:p>
       <w:pPr>
         <w:pStyle w:val="ListBullet"/>
-        <w:spacing w:after="40" w:line="247" w:lineRule="auto"/>
-      </w:pPr>
-      <w:r>
-        <w:t>You may request account deletion. Deletion requests are generally processed within 30 days, subject to legal, security, fraud-prevention, backup, and technical limitations described below.</w:t>
+        <w:ind w:hanging="187"/>
+      </w:pPr>
+      <w:r>
+        <w:t>Prevent duplicate actions, abuse, fraud, unauthorized access, and cross-account data leakage.</w:t>
       </w:r>
     </w:p>
     <w:p>
       <w:pPr>
         <w:pStyle w:val="ListBullet"/>
-        <w:spacing w:after="40" w:line="247" w:lineRule="auto"/>
-      </w:pPr>
-      <w:r>
-        <w:t>This Policy is provided for transparency about K Scan’s privacy practices. If you have questions, contact us at kscanai.app@gmail.com.</w:t>
+        <w:ind w:hanging="187"/>
+      </w:pPr>
+      <w:r>
+        <w:t>Measure service reliability, diagnose errors, and improve product quality where permitted.</w:t>
+      </w:r>
+    </w:p>
+    <w:p>
+      <w:pPr>
+        <w:pStyle w:val="ListBullet"/>
+        <w:ind w:hanging="187"/>
+      </w:pPr>
+      <w:r>
+        <w:t>Comply with law, respond to lawful requests, enforce terms, and protect users and the Service.</w:t>
+      </w:r>
+    </w:p>
+    <w:p>
+      <w:pPr>
+        <w:pStyle w:val="ListBullet"/>
+        <w:ind w:hanging="187"/>
+      </w:pPr>
+      <w:r>
+        <w:t>Create aggregated or de-identified analytics for internal service improvement, planning, and reporting.</w:t>
       </w:r>
     </w:p>
     <w:p>
       <w:pPr>
         <w:pStyle w:val="Heading1"/>
-      </w:pPr>
-      <w:r>
-        <w:t>1. Scope and Overview</w:t>
-      </w:r>
-    </w:p>
-    <w:p>
-      <w:r>
-        <w:t>This Policy applies to the K Scan website, Android app, iOS app, beta releases, TestFlight releases, APIs, AI systems, and related services unless a separate privacy notice says otherwise. It covers data collected directly from users, data generated through app use, data processed by service providers, and data disclosed to shopping, retailer, marketplace, AI, analytics, infrastructure, and support providers where applicable.</w:t>
-      </w:r>
-    </w:p>
-    <w:p>
-      <w:r>
-        <w:t>Some website, investor, beta, or demonstration materials may show planned, conceptual, or future K Scan capabilities. This Policy describes the currently available Service unless a feature is expressly described as future functionality. If K Scan introduces new functionality that materially changes data collection or processing, such as microphone-based voice search, smart-glasses capture, persistent background capture, checkout/payment processing, or on-device privacy filtering, we will update this Policy, update required Google Play and Apple disclosures, and request any required permissions or consent before enabling that functionality.</w:t>
+        <w:pBdr>
+          <w:bottom w:val="single" w:sz="6" w:space="3" w:color="C89B3C"/>
+        </w:pBdr>
+      </w:pPr>
+      <w:r>
+        <w:t>6. AI Processing and Automated Results</w:t>
+      </w:r>
+    </w:p>
+    <w:p>
+      <w:r>
+        <w:t>K Scan uses cloud-hosted AI and automated systems to identify clothing and accessories, generate fashion attributes, match products, provide Elise responses, generate spoken audio, and personalize style assistance. Depending on the production configuration, providers may include Google Gemini, Supabase-hosted functions, ElevenLabs, and other authorized infrastructure or fallback providers.</w:t>
+      </w:r>
+    </w:p>
+    <w:p>
+      <w:r>
+        <w:t>AI-generated results are probabilistic and may be incomplete, inaccurate, unavailable, offensive, or based on similar rather than exact products. K Scan does not guarantee product identity, brand, authenticity, price, currency, availability, fit, material, retailer listing, or recommendation accuracy. AI Outputs are for fashion discovery and informational use, not professional, legal, medical, financial, authentication, or purchasing advice.</w:t>
+      </w:r>
+    </w:p>
+    <w:p>
+      <w:r>
+        <w:t>K Scan does not use AI to identify people, perform facial recognition, create biometric profiles, infer protected traits for legally significant decisions, or make decisions about employment, housing, credit, health care, insurance, or similar opportunities.</w:t>
       </w:r>
     </w:p>
     <w:p>
       <w:pPr>
         <w:pStyle w:val="Heading1"/>
-      </w:pPr>
-      <w:r>
-        <w:t>2. Age Eligibility and 18+ Target Audience</w:t>
-      </w:r>
-    </w:p>
-    <w:p>
-      <w:r>
-        <w:t>K Scan AI is intended for users 18 years of age and older. The Service is not directed to children or minors. Users under 18 should not use the Service.</w:t>
-      </w:r>
-    </w:p>
-    <w:p>
+        <w:pBdr>
+          <w:bottom w:val="single" w:sz="6" w:space="3" w:color="C89B3C"/>
+        </w:pBdr>
+      </w:pPr>
+      <w:r>
+        <w:t>7. How We Disclose Information</w:t>
+      </w:r>
+    </w:p>
+    <w:p>
+      <w:r>
+        <w:t>K Scan may disclose information to service providers and other recipients only as reasonably necessary for the purposes described in this Policy, based on the feature used, user choices, app version, provider configuration, and legal requirements.</w:t>
+      </w:r>
+    </w:p>
+    <w:p>
+      <w:pPr>
+        <w:pStyle w:val="Heading1"/>
+        <w:pBdr>
+          <w:bottom w:val="single" w:sz="6" w:space="3" w:color="C89B3C"/>
+        </w:pBdr>
+      </w:pPr>
+      <w:r>
+        <w:t>8. Service Providers and Infrastructure</w:t>
+      </w:r>
+    </w:p>
+    <w:p>
+      <w:r>
+        <w:t>K Scan may use providers for authentication, database hosting, storage, cloud infrastructure, AI inference, text-to-speech, product search, email, security, diagnostics, support, account deletion, and app operations. These providers may process account data, Submitted Visual Data, prompts, messages, generated audio, item metadata, diagnostics, and related information as necessary to provide their services.</w:t>
+      </w:r>
+    </w:p>
+    <w:p>
+      <w:r>
+        <w:t>K Scan uses reasonable contractual, technical, and organizational measures designed to have providers handle information consistently with this Policy and applicable law. Provider-specific logging, retention, safety review, quality improvement, and deletion terms may apply. K Scan does not make a zero-retention or no-human-review promise unless the applicable production configuration has been verified and separately disclosed.</w:t>
+      </w:r>
+    </w:p>
+    <w:p>
+      <w:pPr>
+        <w:pStyle w:val="Heading1"/>
+        <w:pBdr>
+          <w:bottom w:val="single" w:sz="6" w:space="3" w:color="C89B3C"/>
+        </w:pBdr>
+      </w:pPr>
+      <w:r>
+        <w:t>9. Retailer, Marketplace, and Product-Search Providers</w:t>
+      </w:r>
+    </w:p>
+    <w:p>
+      <w:r>
+        <w:t>K Scan may disclose limited fashion and product information, such as search terms, garment attributes, product signals, product identifiers, and product URLs, to product-search, commerce, affiliate, retailer, or marketplace providers to return relevant results and route users to third-party pages. When you visit a third party, its privacy policy and terms apply.</w:t>
+      </w:r>
+    </w:p>
+    <w:p>
+      <w:pPr>
+        <w:pStyle w:val="Heading1"/>
+        <w:pBdr>
+          <w:bottom w:val="single" w:sz="6" w:space="3" w:color="C89B3C"/>
+        </w:pBdr>
+      </w:pPr>
+      <w:r>
+        <w:t>10. Analytics, Advertising, and Tracking Posture</w:t>
+      </w:r>
+    </w:p>
+    <w:p>
+      <w:r>
+        <w:t xml:space="preserve">K Scan may use first-party operational logs and basic usage information to maintain security, understand feature performance, diagnose errors, and improve the Service. The current mobile release does not use third-party </w:t>
+      </w:r>
       <w:r>
         <w:lastRenderedPageBreak/>
-        <w:t>K Scan does not knowingly collect personal information from children or minors. If we learn that we have collected information from a person under 18, we will take reasonable steps to delete or restrict that information, subject to legal, safety, security, fraud-prevention, backup, and technical requirements.</w:t>
-      </w:r>
-    </w:p>
-    <w:p>
-      <w:r>
-        <w:t>K Scan does not participate in Google Play Families or Designed for Children for the current release posture.</w:t>
+        <w:t>advertising SDKs, does not collect Advertising ID for targeted advertising, and does not track users across third-party apps or websites for targeted advertising.</w:t>
+      </w:r>
+    </w:p>
+    <w:p>
+      <w:r>
+        <w:t>If K Scan later introduces cross-app tracking, targeted advertising, advertising SDKs, or activities requiring consent or App Tracking Transparency, K Scan will update this Policy and platform disclosures and request required consent before enabling those activities.</w:t>
       </w:r>
     </w:p>
     <w:p>
       <w:pPr>
         <w:pStyle w:val="Heading1"/>
-      </w:pPr>
-      <w:r>
-        <w:t>3. Key Definitions</w:t>
-      </w:r>
-    </w:p>
-    <w:p>
-      <w:r>
-        <w:t>Personal Information / Personal Data: information that identifies, relates to, describes, can reasonably be linked to, or could reasonably identify an individual or household.</w:t>
-      </w:r>
-    </w:p>
-    <w:p>
-      <w:r>
-        <w:t>User Content: content a user submits, uploads, saves, sends, or shares through the Service, including scan images, uploaded photos, screenshots, StyleChat messages, Dressing Room content, notes, captions, shared-room content, and support communications.</w:t>
-      </w:r>
-    </w:p>
-    <w:p>
-      <w:r>
-        <w:t>Submitted Visual Data: camera captures, uploaded photos, screenshots, image files, QR/barcode captures, or other visual inputs submitted to K Scan for scanning, StyleChat, fashion recognition, product matching, product search, visual inspiration, Dressing Room organization, or related functionality.</w:t>
-      </w:r>
-    </w:p>
-    <w:p>
-      <w:r>
-        <w:t>Derived Data: metadata or analysis generated from use of the Service, including garment category, color, texture, style attributes, product-match signals, image-analysis outputs, search terms, product-interest signals, interaction signals, and related analytical outputs.</w:t>
-      </w:r>
-    </w:p>
-    <w:p>
-      <w:r>
-        <w:t>Commercial and Preference Data: saved items, product interactions, style preferences, shopping activity, affiliate attribution data, product-interest signals, inferred fashion interests, and commerce-related preferences.</w:t>
-      </w:r>
-    </w:p>
-    <w:p>
-      <w:r>
-        <w:t>Aggregated, Anonymized, or De-identified Data: information processed or combined so it does not reasonably identify a specific person and is subject to controls designed to prevent re-identification.</w:t>
+        <w:pBdr>
+          <w:bottom w:val="single" w:sz="6" w:space="3" w:color="C89B3C"/>
+        </w:pBdr>
+      </w:pPr>
+      <w:r>
+        <w:t>11. Sale, Sharing, and De-identified Information</w:t>
+      </w:r>
+    </w:p>
+    <w:p>
+      <w:r>
+        <w:t>K Scan does not sell raw scans, uploaded images, Elise messages, biometric identifiers, face templates, voiceprints, precise location, government identification, payment-card information, or sensitive personal information for independent third-party use.</w:t>
+      </w:r>
+    </w:p>
+    <w:p>
+      <w:r>
+        <w:t>K Scan may use aggregated or de-identified information for internal analytics, security, service improvement, product planning, trend analysis, and business reporting, provided the information does not reasonably identify a person. If K Scan later begins a regulated sale or sharing activity, it will provide required notice, consent, and opt-out controls before or when the activity begins.</w:t>
       </w:r>
     </w:p>
     <w:p>
       <w:pPr>
         <w:pStyle w:val="Heading1"/>
-      </w:pPr>
-      <w:r>
-        <w:t>4. Information We Collect</w:t>
-      </w:r>
-    </w:p>
-    <w:p>
-      <w:pPr>
-        <w:pStyle w:val="Heading2"/>
-      </w:pPr>
-      <w:r>
-        <w:t>A. Information You Provide</w:t>
-      </w:r>
-    </w:p>
-    <w:p>
-      <w:r>
-        <w:t>We may collect information you provide directly, including:</w:t>
+        <w:pBdr>
+          <w:bottom w:val="single" w:sz="6" w:space="3" w:color="C89B3C"/>
+        </w:pBdr>
+      </w:pPr>
+      <w:r>
+        <w:t>12. Data Retention</w:t>
+      </w:r>
+    </w:p>
+    <w:p>
+      <w:r>
+        <w:t>K Scan retains information only as long as reasonably necessary for the purposes described in this Policy, unless a longer period is required or permitted by law.</w:t>
       </w:r>
     </w:p>
     <w:p>
       <w:pPr>
         <w:pStyle w:val="ListBullet"/>
-        <w:spacing w:after="40" w:line="247" w:lineRule="auto"/>
-      </w:pPr>
-      <w:r>
-        <w:t>Name, if voluntarily provided</w:t>
+        <w:ind w:hanging="187"/>
+      </w:pPr>
+      <w:r>
+        <w:t>Account and contact data: retained while the account is active and for a reasonable period afterward for support, security, fraud prevention, dispute resolution, or legal compliance.</w:t>
       </w:r>
     </w:p>
     <w:p>
       <w:pPr>
         <w:pStyle w:val="ListBullet"/>
-        <w:spacing w:after="40" w:line="247" w:lineRule="auto"/>
-      </w:pPr>
-      <w:r>
-        <w:t>Email address, including for waitlist signup, beta access, support, account creation, login, marketing communications, or privacy requests</w:t>
+        <w:ind w:hanging="187"/>
+      </w:pPr>
+      <w:r>
+        <w:t>Device-local Recent Scans: retained on the device until deleted in the app, app data is cleared, or the app is uninstalled, subject to device and operating-system behavior.</w:t>
       </w:r>
     </w:p>
     <w:p>
       <w:pPr>
         <w:pStyle w:val="ListBullet"/>
-        <w:spacing w:after="40" w:line="247" w:lineRule="auto"/>
-      </w:pPr>
-      <w:r>
-        <w:t>Account credentials or authentication-related information, where applicable</w:t>
+        <w:ind w:hanging="187"/>
+      </w:pPr>
+      <w:r>
+        <w:t>Account-backed Style Library and Dressing Room data: retained while the account is active or until the user deletes the item, room, membership, or account, subject to backup, security, fraud-prevention, and legal requirements.</w:t>
       </w:r>
     </w:p>
     <w:p>
       <w:pPr>
         <w:pStyle w:val="ListBullet"/>
-        <w:spacing w:after="40" w:line="247" w:lineRule="auto"/>
-      </w:pPr>
-      <w:r>
-        <w:t>Support requests, feedback, communications, privacy requests, and inquiries</w:t>
+        <w:ind w:hanging="187"/>
+      </w:pPr>
+      <w:r>
+        <w:t>Submitted Visual Data used for AI processing: retained only as long as reasonably necessary to process the request, maintain security, troubleshoot, prevent abuse, comply with law, or support an item the user intentionally saves.</w:t>
       </w:r>
     </w:p>
     <w:p>
       <w:pPr>
         <w:pStyle w:val="ListBullet"/>
-        <w:spacing w:after="40" w:line="247" w:lineRule="auto"/>
-      </w:pPr>
-      <w:r>
-        <w:t>Saved items, shopping preferences, profile settings, style preferences, notes, captions, and visual inspiration organization choices</w:t>
+        <w:ind w:hanging="187"/>
+      </w:pPr>
+      <w:r>
+        <w:t>Elise and StyleChat messages: retained as needed to operate sessions, preserve requested history, provide Signature Style context, troubleshoot, maintain security, and honor privacy requests.</w:t>
       </w:r>
     </w:p>
     <w:p>
       <w:pPr>
         <w:pStyle w:val="ListBullet"/>
-        <w:spacing w:after="40" w:line="247" w:lineRule="auto"/>
-      </w:pPr>
-      <w:r>
-        <w:t>StyleChat messages, prompts, responses, image context, and saved chat-related preferences when you use StyleChat or similar AI features</w:t>
-      </w:r>
-    </w:p>
-    <w:p>
-      <w:pPr>
-        <w:pStyle w:val="Heading2"/>
-      </w:pPr>
-      <w:r>
-        <w:t>B. Authentication and Account Data</w:t>
-      </w:r>
-    </w:p>
-    <w:p>
-      <w:r>
-        <w:t>If you create an account or sign in through Google, Sign in with Apple, email, or another authentication provider, we may receive limited profile or authentication information permitted by that provider, such as your name, email address, profile identifier, username, authentication token metadata, or publicly available profile information, depending on your settings and the provider’s rules.</w:t>
-      </w:r>
-    </w:p>
-    <w:p>
-      <w:r>
-        <w:t>We use this information to authenticate users, operate the Service, personalize experiences, maintain account security, support account deletion requests, and comply with legal obligations.</w:t>
-      </w:r>
-    </w:p>
-    <w:p>
-      <w:pPr>
-        <w:pStyle w:val="Heading2"/>
-      </w:pPr>
-      <w:r>
-        <w:t>C. Camera, Image, Scan, QR, Barcode, and Uploaded Visual Data</w:t>
-      </w:r>
-    </w:p>
-    <w:p>
-      <w:r>
-        <w:t>When you choose to use K Scan’s camera, upload an image, scan a screenshot, scan QR/barcode content, or submit a fashion-related visual input, we may process the image or scan input to identify fashion items, style signals, product identifiers, text, QR/barcode content, URLs, related product matches, and related style or shopping context.</w:t>
-      </w:r>
-    </w:p>
-    <w:p>
-      <w:r>
-        <w:t>Camera access is activated only when you intentionally initiate a scan, capture, upload, or QR/barcode action. K Scan does not use the camera for continuous monitoring or background surveillance.</w:t>
-      </w:r>
-    </w:p>
-    <w:p>
-      <w:r>
-        <w:t>Submitted images may be processed locally and/or through secure cloud systems to provide fashion identification, StyleChat, search, matching, product recommendations, product lookup, and related functionality. K Scan does not claim that submitted images are processed only on the device.</w:t>
+        <w:ind w:hanging="187"/>
+      </w:pPr>
+      <w:r>
+        <w:t>Generated spoken-response audio: generally stored temporarily for playback and cache management rather than as a permanent voice recording.</w:t>
+      </w:r>
+    </w:p>
+    <w:p>
+      <w:pPr>
+        <w:pStyle w:val="ListBullet"/>
+        <w:ind w:hanging="187"/>
+      </w:pPr>
+      <w:r>
+        <w:t>Operational logs and diagnostics: retained for a reasonable period for security, reliability, troubleshooting, and legal compliance.</w:t>
+      </w:r>
+    </w:p>
+    <w:p>
+      <w:pPr>
+        <w:pStyle w:val="ListBullet"/>
+        <w:ind w:hanging="187"/>
+      </w:pPr>
+      <w:r>
+        <w:t>Aggregated or de-identified information: may be retained for internal analytics and planning if it cannot reasonably identify a person.</w:t>
+      </w:r>
+    </w:p>
+    <w:p>
+      <w:r>
+        <w:t>Active application systems are generally processed for deletion within 30 days of a verified deletion request. Residual copies may remain in encrypted or access-controlled backups for a limited additional period before expiring through normal backup lifecycle processes, unless a longer period is required or permitted by law.</w:t>
+      </w:r>
+    </w:p>
+    <w:p>
+      <w:pPr>
+        <w:pStyle w:val="Heading1"/>
+        <w:pBdr>
+          <w:bottom w:val="single" w:sz="6" w:space="3" w:color="C89B3C"/>
+        </w:pBdr>
+      </w:pPr>
+      <w:r>
+        <w:t>13. Account Deletion and Privacy Requests</w:t>
+      </w:r>
+    </w:p>
+    <w:p>
+      <w:r>
+        <w:t>You may request deletion through the app at Settings &gt; Account &gt; Delete Account, through the public deletion page, or by contacting K Scan. The external deletion resource is available at https://kscan.app/legal/delete-account.</w:t>
+      </w:r>
+    </w:p>
+    <w:p>
+      <w:r>
+        <w:t>Deletion requests are generally processed within 30 days after verification, subject to legal, security, fraud-prevention, dispute-resolution, backup, and technical limitations. K Scan does not claim that deletion is immediate or fully automated across every system.</w:t>
       </w:r>
     </w:p>
     <w:p>
       <w:r>
         <w:lastRenderedPageBreak/>
-        <w:t>K Scan does not currently claim that faces, bystanders, license plates, private documents, or other identifying visual elements are detected, removed, blurred, or filtered before upload. If your submitted image contains such content, it may be included in the transmitted or stored content because the current release does not remove or obscure those elements before processing.</w:t>
-      </w:r>
-    </w:p>
-    <w:p>
-      <w:r>
-        <w:t>K Scan is designed to analyze garments, accessories, style attributes, product identifiers, QR/barcode content, and product-matching signals, not human faces. K Scan does not use submitted visual data to identify people, verify identity, create biometric profiles, perform facial recognition, perform targeted advertising based on identity, or build identity profiles.</w:t>
-      </w:r>
-    </w:p>
-    <w:p>
-      <w:pPr>
-        <w:pStyle w:val="Heading2"/>
-      </w:pPr>
-      <w:r>
-        <w:t>D. Photo Library, Media Permissions, Style Library, and Dressing Rooms</w:t>
-      </w:r>
-    </w:p>
-    <w:p>
-      <w:r>
-        <w:t>If you choose to upload screenshots, photos, outfit images, mood-board references, shopping screenshots, social-media screenshots, or other images into K Scan features such as Style Library, Dressing Rooms, saved items, style boards, or related private visual-inspiration tools, K Scan may request access to your device’s photo library, media library, image picker, or selected media files, depending on your device settings and operating system.</w:t>
-      </w:r>
-    </w:p>
-    <w:p>
-      <w:r>
-        <w:t>K Scan uses media-library access only when you choose to upload, import, save, or manage an image. K Scan does not use media permissions for background monitoring, continuous media-library scanning, social media scraping, URL importing, link previews, or access to photos or videos that you have not selected or otherwise granted permission to access.</w:t>
-      </w:r>
-    </w:p>
-    <w:p>
-      <w:r>
-        <w:t>Uploaded inspiration images are private to your account by default. Images uploaded to a Dressing Room may also appear in your Style Library and in the selected Dressing Room’s Room Inspiration section. Removing an uploaded image from a Dressing Room may remove only the room link while keeping the underlying Style Library inspiration item. Deleting an uploaded image from your Style Library may remove or hide it from attached Dressing Rooms, subject to the app’s deletion and retention practices.</w:t>
-      </w:r>
-    </w:p>
-    <w:p>
-      <w:r>
-        <w:t>Uploaded inspiration images may be transmitted through encrypted connections to K Scan’s private cloud storage and authorized service providers to provide upload, storage, display, signed-URL access, account, Library, Dressing Room, support, security, fraud-prevention, troubleshooting, quality-improvement, backup, and legal-compliance functions.</w:t>
-      </w:r>
-    </w:p>
-    <w:p>
-      <w:r>
-        <w:t>In the current release posture, uploaded inspiration images are not included in public shared-room previews or public shared-room web pages unless a separate user-facing sharing feature expressly allows that content to be shared and the user chooses to share it. K Scan does not allow anonymous users to upload inspiration images.</w:t>
-      </w:r>
-    </w:p>
-    <w:p>
-      <w:pPr>
-        <w:pStyle w:val="Heading2"/>
-      </w:pPr>
-      <w:r>
-        <w:t>E. StyleChat and User-Generated Messages</w:t>
-      </w:r>
-    </w:p>
-    <w:p>
-      <w:r>
-        <w:t>If you use StyleChat or related AI chat, messaging, or style-assistance features, we may process your messages, prompts, selected image context, saved style preferences, session metadata, and related content needed to provide the feature.</w:t>
-      </w:r>
-    </w:p>
-    <w:p>
-      <w:r>
-        <w:t>StyleChat may be powered by Gemini and/or other AI infrastructure depending on the current production configuration. AI requests may include text, image context, scan-derived attributes, style preferences, product signals, or other information needed to respond to your request.</w:t>
-      </w:r>
-    </w:p>
-    <w:p>
-      <w:r>
-        <w:t>Users should not submit sensitive personal information, health information, financial information, government IDs, private documents, or private information about other people through StyleChat. StyleChat outputs are AI-generated and may be incomplete, inaccurate, unavailable, or based on similar rather than exact matches.</w:t>
-      </w:r>
-    </w:p>
-    <w:p>
-      <w:pPr>
-        <w:pStyle w:val="Heading2"/>
-      </w:pPr>
-      <w:r>
-        <w:t>F. Dressing Rooms, Sharing, and In-App Messaging</w:t>
-      </w:r>
-    </w:p>
-    <w:p>
-      <w:r>
-        <w:t>If you use Dressing Rooms, shared rooms, owner controls, messaging, notes, comments, or similar collaboration features, K Scan may process room names, room descriptions, shared content, uploaded images, messages, participants, timestamps, owner controls, invitation or revocation events, and related metadata to operate those features.</w:t>
-      </w:r>
-    </w:p>
-    <w:p>
-      <w:r>
-        <w:t>Users should only upload or share content they have permission to share. Private-room, signed-link, access-control, and owner-control features are used to operate access control, but K Scan does not describe these features as end-to-end encrypted unless a future version implements and verifies that architecture.</w:t>
-      </w:r>
-    </w:p>
-    <w:p>
-      <w:pPr>
-        <w:pStyle w:val="Heading2"/>
-      </w:pPr>
-      <w:r>
-        <w:t>G. Shopping, Search, Retailer, Marketplace, and Product Lookup Data</w:t>
-      </w:r>
-    </w:p>
-    <w:p>
-      <w:r>
-        <w:t>K Scan may collect and process search terms, scan-derived product signals, item attributes, product identifiers, retailer identifiers, marketplace identifiers, product URLs, product images, outbound retailer clicks, saved items, price alerts, product categories, affiliate attribution data, and other shopping or product interaction data.</w:t>
-      </w:r>
-    </w:p>
-    <w:p>
-      <w:r>
-        <w:t>K Scan may send search terms, item attributes, product signals, retailer identifiers, product URLs, or similar fashion/product data to product-search, affiliate, retailer, commerce, marketplace, or product-lookup providers to return relevant product matches, retailer links, shopping links, or related results.</w:t>
-      </w:r>
-    </w:p>
-    <w:p>
+        <w:t>Cloud account deletion does not necessarily remove device-local Recent Scans from a device that is offline or no longer connected to the account. To remove local records, delete them in the app, clear app data, or uninstall the app. Information may be retained where legally permitted or technically necessary for security, fraud prevention, dispute resolution, tax or accounting obligations, backup integrity, or other legitimate operational purposes.</w:t>
+      </w:r>
+    </w:p>
+    <w:p>
+      <w:pPr>
+        <w:pStyle w:val="Heading1"/>
+        <w:pBdr>
+          <w:bottom w:val="single" w:sz="6" w:space="3" w:color="C89B3C"/>
+        </w:pBdr>
+      </w:pPr>
+      <w:r>
+        <w:t>14. Your Privacy Choices and Controls</w:t>
+      </w:r>
+    </w:p>
+    <w:p>
+      <w:pPr>
+        <w:pStyle w:val="ListBullet"/>
+        <w:ind w:hanging="187"/>
+      </w:pPr>
+      <w:r>
+        <w:t>Use device settings to allow or deny camera, selected-photo, and approximate-location access.</w:t>
+      </w:r>
+    </w:p>
+    <w:p>
+      <w:pPr>
+        <w:pStyle w:val="ListBullet"/>
+        <w:ind w:hanging="187"/>
+      </w:pPr>
+      <w:r>
+        <w:t>Turn Elise Spoken Responses on or off in the app.</w:t>
+      </w:r>
+    </w:p>
+    <w:p>
+      <w:pPr>
+        <w:pStyle w:val="ListBullet"/>
+        <w:ind w:hanging="187"/>
+      </w:pPr>
+      <w:r>
+        <w:t>Delete individual Recent Scans, Style Library items, Dressing Rooms, or memberships where the app provides those controls.</w:t>
+      </w:r>
+    </w:p>
+    <w:p>
+      <w:pPr>
+        <w:pStyle w:val="ListBullet"/>
+        <w:ind w:hanging="187"/>
+      </w:pPr>
+      <w:r>
+        <w:t>Revoke room share links or remove Shared with Me memberships where available.</w:t>
+      </w:r>
+    </w:p>
+    <w:p>
+      <w:pPr>
+        <w:pStyle w:val="ListBullet"/>
+        <w:ind w:hanging="187"/>
+      </w:pPr>
+      <w:r>
+        <w:t>Request access, correction, deletion, export, restriction, objection, or withdrawal of consent where required by law.</w:t>
+      </w:r>
+    </w:p>
+    <w:p>
+      <w:pPr>
+        <w:pStyle w:val="ListBullet"/>
+        <w:ind w:hanging="187"/>
+      </w:pPr>
+      <w:r>
+        <w:t>Opt out of marketing communications through the method included in the communication.</w:t>
+      </w:r>
+    </w:p>
+    <w:p>
+      <w:pPr>
+        <w:pStyle w:val="ListBullet"/>
+        <w:ind w:hanging="187"/>
+      </w:pPr>
+      <w:r>
+        <w:t>Use any legally required sale, sharing, or targeted-advertising opt-out control if such processing is introduced.</w:t>
+      </w:r>
+    </w:p>
+    <w:p>
+      <w:r>
+        <w:t>Privacy requests may be submitted to kscanai.app@gmail.com. We may need to verify your identity before completing certain requests.</w:t>
+      </w:r>
+    </w:p>
+    <w:p>
+      <w:pPr>
+        <w:pStyle w:val="Heading1"/>
+        <w:pBdr>
+          <w:bottom w:val="single" w:sz="6" w:space="3" w:color="C89B3C"/>
+        </w:pBdr>
+      </w:pPr>
+      <w:r>
+        <w:t>15. California and Other U.S. State Privacy Rights</w:t>
+      </w:r>
+    </w:p>
+    <w:p>
+      <w:r>
+        <w:t>Residents of California and other U.S. states with applicable privacy laws may have rights to know, access, correct, delete, obtain a copy of, or opt out of certain processing of personal information, and to avoid unlawful discrimination for exercising those rights, subject to legal exceptions. K Scan honors Global Privacy Control signals where required by law.</w:t>
+      </w:r>
+    </w:p>
+    <w:p>
+      <w:r>
+        <w:t>The current mobile release does not use third-party advertising SDKs or Advertising ID for targeted advertising. K Scan does not sell raw scans, uploaded images, biometric data, or sensitive personal information. Requests may be submitted through available in-app controls, https://kscan.app/legal/delete-account, or kscanai.app@gmail.com.</w:t>
+      </w:r>
+    </w:p>
+    <w:p>
+      <w:pPr>
+        <w:pStyle w:val="Heading1"/>
+        <w:pBdr>
+          <w:bottom w:val="single" w:sz="6" w:space="3" w:color="C89B3C"/>
+        </w:pBdr>
+      </w:pPr>
+      <w:r>
+        <w:t>16. GDPR and UK GDPR Rights and Legal Bases</w:t>
+      </w:r>
+    </w:p>
+    <w:p>
+      <w:r>
+        <w:t>If you are located in the European Economic Area, United Kingdom, or another jurisdiction with similar rights, you may have rights to access, correct, delete, restrict, object, request portability, withdraw consent, and lodge a complaint with a supervisory authority.</w:t>
+      </w:r>
+    </w:p>
+    <w:p>
+      <w:r>
+        <w:t>Possible legal bases include performance of a contract for core Service delivery; consent where required for optional permissions, cookies, marketing, or other optional processing; legitimate interests for security, fraud prevention, diagnostics, service improvement, account support, and commerce routing where lawful; and legal obligations.</w:t>
+      </w:r>
+    </w:p>
+    <w:p>
+      <w:pPr>
+        <w:pStyle w:val="Heading1"/>
+        <w:pBdr>
+          <w:bottom w:val="single" w:sz="6" w:space="3" w:color="C89B3C"/>
+        </w:pBdr>
+      </w:pPr>
+      <w:r>
+        <w:t>17. International Data Transfers</w:t>
+      </w:r>
+    </w:p>
+    <w:p>
+      <w:r>
+        <w:t>Information may be processed in the United States and other countries. Where required, K Scan uses lawful transfer mechanisms and safeguards, which may include Standard Contractual Clauses or other approved mechanisms.</w:t>
+      </w:r>
+    </w:p>
+    <w:p>
+      <w:pPr>
+        <w:pStyle w:val="Heading1"/>
+        <w:pBdr>
+          <w:bottom w:val="single" w:sz="6" w:space="3" w:color="C89B3C"/>
+        </w:pBdr>
+      </w:pPr>
+      <w:r>
+        <w:t>18. Security</w:t>
+      </w:r>
+    </w:p>
+    <w:p>
+      <w:r>
+        <w:t>K Scan implements reasonable administrative, technical, and organizational safeguards designed to protect information, including encryption in transit where appropriate, access controls, private storage where appropriate, actor-scoped authorization, data minimization, and operational security practices. No system can be guaranteed completely secure, and K Scan does not use absolute-security or zero-knowledge claims for the current mobile architecture.</w:t>
+      </w:r>
+    </w:p>
+    <w:p>
+      <w:pPr>
+        <w:pStyle w:val="Heading1"/>
+        <w:pBdr>
+          <w:bottom w:val="single" w:sz="6" w:space="3" w:color="C89B3C"/>
+        </w:pBdr>
+      </w:pPr>
       <w:r>
         <w:lastRenderedPageBreak/>
-        <w:t>K Scan does not intentionally send raw uploaded images to retailers for independent reuse unless separately disclosed. References to retailer, marketplace, or product-search providers do not mean K Scan has an official partnership with any named retailer or marketplace unless we expressly state that a partnership exists.</w:t>
-      </w:r>
-    </w:p>
-    <w:p>
-      <w:pPr>
-        <w:pStyle w:val="Heading2"/>
-      </w:pPr>
-      <w:r>
-        <w:t>H. Device, App, Diagnostics, and Log Data</w:t>
-      </w:r>
-    </w:p>
-    <w:p>
-      <w:r>
-        <w:t>We may collect device, app, diagnostics, and log information, including:</w:t>
-      </w:r>
-    </w:p>
-    <w:p>
-      <w:pPr>
-        <w:pStyle w:val="ListBullet"/>
-        <w:spacing w:after="40" w:line="247" w:lineRule="auto"/>
-      </w:pPr>
-      <w:r>
-        <w:t>Device type, operating system, browser information, app version, package/build information, and language settings</w:t>
-      </w:r>
-    </w:p>
-    <w:p>
-      <w:pPr>
-        <w:pStyle w:val="ListBullet"/>
-        <w:spacing w:after="40" w:line="247" w:lineRule="auto"/>
-      </w:pPr>
-      <w:r>
-        <w:t>IP address and approximate location derived from technical data, where applicable</w:t>
-      </w:r>
-    </w:p>
-    <w:p>
-      <w:pPr>
-        <w:pStyle w:val="ListBullet"/>
-        <w:spacing w:after="40" w:line="247" w:lineRule="auto"/>
-      </w:pPr>
-      <w:r>
-        <w:t>App interactions, session events, feature usage, tap/click events, saved-item interactions, product interactions, and outbound link interactions</w:t>
-      </w:r>
-    </w:p>
-    <w:p>
-      <w:pPr>
-        <w:pStyle w:val="ListBullet"/>
-        <w:spacing w:after="40" w:line="247" w:lineRule="auto"/>
-      </w:pPr>
-      <w:r>
-        <w:t>Crash logs, performance logs, error logs, security logs, request metadata, fraud-prevention signals, and troubleshooting information</w:t>
-      </w:r>
-    </w:p>
-    <w:p>
-      <w:pPr>
-        <w:pStyle w:val="ListBullet"/>
-        <w:spacing w:after="40" w:line="247" w:lineRule="auto"/>
-      </w:pPr>
-      <w:r>
-        <w:t>User ID, account ID, authentication identifiers, or device-level identifiers where used by the applicable app version or SDKs</w:t>
-      </w:r>
-    </w:p>
-    <w:p>
-      <w:pPr>
-        <w:pStyle w:val="Heading2"/>
-      </w:pPr>
-      <w:r>
-        <w:t>I. Website, Cookies, and Similar Technologies</w:t>
-      </w:r>
-    </w:p>
-    <w:p>
-      <w:r>
-        <w:t>When you use the K Scan website, we may collect website traffic data, cookie data, browser information, device information, referral information, and interaction data to operate the site, measure performance, maintain security, understand usage, support marketing where permitted, and comply with legal obligations.</w:t>
-      </w:r>
-    </w:p>
-    <w:p>
-      <w:r>
-        <w:t>Where required by law, non-essential cookies or similar technologies are used only after valid consent. Browser controls, device controls, and legally required privacy-control mechanisms may also be available.</w:t>
+        <w:t>19. Children and Minor Safety</w:t>
+      </w:r>
+    </w:p>
+    <w:p>
+      <w:r>
+        <w:t>The Service is intended for adults 18 and older and is not directed to children or minors. If you believe a minor has provided information to K Scan, contact kscanai.app@gmail.com.</w:t>
       </w:r>
     </w:p>
     <w:p>
       <w:pPr>
         <w:pStyle w:val="Heading1"/>
-      </w:pPr>
-      <w:r>
-        <w:t>5. How We Use Information</w:t>
-      </w:r>
-    </w:p>
-    <w:p>
-      <w:r>
-        <w:t>We may use information to:</w:t>
-      </w:r>
-    </w:p>
-    <w:p>
-      <w:pPr>
-        <w:pStyle w:val="ListBullet"/>
-        <w:spacing w:after="40" w:line="247" w:lineRule="auto"/>
-      </w:pPr>
-      <w:r>
-        <w:t>Provide, operate, maintain, secure, and improve the Service</w:t>
-      </w:r>
-    </w:p>
-    <w:p>
-      <w:pPr>
-        <w:pStyle w:val="ListBullet"/>
-        <w:spacing w:after="40" w:line="247" w:lineRule="auto"/>
-      </w:pPr>
-      <w:r>
-        <w:t>Authenticate users and support account functionality</w:t>
-      </w:r>
-    </w:p>
-    <w:p>
-      <w:pPr>
-        <w:pStyle w:val="ListBullet"/>
-        <w:spacing w:after="40" w:line="247" w:lineRule="auto"/>
-      </w:pPr>
-      <w:r>
-        <w:t>Process scans and uploaded images and generate fashion-related, style-related, commerce-related, visual-search, or product-search results</w:t>
-      </w:r>
-    </w:p>
-    <w:p>
-      <w:pPr>
-        <w:pStyle w:val="ListBullet"/>
-        <w:spacing w:after="40" w:line="247" w:lineRule="auto"/>
-      </w:pPr>
-      <w:r>
-        <w:t>Operate StyleChat and related AI style-assistance functionality</w:t>
-      </w:r>
-    </w:p>
-    <w:p>
-      <w:pPr>
-        <w:pStyle w:val="ListBullet"/>
-        <w:spacing w:after="40" w:line="247" w:lineRule="auto"/>
-      </w:pPr>
-      <w:r>
-        <w:t>Operate Style Library, Dressing Rooms, saved items, sharing, notes, captions, messages, and user controls</w:t>
-      </w:r>
-    </w:p>
-    <w:p>
-      <w:pPr>
-        <w:pStyle w:val="ListBullet"/>
-        <w:spacing w:after="40" w:line="247" w:lineRule="auto"/>
-      </w:pPr>
-      <w:r>
-        <w:t>Personalize product results, style suggestions, recommendations, content, style boards, and user experience</w:t>
-      </w:r>
-    </w:p>
-    <w:p>
-      <w:pPr>
-        <w:pStyle w:val="ListBullet"/>
-        <w:spacing w:after="40" w:line="247" w:lineRule="auto"/>
-      </w:pPr>
-      <w:r>
-        <w:t>Route users to retailer, marketplace, product-search, affiliate, or product pages</w:t>
-      </w:r>
-    </w:p>
-    <w:p>
-      <w:pPr>
-        <w:pStyle w:val="ListBullet"/>
-        <w:spacing w:after="40" w:line="247" w:lineRule="auto"/>
-      </w:pPr>
-      <w:r>
-        <w:t>Measure affiliate attribution, campaign performance, product engagement, and product interaction where permitted</w:t>
-      </w:r>
-    </w:p>
-    <w:p>
-      <w:pPr>
-        <w:pStyle w:val="ListBullet"/>
-        <w:spacing w:after="40" w:line="247" w:lineRule="auto"/>
-      </w:pPr>
-      <w:r>
-        <w:t>Analyze usage trends, diagnose errors, improve AI systems and product quality where permitted, and maintain security</w:t>
-      </w:r>
-    </w:p>
-    <w:p>
-      <w:pPr>
-        <w:pStyle w:val="ListBullet"/>
-        <w:spacing w:after="40" w:line="247" w:lineRule="auto"/>
-      </w:pPr>
-      <w:r>
-        <w:t>Detect fraud, prevent misuse, protect users, enforce legal terms, and comply with legal obligations</w:t>
-      </w:r>
-    </w:p>
-    <w:p>
-      <w:pPr>
-        <w:pStyle w:val="ListBullet"/>
-        <w:spacing w:after="40" w:line="247" w:lineRule="auto"/>
-      </w:pPr>
-      <w:r>
-        <w:t>Generate derived, aggregated, anonymized, or de-identified business intelligence that does not reasonably identify an individual</w:t>
+        <w:pBdr>
+          <w:bottom w:val="single" w:sz="6" w:space="3" w:color="C89B3C"/>
+        </w:pBdr>
+      </w:pPr>
+      <w:r>
+        <w:t>20. Third-Party Links and Retailer Transactions</w:t>
+      </w:r>
+    </w:p>
+    <w:p>
+      <w:r>
+        <w:t>The Service may link to third-party retailers, marketplaces, websites, or apps. K Scan is not responsible for third-party privacy practices, security, pricing, availability, authenticity, shipping, returns, payment processing, or customer service. Purchases are completed directly with the applicable third party unless K Scan expressly discloses otherwise.</w:t>
       </w:r>
     </w:p>
     <w:p>
       <w:pPr>
         <w:pStyle w:val="Heading1"/>
-      </w:pPr>
-      <w:r>
-        <w:t>6. AI Processing and Automated Results</w:t>
-      </w:r>
-    </w:p>
-    <w:p>
-      <w:r>
-        <w:t>K Scan uses cloud-hosted AI and automated systems during the current release posture to identify fashion items, extract product attributes, generate style signals, rank matches, power StyleChat, provide style assistance, and personalize experiences where permitted.</w:t>
-      </w:r>
-    </w:p>
-    <w:p>
-      <w:r>
-        <w:t>Depending on the production provider configuration, AI requests may be processed by providers such as Gemini and/or other AI routing or infrastructure providers. Some AI provider processing may be subject to provider terms that permit safety review, abuse monitoring, quality improvement, logging, or other processing described by that provider.</w:t>
-      </w:r>
-    </w:p>
-    <w:p>
-      <w:r>
-        <w:t>K Scan does not make provider-specific commitments about model training, retention, human review, special provider retention modes, or processor-only handling unless the relevant production configuration and provider terms have been verified and separately disclosed.</w:t>
-      </w:r>
-    </w:p>
-    <w:p>
-      <w:r>
-        <w:t>AI-generated results may be incomplete, inaccurate, unavailable, or based on similar rather than exact matches. K Scan does not guarantee that any product match, price, availability, retailer listing, style attribute, StyleChat response, or recommendation is complete or error-free.</w:t>
-      </w:r>
-    </w:p>
-    <w:p>
-      <w:r>
-        <w:t>K Scan does not use AI systems to identify people, perform facial recognition, generate biometric profiles, infer protected traits, or make decisions about eligibility for employment, housing, credit, health care, insurance, or other legally significant opportunities.</w:t>
+        <w:pBdr>
+          <w:bottom w:val="single" w:sz="6" w:space="3" w:color="C89B3C"/>
+        </w:pBdr>
+      </w:pPr>
+      <w:r>
+        <w:t>21. Payments and Future Paid Features</w:t>
+      </w:r>
+    </w:p>
+    <w:p>
+      <w:r>
+        <w:t>In the current release, shopping actions route users to third-party pages for physical goods. K Scan does not process payment-card information for those purchases. If K Scan later offers paid digital features or subscriptions in the app, it will use Google Play Billing, Apple In-App Purchase, or other required payment methods and will update applicable disclosures.</w:t>
       </w:r>
     </w:p>
     <w:p>
       <w:pPr>
         <w:pStyle w:val="Heading1"/>
+        <w:pBdr>
+          <w:bottom w:val="single" w:sz="6" w:space="3" w:color="C89B3C"/>
+        </w:pBdr>
+      </w:pPr>
+      <w:r>
+        <w:t>22. Platform Privacy Disclosures</w:t>
+      </w:r>
+    </w:p>
+    <w:p>
+      <w:r>
+        <w:t>K Scan will maintain Google Play Data Safety and other platform disclosures that correspond to the applicable app build. Depending on the features used, reportable categories may include contact information, identifiers, photos, User Content, search terms, app activity, product interactions, diagnostics, and approximate location. Platform disclosures must be updated when permissions, SDKs, AI providers, storage practices, or data flows change.</w:t>
+      </w:r>
+    </w:p>
+    <w:p>
+      <w:pPr>
+        <w:pStyle w:val="Heading1"/>
+        <w:pBdr>
+          <w:bottom w:val="single" w:sz="6" w:space="3" w:color="C89B3C"/>
+        </w:pBdr>
+      </w:pPr>
+      <w:r>
+        <w:t>23. Changes to This Policy</w:t>
+      </w:r>
+    </w:p>
+    <w:p>
+      <w:r>
+        <w:t>K Scan may update this Privacy Policy as the Service, data flows, providers, platform requirements, or law changes. For material changes, K Scan will provide additional notice or obtain consent where required. The Last Updated date will be revised when changes are published.</w:t>
+      </w:r>
+    </w:p>
+    <w:p>
+      <w:pPr>
+        <w:pStyle w:val="Heading1"/>
+        <w:pBdr>
+          <w:bottom w:val="single" w:sz="6" w:space="3" w:color="C89B3C"/>
+        </w:pBdr>
+      </w:pPr>
+      <w:r>
+        <w:t>24. Contact Us</w:t>
+      </w:r>
+    </w:p>
+    <w:p>
+      <w:r>
+        <w:t>K Scan AI</w:t>
+      </w:r>
+    </w:p>
+    <w:p>
+      <w:r>
+        <w:rPr>
+          <w:b/>
+        </w:rPr>
+        <w:t xml:space="preserve">Email: </w:t>
+      </w:r>
+      <w:hyperlink r:id="rId10">
+        <w:r>
+          <w:rPr>
+            <w:color w:val="2D1F5E"/>
+            <w:u w:val="single"/>
+          </w:rPr>
+          <w:t>kscanai.app@gmail.com</w:t>
+        </w:r>
+      </w:hyperlink>
+    </w:p>
+    <w:p>
+      <w:r>
+        <w:rPr>
+          <w:b/>
+        </w:rPr>
+        <w:t xml:space="preserve">Website: </w:t>
+      </w:r>
+      <w:hyperlink r:id="rId11">
+        <w:r>
+          <w:rPr>
+            <w:color w:val="2D1F5E"/>
+            <w:u w:val="single"/>
+          </w:rPr>
+          <w:t>https://kscan.app</w:t>
+        </w:r>
+      </w:hyperlink>
+    </w:p>
+    <w:p>
+      <w:r>
+        <w:rPr>
+          <w:b/>
+        </w:rPr>
+        <w:t xml:space="preserve">Full Privacy Policy: </w:t>
+      </w:r>
+      <w:hyperlink r:id="rId12">
+        <w:r>
+          <w:rPr>
+            <w:color w:val="2D1F5E"/>
+            <w:u w:val="single"/>
+          </w:rPr>
+          <w:t>https://kscan.app/legal/privacy</w:t>
+        </w:r>
+      </w:hyperlink>
+    </w:p>
+    <w:p>
+      <w:r>
+        <w:rPr>
+          <w:b/>
+        </w:rPr>
+        <w:t xml:space="preserve">Privacy Summary: </w:t>
+      </w:r>
+      <w:hyperlink r:id="rId13">
+        <w:r>
+          <w:rPr>
+            <w:color w:val="2D1F5E"/>
+            <w:u w:val="single"/>
+          </w:rPr>
+          <w:t>https://kscan.app/privacy</w:t>
+        </w:r>
+      </w:hyperlink>
+    </w:p>
+    <w:p>
+      <w:r>
+        <w:rPr>
+          <w:b/>
+        </w:rPr>
+        <w:t xml:space="preserve">Account Deletion: </w:t>
+      </w:r>
+      <w:hyperlink r:id="rId14">
+        <w:r>
+          <w:rPr>
+            <w:color w:val="2D1F5E"/>
+            <w:u w:val="single"/>
+          </w:rPr>
+          <w:t>https://kscan.app/legal/delete-account</w:t>
+        </w:r>
+      </w:hyperlink>
+    </w:p>
+    <w:p>
+      <w:r>
+        <w:br w:type="page"/>
+      </w:r>
+    </w:p>
+    <w:p>
+      <w:pPr>
+        <w:pStyle w:val="Heading1"/>
+        <w:pBdr>
+          <w:bottom w:val="single" w:sz="6" w:space="3" w:color="C89B3C"/>
+        </w:pBdr>
       </w:pPr>
       <w:r>
         <w:lastRenderedPageBreak/>
-        <w:t>7. How We Disclose Information</w:t>
-      </w:r>
-    </w:p>
-    <w:p>
-      <w:r>
-        <w:t>K Scan may disclose information to the categories of recipients described below. We do not disclose every data category to every recipient. The data disclosed depends on the feature used, the user’s choices, the app version, provider configuration, legal requirements, and applicable privacy controls.</w:t>
-      </w:r>
-    </w:p>
-    <w:p>
-      <w:pPr>
-        <w:pStyle w:val="Heading1"/>
-      </w:pPr>
-      <w:r>
-        <w:t>8. Service Providers and Third-Party Processors</w:t>
-      </w:r>
-    </w:p>
-    <w:p>
-      <w:r>
-        <w:t>K Scan may disclose information to service providers that perform services on our behalf, such as cloud hosting, infrastructure, storage, database hosting, AI inference, AI routing, analytics, diagnostics, email delivery, customer support, authentication, security, fraud prevention, performance monitoring, crash reporting, account deletion workflows, and app operations.</w:t>
-      </w:r>
-    </w:p>
-    <w:p>
-      <w:r>
-        <w:t>Cloud hosting, infrastructure, storage, database, AI, and processing providers may process submitted images, StyleChat messages, account data, log data, diagnostics, and related metadata to operate the Service, return results, maintain security, troubleshoot functionality, prevent fraud, improve quality where permitted, process deletion requests, or comply with law.</w:t>
-      </w:r>
-    </w:p>
-    <w:p>
-      <w:r>
-        <w:t>These providers may process information as permitted by their agreements with K Scan, their applicable provider terms, this Policy, applicable law, platform rules, and user privacy controls. K Scan uses reasonable contractual, technical, and organizational measures designed to have providers handle user data consistently with this Policy and applicable law, but provider-specific retention, logging, and deletion controls should be verified before stronger claims are made.</w:t>
-      </w:r>
-    </w:p>
-    <w:p>
-      <w:pPr>
-        <w:pStyle w:val="Heading1"/>
-      </w:pPr>
-      <w:r>
-        <w:t>9. Retailer, Affiliate, Commerce, Marketplace, and Product-Search Providers</w:t>
-      </w:r>
-    </w:p>
-    <w:p>
-      <w:r>
-        <w:t>K Scan may disclose limited information to retail, affiliate, commerce, marketplace, product-search, and attribution providers to route users to product results, return relevant listings, measure affiliate conversions, confirm referral activity, attribute purchases or clicks, prevent fraud, support campaign reporting, improve product relevance, and support retailer or partner analytics where permitted.</w:t>
-      </w:r>
-    </w:p>
-    <w:p>
-      <w:r>
-        <w:t>This information may include technical referral data, click data, product interaction data, search terms, product identifiers, product URLs, campaign identifiers, transaction attribution data, approximate location derived from technical data, device or browser information, and limited account or identifier data where permitted.</w:t>
-      </w:r>
-    </w:p>
-    <w:p>
-      <w:r>
-        <w:t>When you tap retailer links, marketplace links, product links, or third-party links, you leave K Scan and the third party’s privacy policy and terms apply. K Scan is not responsible for third-party retailer, marketplace, or affiliate privacy practices, pricing, inventory, shipping, returns, payments, or policies.</w:t>
-      </w:r>
-    </w:p>
-    <w:p>
-      <w:pPr>
-        <w:pStyle w:val="Heading1"/>
-      </w:pPr>
-      <w:r>
-        <w:t>10. Analytics, Advertising, Tracking, and Attribution Posture</w:t>
-      </w:r>
-    </w:p>
-    <w:p>
-      <w:r>
-        <w:t>K Scan may collect basic app interactions, diagnostics, logs, performance data, product interaction data, and attribution data to operate and improve the Service, understand feature performance, troubleshoot errors, prevent fraud, and support commerce routing.</w:t>
-      </w:r>
-    </w:p>
-    <w:p>
-      <w:r>
-        <w:t>Based on the current release posture, K Scan does not currently use third-party advertising SDKs or collect Advertising ID for targeted advertising. K Scan does not currently track users across third-party apps and websites for targeted advertising.</w:t>
-      </w:r>
-    </w:p>
-    <w:p>
-      <w:r>
-        <w:t>If K Scan introduces tracking, third-party advertising SDKs, cross-app or cross-site advertising measurement, or other activities requiring consent or Apple App Tracking Transparency permission, K Scan will update this Policy, update required Google Play and Apple disclosures, and request required consent or App Tracking Transparency permission where required before enabling those activities.</w:t>
-      </w:r>
-    </w:p>
-    <w:p>
-      <w:r>
-        <w:t>Denying optional tracking, if ever requested, will not prevent you from using the core camera-search and style-assistance functionality of the Service, although optional personalization, advertising, attribution, or partner-supported experiences may be affected.</w:t>
-      </w:r>
-    </w:p>
-    <w:p>
-      <w:pPr>
-        <w:pStyle w:val="Heading1"/>
-      </w:pPr>
-      <w:r>
-        <w:t>11. Sale, Sharing, and Targeted Advertising Notice</w:t>
-      </w:r>
-    </w:p>
-    <w:p>
-      <w:r>
-        <w:t>Some privacy laws define sale, sharing, targeted advertising, or similar regulated processing broadly. Certain analytics, affiliate attribution, campaign measurement, product-search, commerce, or partner reporting activities described in this Policy may be considered a sale, sharing, targeted advertising, or similar regulated processing under those laws depending on the data flow and jurisdiction.</w:t>
-      </w:r>
-    </w:p>
-    <w:p>
-      <w:r>
-        <w:t>K Scan does not sell raw scans, uploaded images, biometric identifiers, face templates, faceprints, facial recognition data, government identification, payment card information, or sensitive personal information for independent third-party use.</w:t>
-      </w:r>
-    </w:p>
-    <w:p>
-      <w:r>
-        <w:lastRenderedPageBreak/>
-        <w:t>K Scan may create, use, disclose, license, sell, or commercialize aggregated, anonymized, or de-identified data and insights that do not reasonably identify an individual. These insights may include fashion trend signals, product demand patterns, scan-volume trends, category interest data, style-preference trends, geography-level demand signals at city-level or broader aggregation, retailer performance insights, product-match analytics, conversion analytics, anonymized market research, and aggregated commercial intelligence.</w:t>
-      </w:r>
-    </w:p>
-    <w:p>
-      <w:r>
-        <w:t>Where required by law, K Scan will provide required notices, consent mechanisms, opt-out rights, and legally required controls. You may contact kscanai.app@gmail.com for opt-out or privacy requests. You may also use any legally required privacy-control mechanism we make available, including https://kscan.app/do-not-sell-or-share where applicable.</w:t>
-      </w:r>
-    </w:p>
-    <w:p>
-      <w:pPr>
-        <w:pStyle w:val="Heading1"/>
-      </w:pPr>
-      <w:r>
-        <w:t>12. Data Retention</w:t>
-      </w:r>
-    </w:p>
-    <w:p>
-      <w:r>
-        <w:t>We retain information only as long as reasonably necessary for the purposes described in this Policy, unless a longer period is required or permitted by law.</w:t>
-      </w:r>
-    </w:p>
-    <w:p>
-      <w:pPr>
-        <w:pStyle w:val="ListBullet"/>
-        <w:spacing w:after="40" w:line="247" w:lineRule="auto"/>
-      </w:pPr>
-      <w:r>
-        <w:t>Account and contact data: retained for the duration of the relationship and for a reasonable period afterward as needed for account support, legal compliance, security, fraud prevention, dispute resolution, or legitimate business records.</w:t>
-      </w:r>
-    </w:p>
-    <w:p>
-      <w:pPr>
-        <w:pStyle w:val="ListBullet"/>
-        <w:spacing w:after="40" w:line="247" w:lineRule="auto"/>
-      </w:pPr>
-      <w:r>
-        <w:t>Support and communications data: retained as long as reasonably necessary to resolve the issue, maintain business records, protect the Service, or comply with law.</w:t>
-      </w:r>
-    </w:p>
-    <w:p>
-      <w:pPr>
-        <w:pStyle w:val="ListBullet"/>
-        <w:spacing w:after="40" w:line="247" w:lineRule="auto"/>
-      </w:pPr>
-      <w:r>
-        <w:t>Usage, analytics, attribution, diagnostics, and marketing data: retained as long as reasonably necessary for analytics, product improvement, attribution, legal compliance, business reporting, troubleshooting, security, or fraud prevention, unless retained in aggregated, anonymized, or de-identified form.</w:t>
-      </w:r>
-    </w:p>
-    <w:p>
-      <w:pPr>
-        <w:pStyle w:val="ListBullet"/>
-        <w:spacing w:after="40" w:line="247" w:lineRule="auto"/>
-      </w:pPr>
-      <w:r>
-        <w:t>Submitted visual data and AI request data: retained as long as reasonably necessary to provide the requested feature, operate the Service, maintain security, troubleshoot issues, improve quality where permitted, prevent abuse or fraud, comply with law, and support legitimate operational needs.</w:t>
-      </w:r>
-    </w:p>
-    <w:p>
-      <w:pPr>
-        <w:pStyle w:val="ListBullet"/>
-        <w:spacing w:after="40" w:line="247" w:lineRule="auto"/>
-      </w:pPr>
-      <w:r>
-        <w:t>Library, Dressing Room, saved-item, style-board, and user-uploaded inspiration media: retained while your account is active, while the item remains saved, or until you delete the item or your account, unless retention is required or permitted for security, fraud prevention, troubleshooting, support, quality improvement, backup integrity, legal compliance, or another purpose described in this Policy.</w:t>
-      </w:r>
-    </w:p>
-    <w:p>
-      <w:pPr>
-        <w:pStyle w:val="ListBullet"/>
-        <w:spacing w:after="40" w:line="247" w:lineRule="auto"/>
-      </w:pPr>
-      <w:r>
-        <w:t>StyleChat messages, prompts, and related context: retained as needed to operate the feature, maintain chat/session functionality where applicable, troubleshoot issues, maintain security, prevent abuse, improve quality where permitted, comply with law, or support user-requested account deletion and privacy requests.</w:t>
-      </w:r>
-    </w:p>
-    <w:p>
-      <w:pPr>
-        <w:pStyle w:val="ListBullet"/>
-        <w:spacing w:after="40" w:line="247" w:lineRule="auto"/>
-      </w:pPr>
-      <w:r>
-        <w:t>Saved items, scan history, style boards, Dressing Room content, messages, and user preferences: retained while your account is active or until you delete them, unless retention is required or permitted by law.</w:t>
-      </w:r>
-    </w:p>
-    <w:p>
-      <w:pPr>
-        <w:pStyle w:val="ListBullet"/>
-        <w:spacing w:after="40" w:line="247" w:lineRule="auto"/>
-      </w:pPr>
-      <w:r>
-        <w:t>Aggregated, anonymized, or de-identified data: may be retained indefinitely for research, analytics, commercial insights, product improvement, trend analysis, business reporting, retailer insights, partner analytics, and demand-intelligence products, provided it cannot reasonably identify you.</w:t>
-      </w:r>
-    </w:p>
-    <w:p>
-      <w:r>
-        <w:t>Although active application systems are generally processed for deletion within 30 days of a verified deletion request, residual copies may remain in encrypted or access-controlled backups for a limited additional period, such as up to 90 days, before expiring through normal backup lifecycle processes, unless a longer period is required or permitted by law.</w:t>
-      </w:r>
-    </w:p>
-    <w:p>
-      <w:pPr>
-        <w:pStyle w:val="Heading1"/>
-      </w:pPr>
-      <w:r>
-        <w:t>13. Account Deletion and Privacy Requests</w:t>
-      </w:r>
-    </w:p>
-    <w:p>
-      <w:r>
-        <w:t>If you create an account, you may request deletion of your K Scan account and associated personal information. Where available, you may initiate account deletion through the app at Settings &gt; Account &gt; Delete Account. You may also contact kscanai.app@gmail.com for deletion assistance or privacy requests.</w:t>
-      </w:r>
-    </w:p>
-    <w:p>
-      <w:r>
-        <w:t>Deletion requests are generally processed within 30 days after verification, subject to legal, security, fraud-prevention, dispute-resolution, backup, and technical limitations. K Scan does not claim that deletion is immediate, fully automated, or exhaustive across all downstream systems at the moment a request is submitted.</w:t>
-      </w:r>
-    </w:p>
-    <w:p>
-      <w:r>
-        <w:t>When we process a deletion request, we will delete or de-identify account data and associated personal information where required and reasonably feasible, and we will request relevant service providers to take corresponding action where required by law or applicable agreements. Some information may be retained where legally permitted or technically necessary for security, fraud prevention, legal compliance, dispute resolution, tax, accounting, safety, backup integrity, or other legitimate operational purposes.</w:t>
-      </w:r>
-    </w:p>
-    <w:p>
-      <w:r>
-        <w:t>Aggregated, anonymized, or de-identified data that cannot reasonably be linked back to you may be retained.</w:t>
-      </w:r>
-    </w:p>
-    <w:p>
-      <w:pPr>
-        <w:pStyle w:val="Heading1"/>
-      </w:pPr>
-      <w:r>
-        <w:lastRenderedPageBreak/>
-        <w:t>14. Your Privacy Choices and Controls</w:t>
-      </w:r>
-    </w:p>
-    <w:p>
-      <w:r>
-        <w:t>Depending on your location, you may request access, correction, deletion, portability, restriction, objection, or withdrawal of consent for certain personal information. You may also opt out of marketing emails, manage app permissions through your device settings, limit media access, limit camera access, and use legally required privacy-control mechanisms where available.</w:t>
-      </w:r>
-    </w:p>
-    <w:p>
-      <w:r>
-        <w:t>You may contact us at kscanai.app@gmail.com for privacy requests or questions. We may need to verify your identity before completing certain requests.</w:t>
-      </w:r>
-    </w:p>
-    <w:p>
-      <w:pPr>
-        <w:pStyle w:val="Heading1"/>
-      </w:pPr>
-      <w:r>
-        <w:t>15. California and U.S. State Privacy Rights</w:t>
-      </w:r>
-    </w:p>
-    <w:p>
-      <w:r>
-        <w:t>California residents and residents of other U.S. states with privacy laws may have rights to know, access, delete, correct, obtain a copy of, opt out of sale or sharing, opt out of targeted advertising, limit certain uses of sensitive personal information, and avoid discrimination for exercising privacy rights, subject to legal exceptions.</w:t>
-      </w:r>
-    </w:p>
-    <w:p>
-      <w:r>
-        <w:t>K Scan may use, disclose, share, license, sell, or commercialize certain categories of commercial data, preference data, attribution data, analytics data, derived scan signals, and aggregated or de-identified demand intelligence where permitted by law. K Scan will provide required notices, opt-out rights, consent mechanisms, and other legally required controls for activities that constitute sale, sharing, targeted advertising, or similar regulated processing.</w:t>
-      </w:r>
-    </w:p>
-    <w:p>
-      <w:r>
-        <w:t>Where required, you may opt out by using the in-app privacy settings, using any legally required privacy-control mechanism we make available, visiting https://kscan.app/do-not-sell-or-share, or contacting kscanai.app@gmail.com. K Scan honors Global Privacy Control signals where required by applicable law.</w:t>
-      </w:r>
-    </w:p>
-    <w:p>
-      <w:pPr>
-        <w:pStyle w:val="Heading1"/>
-      </w:pPr>
-      <w:r>
-        <w:t>16. GDPR / UK GDPR Rights and Legal Bases</w:t>
-      </w:r>
-    </w:p>
-    <w:p>
-      <w:r>
-        <w:t>If you are located in the European Economic Area, United Kingdom, or another jurisdiction with similar rights, you may have the right to access, correct, delete, restrict, object to processing, request portability, withdraw consent, and lodge a complaint with a supervisory authority.</w:t>
-      </w:r>
-    </w:p>
-    <w:p>
-      <w:r>
-        <w:t>Possible legal bases include contract performance for core service delivery, consent where required for optional analytics, marketing, tracking, cookies, or targeted advertising, legitimate interests for security, fraud prevention, diagnostics, service improvement, account support, style assistance, commerce routing, and limited affiliate attribution where lawful, and legal obligations for compliance and lawful requests.</w:t>
-      </w:r>
-    </w:p>
-    <w:p>
-      <w:r>
-        <w:t>Where consent is required, it will be requested separately from acceptance of Terms, presented in a reasonably granular manner, and may be withdrawn at any time. Withdrawal does not affect processing already completed lawfully before withdrawal, but it may reduce optional personalized, marketing, or partner-supported features.</w:t>
-      </w:r>
-    </w:p>
-    <w:p>
-      <w:pPr>
-        <w:pStyle w:val="Heading1"/>
-      </w:pPr>
-      <w:r>
-        <w:t>17. International Data Transfers</w:t>
-      </w:r>
-    </w:p>
-    <w:p>
-      <w:r>
-        <w:t>Your information may be processed in the United States and other countries. Where required, we use appropriate safeguards such as Standard Contractual Clauses approved by the European Commission, the UK International Data Transfer Addendum, or other lawful transfer mechanisms.</w:t>
-      </w:r>
-    </w:p>
-    <w:p>
-      <w:pPr>
-        <w:pStyle w:val="Heading1"/>
-      </w:pPr>
-      <w:r>
-        <w:t>18. Security</w:t>
-      </w:r>
-    </w:p>
-    <w:p>
-      <w:r>
-        <w:t>We implement reasonable administrative, technical, and organizational safeguards designed to protect information, including encryption in transit where appropriate, access controls, secure infrastructure, private storage where appropriate, data minimization, retention controls, and operational security practices.</w:t>
-      </w:r>
-    </w:p>
-    <w:p>
-      <w:r>
-        <w:t>No system can be guaranteed completely secure. K Scan does not use absolute-security marketing descriptions unless a future system architecture is verified and disclosed.</w:t>
-      </w:r>
-    </w:p>
-    <w:p>
-      <w:pPr>
-        <w:pStyle w:val="Heading1"/>
-      </w:pPr>
-      <w:r>
-        <w:t>19. Children’s Privacy and Minor Safety</w:t>
-      </w:r>
-    </w:p>
-    <w:p>
-      <w:r>
-        <w:t>K Scan AI is intended for users 18 years of age and older. The Service is not directed to children or minors, and users under 18 should not use the Service.</w:t>
-      </w:r>
-    </w:p>
-    <w:p>
-      <w:r>
-        <w:t>We do not knowingly collect personal information from children or minors. If we learn that we collected information from a person under 18, we will take reasonable steps to delete or restrict that information, subject to legal, safety, security, fraud-prevention, backup, and technical requirements.</w:t>
-      </w:r>
-    </w:p>
-    <w:p>
-      <w:pPr>
-        <w:pStyle w:val="Heading1"/>
-      </w:pPr>
-      <w:r>
-        <w:lastRenderedPageBreak/>
-        <w:t>20. Third-Party Links, Retailers, and Marketplaces</w:t>
-      </w:r>
-    </w:p>
-    <w:p>
-      <w:r>
-        <w:t>The Service may link to third-party retailers, marketplaces, websites, platforms, affiliate partners, product-search providers, or services. K Scan is not responsible for third-party privacy practices, content, security, pricing, product availability, shipping, returns, payment processing, or policies.</w:t>
-      </w:r>
-    </w:p>
-    <w:p>
-      <w:r>
-        <w:t>When you leave K Scan and visit a retailer, marketplace, or third-party website or app, that third party’s privacy policy and terms apply.</w:t>
-      </w:r>
-    </w:p>
-    <w:p>
-      <w:pPr>
-        <w:pStyle w:val="Heading1"/>
-      </w:pPr>
-      <w:r>
-        <w:t>21. Payments and Paid Features</w:t>
-      </w:r>
-    </w:p>
-    <w:p>
-      <w:r>
-        <w:t>In the current release posture, purchase-related calls to action are intended to route users to third-party retailer, marketplace, or product pages. K Scan does not complete checkout, process payment cards, or act as the merchant of record for third-party physical goods purchases unless separately disclosed.</w:t>
-      </w:r>
-    </w:p>
-    <w:p>
-      <w:r>
-        <w:t>If K Scan introduces paid digital features, subscriptions, premium AI features, scan quotas, or account upgrades in the iOS app or Android app, those features will be offered in accordance with applicable Apple, Google Play, and payment-provider rules.</w:t>
-      </w:r>
-    </w:p>
-    <w:p>
-      <w:r>
-        <w:t>Retailer links for physical goods may route users to third-party retailer websites or apps. K Scan does not process payment card data for purchases completed directly with third-party retailers.</w:t>
-      </w:r>
-    </w:p>
-    <w:p>
-      <w:pPr>
-        <w:pStyle w:val="Heading1"/>
-      </w:pPr>
-      <w:r>
-        <w:t>22. Cookies and Website Technologies</w:t>
-      </w:r>
-    </w:p>
-    <w:p>
-      <w:r>
-        <w:t>K Scan may use cookies, pixels, SDKs, local storage, analytics tools, and similar technologies on its website to operate the site, understand usage, maintain security, prevent fraud, measure performance, improve content, and support marketing where permitted.</w:t>
-      </w:r>
-    </w:p>
-    <w:p>
-      <w:r>
-        <w:t>Where required by law, non-essential analytics, advertising, and marketing cookies or SDKs are used only after valid consent. You may manage cookies through browser controls and legally required consent tools where available.</w:t>
-      </w:r>
-    </w:p>
-    <w:p>
-      <w:r>
-        <w:t>We currently do not respond to traditional Do Not Track browser signals. Where required by applicable law, we honor Global Privacy Control signals as opt-out requests for sale or sharing.</w:t>
-      </w:r>
-    </w:p>
-    <w:p>
-      <w:pPr>
-        <w:pStyle w:val="Heading1"/>
-      </w:pPr>
-      <w:r>
-        <w:t>23. Data Breach and Security Incident Notice</w:t>
-      </w:r>
-    </w:p>
-    <w:p>
-      <w:r>
-        <w:t>If K Scan becomes aware of a security incident involving personal information, we will investigate and take appropriate steps based on the nature of the incident. Where required by applicable law, we will notify affected users, regulators, or other parties within legally required timeframes.</w:t>
-      </w:r>
-    </w:p>
-    <w:p>
-      <w:pPr>
-        <w:pStyle w:val="Heading1"/>
-      </w:pPr>
-      <w:r>
-        <w:t>24. Platform Privacy Disclosures</w:t>
-      </w:r>
-    </w:p>
-    <w:p>
-      <w:r>
-        <w:t>K Scan will make required platform privacy disclosures for the applicable app version in Google Play Console and App Store Connect. These disclosures may include categories such as contact information, identifiers, user content, uploaded photos or videos, StyleChat messages, search history, app activity, product interactions, diagnostics, approximate location derived from technical data, and other data depending on the final app build and provider configuration.</w:t>
-      </w:r>
-    </w:p>
-    <w:p>
-      <w:r>
-        <w:t>Platform labels and Data Safety answers should be kept accurate and up to date. If the SDK mix, AI provider routing, data flows, account deletion flow, advertising/tracking posture, or permissions change, K Scan will update this Policy and the relevant platform disclosures.</w:t>
-      </w:r>
-    </w:p>
-    <w:p>
-      <w:pPr>
-        <w:pStyle w:val="Heading1"/>
-      </w:pPr>
-      <w:r>
-        <w:t>25. Legal, Compliance, and Policy Review</w:t>
-      </w:r>
-    </w:p>
-    <w:p>
-      <w:r>
-        <w:t>This Privacy Policy is provided for transparency about K Scan’s privacy practices. It may be updated as the Service, data flows, platform requirements, provider configurations, and applicable laws change. If you have questions, contact kscanai.app@gmail.com.</w:t>
-      </w:r>
-    </w:p>
-    <w:p>
-      <w:pPr>
-        <w:pStyle w:val="Heading1"/>
-      </w:pPr>
-      <w:r>
-        <w:t>26. Changes to This Policy</w:t>
-      </w:r>
-    </w:p>
-    <w:p>
-      <w:r>
-        <w:t>We may update this Privacy Policy from time to time. For material changes that expand how personal information may be used, disclosed, shared, or processed, we will provide additional notice where required and obtain consent or other authorization when applicable. We will update the Last Updated date above when changes are made.</w:t>
-      </w:r>
-    </w:p>
-    <w:p>
-      <w:pPr>
-        <w:pStyle w:val="Heading1"/>
-      </w:pPr>
-      <w:r>
-        <w:t>27. Contact Us</w:t>
-      </w:r>
-    </w:p>
-    <w:p>
-      <w:r>
-        <w:t>K Scan AI</w:t>
-      </w:r>
-    </w:p>
-    <w:p>
-      <w:r>
-        <w:lastRenderedPageBreak/>
-        <w:t>Email: kscanai.app@gmail.com</w:t>
-      </w:r>
-    </w:p>
-    <w:p>
-      <w:r>
-        <w:t>Website: https://kscan.app</w:t>
-      </w:r>
-    </w:p>
-    <w:p>
-      <w:r>
-        <w:t>Privacy-first fashion discovery.</w:t>
-      </w:r>
-    </w:p>
-    <w:p>
-      <w:r>
-        <w:br w:type="page"/>
-      </w:r>
-    </w:p>
-    <w:p>
-      <w:pPr>
-        <w:pStyle w:val="Heading1"/>
-      </w:pPr>
-      <w:r>
-        <w:lastRenderedPageBreak/>
-        <w:t>Appendix A — Public Data Category Summary</w:t>
-      </w:r>
-    </w:p>
-    <w:p>
-      <w:r>
-        <w:t>This summary is provided to help users understand the categories of data the current Service may collect or process. The precise categories depend on the feature used, user choices, app permissions, app version, and provider configuration.</w:t>
+        <w:t>Appendix A - Current Data Category Summary</w:t>
       </w:r>
     </w:p>
     <w:tbl>
@@ -1211,25 +1309,29 @@
         <w:tblLook w:val="04A0" w:firstRow="1" w:lastRow="0" w:firstColumn="1" w:lastColumn="0" w:noHBand="0" w:noVBand="1"/>
       </w:tblPr>
       <w:tblGrid>
-        <w:gridCol w:w="1800"/>
-        <w:gridCol w:w="4896"/>
-        <w:gridCol w:w="3744"/>
+        <w:gridCol w:w="3328"/>
+        <w:gridCol w:w="3328"/>
+        <w:gridCol w:w="3328"/>
       </w:tblGrid>
       <w:tr>
         <w:trPr>
+          <w:tblHeader/>
           <w:jc w:val="center"/>
         </w:trPr>
         <w:tc>
           <w:tcPr>
-            <w:tcW w:w="1800" w:type="dxa"/>
-            <w:shd w:val="clear" w:color="auto" w:fill="E5E7EB"/>
+            <w:tcW w:w="3331" w:type="dxa"/>
+            <w:shd w:val="clear" w:color="auto" w:fill="2D1F5E"/>
             <w:vAlign w:val="center"/>
           </w:tcPr>
           <w:p>
+            <w:pPr>
+              <w:jc w:val="center"/>
+            </w:pPr>
             <w:r>
               <w:rPr>
                 <w:b/>
-                <w:sz w:val="17"/>
+                <w:color w:val="FFFFFF"/>
               </w:rPr>
               <w:t>Category</w:t>
             </w:r>
@@ -1237,15 +1339,18 @@
         </w:tc>
         <w:tc>
           <w:tcPr>
-            <w:tcW w:w="4896" w:type="dxa"/>
-            <w:shd w:val="clear" w:color="auto" w:fill="E5E7EB"/>
+            <w:tcW w:w="3331" w:type="dxa"/>
+            <w:shd w:val="clear" w:color="auto" w:fill="2D1F5E"/>
             <w:vAlign w:val="center"/>
           </w:tcPr>
           <w:p>
+            <w:pPr>
+              <w:jc w:val="center"/>
+            </w:pPr>
             <w:r>
               <w:rPr>
                 <w:b/>
-                <w:sz w:val="17"/>
+                <w:color w:val="FFFFFF"/>
               </w:rPr>
               <w:t>Examples</w:t>
             </w:r>
@@ -1253,17 +1358,20 @@
         </w:tc>
         <w:tc>
           <w:tcPr>
-            <w:tcW w:w="3744" w:type="dxa"/>
-            <w:shd w:val="clear" w:color="auto" w:fill="E5E7EB"/>
+            <w:tcW w:w="3331" w:type="dxa"/>
+            <w:shd w:val="clear" w:color="auto" w:fill="2D1F5E"/>
             <w:vAlign w:val="center"/>
           </w:tcPr>
           <w:p>
+            <w:pPr>
+              <w:jc w:val="center"/>
+            </w:pPr>
             <w:r>
               <w:rPr>
                 <w:b/>
-                <w:sz w:val="17"/>
+                <w:color w:val="FFFFFF"/>
               </w:rPr>
-              <w:t>Primary Purposes</w:t>
+              <w:t>Primary purpose</w:t>
             </w:r>
           </w:p>
         </w:tc>
@@ -1274,40 +1382,58 @@
         </w:trPr>
         <w:tc>
           <w:tcPr>
-            <w:tcW w:w="1800" w:type="dxa"/>
+            <w:tcW w:w="3331" w:type="dxa"/>
+            <w:tcMar>
+              <w:top w:w="80" w:type="dxa"/>
+              <w:left w:w="100" w:type="dxa"/>
+              <w:bottom w:w="80" w:type="dxa"/>
+              <w:right w:w="100" w:type="dxa"/>
+            </w:tcMar>
           </w:tcPr>
           <w:p>
             <w:r>
               <w:rPr>
                 <w:sz w:val="16"/>
               </w:rPr>
-              <w:t>Contact Info</w:t>
+              <w:t>Contact information</w:t>
             </w:r>
           </w:p>
         </w:tc>
         <w:tc>
           <w:tcPr>
-            <w:tcW w:w="4896" w:type="dxa"/>
+            <w:tcW w:w="3331" w:type="dxa"/>
+            <w:tcMar>
+              <w:top w:w="80" w:type="dxa"/>
+              <w:left w:w="100" w:type="dxa"/>
+              <w:bottom w:w="80" w:type="dxa"/>
+              <w:right w:w="100" w:type="dxa"/>
+            </w:tcMar>
           </w:tcPr>
           <w:p>
             <w:r>
               <w:rPr>
                 <w:sz w:val="16"/>
               </w:rPr>
-              <w:t>Email address, name if provided, support contact details</w:t>
+              <w:t>Email address and name if provided</w:t>
             </w:r>
           </w:p>
         </w:tc>
         <w:tc>
           <w:tcPr>
-            <w:tcW w:w="3744" w:type="dxa"/>
+            <w:tcW w:w="3331" w:type="dxa"/>
+            <w:tcMar>
+              <w:top w:w="80" w:type="dxa"/>
+              <w:left w:w="100" w:type="dxa"/>
+              <w:bottom w:w="80" w:type="dxa"/>
+              <w:right w:w="100" w:type="dxa"/>
+            </w:tcMar>
           </w:tcPr>
           <w:p>
             <w:r>
               <w:rPr>
                 <w:sz w:val="16"/>
               </w:rPr>
-              <w:t>Account creation, authentication, support, beta access, notices, privacy requests</w:t>
+              <w:t>Authentication, support, notices, privacy requests</w:t>
             </w:r>
           </w:p>
         </w:tc>
@@ -1318,7 +1444,13 @@
         </w:trPr>
         <w:tc>
           <w:tcPr>
-            <w:tcW w:w="1800" w:type="dxa"/>
+            <w:tcW w:w="3331" w:type="dxa"/>
+            <w:tcMar>
+              <w:top w:w="80" w:type="dxa"/>
+              <w:left w:w="100" w:type="dxa"/>
+              <w:bottom w:w="80" w:type="dxa"/>
+              <w:right w:w="100" w:type="dxa"/>
+            </w:tcMar>
           </w:tcPr>
           <w:p>
             <w:r>
@@ -1331,27 +1463,39 @@
         </w:tc>
         <w:tc>
           <w:tcPr>
-            <w:tcW w:w="4896" w:type="dxa"/>
+            <w:tcW w:w="3331" w:type="dxa"/>
+            <w:tcMar>
+              <w:top w:w="80" w:type="dxa"/>
+              <w:left w:w="100" w:type="dxa"/>
+              <w:bottom w:w="80" w:type="dxa"/>
+              <w:right w:w="100" w:type="dxa"/>
+            </w:tcMar>
           </w:tcPr>
           <w:p>
             <w:r>
               <w:rPr>
                 <w:sz w:val="16"/>
               </w:rPr>
-              <w:t>User ID, account ID, authentication identifiers, device-level identifiers where used</w:t>
+              <w:t>User ID, account ID, authentication and session identifiers</w:t>
             </w:r>
           </w:p>
         </w:tc>
         <w:tc>
           <w:tcPr>
-            <w:tcW w:w="3744" w:type="dxa"/>
+            <w:tcW w:w="3331" w:type="dxa"/>
+            <w:tcMar>
+              <w:top w:w="80" w:type="dxa"/>
+              <w:left w:w="100" w:type="dxa"/>
+              <w:bottom w:w="80" w:type="dxa"/>
+              <w:right w:w="100" w:type="dxa"/>
+            </w:tcMar>
           </w:tcPr>
           <w:p>
             <w:r>
               <w:rPr>
                 <w:sz w:val="16"/>
               </w:rPr>
-              <w:t>Authentication, security, account management, diagnostics, fraud prevention</w:t>
+              <w:t>Account security, actor isolation, diagnostics</w:t>
             </w:r>
           </w:p>
         </w:tc>
@@ -1362,40 +1506,58 @@
         </w:trPr>
         <w:tc>
           <w:tcPr>
-            <w:tcW w:w="1800" w:type="dxa"/>
+            <w:tcW w:w="3331" w:type="dxa"/>
+            <w:tcMar>
+              <w:top w:w="80" w:type="dxa"/>
+              <w:left w:w="100" w:type="dxa"/>
+              <w:bottom w:w="80" w:type="dxa"/>
+              <w:right w:w="100" w:type="dxa"/>
+            </w:tcMar>
           </w:tcPr>
           <w:p>
             <w:r>
               <w:rPr>
                 <w:sz w:val="16"/>
               </w:rPr>
-              <w:t>User Content</w:t>
+              <w:t>Photos and User Content</w:t>
             </w:r>
           </w:p>
         </w:tc>
         <w:tc>
           <w:tcPr>
-            <w:tcW w:w="4896" w:type="dxa"/>
+            <w:tcW w:w="3331" w:type="dxa"/>
+            <w:tcMar>
+              <w:top w:w="80" w:type="dxa"/>
+              <w:left w:w="100" w:type="dxa"/>
+              <w:bottom w:w="80" w:type="dxa"/>
+              <w:right w:w="100" w:type="dxa"/>
+            </w:tcMar>
           </w:tcPr>
           <w:p>
             <w:r>
               <w:rPr>
                 <w:sz w:val="16"/>
               </w:rPr>
-              <w:t>Uploaded images, screenshots, scan content, StyleChat messages, notes, captions, Dressing Room content, shared-room content, support messages</w:t>
+              <w:t>Selected images, scans, Elise/StyleChat messages, room content</w:t>
             </w:r>
           </w:p>
         </w:tc>
         <w:tc>
           <w:tcPr>
-            <w:tcW w:w="3744" w:type="dxa"/>
+            <w:tcW w:w="3331" w:type="dxa"/>
+            <w:tcMar>
+              <w:top w:w="80" w:type="dxa"/>
+              <w:left w:w="100" w:type="dxa"/>
+              <w:bottom w:w="80" w:type="dxa"/>
+              <w:right w:w="100" w:type="dxa"/>
+            </w:tcMar>
           </w:tcPr>
           <w:p>
             <w:r>
               <w:rPr>
                 <w:sz w:val="16"/>
               </w:rPr>
-              <w:t>Core app functionality, AI style assistance, storage, display, support, safety, troubleshooting</w:t>
+              <w:t>Scanning, AI styling, saving, sharing, support</w:t>
             </w:r>
           </w:p>
         </w:tc>
@@ -1406,40 +1568,58 @@
         </w:trPr>
         <w:tc>
           <w:tcPr>
-            <w:tcW w:w="1800" w:type="dxa"/>
+            <w:tcW w:w="3331" w:type="dxa"/>
+            <w:tcMar>
+              <w:top w:w="80" w:type="dxa"/>
+              <w:left w:w="100" w:type="dxa"/>
+              <w:bottom w:w="80" w:type="dxa"/>
+              <w:right w:w="100" w:type="dxa"/>
+            </w:tcMar>
           </w:tcPr>
           <w:p>
             <w:r>
               <w:rPr>
                 <w:sz w:val="16"/>
               </w:rPr>
-              <w:t>Search History</w:t>
+              <w:t>Search and commerce data</w:t>
             </w:r>
           </w:p>
         </w:tc>
         <w:tc>
           <w:tcPr>
-            <w:tcW w:w="4896" w:type="dxa"/>
+            <w:tcW w:w="3331" w:type="dxa"/>
+            <w:tcMar>
+              <w:top w:w="80" w:type="dxa"/>
+              <w:left w:w="100" w:type="dxa"/>
+              <w:bottom w:w="80" w:type="dxa"/>
+              <w:right w:w="100" w:type="dxa"/>
+            </w:tcMar>
           </w:tcPr>
           <w:p>
             <w:r>
               <w:rPr>
                 <w:sz w:val="16"/>
               </w:rPr>
-              <w:t>In-app searches, product lookup queries, scan-derived search terms</w:t>
+              <w:t>Product queries, item attributes, retailer links, saved commerce snapshots</w:t>
             </w:r>
           </w:p>
         </w:tc>
         <w:tc>
           <w:tcPr>
-            <w:tcW w:w="3744" w:type="dxa"/>
+            <w:tcW w:w="3331" w:type="dxa"/>
+            <w:tcMar>
+              <w:top w:w="80" w:type="dxa"/>
+              <w:left w:w="100" w:type="dxa"/>
+              <w:bottom w:w="80" w:type="dxa"/>
+              <w:right w:w="100" w:type="dxa"/>
+            </w:tcMar>
           </w:tcPr>
           <w:p>
             <w:r>
               <w:rPr>
                 <w:sz w:val="16"/>
               </w:rPr>
-              <w:t>Search, product matching, retailer results, recommendations, analytics where permitted</w:t>
+              <w:t>Product matching, retailer-neutral routing, reopen behavior</w:t>
             </w:r>
           </w:p>
         </w:tc>
@@ -1450,40 +1630,58 @@
         </w:trPr>
         <w:tc>
           <w:tcPr>
-            <w:tcW w:w="1800" w:type="dxa"/>
+            <w:tcW w:w="3331" w:type="dxa"/>
+            <w:tcMar>
+              <w:top w:w="80" w:type="dxa"/>
+              <w:left w:w="100" w:type="dxa"/>
+              <w:bottom w:w="80" w:type="dxa"/>
+              <w:right w:w="100" w:type="dxa"/>
+            </w:tcMar>
           </w:tcPr>
           <w:p>
             <w:r>
               <w:rPr>
                 <w:sz w:val="16"/>
               </w:rPr>
-              <w:t>Usage Data</w:t>
+              <w:t>App activity</w:t>
             </w:r>
           </w:p>
         </w:tc>
         <w:tc>
           <w:tcPr>
-            <w:tcW w:w="4896" w:type="dxa"/>
+            <w:tcW w:w="3331" w:type="dxa"/>
+            <w:tcMar>
+              <w:top w:w="80" w:type="dxa"/>
+              <w:left w:w="100" w:type="dxa"/>
+              <w:bottom w:w="80" w:type="dxa"/>
+              <w:right w:w="100" w:type="dxa"/>
+            </w:tcMar>
           </w:tcPr>
           <w:p>
             <w:r>
               <w:rPr>
                 <w:sz w:val="16"/>
               </w:rPr>
-              <w:t>App interactions, product interactions, saved items, outbound retailer clicks, feature usage</w:t>
+              <w:t>Feature usage, save actions, room actions, outbound-link interactions</w:t>
             </w:r>
           </w:p>
         </w:tc>
         <w:tc>
           <w:tcPr>
-            <w:tcW w:w="3744" w:type="dxa"/>
+            <w:tcW w:w="3331" w:type="dxa"/>
+            <w:tcMar>
+              <w:top w:w="80" w:type="dxa"/>
+              <w:left w:w="100" w:type="dxa"/>
+              <w:bottom w:w="80" w:type="dxa"/>
+              <w:right w:w="100" w:type="dxa"/>
+            </w:tcMar>
           </w:tcPr>
           <w:p>
             <w:r>
               <w:rPr>
                 <w:sz w:val="16"/>
               </w:rPr>
-              <w:t>App functionality, product improvement, attribution, analytics, personalization where permitted</w:t>
+              <w:t>App functionality, reliability, fraud prevention, internal analytics</w:t>
             </w:r>
           </w:p>
         </w:tc>
@@ -1494,7 +1692,75 @@
         </w:trPr>
         <w:tc>
           <w:tcPr>
-            <w:tcW w:w="1800" w:type="dxa"/>
+            <w:tcW w:w="3331" w:type="dxa"/>
+            <w:tcMar>
+              <w:top w:w="80" w:type="dxa"/>
+              <w:left w:w="100" w:type="dxa"/>
+              <w:bottom w:w="80" w:type="dxa"/>
+              <w:right w:w="100" w:type="dxa"/>
+            </w:tcMar>
+          </w:tcPr>
+          <w:p>
+            <w:r>
+              <w:rPr>
+                <w:sz w:val="16"/>
+              </w:rPr>
+              <w:t>Approximate location</w:t>
+            </w:r>
+          </w:p>
+        </w:tc>
+        <w:tc>
+          <w:tcPr>
+            <w:tcW w:w="3331" w:type="dxa"/>
+            <w:tcMar>
+              <w:top w:w="80" w:type="dxa"/>
+              <w:left w:w="100" w:type="dxa"/>
+              <w:bottom w:w="80" w:type="dxa"/>
+              <w:right w:w="100" w:type="dxa"/>
+            </w:tcMar>
+          </w:tcPr>
+          <w:p>
+            <w:r>
+              <w:rPr>
+                <w:sz w:val="16"/>
+              </w:rPr>
+              <w:t>Optional coarse device location or IP-derived region</w:t>
+            </w:r>
+          </w:p>
+        </w:tc>
+        <w:tc>
+          <w:tcPr>
+            <w:tcW w:w="3331" w:type="dxa"/>
+            <w:tcMar>
+              <w:top w:w="80" w:type="dxa"/>
+              <w:left w:w="100" w:type="dxa"/>
+              <w:bottom w:w="80" w:type="dxa"/>
+              <w:right w:w="100" w:type="dxa"/>
+            </w:tcMar>
+          </w:tcPr>
+          <w:p>
+            <w:r>
+              <w:rPr>
+                <w:sz w:val="16"/>
+              </w:rPr>
+              <w:t>Optional weather context, localization, security</w:t>
+            </w:r>
+          </w:p>
+        </w:tc>
+      </w:tr>
+      <w:tr>
+        <w:trPr>
+          <w:jc w:val="center"/>
+        </w:trPr>
+        <w:tc>
+          <w:tcPr>
+            <w:tcW w:w="3331" w:type="dxa"/>
+            <w:tcMar>
+              <w:top w:w="80" w:type="dxa"/>
+              <w:left w:w="100" w:type="dxa"/>
+              <w:bottom w:w="80" w:type="dxa"/>
+              <w:right w:w="100" w:type="dxa"/>
+            </w:tcMar>
           </w:tcPr>
           <w:p>
             <w:r>
@@ -1507,27 +1773,39 @@
         </w:tc>
         <w:tc>
           <w:tcPr>
-            <w:tcW w:w="4896" w:type="dxa"/>
+            <w:tcW w:w="3331" w:type="dxa"/>
+            <w:tcMar>
+              <w:top w:w="80" w:type="dxa"/>
+              <w:left w:w="100" w:type="dxa"/>
+              <w:bottom w:w="80" w:type="dxa"/>
+              <w:right w:w="100" w:type="dxa"/>
+            </w:tcMar>
           </w:tcPr>
           <w:p>
             <w:r>
               <w:rPr>
                 <w:sz w:val="16"/>
               </w:rPr>
-              <w:t>Crash logs, performance logs, error logs, security logs</w:t>
+              <w:t>Error, performance, request, and security logs</w:t>
             </w:r>
           </w:p>
         </w:tc>
         <w:tc>
           <w:tcPr>
-            <w:tcW w:w="3744" w:type="dxa"/>
+            <w:tcW w:w="3331" w:type="dxa"/>
+            <w:tcMar>
+              <w:top w:w="80" w:type="dxa"/>
+              <w:left w:w="100" w:type="dxa"/>
+              <w:bottom w:w="80" w:type="dxa"/>
+              <w:right w:w="100" w:type="dxa"/>
+            </w:tcMar>
           </w:tcPr>
           <w:p>
             <w:r>
               <w:rPr>
                 <w:sz w:val="16"/>
               </w:rPr>
-              <w:t>Troubleshooting, security, performance, quality improvement</w:t>
+              <w:t>Troubleshooting, reliability, security</w:t>
             </w:r>
           </w:p>
         </w:tc>
@@ -1538,40 +1816,58 @@
         </w:trPr>
         <w:tc>
           <w:tcPr>
-            <w:tcW w:w="1800" w:type="dxa"/>
+            <w:tcW w:w="3331" w:type="dxa"/>
+            <w:tcMar>
+              <w:top w:w="80" w:type="dxa"/>
+              <w:left w:w="100" w:type="dxa"/>
+              <w:bottom w:w="80" w:type="dxa"/>
+              <w:right w:w="100" w:type="dxa"/>
+            </w:tcMar>
           </w:tcPr>
           <w:p>
             <w:r>
               <w:rPr>
                 <w:sz w:val="16"/>
               </w:rPr>
-              <w:t>Approximate Location</w:t>
+              <w:t>Audio</w:t>
             </w:r>
           </w:p>
         </w:tc>
         <w:tc>
           <w:tcPr>
-            <w:tcW w:w="4896" w:type="dxa"/>
+            <w:tcW w:w="3331" w:type="dxa"/>
+            <w:tcMar>
+              <w:top w:w="80" w:type="dxa"/>
+              <w:left w:w="100" w:type="dxa"/>
+              <w:bottom w:w="80" w:type="dxa"/>
+              <w:right w:w="100" w:type="dxa"/>
+            </w:tcMar>
           </w:tcPr>
           <w:p>
             <w:r>
               <w:rPr>
                 <w:sz w:val="16"/>
               </w:rPr>
-              <w:t>Approximate location derived from IP address or technical data, if applicable</w:t>
+              <w:t>Generated Elise speech audio and timing data</w:t>
             </w:r>
           </w:p>
         </w:tc>
         <w:tc>
           <w:tcPr>
-            <w:tcW w:w="3744" w:type="dxa"/>
+            <w:tcW w:w="3331" w:type="dxa"/>
+            <w:tcMar>
+              <w:top w:w="80" w:type="dxa"/>
+              <w:left w:w="100" w:type="dxa"/>
+              <w:bottom w:w="80" w:type="dxa"/>
+              <w:right w:w="100" w:type="dxa"/>
+            </w:tcMar>
           </w:tcPr>
           <w:p>
             <w:r>
               <w:rPr>
                 <w:sz w:val="16"/>
               </w:rPr>
-              <w:t>Security, localization, analytics, product relevance, fraud prevention</w:t>
+              <w:t>Text-to-speech playback; no microphone recording</w:t>
             </w:r>
           </w:p>
         </w:tc>
@@ -1582,40 +1878,58 @@
         </w:trPr>
         <w:tc>
           <w:tcPr>
-            <w:tcW w:w="1800" w:type="dxa"/>
+            <w:tcW w:w="3331" w:type="dxa"/>
+            <w:tcMar>
+              <w:top w:w="80" w:type="dxa"/>
+              <w:left w:w="100" w:type="dxa"/>
+              <w:bottom w:w="80" w:type="dxa"/>
+              <w:right w:w="100" w:type="dxa"/>
+            </w:tcMar>
           </w:tcPr>
           <w:p>
             <w:r>
               <w:rPr>
                 <w:sz w:val="16"/>
               </w:rPr>
-              <w:t>Purchases / Product Interaction</w:t>
+              <w:t>Financial information</w:t>
             </w:r>
           </w:p>
         </w:tc>
         <w:tc>
           <w:tcPr>
-            <w:tcW w:w="4896" w:type="dxa"/>
+            <w:tcW w:w="3331" w:type="dxa"/>
+            <w:tcMar>
+              <w:top w:w="80" w:type="dxa"/>
+              <w:left w:w="100" w:type="dxa"/>
+              <w:bottom w:w="80" w:type="dxa"/>
+              <w:right w:w="100" w:type="dxa"/>
+            </w:tcMar>
           </w:tcPr>
           <w:p>
             <w:r>
               <w:rPr>
                 <w:sz w:val="16"/>
               </w:rPr>
-              <w:t>Retailer clicks, affiliate attribution, purchase-attribution signals where available</w:t>
+              <w:t>Payment-card data for retailer purchases</w:t>
             </w:r>
           </w:p>
         </w:tc>
         <w:tc>
           <w:tcPr>
-            <w:tcW w:w="3744" w:type="dxa"/>
+            <w:tcW w:w="3331" w:type="dxa"/>
+            <w:tcMar>
+              <w:top w:w="80" w:type="dxa"/>
+              <w:left w:w="100" w:type="dxa"/>
+              <w:bottom w:w="80" w:type="dxa"/>
+              <w:right w:w="100" w:type="dxa"/>
+            </w:tcMar>
           </w:tcPr>
           <w:p>
             <w:r>
               <w:rPr>
                 <w:sz w:val="16"/>
               </w:rPr>
-              <w:t>Commerce routing, attribution, partner reporting where permitted</w:t>
+              <w:t>Not collected by K Scan in the current third-party checkout flow</w:t>
             </w:r>
           </w:p>
         </w:tc>
@@ -1626,172 +1940,58 @@
         </w:trPr>
         <w:tc>
           <w:tcPr>
-            <w:tcW w:w="1800" w:type="dxa"/>
+            <w:tcW w:w="3331" w:type="dxa"/>
+            <w:tcMar>
+              <w:top w:w="80" w:type="dxa"/>
+              <w:left w:w="100" w:type="dxa"/>
+              <w:bottom w:w="80" w:type="dxa"/>
+              <w:right w:w="100" w:type="dxa"/>
+            </w:tcMar>
           </w:tcPr>
           <w:p>
             <w:r>
               <w:rPr>
                 <w:sz w:val="16"/>
               </w:rPr>
-              <w:t>Financial Info</w:t>
+              <w:t>Sensitive information</w:t>
             </w:r>
           </w:p>
         </w:tc>
         <w:tc>
           <w:tcPr>
-            <w:tcW w:w="4896" w:type="dxa"/>
+            <w:tcW w:w="3331" w:type="dxa"/>
+            <w:tcMar>
+              <w:top w:w="80" w:type="dxa"/>
+              <w:left w:w="100" w:type="dxa"/>
+              <w:bottom w:w="80" w:type="dxa"/>
+              <w:right w:w="100" w:type="dxa"/>
+            </w:tcMar>
           </w:tcPr>
           <w:p>
             <w:r>
               <w:rPr>
                 <w:sz w:val="16"/>
               </w:rPr>
-              <w:t>Payment card data is not processed by K Scan for third-party physical goods purchases in the current release posture</w:t>
+              <w:t>Not intentionally requested; may appear incidentally in uploaded content</w:t>
             </w:r>
           </w:p>
         </w:tc>
         <w:tc>
           <w:tcPr>
-            <w:tcW w:w="3744" w:type="dxa"/>
+            <w:tcW w:w="3331" w:type="dxa"/>
+            <w:tcMar>
+              <w:top w:w="80" w:type="dxa"/>
+              <w:left w:w="100" w:type="dxa"/>
+              <w:bottom w:w="80" w:type="dxa"/>
+              <w:right w:w="100" w:type="dxa"/>
+            </w:tcMar>
           </w:tcPr>
           <w:p>
             <w:r>
               <w:rPr>
                 <w:sz w:val="16"/>
               </w:rPr>
-              <w:t>Not collected by K Scan for current third-party retailer checkout flows</w:t>
-            </w:r>
-          </w:p>
-        </w:tc>
-      </w:tr>
-      <w:tr>
-        <w:trPr>
-          <w:jc w:val="center"/>
-        </w:trPr>
-        <w:tc>
-          <w:tcPr>
-            <w:tcW w:w="1800" w:type="dxa"/>
-          </w:tcPr>
-          <w:p>
-            <w:r>
-              <w:rPr>
-                <w:sz w:val="16"/>
-              </w:rPr>
-              <w:t>Sensitive Info</w:t>
-            </w:r>
-          </w:p>
-        </w:tc>
-        <w:tc>
-          <w:tcPr>
-            <w:tcW w:w="4896" w:type="dxa"/>
-          </w:tcPr>
-          <w:p>
-            <w:r>
-              <w:rPr>
-                <w:sz w:val="16"/>
-              </w:rPr>
-              <w:t>Not intentionally collected; may be incidentally present in user-uploaded images or messages</w:t>
-            </w:r>
-          </w:p>
-        </w:tc>
-        <w:tc>
-          <w:tcPr>
-            <w:tcW w:w="3744" w:type="dxa"/>
-          </w:tcPr>
-          <w:p>
-            <w:r>
-              <w:rPr>
-                <w:sz w:val="16"/>
-              </w:rPr>
-              <w:t>Users should avoid submitting sensitive personal information</w:t>
-            </w:r>
-          </w:p>
-        </w:tc>
-      </w:tr>
-      <w:tr>
-        <w:trPr>
-          <w:jc w:val="center"/>
-        </w:trPr>
-        <w:tc>
-          <w:tcPr>
-            <w:tcW w:w="1800" w:type="dxa"/>
-          </w:tcPr>
-          <w:p>
-            <w:r>
-              <w:rPr>
-                <w:sz w:val="16"/>
-              </w:rPr>
-              <w:t>Contacts / Health / Fitness / Browsing History</w:t>
-            </w:r>
-          </w:p>
-        </w:tc>
-        <w:tc>
-          <w:tcPr>
-            <w:tcW w:w="4896" w:type="dxa"/>
-          </w:tcPr>
-          <w:p>
-            <w:r>
-              <w:rPr>
-                <w:sz w:val="16"/>
-              </w:rPr>
-              <w:t>Not collected by K Scan as current core app categories unless future features separately disclose otherwise</w:t>
-            </w:r>
-          </w:p>
-        </w:tc>
-        <w:tc>
-          <w:tcPr>
-            <w:tcW w:w="3744" w:type="dxa"/>
-          </w:tcPr>
-          <w:p>
-            <w:r>
-              <w:rPr>
-                <w:sz w:val="16"/>
-              </w:rPr>
-              <w:t>Not applicable to current core functionality</w:t>
-            </w:r>
-          </w:p>
-        </w:tc>
-      </w:tr>
-      <w:tr>
-        <w:trPr>
-          <w:jc w:val="center"/>
-        </w:trPr>
-        <w:tc>
-          <w:tcPr>
-            <w:tcW w:w="1800" w:type="dxa"/>
-          </w:tcPr>
-          <w:p>
-            <w:r>
-              <w:rPr>
-                <w:sz w:val="16"/>
-              </w:rPr>
-              <w:t>Other Data</w:t>
-            </w:r>
-          </w:p>
-        </w:tc>
-        <w:tc>
-          <w:tcPr>
-            <w:tcW w:w="4896" w:type="dxa"/>
-          </w:tcPr>
-          <w:p>
-            <w:r>
-              <w:rPr>
-                <w:sz w:val="16"/>
-              </w:rPr>
-              <w:t>Style preferences, garment attributes, product signals, derived fashion interests</w:t>
-            </w:r>
-          </w:p>
-        </w:tc>
-        <w:tc>
-          <w:tcPr>
-            <w:tcW w:w="3744" w:type="dxa"/>
-          </w:tcPr>
-          <w:p>
-            <w:r>
-              <w:rPr>
-                <w:sz w:val="16"/>
-              </w:rPr>
-              <w:t>Recommendations, product matching, personalization, analytics, aggregated insights where permitted</w:t>
+              <w:t>Users should avoid submitting sensitive or non-fashion information</w:t>
             </w:r>
           </w:p>
         </w:tc>
@@ -1799,10 +1999,10 @@
     </w:tbl>
     <w:p/>
     <w:sectPr>
-      <w:headerReference w:type="default" r:id="rId8"/>
-      <w:footerReference w:type="default" r:id="rId9"/>
+      <w:headerReference w:type="default" r:id="rId15"/>
+      <w:footerReference w:type="default" r:id="rId16"/>
       <w:pgSz w:w="12240" w:h="15840"/>
-      <w:pgMar w:top="792" w:right="893" w:bottom="792" w:left="893" w:header="360" w:footer="360" w:gutter="0"/>
+      <w:pgMar w:top="936" w:right="1123" w:bottom="936" w:left="1123" w:header="432" w:footer="432" w:gutter="0"/>
       <w:cols w:space="720"/>
       <w:docGrid w:linePitch="360"/>
     </w:sectPr>
@@ -1839,15 +2039,40 @@
 <w:ftr xmlns:wpc="http://schemas.microsoft.com/office/word/2010/wordprocessingCanvas" xmlns:cx="http://schemas.microsoft.com/office/drawing/2014/chartex" xmlns:cx1="http://schemas.microsoft.com/office/drawing/2015/9/8/chartex" xmlns:cx2="http://schemas.microsoft.com/office/drawing/2015/10/21/chartex" xmlns:cx3="http://schemas.microsoft.com/office/drawing/2016/5/9/chartex" xmlns:cx4="http://schemas.microsoft.com/office/drawing/2016/5/10/chartex" xmlns:cx5="http://schemas.microsoft.com/office/drawing/2016/5/11/chartex" xmlns:cx6="http://schemas.microsoft.com/office/drawing/2016/5/12/chartex" xmlns:cx7="http://schemas.microsoft.com/office/drawing/2016/5/13/chartex" xmlns:cx8="http://schemas.microsoft.com/office/drawing/2016/5/14/chartex" xmlns:mc="http://schemas.openxmlformats.org/markup-compatibility/2006" xmlns:aink="http://schemas.microsoft.com/office/drawing/2016/ink" xmlns:am3d="http://schemas.microsoft.com/office/drawing/2017/model3d" xmlns:o="urn:schemas-microsoft-com:office:office" xmlns:oel="http://schemas.microsoft.com/office/2019/extlst" xmlns:r="http://schemas.openxmlformats.org/officeDocument/2006/relationships" xmlns:m="http://schemas.openxmlformats.org/officeDocument/2006/math" xmlns:v="urn:schemas-microsoft-com:vml" xmlns:wp14="http://schemas.microsoft.com/office/word/2010/wordprocessingDrawing" xmlns:wp="http://schemas.openxmlformats.org/drawingml/2006/wordprocessingDrawing" xmlns:w10="urn:schemas-microsoft-com:office:word" xmlns:w="http://schemas.openxmlformats.org/wordprocessingml/2006/main" xmlns:w14="http://schemas.microsoft.com/office/word/2010/wordml" xmlns:w15="http://schemas.microsoft.com/office/word/2012/wordml" xmlns:w16cex="http://schemas.microsoft.com/office/word/2018/wordml/cex" xmlns:w16cid="http://schemas.microsoft.com/office/word/2016/wordml/cid" xmlns:w16="http://schemas.microsoft.com/office/word/2018/wordml" xmlns:w16du="http://schemas.microsoft.com/office/word/2023/wordml/word16du" xmlns:w16sdtdh="http://schemas.microsoft.com/office/word/2020/wordml/sdtdatahash" xmlns:w16sdtfl="http://schemas.microsoft.com/office/word/2024/wordml/sdtformatlock" xmlns:w16se="http://schemas.microsoft.com/office/word/2015/wordml/symex" xmlns:wpg="http://schemas.microsoft.com/office/word/2010/wordprocessingGroup" xmlns:wpi="http://schemas.microsoft.com/office/word/2010/wordprocessingInk" xmlns:wne="http://schemas.microsoft.com/office/word/2006/wordml" xmlns:wps="http://schemas.microsoft.com/office/word/2010/wordprocessingShape" mc:Ignorable="w14 w15 w16se w16cid w16 w16cex w16sdtdh w16sdtfl w16du wp14">
   <w:p>
     <w:pPr>
-      <w:pStyle w:val="Footer"/>
+      <w:pStyle w:val="Meta"/>
       <w:jc w:val="center"/>
     </w:pPr>
     <w:r>
-      <w:rPr>
-        <w:color w:val="6B7280"/>
-        <w:sz w:val="16"/>
-      </w:rPr>
-      <w:t>Website, Google Play, and Apple App Store submission-ready public policy version</w:t>
+      <w:t xml:space="preserve">K Scan AI  |  </w:t>
+    </w:r>
+    <w:hyperlink r:id="rId1">
+      <w:r>
+        <w:rPr>
+          <w:color w:val="2D1F5E"/>
+        </w:rPr>
+        <w:t>https://kscan.app/legal/privacy</w:t>
+      </w:r>
+    </w:hyperlink>
+    <w:r>
+      <w:t xml:space="preserve">  |  </w:t>
+    </w:r>
+    <w:r>
+      <w:fldChar w:fldCharType="begin"/>
+    </w:r>
+    <w:r>
+      <w:instrText xml:space="preserve"> PAGE </w:instrText>
+    </w:r>
+    <w:r>
+      <w:fldChar w:fldCharType="separate"/>
+    </w:r>
+    <w:r>
+      <w:rPr>
+        <w:noProof/>
+      </w:rPr>
+      <w:t>1</w:t>
+    </w:r>
+    <w:r>
+      <w:fldChar w:fldCharType="end"/>
     </w:r>
   </w:p>
 </w:ftr>
@@ -1882,31 +2107,11 @@
 <w:hdr xmlns:wpc="http://schemas.microsoft.com/office/word/2010/wordprocessingCanvas" xmlns:cx="http://schemas.microsoft.com/office/drawing/2014/chartex" xmlns:cx1="http://schemas.microsoft.com/office/drawing/2015/9/8/chartex" xmlns:cx2="http://schemas.microsoft.com/office/drawing/2015/10/21/chartex" xmlns:cx3="http://schemas.microsoft.com/office/drawing/2016/5/9/chartex" xmlns:cx4="http://schemas.microsoft.com/office/drawing/2016/5/10/chartex" xmlns:cx5="http://schemas.microsoft.com/office/drawing/2016/5/11/chartex" xmlns:cx6="http://schemas.microsoft.com/office/drawing/2016/5/12/chartex" xmlns:cx7="http://schemas.microsoft.com/office/drawing/2016/5/13/chartex" xmlns:cx8="http://schemas.microsoft.com/office/drawing/2016/5/14/chartex" xmlns:mc="http://schemas.openxmlformats.org/markup-compatibility/2006" xmlns:aink="http://schemas.microsoft.com/office/drawing/2016/ink" xmlns:am3d="http://schemas.microsoft.com/office/drawing/2017/model3d" xmlns:o="urn:schemas-microsoft-com:office:office" xmlns:oel="http://schemas.microsoft.com/office/2019/extlst" xmlns:r="http://schemas.openxmlformats.org/officeDocument/2006/relationships" xmlns:m="http://schemas.openxmlformats.org/officeDocument/2006/math" xmlns:v="urn:schemas-microsoft-com:vml" xmlns:wp14="http://schemas.microsoft.com/office/word/2010/wordprocessingDrawing" xmlns:wp="http://schemas.openxmlformats.org/drawingml/2006/wordprocessingDrawing" xmlns:w10="urn:schemas-microsoft-com:office:word" xmlns:w="http://schemas.openxmlformats.org/wordprocessingml/2006/main" xmlns:w14="http://schemas.microsoft.com/office/word/2010/wordml" xmlns:w15="http://schemas.microsoft.com/office/word/2012/wordml" xmlns:w16cex="http://schemas.microsoft.com/office/word/2018/wordml/cex" xmlns:w16cid="http://schemas.microsoft.com/office/word/2016/wordml/cid" xmlns:w16="http://schemas.microsoft.com/office/word/2018/wordml" xmlns:w16du="http://schemas.microsoft.com/office/word/2023/wordml/word16du" xmlns:w16sdtdh="http://schemas.microsoft.com/office/word/2020/wordml/sdtdatahash" xmlns:w16sdtfl="http://schemas.microsoft.com/office/word/2024/wordml/sdtformatlock" xmlns:w16se="http://schemas.microsoft.com/office/word/2015/wordml/symex" xmlns:wpg="http://schemas.microsoft.com/office/word/2010/wordprocessingGroup" xmlns:wpi="http://schemas.microsoft.com/office/word/2010/wordprocessingInk" xmlns:wne="http://schemas.microsoft.com/office/word/2006/wordml" xmlns:wps="http://schemas.microsoft.com/office/word/2010/wordprocessingShape" mc:Ignorable="w14 w15 w16se w16cid w16 w16cex w16sdtdh w16sdtfl w16du wp14">
   <w:p>
     <w:pPr>
-      <w:pStyle w:val="Header"/>
-      <w:jc w:val="center"/>
+      <w:pStyle w:val="Meta"/>
+      <w:jc w:val="right"/>
     </w:pPr>
     <w:r>
-      <w:rPr>
-        <w:color w:val="6B7280"/>
-        <w:sz w:val="16"/>
-      </w:rPr>
-      <w:t xml:space="preserve">K Scan </w:t>
-    </w:r>
-    <w:proofErr w:type="gramStart"/>
-    <w:r>
-      <w:rPr>
-        <w:color w:val="6B7280"/>
-        <w:sz w:val="16"/>
-      </w:rPr>
-      <w:t>AI  |</w:t>
-    </w:r>
-    <w:proofErr w:type="gramEnd"/>
-    <w:r>
-      <w:rPr>
-        <w:color w:val="6B7280"/>
-        <w:sz w:val="16"/>
-      </w:rPr>
-      <w:t xml:space="preserve">  Privacy Policy</w:t>
+      <w:t>K SCAN AI  |  FULL PUBLIC LEGAL POLICY</w:t>
     </w:r>
   </w:p>
 </w:hdr>
@@ -2085,31 +2290,31 @@
       </w:rPr>
     </w:lvl>
   </w:abstractNum>
-  <w:num w:numId="1" w16cid:durableId="1996176602">
+  <w:num w:numId="1" w16cid:durableId="1447964682">
     <w:abstractNumId w:val="8"/>
   </w:num>
-  <w:num w:numId="2" w16cid:durableId="905265907">
+  <w:num w:numId="2" w16cid:durableId="1178932527">
     <w:abstractNumId w:val="6"/>
   </w:num>
-  <w:num w:numId="3" w16cid:durableId="173957529">
+  <w:num w:numId="3" w16cid:durableId="1065101629">
     <w:abstractNumId w:val="5"/>
   </w:num>
-  <w:num w:numId="4" w16cid:durableId="873466764">
+  <w:num w:numId="4" w16cid:durableId="983003499">
     <w:abstractNumId w:val="4"/>
   </w:num>
-  <w:num w:numId="5" w16cid:durableId="47461648">
+  <w:num w:numId="5" w16cid:durableId="1682658535">
     <w:abstractNumId w:val="7"/>
   </w:num>
-  <w:num w:numId="6" w16cid:durableId="1420249278">
+  <w:num w:numId="6" w16cid:durableId="1507985734">
     <w:abstractNumId w:val="3"/>
   </w:num>
-  <w:num w:numId="7" w16cid:durableId="1937402122">
+  <w:num w:numId="7" w16cid:durableId="1541816838">
     <w:abstractNumId w:val="2"/>
   </w:num>
-  <w:num w:numId="8" w16cid:durableId="712731749">
+  <w:num w:numId="8" w16cid:durableId="1589726869">
     <w:abstractNumId w:val="1"/>
   </w:num>
-  <w:num w:numId="9" w16cid:durableId="299650180">
+  <w:num w:numId="9" w16cid:durableId="1586261999">
     <w:abstractNumId w:val="0"/>
   </w:num>
 </w:numbering>
@@ -2506,12 +2711,12 @@
     <w:qFormat/>
     <w:rsid w:val="00FC693F"/>
     <w:pPr>
-      <w:spacing w:after="100" w:line="254" w:lineRule="auto"/>
+      <w:spacing w:after="120" w:line="259" w:lineRule="auto"/>
     </w:pPr>
     <w:rPr>
-      <w:rFonts w:ascii="Aptos" w:eastAsia="Aptos" w:hAnsi="Aptos"/>
-      <w:color w:val="18181B"/>
-      <w:sz w:val="19"/>
+      <w:rFonts w:ascii="Aptos" w:hAnsi="Aptos"/>
+      <w:color w:val="1C1C1C"/>
+      <w:sz w:val="20"/>
     </w:rPr>
   </w:style>
   <w:style w:type="paragraph" w:styleId="Heading1">
@@ -2525,15 +2730,15 @@
     <w:pPr>
       <w:keepNext/>
       <w:keepLines/>
-      <w:spacing w:before="180" w:after="80"/>
+      <w:spacing w:before="240" w:after="100"/>
       <w:outlineLvl w:val="0"/>
     </w:pPr>
     <w:rPr>
       <w:rFonts w:asciiTheme="majorHAnsi" w:eastAsiaTheme="majorEastAsia" w:hAnsiTheme="majorHAnsi" w:cstheme="majorBidi"/>
       <w:b/>
       <w:bCs/>
-      <w:color w:val="111827"/>
-      <w:sz w:val="28"/>
+      <w:color w:val="2D1F5E"/>
+      <w:sz w:val="30"/>
       <w:szCs w:val="28"/>
     </w:rPr>
   </w:style>
@@ -2549,15 +2754,15 @@
     <w:pPr>
       <w:keepNext/>
       <w:keepLines/>
-      <w:spacing w:before="120" w:after="40"/>
+      <w:spacing w:before="160" w:after="60"/>
       <w:outlineLvl w:val="1"/>
     </w:pPr>
     <w:rPr>
       <w:rFonts w:asciiTheme="majorHAnsi" w:eastAsiaTheme="majorEastAsia" w:hAnsiTheme="majorHAnsi" w:cstheme="majorBidi"/>
       <w:b/>
       <w:bCs/>
-      <w:color w:val="203764"/>
-      <w:sz w:val="22"/>
+      <w:color w:val="2D1F5E"/>
+      <w:sz w:val="23"/>
       <w:szCs w:val="26"/>
     </w:rPr>
   </w:style>
@@ -2573,15 +2778,15 @@
     <w:pPr>
       <w:keepNext/>
       <w:keepLines/>
-      <w:spacing w:before="80" w:after="20"/>
+      <w:spacing w:before="160" w:after="60"/>
       <w:outlineLvl w:val="2"/>
     </w:pPr>
     <w:rPr>
       <w:rFonts w:asciiTheme="majorHAnsi" w:eastAsiaTheme="majorEastAsia" w:hAnsiTheme="majorHAnsi" w:cstheme="majorBidi"/>
       <w:b/>
       <w:bCs/>
-      <w:color w:val="374151"/>
-      <w:sz w:val="20"/>
+      <w:color w:val="2D1F5E"/>
+      <w:sz w:val="21"/>
     </w:rPr>
   </w:style>
   <w:style w:type="paragraph" w:styleId="Heading4">
@@ -2695,7 +2900,6 @@
     <w:rPr>
       <w:rFonts w:asciiTheme="majorHAnsi" w:eastAsiaTheme="majorEastAsia" w:hAnsiTheme="majorHAnsi" w:cstheme="majorBidi"/>
       <w:color w:val="4F81BD" w:themeColor="accent1"/>
-      <w:sz w:val="20"/>
       <w:szCs w:val="20"/>
     </w:rPr>
   </w:style>
@@ -2720,7 +2924,6 @@
       <w:i/>
       <w:iCs/>
       <w:color w:val="404040" w:themeColor="text1" w:themeTint="BF"/>
-      <w:sz w:val="20"/>
       <w:szCs w:val="20"/>
     </w:rPr>
   </w:style>
@@ -2859,16 +3062,16 @@
       <w:pBdr>
         <w:bottom w:val="single" w:sz="8" w:space="4" w:color="4F81BD" w:themeColor="accent1"/>
       </w:pBdr>
-      <w:spacing w:after="160" w:line="240" w:lineRule="auto"/>
+      <w:spacing w:after="300" w:line="240" w:lineRule="auto"/>
       <w:contextualSpacing/>
     </w:pPr>
     <w:rPr>
       <w:rFonts w:asciiTheme="majorHAnsi" w:eastAsiaTheme="majorEastAsia" w:hAnsiTheme="majorHAnsi" w:cstheme="majorBidi"/>
       <w:b/>
-      <w:color w:val="121212"/>
+      <w:color w:val="2D1F5E"/>
       <w:spacing w:val="5"/>
       <w:kern w:val="28"/>
-      <w:sz w:val="48"/>
+      <w:sz w:val="50"/>
       <w:szCs w:val="52"/>
     </w:rPr>
   </w:style>
@@ -2904,9 +3107,9 @@
       <w:rFonts w:asciiTheme="majorHAnsi" w:eastAsiaTheme="majorEastAsia" w:hAnsiTheme="majorHAnsi" w:cstheme="majorBidi"/>
       <w:i/>
       <w:iCs/>
-      <w:color w:val="4F81BD" w:themeColor="accent1"/>
+      <w:color w:val="666666"/>
       <w:spacing w:val="15"/>
-      <w:sz w:val="24"/>
+      <w:sz w:val="23"/>
       <w:szCs w:val="24"/>
     </w:rPr>
   </w:style>
@@ -2944,9 +3147,6 @@
     <w:uiPriority w:val="99"/>
     <w:unhideWhenUsed/>
     <w:rsid w:val="00AA1D8D"/>
-    <w:pPr>
-      <w:spacing w:after="120"/>
-    </w:pPr>
   </w:style>
   <w:style w:type="character" w:customStyle="1" w:styleId="BodyTextChar">
     <w:name w:val="Body Text Char"/>
@@ -2963,7 +3163,7 @@
     <w:unhideWhenUsed/>
     <w:rsid w:val="00AA1D8D"/>
     <w:pPr>
-      <w:spacing w:after="120" w:line="480" w:lineRule="auto"/>
+      <w:spacing w:line="480" w:lineRule="auto"/>
     </w:pPr>
   </w:style>
   <w:style w:type="character" w:customStyle="1" w:styleId="BodyText2Char">
@@ -2980,9 +3180,6 @@
     <w:uiPriority w:val="99"/>
     <w:unhideWhenUsed/>
     <w:rsid w:val="00AA1D8D"/>
-    <w:pPr>
-      <w:spacing w:after="120"/>
-    </w:pPr>
     <w:rPr>
       <w:sz w:val="16"/>
       <w:szCs w:val="16"/>
@@ -3117,7 +3314,6 @@
     <w:unhideWhenUsed/>
     <w:rsid w:val="0029639D"/>
     <w:pPr>
-      <w:spacing w:after="120"/>
       <w:ind w:left="360"/>
       <w:contextualSpacing/>
     </w:pPr>
@@ -3129,7 +3325,6 @@
     <w:unhideWhenUsed/>
     <w:rsid w:val="0029639D"/>
     <w:pPr>
-      <w:spacing w:after="120"/>
       <w:ind w:left="720"/>
       <w:contextualSpacing/>
     </w:pPr>
@@ -3141,7 +3336,6 @@
     <w:unhideWhenUsed/>
     <w:rsid w:val="0029639D"/>
     <w:pPr>
-      <w:spacing w:after="120"/>
       <w:ind w:left="1080"/>
       <w:contextualSpacing/>
     </w:pPr>
@@ -13505,26 +13699,38 @@
       </w:tcPr>
     </w:tblStylePr>
   </w:style>
-  <w:style w:type="paragraph" w:customStyle="1" w:styleId="SmallNote">
-    <w:name w:val="Small Note"/>
-    <w:pPr>
-      <w:spacing w:after="60" w:line="240" w:lineRule="auto"/>
-    </w:pPr>
-    <w:rPr>
-      <w:rFonts w:ascii="Aptos" w:eastAsia="Aptos" w:hAnsi="Aptos"/>
-      <w:color w:val="4B5563"/>
-      <w:sz w:val="17"/>
-    </w:rPr>
-  </w:style>
   <w:style w:type="paragraph" w:customStyle="1" w:styleId="Meta">
     <w:name w:val="Meta"/>
     <w:pPr>
-      <w:spacing w:after="120"/>
+      <w:spacing w:after="160"/>
     </w:pPr>
     <w:rPr>
-      <w:rFonts w:ascii="Aptos" w:eastAsia="Aptos" w:hAnsi="Aptos"/>
-      <w:color w:val="4B5563"/>
+      <w:rFonts w:ascii="Aptos" w:hAnsi="Aptos"/>
+      <w:color w:val="666666"/>
       <w:sz w:val="18"/>
+    </w:rPr>
+  </w:style>
+  <w:style w:type="paragraph" w:customStyle="1" w:styleId="Callout">
+    <w:name w:val="Callout"/>
+    <w:pPr>
+      <w:spacing w:before="80" w:after="160"/>
+      <w:ind w:left="259" w:right="259"/>
+    </w:pPr>
+    <w:rPr>
+      <w:rFonts w:ascii="Aptos" w:hAnsi="Aptos"/>
+      <w:color w:val="1C1C1C"/>
+      <w:sz w:val="19"/>
+    </w:rPr>
+  </w:style>
+  <w:style w:type="paragraph" w:customStyle="1" w:styleId="Definition">
+    <w:name w:val="Definition"/>
+    <w:pPr>
+      <w:spacing w:after="100"/>
+      <w:ind w:left="216" w:hanging="216"/>
+    </w:pPr>
+    <w:rPr>
+      <w:rFonts w:ascii="Aptos" w:hAnsi="Aptos"/>
+      <w:sz w:val="20"/>
     </w:rPr>
   </w:style>
 </w:styles>

</xml_diff>